<commit_message>
Regenerar entregable de Casos de uso (actor freelance + módulo Configuración)
- PNG del diagrama regenerado (mermaid-cli ELK) con el actor `freelance`
  (es-un Empleado) y el módulo Configuración/Catálogos (CU-13/15/26/31).
- DOCX regenerado desde los .md fuente. Verificado 0 fugas de cocina interna.
- build-casos-de-uso.sh: reglas de filtro para limpiar artefactos de paréntesis
  (',)', '(,)', '—)', ';)') que dejaban las referencias DEC- inline al quitarlas;
  0 artefactos en el DOCX final.
- CONTINUAR: actualizado el estado del entregable.

Co-Authored-By: Claude Opus 4.8 <noreply@anthropic.com>
</commit_message>
<xml_diff>
--- a/07-Entregables/Casos de uso/Rumbo — Casos de uso.docx
+++ b/07-Entregables/Casos de uso/Rumbo — Casos de uso.docx
@@ -478,7 +478,7 @@
       <w:r>
         <w:drawing>
           <wp:inline>
-            <wp:extent cx="2876550" cy="6299791"/>
+            <wp:extent cx="2876550" cy="6285114"/>
             <wp:effectExtent b="0" l="0" r="0" t="0"/>
             <wp:docPr descr="Diagrama general de casos de uso de Rumbo." title="" id="52" name="Picture"/>
             <a:graphic>
@@ -499,7 +499,7 @@
                   <pic:spPr bwMode="auto">
                     <a:xfrm>
                       <a:off x="0" y="0"/>
-                      <a:ext cx="2876550" cy="6299791"/>
+                      <a:ext cx="2876550" cy="6285114"/>
                     </a:xfrm>
                     <a:prstGeom prst="rect">
                       <a:avLst/>
@@ -998,7 +998,40 @@
         <w:pStyle w:val="FirstParagraph"/>
       </w:pPr>
       <w:r>
-        <w:t xml:space="preserve">Agente / Asesor</w:t>
+        <w:t xml:space="preserve">empleado (rol operativo; los</w:t>
+      </w:r>
+      <w:r>
+        <w:t xml:space="preserve"> </w:t>
+      </w:r>
+      <w:r>
+        <w:rPr>
+          <w:rStyle w:val="VerbatimChar"/>
+        </w:rPr>
+        <w:t xml:space="preserve">admin</w:t>
+      </w:r>
+      <w:r>
+        <w:t xml:space="preserve">/</w:t>
+      </w:r>
+      <w:r>
+        <w:rPr>
+          <w:rStyle w:val="VerbatimChar"/>
+        </w:rPr>
+        <w:t xml:space="preserve">dueño</w:t>
+      </w:r>
+      <w:r>
+        <w:t xml:space="preserve">/</w:t>
+      </w:r>
+      <w:r>
+        <w:rPr>
+          <w:rStyle w:val="VerbatimChar"/>
+        </w:rPr>
+        <w:t xml:space="preserve">freelance</w:t>
+      </w:r>
+      <w:r>
+        <w:t xml:space="preserve"> </w:t>
+      </w:r>
+      <w:r>
+        <w:t xml:space="preserve">son especializaciones — Actores)</w:t>
       </w:r>
     </w:p>
     <w:bookmarkEnd w:id="63"/>
@@ -1042,7 +1075,7 @@
         </w:numPr>
       </w:pPr>
       <w:r>
-        <w:t xml:space="preserve">Llega una consulta por Instagram o WhatsApp.</w:t>
+        <w:t xml:space="preserve">Llega una consulta por un canal: Instagram, WhatsApp o presencial.</w:t>
       </w:r>
     </w:p>
     <w:bookmarkEnd w:id="65"/>
@@ -1074,7 +1107,50 @@
         <w:t xml:space="preserve"> </w:t>
       </w:r>
       <w:r>
-        <w:t xml:space="preserve">el agente registra pasajeros, destino y fechas → se crea una Oportunidad.</w:t>
+        <w:t xml:space="preserve">el empleado registra el</w:t>
+      </w:r>
+      <w:r>
+        <w:t xml:space="preserve"> </w:t>
+      </w:r>
+      <w:r>
+        <w:rPr>
+          <w:b/>
+          <w:bCs/>
+        </w:rPr>
+        <w:t xml:space="preserve">canal</w:t>
+      </w:r>
+      <w:r>
+        <w:t xml:space="preserve"> </w:t>
+      </w:r>
+      <w:r>
+        <w:t xml:space="preserve">(Instagram · WhatsApp · presencial), los pasajeros, el destino y las fechas → se crea una Oportunidad en estado</w:t>
+      </w:r>
+      <w:r>
+        <w:t xml:space="preserve"> </w:t>
+      </w:r>
+      <w:r>
+        <w:rPr>
+          <w:rStyle w:val="VerbatimChar"/>
+        </w:rPr>
+        <w:t xml:space="preserve">nueva</w:t>
+      </w:r>
+      <w:r>
+        <w:t xml:space="preserve">, que pasa a</w:t>
+      </w:r>
+      <w:r>
+        <w:t xml:space="preserve"> </w:t>
+      </w:r>
+      <w:r>
+        <w:rPr>
+          <w:rStyle w:val="VerbatimChar"/>
+        </w:rPr>
+        <w:t xml:space="preserve">en_gestión</w:t>
+      </w:r>
+      <w:r>
+        <w:t xml:space="preserve"> </w:t>
+      </w:r>
+      <w:r>
+        <w:t xml:space="preserve">al empezar a atenderla (CU-04 Registrar consulta, CU-05 Seguir oportunidad).</w:t>
       </w:r>
     </w:p>
     <w:p>
@@ -1096,7 +1172,7 @@
         <w:t xml:space="preserve"> </w:t>
       </w:r>
       <w:r>
-        <w:t xml:space="preserve">se identifica o se crea la ficha del Cliente (preferencias, segmento).</w:t>
+        <w:t xml:space="preserve">se identifica o se crea la ficha del Cliente (preferencias, segmento) (CU-02 Registrar cliente).</w:t>
       </w:r>
     </w:p>
     <w:p>
@@ -1118,7 +1194,22 @@
         <w:t xml:space="preserve"> </w:t>
       </w:r>
       <w:r>
-        <w:t xml:space="preserve">se genera la Cotización desde plantilla → documento.</w:t>
+        <w:t xml:space="preserve">se genera la Cotización desde plantilla → documento; la Oportunidad pasa a</w:t>
+      </w:r>
+      <w:r>
+        <w:t xml:space="preserve"> </w:t>
+      </w:r>
+      <w:r>
+        <w:rPr>
+          <w:rStyle w:val="VerbatimChar"/>
+        </w:rPr>
+        <w:t xml:space="preserve">cotizada</w:t>
+      </w:r>
+      <w:r>
+        <w:t xml:space="preserve"> </w:t>
+      </w:r>
+      <w:r>
+        <w:t xml:space="preserve">(CU-06 Emitir cotización).</w:t>
       </w:r>
     </w:p>
     <w:p>
@@ -1140,7 +1231,182 @@
         <w:t xml:space="preserve"> </w:t>
       </w:r>
       <w:r>
-        <w:t xml:space="preserve">se confirma el Viaje con venta, costo neto, comisión y cuotas (Pago).</w:t>
+        <w:t xml:space="preserve">al ganarse la Oportunidad se confirma el Viaje, que nace en estado</w:t>
+      </w:r>
+      <w:r>
+        <w:t xml:space="preserve"> </w:t>
+      </w:r>
+      <w:r>
+        <w:rPr>
+          <w:rStyle w:val="VerbatimChar"/>
+          <w:b/>
+          <w:bCs/>
+        </w:rPr>
+        <w:t xml:space="preserve">reservado</w:t>
+      </w:r>
+      <w:r>
+        <w:t xml:space="preserve"> </w:t>
+      </w:r>
+      <w:r>
+        <w:t xml:space="preserve">(CU-07 Confirmar reserva). Se carga su</w:t>
+      </w:r>
+      <w:r>
+        <w:t xml:space="preserve"> </w:t>
+      </w:r>
+      <w:r>
+        <w:rPr>
+          <w:b/>
+          <w:bCs/>
+        </w:rPr>
+        <w:t xml:space="preserve">economía</w:t>
+      </w:r>
+      <w:r>
+        <w:t xml:space="preserve"> </w:t>
+      </w:r>
+      <w:r>
+        <w:t xml:space="preserve">—precio de venta,</w:t>
+      </w:r>
+      <w:r>
+        <w:t xml:space="preserve"> </w:t>
+      </w:r>
+      <w:r>
+        <w:rPr>
+          <w:b/>
+          <w:bCs/>
+        </w:rPr>
+        <w:t xml:space="preserve">costo del Operador</w:t>
+      </w:r>
+      <w:r>
+        <w:t xml:space="preserve">,</w:t>
+      </w:r>
+      <w:r>
+        <w:t xml:space="preserve"> </w:t>
+      </w:r>
+      <w:r>
+        <w:rPr>
+          <w:b/>
+          <w:bCs/>
+        </w:rPr>
+        <w:t xml:space="preserve">moneda</w:t>
+      </w:r>
+      <w:r>
+        <w:t xml:space="preserve"> </w:t>
+      </w:r>
+      <w:r>
+        <w:t xml:space="preserve">(ARS/USD); el sistema calcula</w:t>
+      </w:r>
+      <w:r>
+        <w:t xml:space="preserve"> </w:t>
+      </w:r>
+      <w:r>
+        <w:rPr>
+          <w:b/>
+          <w:bCs/>
+        </w:rPr>
+        <w:t xml:space="preserve">ganancia</w:t>
+      </w:r>
+      <w:r>
+        <w:t xml:space="preserve"> </w:t>
+      </w:r>
+      <w:r>
+        <w:t xml:space="preserve">(</w:t>
+      </w:r>
+      <w:r>
+        <w:rPr>
+          <w:rStyle w:val="VerbatimChar"/>
+        </w:rPr>
+        <w:t xml:space="preserve">venta − costo</w:t>
+      </w:r>
+      <w:r>
+        <w:t xml:space="preserve">) y</w:t>
+      </w:r>
+      <w:r>
+        <w:t xml:space="preserve"> </w:t>
+      </w:r>
+      <w:r>
+        <w:rPr>
+          <w:b/>
+          <w:bCs/>
+        </w:rPr>
+        <w:t xml:space="preserve">margen</w:t>
+      </w:r>
+      <w:r>
+        <w:t xml:space="preserve">, y se registra aparte la</w:t>
+      </w:r>
+      <w:r>
+        <w:t xml:space="preserve"> </w:t>
+      </w:r>
+      <w:r>
+        <w:rPr>
+          <w:b/>
+          <w:bCs/>
+        </w:rPr>
+        <w:t xml:space="preserve">comisión del vendedor</w:t>
+      </w:r>
+      <w:r>
+        <w:t xml:space="preserve"> </w:t>
+      </w:r>
+      <w:r>
+        <w:t xml:space="preserve">(CU-10 Registrar economía del viaje, RN-01 Comisión automática)— y el</w:t>
+      </w:r>
+      <w:r>
+        <w:t xml:space="preserve"> </w:t>
+      </w:r>
+      <w:r>
+        <w:rPr>
+          <w:b/>
+          <w:bCs/>
+        </w:rPr>
+        <w:t xml:space="preserve">plan de cuotas</w:t>
+      </w:r>
+      <w:r>
+        <w:t xml:space="preserve"> </w:t>
+      </w:r>
+      <w:r>
+        <w:t xml:space="preserve">(Pago, CU-11 Definir plan de cuotas). Al cobrarse la</w:t>
+      </w:r>
+      <w:r>
+        <w:t xml:space="preserve"> </w:t>
+      </w:r>
+      <w:r>
+        <w:rPr>
+          <w:b/>
+          <w:bCs/>
+        </w:rPr>
+        <w:t xml:space="preserve">seña</w:t>
+      </w:r>
+      <w:r>
+        <w:t xml:space="preserve"> </w:t>
+      </w:r>
+      <w:r>
+        <w:t xml:space="preserve">el Viaje pasa a</w:t>
+      </w:r>
+      <w:r>
+        <w:t xml:space="preserve"> </w:t>
+      </w:r>
+      <w:r>
+        <w:rPr>
+          <w:rStyle w:val="VerbatimChar"/>
+        </w:rPr>
+        <w:t xml:space="preserve">vendido</w:t>
+      </w:r>
+      <w:r>
+        <w:t xml:space="preserve">; al saldarse el total, a</w:t>
+      </w:r>
+      <w:r>
+        <w:t xml:space="preserve"> </w:t>
+      </w:r>
+      <w:r>
+        <w:rPr>
+          <w:rStyle w:val="VerbatimChar"/>
+        </w:rPr>
+        <w:t xml:space="preserve">confirmado</w:t>
+      </w:r>
+      <w:r>
+        <w:t xml:space="preserve"> </w:t>
+      </w:r>
+      <w:r>
+        <w:t xml:space="preserve">(CU-12 Registrar cobro de un pago).</w:t>
       </w:r>
     </w:p>
     <w:p>
@@ -1162,7 +1428,7 @@
         <w:t xml:space="preserve"> </w:t>
       </w:r>
       <w:r>
-        <w:t xml:space="preserve">el sistema arma alertas de pago y formularios por destino.</w:t>
+        <w:t xml:space="preserve">el sistema arma alertas de pago, de formularios por destino (RequisitoDestino) y de próxima salida.</w:t>
       </w:r>
     </w:p>
     <w:p>
@@ -1184,7 +1450,7 @@
         <w:t xml:space="preserve"> </w:t>
       </w:r>
       <w:r>
-        <w:t xml:space="preserve">el cliente deja Reseña y el Hotel se suma al catálogo.</w:t>
+        <w:t xml:space="preserve">al finalizar el viaje, el cliente deja Reseña y el Hotel se suma/consolida en el catálogo.</w:t>
       </w:r>
     </w:p>
     <w:bookmarkEnd w:id="66"/>
@@ -1238,7 +1504,7 @@
         <w:t xml:space="preserve"> </w:t>
       </w:r>
       <w:r>
-        <w:t xml:space="preserve">se registran vencimientos escalonados; aviso un mes antes de cada uno.</w:t>
+        <w:t xml:space="preserve">se registran vencimientos escalonados; aviso un mes antes de cada uno. Un mismo viaje puede cobrarse parte en ARS y parte en USD (CU-12 Registrar cobro de un pago).</w:t>
       </w:r>
     </w:p>
     <w:p>
@@ -1260,7 +1526,7 @@
         <w:t xml:space="preserve"> </w:t>
       </w:r>
       <w:r>
-        <w:t xml:space="preserve">recordatorio del formulario específico según el destino.</w:t>
+        <w:t xml:space="preserve">recordatorio del formulario específico según el destino (RequisitoDestino).</w:t>
       </w:r>
     </w:p>
     <w:bookmarkEnd w:id="67"/>
@@ -1282,7 +1548,37 @@
         </w:numPr>
       </w:pPr>
       <w:r>
-        <w:t xml:space="preserve">Viaje registrado con control económico, pagos y alertas configurados, ficha del cliente actualizada y hotel en el catálogo.</w:t>
+        <w:t xml:space="preserve">Viaje registrado (estado según el avance del cobro:</w:t>
+      </w:r>
+      <w:r>
+        <w:t xml:space="preserve"> </w:t>
+      </w:r>
+      <w:r>
+        <w:rPr>
+          <w:rStyle w:val="VerbatimChar"/>
+        </w:rPr>
+        <w:t xml:space="preserve">reservado</w:t>
+      </w:r>
+      <w:r>
+        <w:t xml:space="preserve">/</w:t>
+      </w:r>
+      <w:r>
+        <w:rPr>
+          <w:rStyle w:val="VerbatimChar"/>
+        </w:rPr>
+        <w:t xml:space="preserve">vendido</w:t>
+      </w:r>
+      <w:r>
+        <w:t xml:space="preserve">/</w:t>
+      </w:r>
+      <w:r>
+        <w:rPr>
+          <w:rStyle w:val="VerbatimChar"/>
+        </w:rPr>
+        <w:t xml:space="preserve">confirmado</w:t>
+      </w:r>
+      <w:r>
+        <w:t xml:space="preserve">) con control económico, pagos y alertas configurados, ficha del cliente actualizada y hotel en el catálogo.</w:t>
       </w:r>
     </w:p>
     <w:bookmarkEnd w:id="68"/>
@@ -1304,7 +1600,7 @@
         </w:numPr>
       </w:pPr>
       <w:r>
-        <w:t xml:space="preserve">RN-01 Comisión automática</w:t>
+        <w:t xml:space="preserve">RN-01 Comisión automática (ganancia y margen automáticos; comisión del vendedor aparte).</w:t>
       </w:r>
     </w:p>
     <w:bookmarkEnd w:id="69"/>
@@ -1326,7 +1622,7 @@
         </w:numPr>
       </w:pPr>
       <w:r>
-        <w:t xml:space="preserve">Oportunidad · Cliente · Cotización · Viaje · Pago · Alerta · Reseña · Hotel</w:t>
+        <w:t xml:space="preserve">Oportunidad · Cliente · Cotización · Viaje · Operador · Destino · Pago · Alerta · RequisitoDestino · Reseña · Hotel</w:t>
       </w:r>
     </w:p>
     <w:bookmarkEnd w:id="70"/>
@@ -1521,7 +1817,7 @@
         <w:t xml:space="preserve"> </w:t>
       </w:r>
       <w:r>
-        <w:t xml:space="preserve">(familia · amigos · individual),</w:t>
+        <w:t xml:space="preserve">(familia · amigos · individual · pareja),</w:t>
       </w:r>
       <w:r>
         <w:t xml:space="preserve"> </w:t>
@@ -1565,7 +1861,7 @@
         <w:t xml:space="preserve"> </w:t>
       </w:r>
       <w:r>
-        <w:t xml:space="preserve">(no restringe el acceso del resto —).</w:t>
+        <w:t xml:space="preserve">(no restringe el acceso del resto).</w:t>
       </w:r>
     </w:p>
     <w:p>
@@ -2175,7 +2471,7 @@
         <w:t xml:space="preserve"> </w:t>
       </w:r>
       <w:r>
-        <w:t xml:space="preserve">(familia · amigos · individual),</w:t>
+        <w:t xml:space="preserve">(familia · amigos · individual · pareja),</w:t>
       </w:r>
       <w:r>
         <w:t xml:space="preserve"> </w:t>
@@ -2207,7 +2503,7 @@
         <w:t xml:space="preserve"> </w:t>
       </w:r>
       <w:r>
-        <w:t xml:space="preserve">(Usuario, opcional —).</w:t>
+        <w:t xml:space="preserve">(Usuario, opcional).</w:t>
       </w:r>
     </w:p>
     <w:p>
@@ -4007,7 +4303,23 @@
         </w:numPr>
       </w:pPr>
       <w:r>
-        <w:t xml:space="preserve">Completa el formulario:</w:t>
+        <w:t xml:space="preserve">Completa el formulario: la</w:t>
+      </w:r>
+      <w:r>
+        <w:t xml:space="preserve"> </w:t>
+      </w:r>
+      <w:r>
+        <w:rPr>
+          <w:b/>
+          <w:bCs/>
+        </w:rPr>
+        <w:t xml:space="preserve">moneda</w:t>
+      </w:r>
+      <w:r>
+        <w:t xml:space="preserve"> </w:t>
+      </w:r>
+      <w:r>
+        <w:t xml:space="preserve">de la operación (ARS/USD), los</w:t>
       </w:r>
       <w:r>
         <w:t xml:space="preserve"> </w:t>
@@ -4039,7 +4351,7 @@
         <w:t xml:space="preserve"> </w:t>
       </w:r>
       <w:r>
-        <w:t xml:space="preserve">en ARS; el sistema calcula el</w:t>
+        <w:t xml:space="preserve">en esa moneda; el sistema calcula el</w:t>
       </w:r>
       <w:r>
         <w:t xml:space="preserve"> </w:t>
@@ -4052,7 +4364,22 @@
         <w:t xml:space="preserve">total</w:t>
       </w:r>
       <w:r>
-        <w:t xml:space="preserve">.</w:t>
+        <w:t xml:space="preserve">. La</w:t>
+      </w:r>
+      <w:r>
+        <w:t xml:space="preserve"> </w:t>
+      </w:r>
+      <w:r>
+        <w:rPr>
+          <w:rStyle w:val="VerbatimChar"/>
+        </w:rPr>
+        <w:t xml:space="preserve">moneda</w:t>
+      </w:r>
+      <w:r>
+        <w:t xml:space="preserve"> </w:t>
+      </w:r>
+      <w:r>
+        <w:t xml:space="preserve">de la cotización aceptada queda como moneda de referencia del Viaje.</w:t>
       </w:r>
     </w:p>
     <w:p>
@@ -4845,7 +5172,38 @@
         <w:t xml:space="preserve"> </w:t>
       </w:r>
       <w:r>
-        <w:t xml:space="preserve">según los requisitos del destino (CU-15 Configurar recordatorios por destino).</w:t>
+        <w:t xml:space="preserve">según los requisitos del destino (CU-15 Configurar recordatorios por destino) y una Alerta de tipo</w:t>
+      </w:r>
+      <w:r>
+        <w:t xml:space="preserve"> </w:t>
+      </w:r>
+      <w:r>
+        <w:rPr>
+          <w:rStyle w:val="VerbatimChar"/>
+        </w:rPr>
+        <w:t xml:space="preserve">salida</w:t>
+      </w:r>
+      <w:r>
+        <w:t xml:space="preserve"> </w:t>
+      </w:r>
+      <w:r>
+        <w:t xml:space="preserve">con aviso previo a la fecha de salida del Viaje (anticipación</w:t>
+      </w:r>
+      <w:r>
+        <w:t xml:space="preserve"> </w:t>
+      </w:r>
+      <w:r>
+        <w:rPr>
+          <w:b/>
+          <w:bCs/>
+        </w:rPr>
+        <w:t xml:space="preserve">configurable, default 7 días</w:t>
+      </w:r>
+      <w:r>
+        <w:t xml:space="preserve"> </w:t>
+      </w:r>
+      <w:r>
+        <w:t xml:space="preserve">valor a validar con la agencia).</w:t>
       </w:r>
     </w:p>
     <w:p>
@@ -5057,7 +5415,7 @@
         <w:t xml:space="preserve"> </w:t>
       </w:r>
       <w:r>
-        <w:t xml:space="preserve">asociado al Cliente y a su Oportunidad, con las Alertas de formulario por destino generadas y su economía/plan cargados; pasará a</w:t>
+        <w:t xml:space="preserve">asociado al Cliente y a su Oportunidad, con las Alertas de formulario por destino y de salida generadas y su economía/plan cargados; pasará a</w:t>
       </w:r>
       <w:r>
         <w:t xml:space="preserve"> </w:t>
@@ -7092,7 +7450,7 @@
         <w:t xml:space="preserve"> </w:t>
       </w:r>
       <w:r>
-        <w:t xml:space="preserve">de este Viaje puntual, distinta al default del vendedor; el sistema la conserva para la liquidación (CU-13 Configurar porcentaje de comisión,).</w:t>
+        <w:t xml:space="preserve">de este Viaje puntual, distinta al default del vendedor; el sistema la conserva para la liquidación (CU-13 Configurar porcentaje de comisión).</w:t>
       </w:r>
     </w:p>
     <w:p>
@@ -7641,7 +7999,32 @@
         <w:t xml:space="preserve"> </w:t>
       </w:r>
       <w:r>
-        <w:t xml:space="preserve">(ARS),</w:t>
+        <w:t xml:space="preserve">(en la</w:t>
+      </w:r>
+      <w:r>
+        <w:t xml:space="preserve"> </w:t>
+      </w:r>
+      <w:r>
+        <w:rPr>
+          <w:b/>
+          <w:bCs/>
+        </w:rPr>
+        <w:t xml:space="preserve">moneda de referencia del Viaje</w:t>
+      </w:r>
+      <w:r>
+        <w:t xml:space="preserve">,</w:t>
+      </w:r>
+      <w:r>
+        <w:t xml:space="preserve"> </w:t>
+      </w:r>
+      <w:r>
+        <w:rPr>
+          <w:rStyle w:val="VerbatimChar"/>
+        </w:rPr>
+        <w:t xml:space="preserve">Viaje.moneda</w:t>
+      </w:r>
+      <w:r>
+        <w:t xml:space="preserve">),</w:t>
       </w:r>
       <w:r>
         <w:t xml:space="preserve"> </w:t>
@@ -7680,7 +8063,36 @@
         <w:t xml:space="preserve">dd/mm/aa</w:t>
       </w:r>
       <w:r>
-        <w:t xml:space="preserve">).</w:t>
+        <w:t xml:space="preserve">). La</w:t>
+      </w:r>
+      <w:r>
+        <w:t xml:space="preserve"> </w:t>
+      </w:r>
+      <w:r>
+        <w:rPr>
+          <w:b/>
+          <w:bCs/>
+        </w:rPr>
+        <w:t xml:space="preserve">moneda real</w:t>
+      </w:r>
+      <w:r>
+        <w:t xml:space="preserve"> </w:t>
+      </w:r>
+      <w:r>
+        <w:t xml:space="preserve">con que se pagará cada cuota</w:t>
+      </w:r>
+      <w:r>
+        <w:t xml:space="preserve"> </w:t>
+      </w:r>
+      <w:r>
+        <w:rPr>
+          <w:b/>
+          <w:bCs/>
+        </w:rPr>
+        <w:t xml:space="preserve">no se fija acá</w:t>
+      </w:r>
+      <w:r>
+        <w:t xml:space="preserve">: se elige al cobrar (CU-12 Registrar cobro de un pago).</w:t>
       </w:r>
     </w:p>
     <w:p>
@@ -7707,7 +8119,7 @@
         <w:t xml:space="preserve"> </w:t>
       </w:r>
       <w:r>
-        <w:t xml:space="preserve">del Viaje.</w:t>
+        <w:t xml:space="preserve">del Viaje (en la moneda de referencia).</w:t>
       </w:r>
     </w:p>
     <w:p>
@@ -7889,7 +8301,24 @@
         <w:t xml:space="preserve">pendiente</w:t>
       </w:r>
       <w:r>
-        <w:t xml:space="preserve">, el empleado anula un Pago del plan (cambió el esquema); el sistema lo elimina, cierra su Alerta y vuelve a exigir que</w:t>
+        <w:t xml:space="preserve">, el empleado anula un Pago del plan (cambió el esquema); el sistema lo pasa a estado</w:t>
+      </w:r>
+      <w:r>
+        <w:t xml:space="preserve"> </w:t>
+      </w:r>
+      <w:r>
+        <w:rPr>
+          <w:rStyle w:val="VerbatimChar"/>
+          <w:b/>
+          <w:bCs/>
+        </w:rPr>
+        <w:t xml:space="preserve">anulado</w:t>
+      </w:r>
+      <w:r>
+        <w:t xml:space="preserve"> </w:t>
+      </w:r>
+      <w:r>
+        <w:t xml:space="preserve">(baja lógica, conserva el registro), cierra su Alerta y vuelve a exigir que</w:t>
       </w:r>
       <w:r>
         <w:t xml:space="preserve"> </w:t>
@@ -7901,7 +8330,10 @@
         <w:t xml:space="preserve">Σ montos = precioVenta</w:t>
       </w:r>
       <w:r>
-        <w:t xml:space="preserve">.</w:t>
+        <w:t xml:space="preserve"> </w:t>
+      </w:r>
+      <w:r>
+        <w:t xml:space="preserve">sobre los pagos no anulados.</w:t>
       </w:r>
     </w:p>
     <w:p>
@@ -8016,7 +8448,23 @@
         </w:numPr>
       </w:pPr>
       <w:r>
-        <w:t xml:space="preserve">La suma de los Pagos del plan debe igualar el</w:t>
+        <w:t xml:space="preserve">La suma de los Pagos</w:t>
+      </w:r>
+      <w:r>
+        <w:t xml:space="preserve"> </w:t>
+      </w:r>
+      <w:r>
+        <w:rPr>
+          <w:b/>
+          <w:bCs/>
+        </w:rPr>
+        <w:t xml:space="preserve">no anulados</w:t>
+      </w:r>
+      <w:r>
+        <w:t xml:space="preserve"> </w:t>
+      </w:r>
+      <w:r>
+        <w:t xml:space="preserve">del plan debe igualar el</w:t>
       </w:r>
       <w:r>
         <w:t xml:space="preserve"> </w:t>
@@ -8031,7 +8479,84 @@
         <w:t xml:space="preserve"> </w:t>
       </w:r>
       <w:r>
-        <w:t xml:space="preserve">del Viaje.</w:t>
+        <w:t xml:space="preserve">del Viaje,</w:t>
+      </w:r>
+      <w:r>
+        <w:t xml:space="preserve"> </w:t>
+      </w:r>
+      <w:r>
+        <w:rPr>
+          <w:b/>
+          <w:bCs/>
+        </w:rPr>
+        <w:t xml:space="preserve">en la moneda de referencia del viaje</w:t>
+      </w:r>
+      <w:r>
+        <w:t xml:space="preserve"> </w:t>
+      </w:r>
+      <w:r>
+        <w:t xml:space="preserve">(</w:t>
+      </w:r>
+      <w:r>
+        <w:rPr>
+          <w:rStyle w:val="VerbatimChar"/>
+        </w:rPr>
+        <w:t xml:space="preserve">Viaje.moneda</w:t>
+      </w:r>
+      <w:r>
+        <w:t xml:space="preserve">).</w:t>
+      </w:r>
+    </w:p>
+    <w:p>
+      <w:pPr>
+        <w:pStyle w:val="Compact"/>
+        <w:numPr>
+          <w:ilvl w:val="0"/>
+          <w:numId w:val="1076"/>
+        </w:numPr>
+      </w:pPr>
+      <w:r>
+        <w:rPr>
+          <w:b/>
+          <w:bCs/>
+        </w:rPr>
+        <w:t xml:space="preserve">Multimoneda (Q6.1):</w:t>
+      </w:r>
+      <w:r>
+        <w:t xml:space="preserve"> </w:t>
+      </w:r>
+      <w:r>
+        <w:t xml:space="preserve">el plan se denomina íntegro en la moneda de referencia, por eso</w:t>
+      </w:r>
+      <w:r>
+        <w:t xml:space="preserve"> </w:t>
+      </w:r>
+      <w:r>
+        <w:rPr>
+          <w:rStyle w:val="VerbatimChar"/>
+        </w:rPr>
+        <w:t xml:space="preserve">Σ montos = precioVenta</w:t>
+      </w:r>
+      <w:r>
+        <w:t xml:space="preserve"> </w:t>
+      </w:r>
+      <w:r>
+        <w:t xml:space="preserve">cierra exacto sin cotizaciones. Un mismo viaje puede luego cobrarse parte en ARS y parte en USD: la moneda real y el</w:t>
+      </w:r>
+      <w:r>
+        <w:t xml:space="preserve"> </w:t>
+      </w:r>
+      <w:r>
+        <w:rPr>
+          <w:rStyle w:val="VerbatimChar"/>
+        </w:rPr>
+        <w:t xml:space="preserve">tipo_cambio</w:t>
+      </w:r>
+      <w:r>
+        <w:t xml:space="preserve"> </w:t>
+      </w:r>
+      <w:r>
+        <w:t xml:space="preserve">se registran al cobrar cada cuota (CU-12 Registrar cobro de un pago, Pago).</w:t>
       </w:r>
     </w:p>
     <w:bookmarkEnd w:id="169"/>
@@ -8211,7 +8736,23 @@
         </w:numPr>
       </w:pPr>
       <w:r>
-        <w:t xml:space="preserve">Registra el cobro: fecha efectiva (</w:t>
+        <w:t xml:space="preserve">Registra el cobro:</w:t>
+      </w:r>
+      <w:r>
+        <w:t xml:space="preserve"> </w:t>
+      </w:r>
+      <w:r>
+        <w:rPr>
+          <w:b/>
+          <w:bCs/>
+        </w:rPr>
+        <w:t xml:space="preserve">fecha efectiva</w:t>
+      </w:r>
+      <w:r>
+        <w:t xml:space="preserve"> </w:t>
+      </w:r>
+      <w:r>
+        <w:t xml:space="preserve">(</w:t>
       </w:r>
       <w:r>
         <w:rPr>
@@ -8220,7 +8761,122 @@
         <w:t xml:space="preserve">dd/mm/aa</w:t>
       </w:r>
       <w:r>
-        <w:t xml:space="preserve">) y, como dato informativo, el medio.</w:t>
+        <w:t xml:space="preserve">),</w:t>
+      </w:r>
+      <w:r>
+        <w:t xml:space="preserve"> </w:t>
+      </w:r>
+      <w:r>
+        <w:rPr>
+          <w:b/>
+          <w:bCs/>
+        </w:rPr>
+        <w:t xml:space="preserve">forma de pago</w:t>
+      </w:r>
+      <w:r>
+        <w:t xml:space="preserve"> </w:t>
+      </w:r>
+      <w:r>
+        <w:t xml:space="preserve">(</w:t>
+      </w:r>
+      <w:r>
+        <w:rPr>
+          <w:rStyle w:val="VerbatimChar"/>
+        </w:rPr>
+        <w:t xml:space="preserve">forma_pago</w:t>
+      </w:r>
+      <w:r>
+        <w:t xml:space="preserve">: efectivo · transferencia · tarjeta · cheque · depósito) y la</w:t>
+      </w:r>
+      <w:r>
+        <w:t xml:space="preserve"> </w:t>
+      </w:r>
+      <w:r>
+        <w:rPr>
+          <w:b/>
+          <w:bCs/>
+        </w:rPr>
+        <w:t xml:space="preserve">moneda real</w:t>
+      </w:r>
+      <w:r>
+        <w:t xml:space="preserve"> </w:t>
+      </w:r>
+      <w:r>
+        <w:t xml:space="preserve">del cobro (</w:t>
+      </w:r>
+      <w:r>
+        <w:rPr>
+          <w:rStyle w:val="VerbatimChar"/>
+        </w:rPr>
+        <w:t xml:space="preserve">moneda_pago</w:t>
+      </w:r>
+      <w:r>
+        <w:t xml:space="preserve">: ARS / USD). Si</w:t>
+      </w:r>
+      <w:r>
+        <w:t xml:space="preserve"> </w:t>
+      </w:r>
+      <w:r>
+        <w:rPr>
+          <w:rStyle w:val="VerbatimChar"/>
+        </w:rPr>
+        <w:t xml:space="preserve">moneda_pago</w:t>
+      </w:r>
+      <w:r>
+        <w:t xml:space="preserve"> </w:t>
+      </w:r>
+      <w:r>
+        <w:rPr>
+          <w:b/>
+          <w:bCs/>
+        </w:rPr>
+        <w:t xml:space="preserve">difiere</w:t>
+      </w:r>
+      <w:r>
+        <w:t xml:space="preserve"> </w:t>
+      </w:r>
+      <w:r>
+        <w:t xml:space="preserve">de la moneda de referencia del Viaje, carga el</w:t>
+      </w:r>
+      <w:r>
+        <w:t xml:space="preserve"> </w:t>
+      </w:r>
+      <w:r>
+        <w:rPr>
+          <w:b/>
+          <w:bCs/>
+        </w:rPr>
+        <w:t xml:space="preserve">tipo de cambio</w:t>
+      </w:r>
+      <w:r>
+        <w:t xml:space="preserve"> </w:t>
+      </w:r>
+      <w:r>
+        <w:t xml:space="preserve">(</w:t>
+      </w:r>
+      <w:r>
+        <w:rPr>
+          <w:rStyle w:val="VerbatimChar"/>
+        </w:rPr>
+        <w:t xml:space="preserve">tipo_cambio</w:t>
+      </w:r>
+      <w:r>
+        <w:t xml:space="preserve">) del día; el sistema calcula el</w:t>
+      </w:r>
+      <w:r>
+        <w:t xml:space="preserve"> </w:t>
+      </w:r>
+      <w:r>
+        <w:rPr>
+          <w:rStyle w:val="VerbatimChar"/>
+        </w:rPr>
+        <w:t xml:space="preserve">monto_cobrado</w:t>
+      </w:r>
+      <w:r>
+        <w:t xml:space="preserve"> </w:t>
+      </w:r>
+      <w:r>
+        <w:t xml:space="preserve">real.</w:t>
       </w:r>
     </w:p>
     <w:p>
@@ -8268,7 +8924,22 @@
         </w:numPr>
       </w:pPr>
       <w:r>
-        <w:t xml:space="preserve">El sistema actualiza el saldo pendiente del Viaje (suma de Pagos no cobrados) y el</w:t>
+        <w:t xml:space="preserve">El sistema actualiza el saldo pendiente del Viaje (suma de los</w:t>
+      </w:r>
+      <w:r>
+        <w:t xml:space="preserve"> </w:t>
+      </w:r>
+      <w:r>
+        <w:rPr>
+          <w:rStyle w:val="VerbatimChar"/>
+        </w:rPr>
+        <w:t xml:space="preserve">monto</w:t>
+      </w:r>
+      <w:r>
+        <w:t xml:space="preserve"> </w:t>
+      </w:r>
+      <w:r>
+        <w:t xml:space="preserve">planificados de los Pagos no cobrados, en la moneda de referencia) y el</w:t>
       </w:r>
       <w:r>
         <w:t xml:space="preserve"> </w:t>
@@ -8610,6 +9281,110 @@
       </w:pPr>
       <w:r>
         <w:t xml:space="preserve">Sin cobro online: solo registro de montos y vencimientos (Pago). Ver Alcance y fuera de alcance.</w:t>
+      </w:r>
+    </w:p>
+    <w:p>
+      <w:pPr>
+        <w:pStyle w:val="Compact"/>
+        <w:numPr>
+          <w:ilvl w:val="0"/>
+          <w:numId w:val="1082"/>
+        </w:numPr>
+      </w:pPr>
+      <w:r>
+        <w:rPr>
+          <w:b/>
+          <w:bCs/>
+        </w:rPr>
+        <w:t xml:space="preserve">Multimoneda por cobro (Q6.1):</w:t>
+      </w:r>
+      <w:r>
+        <w:t xml:space="preserve"> </w:t>
+      </w:r>
+      <w:r>
+        <w:t xml:space="preserve">la</w:t>
+      </w:r>
+      <w:r>
+        <w:t xml:space="preserve"> </w:t>
+      </w:r>
+      <w:r>
+        <w:rPr>
+          <w:rStyle w:val="VerbatimChar"/>
+        </w:rPr>
+        <w:t xml:space="preserve">moneda_pago</w:t>
+      </w:r>
+      <w:r>
+        <w:t xml:space="preserve"> </w:t>
+      </w:r>
+      <w:r>
+        <w:t xml:space="preserve">y el</w:t>
+      </w:r>
+      <w:r>
+        <w:t xml:space="preserve"> </w:t>
+      </w:r>
+      <w:r>
+        <w:rPr>
+          <w:rStyle w:val="VerbatimChar"/>
+        </w:rPr>
+        <w:t xml:space="preserve">tipo_cambio</w:t>
+      </w:r>
+      <w:r>
+        <w:t xml:space="preserve"> </w:t>
+      </w:r>
+      <w:r>
+        <w:t xml:space="preserve">se registran acá, al cobrar; un mismo viaje puede cobrarse parte en ARS y parte en USD. El % pagado y el saldo se calculan sobre los</w:t>
+      </w:r>
+      <w:r>
+        <w:t xml:space="preserve"> </w:t>
+      </w:r>
+      <w:r>
+        <w:rPr>
+          <w:rStyle w:val="VerbatimChar"/>
+        </w:rPr>
+        <w:t xml:space="preserve">monto</w:t>
+      </w:r>
+      <w:r>
+        <w:t xml:space="preserve"> </w:t>
+      </w:r>
+      <w:r>
+        <w:t xml:space="preserve">planificados en la moneda de referencia del Viaje.</w:t>
+      </w:r>
+    </w:p>
+    <w:p>
+      <w:pPr>
+        <w:pStyle w:val="Compact"/>
+        <w:numPr>
+          <w:ilvl w:val="0"/>
+          <w:numId w:val="1082"/>
+        </w:numPr>
+      </w:pPr>
+      <w:r>
+        <w:rPr>
+          <w:rStyle w:val="VerbatimChar"/>
+        </w:rPr>
+        <w:t xml:space="preserve">forma_pago</w:t>
+      </w:r>
+      <w:r>
+        <w:t xml:space="preserve"> </w:t>
+      </w:r>
+      <w:r>
+        <w:t xml:space="preserve">capturada al cobrar; alimenta el reporte de</w:t>
+      </w:r>
+      <w:r>
+        <w:t xml:space="preserve"> </w:t>
+      </w:r>
+      <w:r>
+        <w:rPr>
+          <w:b/>
+          <w:bCs/>
+        </w:rPr>
+        <w:t xml:space="preserve">formas de pago</w:t>
+      </w:r>
+      <w:r>
+        <w:t xml:space="preserve"> </w:t>
+      </w:r>
+      <w:r>
+        <w:t xml:space="preserve">(CU-22 Generar reportes y estadísticas).</w:t>
       </w:r>
     </w:p>
     <w:bookmarkEnd w:id="179"/>
@@ -8981,7 +9756,7 @@
         <w:t xml:space="preserve"> </w:t>
       </w:r>
       <w:r>
-        <w:t xml:space="preserve">distinta para ese Viaje puntual; ese override prevalece sobre el default del vendedor (CU-10 Registrar economía del viaje,).</w:t>
+        <w:t xml:space="preserve">distinta para ese Viaje puntual; ese override prevalece sobre el default del vendedor (CU-10 Registrar economía del viaje).</w:t>
       </w:r>
     </w:p>
     <w:bookmarkEnd w:id="187"/>
@@ -9075,7 +9850,7 @@
         <w:pStyle w:val="FirstParagraph"/>
       </w:pPr>
       <w:r>
-        <w:t xml:space="preserve">Consultar la agenda de Alertas vigentes (pagos, formularios por destino, insistencia y reseñas), atenderlas y marcarlas como resueltas.</w:t>
+        <w:t xml:space="preserve">Consultar la agenda de Alertas vigentes (pagos, formularios por destino, próximas salidas, insistencia y reseñas), atenderlas y marcarlas como resueltas.</w:t>
       </w:r>
     </w:p>
     <w:bookmarkEnd w:id="192"/>
@@ -9246,7 +10021,7 @@
         <w:t xml:space="preserve"> </w:t>
       </w:r>
       <w:r>
-        <w:t xml:space="preserve">(pago · formulario · insistencia · reseña · manual · recontacto).</w:t>
+        <w:t xml:space="preserve">(pago · formulario · salida · insistencia · reseña · manual · recontacto).</w:t>
       </w:r>
     </w:p>
     <w:p>
@@ -9620,7 +10395,7 @@
         <w:t xml:space="preserve"> </w:t>
       </w:r>
       <w:r>
-        <w:t xml:space="preserve">(CU-24 Iniciar sesión,).</w:t>
+        <w:t xml:space="preserve">(CU-24 Iniciar sesión).</w:t>
       </w:r>
     </w:p>
     <w:bookmarkEnd w:id="205"/>
@@ -13097,7 +13872,7 @@
         <w:t xml:space="preserve"> </w:t>
       </w:r>
       <w:r>
-        <w:t xml:space="preserve">(CU-24 Iniciar sesión,).</w:t>
+        <w:t xml:space="preserve">(CU-24 Iniciar sesión).</w:t>
       </w:r>
     </w:p>
     <w:bookmarkEnd w:id="265"/>
@@ -13163,7 +13938,7 @@
         <w:rPr>
           <w:rStyle w:val="VerbatimChar"/>
         </w:rPr>
-        <w:t xml:space="preserve">nueva · cotizada · ganada · perdida</w:t>
+        <w:t xml:space="preserve">nueva · en_gestión · cotizada · ganada · perdida</w:t>
       </w:r>
       <w:r>
         <w:t xml:space="preserve">) y la</w:t>
@@ -13593,7 +14368,7 @@
         <w:t xml:space="preserve"> </w:t>
       </w:r>
       <w:r>
-        <w:t xml:space="preserve">por diseño (visibilidad restringida,). El tablero de empresa completo es de</w:t>
+        <w:t xml:space="preserve">por diseño (visibilidad restringida). El tablero de empresa completo es de</w:t>
       </w:r>
       <w:r>
         <w:t xml:space="preserve"> </w:t>
@@ -13915,7 +14690,7 @@
         <w:t xml:space="preserve"> </w:t>
       </w:r>
       <w:r>
-        <w:t xml:space="preserve">(CU-24 Iniciar sesión,).</w:t>
+        <w:t xml:space="preserve">(CU-24 Iniciar sesión).</w:t>
       </w:r>
     </w:p>
     <w:bookmarkEnd w:id="275"/>
@@ -14992,6 +15767,18 @@
         <w:t xml:space="preserve">admin</w:t>
       </w:r>
       <w:r>
+        <w:t xml:space="preserve">,</w:t>
+      </w:r>
+      <w:r>
+        <w:t xml:space="preserve"> </w:t>
+      </w:r>
+      <w:r>
+        <w:rPr>
+          <w:rStyle w:val="VerbatimChar"/>
+        </w:rPr>
+        <w:t xml:space="preserve">dueño</w:t>
+      </w:r>
+      <w:r>
         <w:t xml:space="preserve"> </w:t>
       </w:r>
       <w:r>
@@ -15004,7 +15791,7 @@
         <w:rPr>
           <w:rStyle w:val="VerbatimChar"/>
         </w:rPr>
-        <w:t xml:space="preserve">dueño</w:t>
+        <w:t xml:space="preserve">freelance</w:t>
       </w:r>
       <w:r>
         <w:t xml:space="preserve">).</w:t>
@@ -15227,6 +16014,72 @@
       </w:r>
       <w:r>
         <w:t xml:space="preserve">→ toda la empresa (incluidas todas las Alertas), más configuración y reportes.</w:t>
+      </w:r>
+    </w:p>
+    <w:p>
+      <w:pPr>
+        <w:pStyle w:val="Compact"/>
+        <w:numPr>
+          <w:ilvl w:val="0"/>
+          <w:numId w:val="1160"/>
+        </w:numPr>
+      </w:pPr>
+      <w:r>
+        <w:rPr>
+          <w:rStyle w:val="VerbatimChar"/>
+        </w:rPr>
+        <w:t xml:space="preserve">freelance</w:t>
+      </w:r>
+      <w:r>
+        <w:t xml:space="preserve"> </w:t>
+      </w:r>
+      <w:r>
+        <w:t xml:space="preserve">→</w:t>
+      </w:r>
+      <w:r>
+        <w:t xml:space="preserve"> </w:t>
+      </w:r>
+      <w:r>
+        <w:rPr>
+          <w:b/>
+          <w:bCs/>
+        </w:rPr>
+        <w:t xml:space="preserve">solo lo suyo</w:t>
+      </w:r>
+      <w:r>
+        <w:t xml:space="preserve"> </w:t>
+      </w:r>
+      <w:r>
+        <w:t xml:space="preserve">(excepción al</w:t>
+      </w:r>
+      <w:r>
+        <w:t xml:space="preserve"> </w:t>
+      </w:r>
+      <w:r>
+        <w:rPr>
+          <w:i/>
+          <w:iCs/>
+        </w:rPr>
+        <w:t xml:space="preserve">lectura global</w:t>
+      </w:r>
+      <w:r>
+        <w:t xml:space="preserve">): ve y opera únicamente sus Clientes, Oportunidades, Viajes, Pagos y comisiones; ve el</w:t>
+      </w:r>
+      <w:r>
+        <w:t xml:space="preserve"> </w:t>
+      </w:r>
+      <w:r>
+        <w:rPr>
+          <w:b/>
+          <w:bCs/>
+        </w:rPr>
+        <w:t xml:space="preserve">catálogo compartido</w:t>
+      </w:r>
+      <w:r>
+        <w:t xml:space="preserve"> </w:t>
+      </w:r>
+      <w:r>
+        <w:t xml:space="preserve">(Hotel, Destino, Operador) y su agenda de Alertas propias. No accede a la información de toda la agencia.</w:t>
       </w:r>
     </w:p>
     <w:bookmarkEnd w:id="296"/>
@@ -15426,7 +16279,7 @@
         <w:t xml:space="preserve"> </w:t>
       </w:r>
       <w:r>
-        <w:t xml:space="preserve">y de la capacidad de acceso al módulo de redes (Actores,).</w:t>
+        <w:t xml:space="preserve">y de la capacidad de acceso al módulo de redes (Actores).</w:t>
       </w:r>
     </w:p>
     <w:bookmarkEnd w:id="302"/>
@@ -15573,10 +16426,7 @@
         <w:t xml:space="preserve">email</w:t>
       </w:r>
       <w:r>
-        <w:t xml:space="preserve"> </w:t>
-      </w:r>
-      <w:r>
-        <w:t xml:space="preserve">y</w:t>
+        <w:t xml:space="preserve">,</w:t>
       </w:r>
       <w:r>
         <w:t xml:space="preserve"> </w:t>
@@ -15630,7 +16480,38 @@
         <w:t xml:space="preserve">dueño</w:t>
       </w:r>
       <w:r>
-        <w:t xml:space="preserve">).</w:t>
+        <w:t xml:space="preserve"> </w:t>
+      </w:r>
+      <w:r>
+        <w:t xml:space="preserve">·</w:t>
+      </w:r>
+      <w:r>
+        <w:t xml:space="preserve"> </w:t>
+      </w:r>
+      <w:r>
+        <w:rPr>
+          <w:rStyle w:val="VerbatimChar"/>
+        </w:rPr>
+        <w:t xml:space="preserve">freelance</w:t>
+      </w:r>
+      <w:r>
+        <w:t xml:space="preserve">) y sus</w:t>
+      </w:r>
+      <w:r>
+        <w:t xml:space="preserve"> </w:t>
+      </w:r>
+      <w:r>
+        <w:rPr>
+          <w:b/>
+          <w:bCs/>
+        </w:rPr>
+        <w:t xml:space="preserve">credenciales de acceso</w:t>
+      </w:r>
+      <w:r>
+        <w:t xml:space="preserve"> </w:t>
+      </w:r>
+      <w:r>
+        <w:t xml:space="preserve">(usuario/contraseña individual).</w:t>
       </w:r>
     </w:p>
     <w:p>
@@ -15670,7 +16551,47 @@
         </w:numPr>
       </w:pPr>
       <w:r>
-        <w:t xml:space="preserve">El sistema valida y guarda el Usuario.</w:t>
+        <w:t xml:space="preserve">El sistema valida y guarda el Usuario. Si el rol es</w:t>
+      </w:r>
+      <w:r>
+        <w:t xml:space="preserve"> </w:t>
+      </w:r>
+      <w:r>
+        <w:rPr>
+          <w:rStyle w:val="VerbatimChar"/>
+        </w:rPr>
+        <w:t xml:space="preserve">freelance</w:t>
+      </w:r>
+      <w:r>
+        <w:t xml:space="preserve">, queda con</w:t>
+      </w:r>
+      <w:r>
+        <w:t xml:space="preserve"> </w:t>
+      </w:r>
+      <w:r>
+        <w:rPr>
+          <w:b/>
+          <w:bCs/>
+        </w:rPr>
+        <w:t xml:space="preserve">visibilidad restringida</w:t>
+      </w:r>
+      <w:r>
+        <w:t xml:space="preserve"> </w:t>
+      </w:r>
+      <w:r>
+        <w:t xml:space="preserve">(solo lo suyo); los Clientes que cree quedan con él como</w:t>
+      </w:r>
+      <w:r>
+        <w:t xml:space="preserve"> </w:t>
+      </w:r>
+      <w:r>
+        <w:rPr>
+          <w:rStyle w:val="VerbatimChar"/>
+        </w:rPr>
+        <w:t xml:space="preserve">asesor_asignado</w:t>
+      </w:r>
+      <w:r>
+        <w:t xml:space="preserve">.</w:t>
       </w:r>
     </w:p>
     <w:bookmarkEnd w:id="306"/>
@@ -16061,7 +16982,7 @@
         <w:t xml:space="preserve"> </w:t>
       </w:r>
       <w:r>
-        <w:t xml:space="preserve">(CU-24 Iniciar sesión,).</w:t>
+        <w:t xml:space="preserve">(CU-24 Iniciar sesión).</w:t>
       </w:r>
     </w:p>
     <w:bookmarkEnd w:id="315"/>
@@ -16636,7 +17557,7 @@
         </w:numPr>
       </w:pPr>
       <w:r>
-        <w:t xml:space="preserve">El sistema desactiva los Pagos</w:t>
+        <w:t xml:space="preserve">El sistema pasa los Pagos</w:t>
       </w:r>
       <w:r>
         <w:t xml:space="preserve"> </w:t>
@@ -16651,7 +17572,24 @@
         <w:t xml:space="preserve"> </w:t>
       </w:r>
       <w:r>
-        <w:t xml:space="preserve">del plan (dejan de ser exigibles) y</w:t>
+        <w:t xml:space="preserve">del plan a estado</w:t>
+      </w:r>
+      <w:r>
+        <w:t xml:space="preserve"> </w:t>
+      </w:r>
+      <w:r>
+        <w:rPr>
+          <w:rStyle w:val="VerbatimChar"/>
+          <w:b/>
+          <w:bCs/>
+        </w:rPr>
+        <w:t xml:space="preserve">anulado</w:t>
+      </w:r>
+      <w:r>
+        <w:t xml:space="preserve"> </w:t>
+      </w:r>
+      <w:r>
+        <w:t xml:space="preserve">(baja lógica: dejan de ser exigibles pero se conservan) y</w:t>
       </w:r>
       <w:r>
         <w:t xml:space="preserve"> </w:t>
@@ -16869,7 +17807,22 @@
         <w:t xml:space="preserve">cancelado</w:t>
       </w:r>
       <w:r>
-        <w:t xml:space="preserve">, con sus Pagos pendientes desactivados y sus Alertas cerradas, preservando el historial.</w:t>
+        <w:t xml:space="preserve">, con sus Pagos pendientes en estado</w:t>
+      </w:r>
+      <w:r>
+        <w:t xml:space="preserve"> </w:t>
+      </w:r>
+      <w:r>
+        <w:rPr>
+          <w:rStyle w:val="VerbatimChar"/>
+        </w:rPr>
+        <w:t xml:space="preserve">anulado</w:t>
+      </w:r>
+      <w:r>
+        <w:t xml:space="preserve"> </w:t>
+      </w:r>
+      <w:r>
+        <w:t xml:space="preserve">y sus Alertas cerradas, preservando el historial.</w:t>
       </w:r>
     </w:p>
     <w:bookmarkEnd w:id="328"/>
@@ -18593,7 +19546,7 @@
         <w:t xml:space="preserve"> </w:t>
       </w:r>
       <w:r>
-        <w:t xml:space="preserve">(CU-24 Iniciar sesión,).</w:t>
+        <w:t xml:space="preserve">(CU-24 Iniciar sesión).</w:t>
       </w:r>
     </w:p>
     <w:bookmarkEnd w:id="365"/>

</xml_diff>

<commit_message>
Limpiar y regenerar el entregable de casos de uso; cerrar pendientes
- CU fuente sin marcas internas (fechas, «a ratificar», Q6.1, EST-*)
  y sin frases cortadas por el filtro de DEC (CU-09, 10, 22, 24, 27,
  29); DOCX de casos de uso regenerado: 31 CU, 0 fugas.
- Vigencia de 1 mes de la Cotización validada con la agencia.
- CategoriaViaje cerrado: grupal · individual.
- Plan detallado hacia PC1 en Estado del proyecto; ARQ con datos
  corregidos (13 entidades, DEC-0005 sellada, rol freelance).
- DOCX de Requisitos y PNG de dominio regenerados.

Co-Authored-By: Claude Opus 5.5 <noreply@anthropic.com>
</commit_message>
<xml_diff>
--- a/07-Entregables/Casos de uso/Rumbo — Casos de uso.docx
+++ b/07-Entregables/Casos de uso/Rumbo — Casos de uso.docx
@@ -63,7 +63,7 @@
             <w:pStyle w:val="TOCHeading"/>
           </w:pPr>
           <w:r>
-            <w:t xml:space="preserve">Table of Contents</w:t>
+            <w:t xml:space="preserve">Índice</w:t>
           </w:r>
         </w:p>
         <w:p>
@@ -536,6 +536,14 @@
         <w:t xml:space="preserve">Actores</w:t>
       </w:r>
     </w:p>
+    <w:p>
+      <w:pPr>
+        <w:pStyle w:val="FirstParagraph"/>
+      </w:pPr>
+      <w:r>
+        <w:t xml:space="preserve">En una PyME una misma persona puede cubrir varios roles.</w:t>
+      </w:r>
+    </w:p>
     <w:bookmarkStart w:id="55" w:name="empleado-asesor-usuario-principal"/>
     <w:p>
       <w:pPr>
@@ -1101,13 +1109,35 @@
           <w:b/>
           <w:bCs/>
         </w:rPr>
+        <w:t xml:space="preserve">Cliente:</w:t>
+      </w:r>
+      <w:r>
+        <w:t xml:space="preserve"> </w:t>
+      </w:r>
+      <w:r>
+        <w:t xml:space="preserve">el empleado identifica al Cliente o, si es nuevo, crea su ficha (preferencias, segmento) (CU-02 Registrar cliente).</w:t>
+      </w:r>
+    </w:p>
+    <w:p>
+      <w:pPr>
+        <w:pStyle w:val="Compact"/>
+        <w:numPr>
+          <w:ilvl w:val="0"/>
+          <w:numId w:val="1005"/>
+        </w:numPr>
+      </w:pPr>
+      <w:r>
+        <w:rPr>
+          <w:b/>
+          <w:bCs/>
+        </w:rPr>
         <w:t xml:space="preserve">Consulta:</w:t>
       </w:r>
       <w:r>
         <w:t xml:space="preserve"> </w:t>
       </w:r>
       <w:r>
-        <w:t xml:space="preserve">el empleado registra el</w:t>
+        <w:t xml:space="preserve">registra el</w:t>
       </w:r>
       <w:r>
         <w:t xml:space="preserve"> </w:t>
@@ -1135,7 +1165,7 @@
         <w:t xml:space="preserve">nueva</w:t>
       </w:r>
       <w:r>
-        <w:t xml:space="preserve">, que pasa a</w:t>
+        <w:t xml:space="preserve">, ya asociada al Cliente, que pasa a</w:t>
       </w:r>
       <w:r>
         <w:t xml:space="preserve"> </w:t>
@@ -1166,13 +1196,28 @@
           <w:b/>
           <w:bCs/>
         </w:rPr>
-        <w:t xml:space="preserve">Cliente:</w:t>
-      </w:r>
-      <w:r>
-        <w:t xml:space="preserve"> </w:t>
-      </w:r>
-      <w:r>
-        <w:t xml:space="preserve">se identifica o se crea la ficha del Cliente (preferencias, segmento) (CU-02 Registrar cliente).</w:t>
+        <w:t xml:space="preserve">Cotización:</w:t>
+      </w:r>
+      <w:r>
+        <w:t xml:space="preserve"> </w:t>
+      </w:r>
+      <w:r>
+        <w:t xml:space="preserve">se genera la Cotización desde plantilla → documento; la Oportunidad pasa a</w:t>
+      </w:r>
+      <w:r>
+        <w:t xml:space="preserve"> </w:t>
+      </w:r>
+      <w:r>
+        <w:rPr>
+          <w:rStyle w:val="VerbatimChar"/>
+        </w:rPr>
+        <w:t xml:space="preserve">cotizada</w:t>
+      </w:r>
+      <w:r>
+        <w:t xml:space="preserve"> </w:t>
+      </w:r>
+      <w:r>
+        <w:t xml:space="preserve">(CU-06 Emitir cotización).</w:t>
       </w:r>
     </w:p>
     <w:p>
@@ -1188,50 +1233,13 @@
           <w:b/>
           <w:bCs/>
         </w:rPr>
-        <w:t xml:space="preserve">Cotización:</w:t>
-      </w:r>
-      <w:r>
-        <w:t xml:space="preserve"> </w:t>
-      </w:r>
-      <w:r>
-        <w:t xml:space="preserve">se genera la Cotización desde plantilla → documento; la Oportunidad pasa a</w:t>
-      </w:r>
-      <w:r>
-        <w:t xml:space="preserve"> </w:t>
-      </w:r>
-      <w:r>
-        <w:rPr>
-          <w:rStyle w:val="VerbatimChar"/>
-        </w:rPr>
-        <w:t xml:space="preserve">cotizada</w:t>
-      </w:r>
-      <w:r>
-        <w:t xml:space="preserve"> </w:t>
-      </w:r>
-      <w:r>
-        <w:t xml:space="preserve">(CU-06 Emitir cotización).</w:t>
-      </w:r>
-    </w:p>
-    <w:p>
-      <w:pPr>
-        <w:pStyle w:val="Compact"/>
-        <w:numPr>
-          <w:ilvl w:val="0"/>
-          <w:numId w:val="1005"/>
-        </w:numPr>
-      </w:pPr>
-      <w:r>
-        <w:rPr>
-          <w:b/>
-          <w:bCs/>
-        </w:rPr>
-        <w:t xml:space="preserve">Reserva:</w:t>
-      </w:r>
-      <w:r>
-        <w:t xml:space="preserve"> </w:t>
-      </w:r>
-      <w:r>
-        <w:t xml:space="preserve">al ganarse la Oportunidad se confirma el Viaje, que nace en estado</w:t>
+        <w:t xml:space="preserve">Reserva y seguimiento:</w:t>
+      </w:r>
+      <w:r>
+        <w:t xml:space="preserve"> </w:t>
+      </w:r>
+      <w:r>
+        <w:t xml:space="preserve">cuando el cliente acepta, se confirma el Viaje, que nace en estado</w:t>
       </w:r>
       <w:r>
         <w:t xml:space="preserve"> </w:t>
@@ -1363,17 +1371,29 @@
         <w:t xml:space="preserve"> </w:t>
       </w:r>
       <w:r>
-        <w:t xml:space="preserve">(Pago, CU-11 Definir plan de cuotas). Al cobrarse la</w:t>
-      </w:r>
-      <w:r>
-        <w:t xml:space="preserve"> </w:t>
-      </w:r>
-      <w:r>
-        <w:rPr>
-          <w:b/>
-          <w:bCs/>
-        </w:rPr>
-        <w:t xml:space="preserve">seña</w:t>
+        <w:t xml:space="preserve">(Pago, CU-11 Definir plan de cuotas). Al confirmar la reserva la Oportunidad queda</w:t>
+      </w:r>
+      <w:r>
+        <w:t xml:space="preserve"> </w:t>
+      </w:r>
+      <w:r>
+        <w:rPr>
+          <w:rStyle w:val="VerbatimChar"/>
+        </w:rPr>
+        <w:t xml:space="preserve">ganada</w:t>
+      </w:r>
+      <w:r>
+        <w:t xml:space="preserve">, y el sistema arma las alertas de seguimiento: las de formularios por destino (RequisitoDestino) y de próxima salida (CU-07 Confirmar reserva) y las de vencimiento de cada pago (CU-11 Definir plan de cuotas). Con el</w:t>
+      </w:r>
+      <w:r>
+        <w:t xml:space="preserve"> </w:t>
+      </w:r>
+      <w:r>
+        <w:rPr>
+          <w:b/>
+          <w:bCs/>
+        </w:rPr>
+        <w:t xml:space="preserve">primer cobro</w:t>
       </w:r>
       <w:r>
         <w:t xml:space="preserve"> </w:t>
@@ -1407,28 +1427,6 @@
       </w:r>
       <w:r>
         <w:t xml:space="preserve">(CU-12 Registrar cobro de un pago).</w:t>
-      </w:r>
-    </w:p>
-    <w:p>
-      <w:pPr>
-        <w:pStyle w:val="Compact"/>
-        <w:numPr>
-          <w:ilvl w:val="0"/>
-          <w:numId w:val="1005"/>
-        </w:numPr>
-      </w:pPr>
-      <w:r>
-        <w:rPr>
-          <w:b/>
-          <w:bCs/>
-        </w:rPr>
-        <w:t xml:space="preserve">Seguimiento:</w:t>
-      </w:r>
-      <w:r>
-        <w:t xml:space="preserve"> </w:t>
-      </w:r>
-      <w:r>
-        <w:t xml:space="preserve">el sistema arma alertas de pago, de formularios por destino (RequisitoDestino) y de próxima salida.</w:t>
       </w:r>
     </w:p>
     <w:p>
@@ -3496,7 +3494,7 @@
         </w:numPr>
       </w:pPr>
       <w:r>
-        <w:t xml:space="preserve">Existe una Oportunidad en estado</w:t>
+        <w:t xml:space="preserve">Existe una Oportunidad abierta, en estado</w:t>
       </w:r>
       <w:r>
         <w:t xml:space="preserve"> </w:t>
@@ -3506,6 +3504,18 @@
           <w:rStyle w:val="VerbatimChar"/>
         </w:rPr>
         <w:t xml:space="preserve">nueva</w:t>
+      </w:r>
+      <w:r>
+        <w:t xml:space="preserve">,</w:t>
+      </w:r>
+      <w:r>
+        <w:t xml:space="preserve"> </w:t>
+      </w:r>
+      <w:r>
+        <w:rPr>
+          <w:rStyle w:val="VerbatimChar"/>
+        </w:rPr>
+        <w:t xml:space="preserve">en_gestión</w:t>
       </w:r>
       <w:r>
         <w:t xml:space="preserve"> </w:t>
@@ -3709,7 +3719,23 @@
         <w:t xml:space="preserve"> </w:t>
       </w:r>
       <w:r>
-        <w:t xml:space="preserve">marca la Oportunidad como</w:t>
+        <w:t xml:space="preserve">cuando el cliente acepta, el empleado</w:t>
+      </w:r>
+      <w:r>
+        <w:t xml:space="preserve"> </w:t>
+      </w:r>
+      <w:r>
+        <w:rPr>
+          <w:b/>
+          <w:bCs/>
+        </w:rPr>
+        <w:t xml:space="preserve">confirma la reserva</w:t>
+      </w:r>
+      <w:r>
+        <w:t xml:space="preserve"> </w:t>
+      </w:r>
+      <w:r>
+        <w:t xml:space="preserve">en CU-07 Confirmar reserva, que cierra la Oportunidad como</w:t>
       </w:r>
       <w:r>
         <w:t xml:space="preserve"> </w:t>
@@ -3721,10 +3747,7 @@
         <w:t xml:space="preserve">ganada</w:t>
       </w:r>
       <w:r>
-        <w:t xml:space="preserve"> </w:t>
-      </w:r>
-      <w:r>
-        <w:t xml:space="preserve">(continúa en CU-07 Confirmar reserva) o</w:t>
+        <w:t xml:space="preserve">; si no hay acuerdo, la marca</w:t>
       </w:r>
       <w:r>
         <w:t xml:space="preserve"> </w:t>
@@ -3883,31 +3906,38 @@
         <w:t xml:space="preserve">Oportunidad</w:t>
       </w:r>
       <w:r>
-        <w:t xml:space="preserve"> </w:t>
-      </w:r>
-      <w:r>
-        <w:t xml:space="preserve">(vuelve a</w:t>
-      </w:r>
-      <w:r>
-        <w:t xml:space="preserve"> </w:t>
-      </w:r>
-      <w:r>
-        <w:rPr>
-          <w:rStyle w:val="VerbatimChar"/>
-        </w:rPr>
-        <w:t xml:space="preserve">nueva</w:t>
-      </w:r>
-      <w:r>
-        <w:t xml:space="preserve">/</w:t>
-      </w:r>
-      <w:r>
-        <w:rPr>
-          <w:rStyle w:val="VerbatimChar"/>
-        </w:rPr>
-        <w:t xml:space="preserve">cotizada</w:t>
-      </w:r>
-      <w:r>
-        <w:t xml:space="preserve">) o se registra una nueva (CU-04 Registrar consulta).</w:t>
+        <w:t xml:space="preserve">, que</w:t>
+      </w:r>
+      <w:r>
+        <w:t xml:space="preserve"> </w:t>
+      </w:r>
+      <w:r>
+        <w:rPr>
+          <w:b/>
+          <w:bCs/>
+        </w:rPr>
+        <w:t xml:space="preserve">vuelve a</w:t>
+      </w:r>
+      <w:r>
+        <w:rPr>
+          <w:b/>
+          <w:bCs/>
+        </w:rPr>
+        <w:t xml:space="preserve"> </w:t>
+      </w:r>
+      <w:r>
+        <w:rPr>
+          <w:rStyle w:val="VerbatimChar"/>
+          <w:b/>
+          <w:bCs/>
+        </w:rPr>
+        <w:t xml:space="preserve">en_gestión</w:t>
+      </w:r>
+      <w:r>
+        <w:t xml:space="preserve"> </w:t>
+      </w:r>
+      <w:r>
+        <w:t xml:space="preserve">(se la está volviendo a trabajar: ya no es una consulta sin atender, y la cotización vieja probablemente no sirva), o se registra una nueva (CU-04 Registrar consulta).</w:t>
       </w:r>
     </w:p>
     <w:p>
@@ -4407,7 +4437,50 @@
         <w:t xml:space="preserve"> </w:t>
       </w:r>
       <w:r>
-        <w:t xml:space="preserve">de la Cotización y la guarda en estado</w:t>
+        <w:t xml:space="preserve">de la Cotización, calcula su</w:t>
+      </w:r>
+      <w:r>
+        <w:t xml:space="preserve"> </w:t>
+      </w:r>
+      <w:r>
+        <w:rPr>
+          <w:rStyle w:val="VerbatimChar"/>
+        </w:rPr>
+        <w:t xml:space="preserve">validez_hasta</w:t>
+      </w:r>
+      <w:r>
+        <w:t xml:space="preserve"> </w:t>
+      </w:r>
+      <w:r>
+        <w:t xml:space="preserve">(por default</w:t>
+      </w:r>
+      <w:r>
+        <w:t xml:space="preserve"> </w:t>
+      </w:r>
+      <w:r>
+        <w:rPr>
+          <w:b/>
+          <w:bCs/>
+        </w:rPr>
+        <w:t xml:space="preserve">1 mes</w:t>
+      </w:r>
+      <w:r>
+        <w:t xml:space="preserve"> </w:t>
+      </w:r>
+      <w:r>
+        <w:t xml:space="preserve">desde la emisión, parámetro configurable por</w:t>
+      </w:r>
+      <w:r>
+        <w:t xml:space="preserve"> </w:t>
+      </w:r>
+      <w:r>
+        <w:rPr>
+          <w:rStyle w:val="VerbatimChar"/>
+        </w:rPr>
+        <w:t xml:space="preserve">admin</w:t>
+      </w:r>
+      <w:r>
+        <w:t xml:space="preserve">) y la guarda en estado</w:t>
       </w:r>
       <w:r>
         <w:t xml:space="preserve"> </w:t>
@@ -4649,6 +4722,130 @@
       </w:r>
       <w:r>
         <w:t xml:space="preserve">.</w:t>
+      </w:r>
+    </w:p>
+    <w:p>
+      <w:pPr>
+        <w:pStyle w:val="Compact"/>
+        <w:numPr>
+          <w:ilvl w:val="0"/>
+          <w:numId w:val="1041"/>
+        </w:numPr>
+      </w:pPr>
+      <w:r>
+        <w:rPr>
+          <w:b/>
+          <w:bCs/>
+        </w:rPr>
+        <w:t xml:space="preserve">A5 — Vencida:</w:t>
+      </w:r>
+      <w:r>
+        <w:t xml:space="preserve"> </w:t>
+      </w:r>
+      <w:r>
+        <w:t xml:space="preserve">pasa la</w:t>
+      </w:r>
+      <w:r>
+        <w:t xml:space="preserve"> </w:t>
+      </w:r>
+      <w:r>
+        <w:rPr>
+          <w:rStyle w:val="VerbatimChar"/>
+        </w:rPr>
+        <w:t xml:space="preserve">validez_hasta</w:t>
+      </w:r>
+      <w:r>
+        <w:t xml:space="preserve"> </w:t>
+      </w:r>
+      <w:r>
+        <w:t xml:space="preserve">sin respuesta del cliente → un</w:t>
+      </w:r>
+      <w:r>
+        <w:t xml:space="preserve"> </w:t>
+      </w:r>
+      <w:r>
+        <w:rPr>
+          <w:b/>
+          <w:bCs/>
+        </w:rPr>
+        <w:t xml:space="preserve">proceso automático</w:t>
+      </w:r>
+      <w:r>
+        <w:t xml:space="preserve"> </w:t>
+      </w:r>
+      <w:r>
+        <w:t xml:space="preserve">deja la Cotización en</w:t>
+      </w:r>
+      <w:r>
+        <w:t xml:space="preserve"> </w:t>
+      </w:r>
+      <w:r>
+        <w:rPr>
+          <w:rStyle w:val="VerbatimChar"/>
+        </w:rPr>
+        <w:t xml:space="preserve">vencida</w:t>
+      </w:r>
+      <w:r>
+        <w:t xml:space="preserve">. Los precios ya no se sostienen: para retomar hay que emitir una</w:t>
+      </w:r>
+      <w:r>
+        <w:t xml:space="preserve"> </w:t>
+      </w:r>
+      <w:r>
+        <w:rPr>
+          <w:b/>
+          <w:bCs/>
+        </w:rPr>
+        <w:t xml:space="preserve">cotización nueva</w:t>
+      </w:r>
+      <w:r>
+        <w:t xml:space="preserve">. Solo vencen las</w:t>
+      </w:r>
+      <w:r>
+        <w:t xml:space="preserve"> </w:t>
+      </w:r>
+      <w:r>
+        <w:rPr>
+          <w:rStyle w:val="VerbatimChar"/>
+        </w:rPr>
+        <w:t xml:space="preserve">enviada</w:t>
+      </w:r>
+      <w:r>
+        <w:t xml:space="preserve"> </w:t>
+      </w:r>
+      <w:r>
+        <w:t xml:space="preserve">(un</w:t>
+      </w:r>
+      <w:r>
+        <w:t xml:space="preserve"> </w:t>
+      </w:r>
+      <w:r>
+        <w:rPr>
+          <w:rStyle w:val="VerbatimChar"/>
+        </w:rPr>
+        <w:t xml:space="preserve">borrador</w:t>
+      </w:r>
+      <w:r>
+        <w:t xml:space="preserve"> </w:t>
+      </w:r>
+      <w:r>
+        <w:t xml:space="preserve">no vence). La Oportunidad</w:t>
+      </w:r>
+      <w:r>
+        <w:t xml:space="preserve"> </w:t>
+      </w:r>
+      <w:r>
+        <w:rPr>
+          <w:b/>
+          <w:bCs/>
+        </w:rPr>
+        <w:t xml:space="preserve">no</w:t>
+      </w:r>
+      <w:r>
+        <w:t xml:space="preserve"> </w:t>
+      </w:r>
+      <w:r>
+        <w:t xml:space="preserve">cambia de estado.</w:t>
       </w:r>
     </w:p>
     <w:p>
@@ -4983,7 +5180,22 @@
         </w:numPr>
       </w:pPr>
       <w:r>
-        <w:t xml:space="preserve">Existe una Oportunidad</w:t>
+        <w:t xml:space="preserve">Existe una Oportunidad abierta con una Cotización</w:t>
+      </w:r>
+      <w:r>
+        <w:t xml:space="preserve"> </w:t>
+      </w:r>
+      <w:r>
+        <w:rPr>
+          <w:rStyle w:val="VerbatimChar"/>
+        </w:rPr>
+        <w:t xml:space="preserve">aceptada</w:t>
+      </w:r>
+      <w:r>
+        <w:t xml:space="preserve"> </w:t>
+      </w:r>
+      <w:r>
+        <w:t xml:space="preserve">(CU-06 Emitir cotización), o una Oportunidad ya cerrada</w:t>
       </w:r>
       <w:r>
         <w:t xml:space="preserve"> </w:t>
@@ -4998,19 +5210,7 @@
         <w:t xml:space="preserve"> </w:t>
       </w:r>
       <w:r>
-        <w:t xml:space="preserve">(o una Cotización</w:t>
-      </w:r>
-      <w:r>
-        <w:t xml:space="preserve"> </w:t>
-      </w:r>
-      <w:r>
-        <w:rPr>
-          <w:rStyle w:val="VerbatimChar"/>
-        </w:rPr>
-        <w:t xml:space="preserve">aceptada</w:t>
-      </w:r>
-      <w:r>
-        <w:t xml:space="preserve">) para un Cliente (CU-05 Seguir oportunidad, CU-06 Emitir cotización).</w:t>
+        <w:t xml:space="preserve">por venta directa (CU-05 Seguir oportunidad A4).</w:t>
       </w:r>
     </w:p>
     <w:bookmarkEnd w:id="125"/>
@@ -5032,7 +5232,7 @@
         </w:numPr>
       </w:pPr>
       <w:r>
-        <w:t xml:space="preserve">Desde la Oportunidad ganada, el empleado elige</w:t>
+        <w:t xml:space="preserve">Desde la Oportunidad (con su Cotización aceptada), el empleado elige</w:t>
       </w:r>
       <w:r>
         <w:t xml:space="preserve"> </w:t>
@@ -5105,7 +5305,31 @@
         <w:t xml:space="preserve"> </w:t>
       </w:r>
       <w:r>
-        <w:t xml:space="preserve">(ej. salida grupal, individual) y</w:t>
+        <w:t xml:space="preserve">(</w:t>
+      </w:r>
+      <w:r>
+        <w:rPr>
+          <w:rStyle w:val="VerbatimChar"/>
+        </w:rPr>
+        <w:t xml:space="preserve">grupal</w:t>
+      </w:r>
+      <w:r>
+        <w:t xml:space="preserve"> </w:t>
+      </w:r>
+      <w:r>
+        <w:t xml:space="preserve">o</w:t>
+      </w:r>
+      <w:r>
+        <w:t xml:space="preserve"> </w:t>
+      </w:r>
+      <w:r>
+        <w:rPr>
+          <w:rStyle w:val="VerbatimChar"/>
+        </w:rPr>
+        <w:t xml:space="preserve">individual</w:t>
+      </w:r>
+      <w:r>
+        <w:t xml:space="preserve">) y</w:t>
       </w:r>
       <w:r>
         <w:t xml:space="preserve"> </w:t>
@@ -5145,7 +5369,38 @@
         <w:t xml:space="preserve">reservado</w:t>
       </w:r>
       <w:r>
-        <w:t xml:space="preserve">, asociado al Cliente y vinculado a la Oportunidad de origen.</w:t>
+        <w:t xml:space="preserve">, asociado al Cliente y vinculado a la Oportunidad de origen, y</w:t>
+      </w:r>
+      <w:r>
+        <w:t xml:space="preserve"> </w:t>
+      </w:r>
+      <w:r>
+        <w:rPr>
+          <w:b/>
+          <w:bCs/>
+        </w:rPr>
+        <w:t xml:space="preserve">cierra la Oportunidad como</w:t>
+      </w:r>
+      <w:r>
+        <w:rPr>
+          <w:b/>
+          <w:bCs/>
+        </w:rPr>
+        <w:t xml:space="preserve"> </w:t>
+      </w:r>
+      <w:r>
+        <w:rPr>
+          <w:rStyle w:val="VerbatimChar"/>
+          <w:b/>
+          <w:bCs/>
+        </w:rPr>
+        <w:t xml:space="preserve">ganada</w:t>
+      </w:r>
+      <w:r>
+        <w:t xml:space="preserve"> </w:t>
+      </w:r>
+      <w:r>
+        <w:t xml:space="preserve">si todavía no lo estaba.</w:t>
       </w:r>
     </w:p>
     <w:p>
@@ -5200,10 +5455,7 @@
         <w:t xml:space="preserve">configurable, default 7 días</w:t>
       </w:r>
       <w:r>
-        <w:t xml:space="preserve"> </w:t>
-      </w:r>
-      <w:r>
-        <w:t xml:space="preserve">valor a validar con la agencia).</w:t>
+        <w:t xml:space="preserve">).</w:t>
       </w:r>
     </w:p>
     <w:p>
@@ -5256,10 +5508,23 @@
         <w:t xml:space="preserve">plan de cuotas</w:t>
       </w:r>
       <w:r>
-        <w:t xml:space="preserve"> </w:t>
-      </w:r>
-      <w:r>
-        <w:t xml:space="preserve">con la seña (CU-11 Definir plan de cuotas); al cobrarse la seña (CU-12 Registrar cobro de un pago) el Viaje pasa a</w:t>
+        <w:t xml:space="preserve">, con o sin seña (CU-11 Definir plan de cuotas); con el</w:t>
+      </w:r>
+      <w:r>
+        <w:t xml:space="preserve"> </w:t>
+      </w:r>
+      <w:r>
+        <w:rPr>
+          <w:b/>
+          <w:bCs/>
+        </w:rPr>
+        <w:t xml:space="preserve">primer cobro</w:t>
+      </w:r>
+      <w:r>
+        <w:t xml:space="preserve"> </w:t>
+      </w:r>
+      <w:r>
+        <w:t xml:space="preserve">(CU-12 Registrar cobro de un pago A0) el Viaje pasa a</w:t>
       </w:r>
       <w:r>
         <w:t xml:space="preserve"> </w:t>
@@ -5430,7 +5695,7 @@
         <w:t xml:space="preserve"> </w:t>
       </w:r>
       <w:r>
-        <w:t xml:space="preserve">al cobrarse la seña (CU-12 Registrar cobro de un pago).</w:t>
+        <w:t xml:space="preserve">con el primer cobro (CU-12 Registrar cobro de un pago A0).</w:t>
       </w:r>
     </w:p>
     <w:p>
@@ -5457,7 +5722,23 @@
         <w:t xml:space="preserve"> </w:t>
       </w:r>
       <w:r>
-        <w:t xml:space="preserve">y cerrada.</w:t>
+        <w:t xml:space="preserve">y cerrada:</w:t>
+      </w:r>
+      <w:r>
+        <w:t xml:space="preserve"> </w:t>
+      </w:r>
+      <w:r>
+        <w:rPr>
+          <w:b/>
+          <w:bCs/>
+        </w:rPr>
+        <w:t xml:space="preserve">la cierra este CU</w:t>
+      </w:r>
+      <w:r>
+        <w:t xml:space="preserve"> </w:t>
+      </w:r>
+      <w:r>
+        <w:t xml:space="preserve">al confirmar la reserva.</w:t>
       </w:r>
     </w:p>
     <w:bookmarkEnd w:id="128"/>
@@ -5789,10 +6070,13 @@
           <w:b/>
           <w:bCs/>
         </w:rPr>
-        <w:t xml:space="preserve">cobro de la seña</w:t>
-      </w:r>
-      <w:r>
-        <w:t xml:space="preserve">;</w:t>
+        <w:t xml:space="preserve">primer cobro</w:t>
+      </w:r>
+      <w:r>
+        <w:t xml:space="preserve"> </w:t>
+      </w:r>
+      <w:r>
+        <w:t xml:space="preserve">del viaje, sea la seña, una cuota o el pago único;</w:t>
       </w:r>
       <w:r>
         <w:t xml:space="preserve"> </w:t>
@@ -5878,7 +6162,24 @@
         <w:t xml:space="preserve"> </w:t>
       </w:r>
       <w:r>
-        <w:t xml:space="preserve">el cambio según las fechas de salida/regreso, pero</w:t>
+        <w:t xml:space="preserve">el cambio según las fechas de salida/regreso con una Alerta de tipo</w:t>
+      </w:r>
+      <w:r>
+        <w:t xml:space="preserve"> </w:t>
+      </w:r>
+      <w:r>
+        <w:rPr>
+          <w:rStyle w:val="VerbatimChar"/>
+          <w:b/>
+          <w:bCs/>
+        </w:rPr>
+        <w:t xml:space="preserve">viaje</w:t>
+      </w:r>
+      <w:r>
+        <w:t xml:space="preserve"> </w:t>
+      </w:r>
+      <w:r>
+        <w:t xml:space="preserve">que le llega al responsable del Viaje el día de salida y el de regreso (CU-14 Ver y atender alertas del día);</w:t>
       </w:r>
       <w:r>
         <w:t xml:space="preserve"> </w:t>
@@ -6255,7 +6556,7 @@
         <w:t xml:space="preserve"> </w:t>
       </w:r>
       <w:r>
-        <w:t xml:space="preserve">= aceptó la cotización (sin seña);</w:t>
+        <w:t xml:space="preserve">= aceptó la cotización (sin cobros);</w:t>
       </w:r>
       <w:r>
         <w:t xml:space="preserve"> </w:t>
@@ -6270,7 +6571,7 @@
         <w:t xml:space="preserve"> </w:t>
       </w:r>
       <w:r>
-        <w:t xml:space="preserve">= seña cobrada;</w:t>
+        <w:t xml:space="preserve">= primer cobro registrado (la seña, si el plan la tiene);</w:t>
       </w:r>
       <w:r>
         <w:t xml:space="preserve"> </w:t>
@@ -6298,7 +6599,7 @@
         <w:t xml:space="preserve">total pagado</w:t>
       </w:r>
       <w:r>
-        <w:t xml:space="preserve">. Las dos primeras transiciones las dispara CU-12 Registrar cobro de un pago (seña y saldo).</w:t>
+        <w:t xml:space="preserve">. Las dos primeras transiciones las dispara CU-12 Registrar cobro de un pago (primer cobro y saldo).</w:t>
       </w:r>
     </w:p>
     <w:p>
@@ -6704,6 +7005,107 @@
           <w:b/>
           <w:bCs/>
         </w:rPr>
+        <w:t xml:space="preserve">A5 — Hotel repetido en tramos no consecutivos:</w:t>
+      </w:r>
+      <w:r>
+        <w:t xml:space="preserve"> </w:t>
+      </w:r>
+      <w:r>
+        <w:t xml:space="preserve">el mismo Hotel puede agregarse en</w:t>
+      </w:r>
+      <w:r>
+        <w:t xml:space="preserve"> </w:t>
+      </w:r>
+      <w:r>
+        <w:rPr>
+          <w:b/>
+          <w:bCs/>
+        </w:rPr>
+        <w:t xml:space="preserve">más de un tramo</w:t>
+      </w:r>
+      <w:r>
+        <w:t xml:space="preserve"> </w:t>
+      </w:r>
+      <w:r>
+        <w:t xml:space="preserve">del itinerario (ej. Buenos Aires → Bariloche → Buenos Aires, con el mismo hotel porteño en ida y vuelta); cada tramo es una fila propia de</w:t>
+      </w:r>
+      <w:r>
+        <w:t xml:space="preserve"> </w:t>
+      </w:r>
+      <w:r>
+        <w:rPr>
+          <w:rStyle w:val="VerbatimChar"/>
+        </w:rPr>
+        <w:t xml:space="preserve">viaje_hotel</w:t>
+      </w:r>
+      <w:r>
+        <w:t xml:space="preserve"> </w:t>
+      </w:r>
+      <w:r>
+        <w:t xml:space="preserve">con su propio</w:t>
+      </w:r>
+      <w:r>
+        <w:t xml:space="preserve"> </w:t>
+      </w:r>
+      <w:r>
+        <w:rPr>
+          <w:rStyle w:val="VerbatimChar"/>
+        </w:rPr>
+        <w:t xml:space="preserve">check_in</w:t>
+      </w:r>
+      <w:r>
+        <w:t xml:space="preserve">/</w:t>
+      </w:r>
+      <w:r>
+        <w:rPr>
+          <w:rStyle w:val="VerbatimChar"/>
+        </w:rPr>
+        <w:t xml:space="preserve">check_out</w:t>
+      </w:r>
+      <w:r>
+        <w:t xml:space="preserve">,</w:t>
+      </w:r>
+      <w:r>
+        <w:t xml:space="preserve"> </w:t>
+      </w:r>
+      <w:r>
+        <w:rPr>
+          <w:rStyle w:val="VerbatimChar"/>
+        </w:rPr>
+        <w:t xml:space="preserve">orden</w:t>
+      </w:r>
+      <w:r>
+        <w:t xml:space="preserve"> </w:t>
+      </w:r>
+      <w:r>
+        <w:t xml:space="preserve">y, si corresponde, su propio</w:t>
+      </w:r>
+      <w:r>
+        <w:t xml:space="preserve"> </w:t>
+      </w:r>
+      <w:r>
+        <w:rPr>
+          <w:rStyle w:val="VerbatimChar"/>
+        </w:rPr>
+        <w:t xml:space="preserve">vencimiento_pago_proveedor</w:t>
+      </w:r>
+      <w:r>
+        <w:t xml:space="preserve">.</w:t>
+      </w:r>
+    </w:p>
+    <w:p>
+      <w:pPr>
+        <w:pStyle w:val="Compact"/>
+        <w:numPr>
+          <w:ilvl w:val="0"/>
+          <w:numId w:val="1060"/>
+        </w:numPr>
+      </w:pPr>
+      <w:r>
+        <w:rPr>
+          <w:b/>
+          <w:bCs/>
+        </w:rPr>
         <w:t xml:space="preserve">A2 — Hotel fuera del catálogo:</w:t>
       </w:r>
       <w:r>
@@ -6852,6 +7254,34 @@
       <w:r>
         <w:rPr>
           <w:rStyle w:val="VerbatimChar"/>
+          <w:b/>
+          <w:bCs/>
+        </w:rPr>
+        <w:t xml:space="preserve">id</w:t>
+      </w:r>
+      <w:r>
+        <w:rPr>
+          <w:b/>
+          <w:bCs/>
+        </w:rPr>
+        <w:t xml:space="preserve"> </w:t>
+      </w:r>
+      <w:r>
+        <w:rPr>
+          <w:b/>
+          <w:bCs/>
+        </w:rPr>
+        <w:t xml:space="preserve">propio</w:t>
+      </w:r>
+      <w:r>
+        <w:t xml:space="preserve">,</w:t>
+      </w:r>
+      <w:r>
+        <w:t xml:space="preserve"> </w:t>
+      </w:r>
+      <w:r>
+        <w:rPr>
+          <w:rStyle w:val="VerbatimChar"/>
         </w:rPr>
         <w:t xml:space="preserve">check_in</w:t>
       </w:r>
@@ -6904,7 +7334,22 @@
         <w:t xml:space="preserve">pago_proveedor_realizado</w:t>
       </w:r>
       <w:r>
-        <w:t xml:space="preserve">) —.</w:t>
+        <w:t xml:space="preserve">). Lleva</w:t>
+      </w:r>
+      <w:r>
+        <w:t xml:space="preserve"> </w:t>
+      </w:r>
+      <w:r>
+        <w:rPr>
+          <w:rStyle w:val="VerbatimChar"/>
+        </w:rPr>
+        <w:t xml:space="preserve">id</w:t>
+      </w:r>
+      <w:r>
+        <w:t xml:space="preserve"> </w:t>
+      </w:r>
+      <w:r>
+        <w:t xml:space="preserve">propio (no PK compuesta) porque un mismo hotel puede figurar en varios tramos del mismo viaje (A5).</w:t>
       </w:r>
     </w:p>
     <w:p>
@@ -7057,7 +7502,7 @@
         <w:t xml:space="preserve">margen %</w:t>
       </w:r>
       <w:r>
-        <w:t xml:space="preserve">. Ver RN-01 Comisión automática y.</w:t>
+        <w:t xml:space="preserve">. Ver RN-01 Comisión automática.</w:t>
       </w:r>
     </w:p>
     <w:bookmarkEnd w:id="152"/>
@@ -7119,19 +7564,22 @@
         </w:numPr>
       </w:pPr>
       <w:r>
-        <w:t xml:space="preserve">Existe el Viaje (creado/</w:t>
-      </w:r>
-      <w:r>
-        <w:rPr>
-          <w:rStyle w:val="VerbatimChar"/>
-        </w:rPr>
-        <w:t xml:space="preserve">vendido</w:t>
-      </w:r>
-      <w:r>
-        <w:t xml:space="preserve"> </w:t>
-      </w:r>
-      <w:r>
-        <w:t xml:space="preserve">en CU-07 Confirmar reserva).</w:t>
+        <w:t xml:space="preserve">Existe el Viaje, creado en estado</w:t>
+      </w:r>
+      <w:r>
+        <w:t xml:space="preserve"> </w:t>
+      </w:r>
+      <w:r>
+        <w:rPr>
+          <w:rStyle w:val="VerbatimChar"/>
+        </w:rPr>
+        <w:t xml:space="preserve">reservado</w:t>
+      </w:r>
+      <w:r>
+        <w:t xml:space="preserve"> </w:t>
+      </w:r>
+      <w:r>
+        <w:t xml:space="preserve">por CU-07 Confirmar reserva (la economía se carga antes del primer cobro).</w:t>
       </w:r>
     </w:p>
     <w:p>
@@ -8255,10 +8703,23 @@
         <w:t xml:space="preserve"> </w:t>
       </w:r>
       <w:r>
-        <w:t xml:space="preserve">mientras un Pago siga</w:t>
-      </w:r>
-      <w:r>
-        <w:t xml:space="preserve"> </w:t>
+        <w:t xml:space="preserve">mientras un Pago</w:t>
+      </w:r>
+      <w:r>
+        <w:t xml:space="preserve"> </w:t>
+      </w:r>
+      <w:r>
+        <w:rPr>
+          <w:b/>
+          <w:bCs/>
+        </w:rPr>
+        <w:t xml:space="preserve">no esté cobrado ni anulado</w:t>
+      </w:r>
+      <w:r>
+        <w:t xml:space="preserve"> </w:t>
+      </w:r>
+      <w:r>
+        <w:t xml:space="preserve">(</w:t>
       </w:r>
       <w:r>
         <w:rPr>
@@ -8267,7 +8728,49 @@
         <w:t xml:space="preserve">pendiente</w:t>
       </w:r>
       <w:r>
-        <w:t xml:space="preserve">, se pueden editar monto o vencimiento; el sistema reagenda su Alerta.</w:t>
+        <w:t xml:space="preserve"> </w:t>
+      </w:r>
+      <w:r>
+        <w:t xml:space="preserve">o</w:t>
+      </w:r>
+      <w:r>
+        <w:t xml:space="preserve"> </w:t>
+      </w:r>
+      <w:r>
+        <w:rPr>
+          <w:rStyle w:val="VerbatimChar"/>
+        </w:rPr>
+        <w:t xml:space="preserve">vencido</w:t>
+      </w:r>
+      <w:r>
+        <w:t xml:space="preserve">), se pueden editar monto o vencimiento; el sistema reagenda su Alerta. Si estaba</w:t>
+      </w:r>
+      <w:r>
+        <w:t xml:space="preserve"> </w:t>
+      </w:r>
+      <w:r>
+        <w:rPr>
+          <w:rStyle w:val="VerbatimChar"/>
+        </w:rPr>
+        <w:t xml:space="preserve">vencido</w:t>
+      </w:r>
+      <w:r>
+        <w:t xml:space="preserve"> </w:t>
+      </w:r>
+      <w:r>
+        <w:t xml:space="preserve">y la fecha nueva es futura, vuelve a</w:t>
+      </w:r>
+      <w:r>
+        <w:t xml:space="preserve"> </w:t>
+      </w:r>
+      <w:r>
+        <w:rPr>
+          <w:rStyle w:val="VerbatimChar"/>
+        </w:rPr>
+        <w:t xml:space="preserve">pendiente</w:t>
+      </w:r>
+      <w:r>
+        <w:t xml:space="preserve">.</w:t>
       </w:r>
     </w:p>
     <w:p>
@@ -8289,7 +8792,23 @@
         <w:t xml:space="preserve"> </w:t>
       </w:r>
       <w:r>
-        <w:t xml:space="preserve">mientras esté</w:t>
+        <w:t xml:space="preserve">mientras</w:t>
+      </w:r>
+      <w:r>
+        <w:t xml:space="preserve"> </w:t>
+      </w:r>
+      <w:r>
+        <w:rPr>
+          <w:b/>
+          <w:bCs/>
+        </w:rPr>
+        <w:t xml:space="preserve">no esté cobrado</w:t>
+      </w:r>
+      <w:r>
+        <w:t xml:space="preserve"> </w:t>
+      </w:r>
+      <w:r>
+        <w:t xml:space="preserve">(es decir,</w:t>
       </w:r>
       <w:r>
         <w:t xml:space="preserve"> </w:t>
@@ -8301,7 +8820,26 @@
         <w:t xml:space="preserve">pendiente</w:t>
       </w:r>
       <w:r>
-        <w:t xml:space="preserve">, el empleado anula un Pago del plan (cambió el esquema); el sistema lo pasa a estado</w:t>
+        <w:t xml:space="preserve"> </w:t>
+      </w:r>
+      <w:r>
+        <w:rPr>
+          <w:b/>
+          <w:bCs/>
+        </w:rPr>
+        <w:t xml:space="preserve">o</w:t>
+      </w:r>
+      <w:r>
+        <w:t xml:space="preserve"> </w:t>
+      </w:r>
+      <w:r>
+        <w:rPr>
+          <w:rStyle w:val="VerbatimChar"/>
+        </w:rPr>
+        <w:t xml:space="preserve">vencido</w:t>
+      </w:r>
+      <w:r>
+        <w:t xml:space="preserve">), el empleado anula un Pago del plan (cambió el esquema); el sistema lo pasa a estado</w:t>
       </w:r>
       <w:r>
         <w:t xml:space="preserve"> </w:t>
@@ -8405,6 +8943,70 @@
       </w:r>
       <w:r>
         <w:t xml:space="preserve">.</w:t>
+      </w:r>
+    </w:p>
+    <w:p>
+      <w:pPr>
+        <w:pStyle w:val="Compact"/>
+        <w:numPr>
+          <w:ilvl w:val="0"/>
+          <w:numId w:val="1074"/>
+        </w:numPr>
+      </w:pPr>
+      <w:r>
+        <w:rPr>
+          <w:b/>
+          <w:bCs/>
+        </w:rPr>
+        <w:t xml:space="preserve">A6 — Dividir una cuota (pago parcial):</w:t>
+      </w:r>
+      <w:r>
+        <w:t xml:space="preserve"> </w:t>
+      </w:r>
+      <w:r>
+        <w:t xml:space="preserve">si el cliente va a pagar solo una parte de un Pago</w:t>
+      </w:r>
+      <w:r>
+        <w:t xml:space="preserve"> </w:t>
+      </w:r>
+      <w:r>
+        <w:rPr>
+          <w:rStyle w:val="VerbatimChar"/>
+        </w:rPr>
+        <w:t xml:space="preserve">pendiente</w:t>
+      </w:r>
+      <w:r>
+        <w:t xml:space="preserve"> </w:t>
+      </w:r>
+      <w:r>
+        <w:t xml:space="preserve">o</w:t>
+      </w:r>
+      <w:r>
+        <w:t xml:space="preserve"> </w:t>
+      </w:r>
+      <w:r>
+        <w:rPr>
+          <w:rStyle w:val="VerbatimChar"/>
+        </w:rPr>
+        <w:t xml:space="preserve">vencido</w:t>
+      </w:r>
+      <w:r>
+        <w:t xml:space="preserve">, el empleado lo divide en dos: uno por el importe que se cobra ahora y otro por el resto, con su propio vencimiento. Se sigue cumpliendo</w:t>
+      </w:r>
+      <w:r>
+        <w:t xml:space="preserve"> </w:t>
+      </w:r>
+      <w:r>
+        <w:rPr>
+          <w:rStyle w:val="VerbatimChar"/>
+        </w:rPr>
+        <w:t xml:space="preserve">Σ montos = precioVenta</w:t>
+      </w:r>
+      <w:r>
+        <w:t xml:space="preserve"> </w:t>
+      </w:r>
+      <w:r>
+        <w:t xml:space="preserve">y el sistema agenda la Alerta del pago nuevo. Después se cobra el primero en CU-12 Registrar cobro de un pago (el Pago es indivisible).</w:t>
       </w:r>
     </w:p>
     <w:bookmarkEnd w:id="167"/>
@@ -8520,7 +9122,7 @@
           <w:b/>
           <w:bCs/>
         </w:rPr>
-        <w:t xml:space="preserve">Multimoneda (Q6.1):</w:t>
+        <w:t xml:space="preserve">Multimoneda:</w:t>
       </w:r>
       <w:r>
         <w:t xml:space="preserve"> </w:t>
@@ -8786,7 +9388,7 @@
         <w:t xml:space="preserve">forma_pago</w:t>
       </w:r>
       <w:r>
-        <w:t xml:space="preserve">: efectivo · transferencia · tarjeta · cheque · depósito) y la</w:t>
+        <w:t xml:space="preserve">: efectivo · transferencia —incluye billeteras virtuales— · tarjeta de crédito · tarjeta de débito · cheque · depósito) y la</w:t>
       </w:r>
       <w:r>
         <w:t xml:space="preserve"> </w:t>
@@ -9046,29 +9648,13 @@
           <w:b/>
           <w:bCs/>
         </w:rPr>
-        <w:t xml:space="preserve">A0 — Cobro de la seña:</w:t>
-      </w:r>
-      <w:r>
-        <w:t xml:space="preserve"> </w:t>
-      </w:r>
-      <w:r>
-        <w:t xml:space="preserve">si el Pago cobrado es la</w:t>
-      </w:r>
-      <w:r>
-        <w:t xml:space="preserve"> </w:t>
-      </w:r>
-      <w:r>
-        <w:rPr>
-          <w:b/>
-          <w:bCs/>
-        </w:rPr>
-        <w:t xml:space="preserve">seña</w:t>
-      </w:r>
-      <w:r>
-        <w:t xml:space="preserve"> </w:t>
-      </w:r>
-      <w:r>
-        <w:t xml:space="preserve">y el Viaje estaba</w:t>
+        <w:t xml:space="preserve">A0 — Primer cobro del viaje:</w:t>
+      </w:r>
+      <w:r>
+        <w:t xml:space="preserve"> </w:t>
+      </w:r>
+      <w:r>
+        <w:t xml:space="preserve">si el Viaje estaba</w:t>
       </w:r>
       <w:r>
         <w:t xml:space="preserve"> </w:t>
@@ -9080,7 +9666,23 @@
         <w:t xml:space="preserve">reservado</w:t>
       </w:r>
       <w:r>
-        <w:t xml:space="preserve">, pasa a</w:t>
+        <w:t xml:space="preserve">, el</w:t>
+      </w:r>
+      <w:r>
+        <w:t xml:space="preserve"> </w:t>
+      </w:r>
+      <w:r>
+        <w:rPr>
+          <w:b/>
+          <w:bCs/>
+        </w:rPr>
+        <w:t xml:space="preserve">primer cobro, de cualquier tipo</w:t>
+      </w:r>
+      <w:r>
+        <w:t xml:space="preserve"> </w:t>
+      </w:r>
+      <w:r>
+        <w:t xml:space="preserve">(seña, cuota o pago único), lo pasa a</w:t>
       </w:r>
       <w:r>
         <w:t xml:space="preserve"> </w:t>
@@ -9097,7 +9699,62 @@
         <w:t xml:space="preserve"> </w:t>
       </w:r>
       <w:r>
-        <w:t xml:space="preserve">(CU-08 Gestionar estado del viaje).</w:t>
+        <w:t xml:space="preserve">(CU-08 Gestionar estado del viaje). Así un plan</w:t>
+      </w:r>
+      <w:r>
+        <w:t xml:space="preserve"> </w:t>
+      </w:r>
+      <w:r>
+        <w:rPr>
+          <w:b/>
+          <w:bCs/>
+        </w:rPr>
+        <w:t xml:space="preserve">sin seña</w:t>
+      </w:r>
+      <w:r>
+        <w:t xml:space="preserve"> </w:t>
+      </w:r>
+      <w:r>
+        <w:t xml:space="preserve">(pago único, CU-11 Definir plan de cuotas A2) no deja el viaje trabado en</w:t>
+      </w:r>
+      <w:r>
+        <w:t xml:space="preserve"> </w:t>
+      </w:r>
+      <w:r>
+        <w:rPr>
+          <w:rStyle w:val="VerbatimChar"/>
+        </w:rPr>
+        <w:t xml:space="preserve">reservado</w:t>
+      </w:r>
+      <w:r>
+        <w:t xml:space="preserve">. Si con ese mismo cobro el saldo llega a cero, en la misma operación sigue a</w:t>
+      </w:r>
+      <w:r>
+        <w:t xml:space="preserve"> </w:t>
+      </w:r>
+      <w:r>
+        <w:rPr>
+          <w:rStyle w:val="VerbatimChar"/>
+        </w:rPr>
+        <w:t xml:space="preserve">confirmado</w:t>
+      </w:r>
+      <w:r>
+        <w:t xml:space="preserve"> </w:t>
+      </w:r>
+      <w:r>
+        <w:t xml:space="preserve">(A2): la secuencia se respeta, no se saltea</w:t>
+      </w:r>
+      <w:r>
+        <w:t xml:space="preserve"> </w:t>
+      </w:r>
+      <w:r>
+        <w:rPr>
+          <w:rStyle w:val="VerbatimChar"/>
+        </w:rPr>
+        <w:t xml:space="preserve">vendido</w:t>
+      </w:r>
+      <w:r>
+        <w:t xml:space="preserve">.</w:t>
       </w:r>
     </w:p>
     <w:p>
@@ -9222,6 +9879,51 @@
           <w:rStyle w:val="VerbatimChar"/>
         </w:rPr>
         <w:t xml:space="preserve">vendido</w:t>
+      </w:r>
+      <w:r>
+        <w:t xml:space="preserve">. Si ese era el</w:t>
+      </w:r>
+      <w:r>
+        <w:t xml:space="preserve"> </w:t>
+      </w:r>
+      <w:r>
+        <w:rPr>
+          <w:b/>
+          <w:bCs/>
+        </w:rPr>
+        <w:t xml:space="preserve">único cobro</w:t>
+      </w:r>
+      <w:r>
+        <w:t xml:space="preserve"> </w:t>
+      </w:r>
+      <w:r>
+        <w:t xml:space="preserve">del viaje (el que lo había pasado a</w:t>
+      </w:r>
+      <w:r>
+        <w:t xml:space="preserve"> </w:t>
+      </w:r>
+      <w:r>
+        <w:rPr>
+          <w:rStyle w:val="VerbatimChar"/>
+        </w:rPr>
+        <w:t xml:space="preserve">vendido</w:t>
+      </w:r>
+      <w:r>
+        <w:t xml:space="preserve"> </w:t>
+      </w:r>
+      <w:r>
+        <w:t xml:space="preserve">en A0), el Viaje vuelve a</w:t>
+      </w:r>
+      <w:r>
+        <w:t xml:space="preserve"> </w:t>
+      </w:r>
+      <w:r>
+        <w:rPr>
+          <w:rStyle w:val="VerbatimChar"/>
+          <w:b/>
+          <w:bCs/>
+        </w:rPr>
+        <w:t xml:space="preserve">reservado</w:t>
       </w:r>
       <w:r>
         <w:t xml:space="preserve">.</w:t>
@@ -9296,7 +9998,87 @@
           <w:b/>
           <w:bCs/>
         </w:rPr>
-        <w:t xml:space="preserve">Multimoneda por cobro (Q6.1):</w:t>
+        <w:t xml:space="preserve">El Pago es indivisible:</w:t>
+      </w:r>
+      <w:r>
+        <w:t xml:space="preserve"> </w:t>
+      </w:r>
+      <w:r>
+        <w:t xml:space="preserve">se cobra completo, sin cobros parciales. Si el cliente paga solo una parte de una cuota, antes de cobrar se</w:t>
+      </w:r>
+      <w:r>
+        <w:t xml:space="preserve"> </w:t>
+      </w:r>
+      <w:r>
+        <w:rPr>
+          <w:b/>
+          <w:bCs/>
+        </w:rPr>
+        <w:t xml:space="preserve">divide la cuota en dos</w:t>
+      </w:r>
+      <w:r>
+        <w:t xml:space="preserve"> </w:t>
+      </w:r>
+      <w:r>
+        <w:t xml:space="preserve">en CU-11 Definir plan de cuotas A6 y se cobra la parte que corresponde. Si por el tipo de cambio el importe real difiere del planificado, la diferencia queda registrada en</w:t>
+      </w:r>
+      <w:r>
+        <w:t xml:space="preserve"> </w:t>
+      </w:r>
+      <w:r>
+        <w:rPr>
+          <w:rStyle w:val="VerbatimChar"/>
+        </w:rPr>
+        <w:t xml:space="preserve">monto_cobrado</w:t>
+      </w:r>
+      <w:r>
+        <w:t xml:space="preserve"> </w:t>
+      </w:r>
+      <w:r>
+        <w:t xml:space="preserve">y</w:t>
+      </w:r>
+      <w:r>
+        <w:t xml:space="preserve"> </w:t>
+      </w:r>
+      <w:r>
+        <w:rPr>
+          <w:rStyle w:val="VerbatimChar"/>
+        </w:rPr>
+        <w:t xml:space="preserve">tipo_cambio</w:t>
+      </w:r>
+      <w:r>
+        <w:t xml:space="preserve">; el saldo se sigue calculando sobre los</w:t>
+      </w:r>
+      <w:r>
+        <w:t xml:space="preserve"> </w:t>
+      </w:r>
+      <w:r>
+        <w:rPr>
+          <w:rStyle w:val="VerbatimChar"/>
+        </w:rPr>
+        <w:t xml:space="preserve">monto</w:t>
+      </w:r>
+      <w:r>
+        <w:t xml:space="preserve"> </w:t>
+      </w:r>
+      <w:r>
+        <w:t xml:space="preserve">planificados.</w:t>
+      </w:r>
+    </w:p>
+    <w:p>
+      <w:pPr>
+        <w:pStyle w:val="Compact"/>
+        <w:numPr>
+          <w:ilvl w:val="0"/>
+          <w:numId w:val="1082"/>
+        </w:numPr>
+      </w:pPr>
+      <w:r>
+        <w:rPr>
+          <w:b/>
+          <w:bCs/>
+        </w:rPr>
+        <w:t xml:space="preserve">Multimoneda por cobro:</w:t>
       </w:r>
       <w:r>
         <w:t xml:space="preserve"> </w:t>
@@ -9368,7 +10150,19 @@
         <w:t xml:space="preserve"> </w:t>
       </w:r>
       <w:r>
-        <w:t xml:space="preserve">capturada al cobrar; alimenta el reporte de</w:t>
+        <w:t xml:space="preserve">capturada al cobrar (las billeteras virtuales se registran como</w:t>
+      </w:r>
+      <w:r>
+        <w:t xml:space="preserve"> </w:t>
+      </w:r>
+      <w:r>
+        <w:rPr>
+          <w:rStyle w:val="VerbatimChar"/>
+        </w:rPr>
+        <w:t xml:space="preserve">transferencia</w:t>
+      </w:r>
+      <w:r>
+        <w:t xml:space="preserve">); alimenta el reporte de</w:t>
       </w:r>
       <w:r>
         <w:t xml:space="preserve"> </w:t>
@@ -9491,42 +10285,6 @@
         <w:t xml:space="preserve">(CU-10 Registrar economía del viaje). No configura la rentabilidad de la agencia (ganancia/margen se calculan solos). Ver RN-01 Comisión automática y.</w:t>
       </w:r>
     </w:p>
-    <w:p>
-      <w:pPr>
-        <w:pStyle w:val="BlockText"/>
-      </w:pPr>
-      <w:r>
-        <w:t xml:space="preserve">ℹ️ El nombre histórico</w:t>
-      </w:r>
-      <w:r>
-        <w:t xml:space="preserve"> </w:t>
-      </w:r>
-      <w:r>
-        <w:t xml:space="preserve">“porcentaje de comisión”</w:t>
-      </w:r>
-      <w:r>
-        <w:t xml:space="preserve"> </w:t>
-      </w:r>
-      <w:r>
-        <w:t xml:space="preserve">se conserva por el número de CU, pero tras la sync 17/09 el alcance es la</w:t>
-      </w:r>
-      <w:r>
-        <w:t xml:space="preserve"> </w:t>
-      </w:r>
-      <w:r>
-        <w:rPr>
-          <w:b/>
-          <w:bCs/>
-        </w:rPr>
-        <w:t xml:space="preserve">comisión del vendedor</w:t>
-      </w:r>
-      <w:r>
-        <w:t xml:space="preserve"> </w:t>
-      </w:r>
-      <w:r>
-        <w:t xml:space="preserve">(puede ser importe o %).</w:t>
-      </w:r>
-    </w:p>
     <w:bookmarkEnd w:id="182"/>
     <w:bookmarkStart w:id="183" w:name="actor-principal-12"/>
     <w:p>
@@ -9946,7 +10704,10 @@
         </w:numPr>
       </w:pPr>
       <w:r>
-        <w:t xml:space="preserve">El sistema lista las Alertas vigentes (</w:t>
+        <w:t xml:space="preserve">El sistema lista las Alertas vigentes (estado</w:t>
+      </w:r>
+      <w:r>
+        <w:t xml:space="preserve"> </w:t>
       </w:r>
       <w:r>
         <w:rPr>
@@ -9955,19 +10716,32 @@
         <w:t xml:space="preserve">pendiente</w:t>
       </w:r>
       <w:r>
-        <w:t xml:space="preserve"> </w:t>
-      </w:r>
-      <w:r>
-        <w:t xml:space="preserve">y</w:t>
-      </w:r>
-      <w:r>
-        <w:t xml:space="preserve"> </w:t>
-      </w:r>
-      <w:r>
-        <w:rPr>
-          <w:rStyle w:val="VerbatimChar"/>
-        </w:rPr>
-        <w:t xml:space="preserve">vencida</w:t>
+        <w:t xml:space="preserve">,</w:t>
+      </w:r>
+      <w:r>
+        <w:t xml:space="preserve"> </w:t>
+      </w:r>
+      <w:r>
+        <w:rPr>
+          <w:b/>
+          <w:bCs/>
+        </w:rPr>
+        <w:t xml:space="preserve">incluidas las que ya pasaron su</w:t>
+      </w:r>
+      <w:r>
+        <w:rPr>
+          <w:b/>
+          <w:bCs/>
+        </w:rPr>
+        <w:t xml:space="preserve"> </w:t>
+      </w:r>
+      <w:r>
+        <w:rPr>
+          <w:rStyle w:val="VerbatimChar"/>
+          <w:b/>
+          <w:bCs/>
+        </w:rPr>
+        <w:t xml:space="preserve">fecha</w:t>
       </w:r>
       <w:r>
         <w:t xml:space="preserve">), ordenadas por</w:t>
@@ -10021,7 +10795,7 @@
         <w:t xml:space="preserve"> </w:t>
       </w:r>
       <w:r>
-        <w:t xml:space="preserve">(pago · formulario · salida · insistencia · reseña · manual · recontacto).</w:t>
+        <w:t xml:space="preserve">(pago · formulario · salida · insistencia · reseña · manual · recontacto · viaje).</w:t>
       </w:r>
     </w:p>
     <w:p>
@@ -12126,7 +12900,7 @@
         <w:pStyle w:val="FirstParagraph"/>
       </w:pPr>
       <w:r>
-        <w:t xml:space="preserve">El empleado consulta el catálogo de Hoteles filtrando por destino y categoría, y usa las Reseñas para recomendar opciones al Cliente al cotizar o armar el itinerario. Es una consulta de</w:t>
+        <w:t xml:space="preserve">El empleado consulta el catálogo de Hoteles filtrando por destino, categoría, rango de precio y servicios, y usa las Reseñas para recomendar opciones al Cliente al cotizar o armar el itinerario. Es una consulta de</w:t>
       </w:r>
       <w:r>
         <w:t xml:space="preserve"> </w:t>
@@ -12310,16 +13084,6 @@
       </w:r>
       <w:r>
         <w:t xml:space="preserve">.</w:t>
-      </w:r>
-      <w:r>
-        <w:t xml:space="preserve"> </w:t>
-      </w:r>
-      <w:r>
-        <w:rPr>
-          <w:i/>
-          <w:iCs/>
-        </w:rPr>
-        <w:t xml:space="preserve">(Precio y servicios requieren sumar esos atributos a Hotel)</w:t>
       </w:r>
     </w:p>
     <w:p>
@@ -13039,6 +13803,132 @@
         <w:t xml:space="preserve">(Rumbo no publica por sí mismo — ver Alcance y fuera de alcance).</w:t>
       </w:r>
     </w:p>
+    <w:p>
+      <w:pPr>
+        <w:pStyle w:val="Compact"/>
+        <w:numPr>
+          <w:ilvl w:val="0"/>
+          <w:numId w:val="1125"/>
+        </w:numPr>
+      </w:pPr>
+      <w:r>
+        <w:rPr>
+          <w:b/>
+          <w:bCs/>
+        </w:rPr>
+        <w:t xml:space="preserve">A4 — Descartar una pieza:</w:t>
+      </w:r>
+      <w:r>
+        <w:t xml:space="preserve"> </w:t>
+      </w:r>
+      <w:r>
+        <w:t xml:space="preserve">la idea no va más → el empleado la pasa a</w:t>
+      </w:r>
+      <w:r>
+        <w:t xml:space="preserve"> </w:t>
+      </w:r>
+      <w:r>
+        <w:rPr>
+          <w:rStyle w:val="VerbatimChar"/>
+          <w:b/>
+          <w:bCs/>
+        </w:rPr>
+        <w:t xml:space="preserve">descartado</w:t>
+      </w:r>
+      <w:r>
+        <w:t xml:space="preserve"> </w:t>
+      </w:r>
+      <w:r>
+        <w:t xml:space="preserve">desde cualquier columna previa a</w:t>
+      </w:r>
+      <w:r>
+        <w:t xml:space="preserve"> </w:t>
+      </w:r>
+      <w:r>
+        <w:rPr>
+          <w:rStyle w:val="VerbatimChar"/>
+        </w:rPr>
+        <w:t xml:space="preserve">publicado</w:t>
+      </w:r>
+      <w:r>
+        <w:t xml:space="preserve">. Es</w:t>
+      </w:r>
+      <w:r>
+        <w:t xml:space="preserve"> </w:t>
+      </w:r>
+      <w:r>
+        <w:rPr>
+          <w:b/>
+          <w:bCs/>
+        </w:rPr>
+        <w:t xml:space="preserve">baja lógica</w:t>
+      </w:r>
+      <w:r>
+        <w:t xml:space="preserve">: la pieza se conserva, no se borra (mismo criterio que Hotel, Reseña, Destino y Operador).</w:t>
+      </w:r>
+    </w:p>
+    <w:p>
+      <w:pPr>
+        <w:pStyle w:val="Compact"/>
+        <w:numPr>
+          <w:ilvl w:val="0"/>
+          <w:numId w:val="1125"/>
+        </w:numPr>
+      </w:pPr>
+      <w:r>
+        <w:rPr>
+          <w:b/>
+          <w:bCs/>
+        </w:rPr>
+        <w:t xml:space="preserve">A5 — Retroceder una tarjeta:</w:t>
+      </w:r>
+      <w:r>
+        <w:t xml:space="preserve"> </w:t>
+      </w:r>
+      <w:r>
+        <w:t xml:space="preserve">el tablero se arrastra en</w:t>
+      </w:r>
+      <w:r>
+        <w:t xml:space="preserve"> </w:t>
+      </w:r>
+      <w:r>
+        <w:rPr>
+          <w:b/>
+          <w:bCs/>
+        </w:rPr>
+        <w:t xml:space="preserve">las dos direcciones</w:t>
+      </w:r>
+      <w:r>
+        <w:t xml:space="preserve">; una pieza</w:t>
+      </w:r>
+      <w:r>
+        <w:t xml:space="preserve"> </w:t>
+      </w:r>
+      <w:r>
+        <w:rPr>
+          <w:rStyle w:val="VerbatimChar"/>
+        </w:rPr>
+        <w:t xml:space="preserve">listo</w:t>
+      </w:r>
+      <w:r>
+        <w:t xml:space="preserve"> </w:t>
+      </w:r>
+      <w:r>
+        <w:t xml:space="preserve">que hay que rehacer vuelve a</w:t>
+      </w:r>
+      <w:r>
+        <w:t xml:space="preserve"> </w:t>
+      </w:r>
+      <w:r>
+        <w:rPr>
+          <w:rStyle w:val="VerbatimChar"/>
+        </w:rPr>
+        <w:t xml:space="preserve">en producción</w:t>
+      </w:r>
+      <w:r>
+        <w:t xml:space="preserve">.</w:t>
+      </w:r>
+    </w:p>
     <w:bookmarkEnd w:id="247"/>
     <w:bookmarkStart w:id="248" w:name="postcondiciones-18"/>
     <w:p>
@@ -13982,7 +14872,7 @@
         <w:t xml:space="preserve"> </w:t>
       </w:r>
       <w:r>
-        <w:t xml:space="preserve">(KPIs definidos por la agencia, ver Relevamiento — respuestas de la agencia (17-09), bloque 2):</w:t>
+        <w:t xml:space="preserve">(KPIs definidos por la agencia):</w:t>
       </w:r>
     </w:p>
     <w:p>
@@ -14760,7 +15650,7 @@
         <w:t xml:space="preserve"> </w:t>
       </w:r>
       <w:r>
-        <w:t xml:space="preserve">(por defecto, el mes). Catálogo definido por la agencia (Relevamiento — respuestas de la agencia (17-09), bloque 3):</w:t>
+        <w:t xml:space="preserve">(por defecto, el mes). Catálogo definido por la agencia:</w:t>
       </w:r>
     </w:p>
     <w:p>
@@ -15896,9 +16786,6 @@
         <w:t xml:space="preserve">rol</w:t>
       </w:r>
       <w:r>
-        <w:t xml:space="preserve"> </w:t>
-      </w:r>
-      <w:r>
         <w:t xml:space="preserve">:</w:t>
       </w:r>
     </w:p>
@@ -17289,7 +18176,7 @@
         <w:pStyle w:val="FirstParagraph"/>
       </w:pPr>
       <w:r>
-        <w:t xml:space="preserve">Dar de baja un Viaje que no se concreta (el cliente desiste, fuerza mayor), registrando el motivo, desactivando los Pagos pendientes y cerrando las Alertas vigentes, sin perder el historial.</w:t>
+        <w:t xml:space="preserve">Dar de baja un Viaje que no se concreta (el cliente desiste, fuerza mayor), registrando el motivo, anulando los Pagos no cobrados y cerrando las Alertas vigentes, sin perder el historial.</w:t>
       </w:r>
     </w:p>
     <w:bookmarkEnd w:id="322"/>
@@ -17564,6 +18451,19 @@
       </w:r>
       <w:r>
         <w:rPr>
+          <w:b/>
+          <w:bCs/>
+        </w:rPr>
+        <w:t xml:space="preserve">no cobrados</w:t>
+      </w:r>
+      <w:r>
+        <w:t xml:space="preserve"> </w:t>
+      </w:r>
+      <w:r>
+        <w:t xml:space="preserve">del plan (</w:t>
+      </w:r>
+      <w:r>
+        <w:rPr>
           <w:rStyle w:val="VerbatimChar"/>
         </w:rPr>
         <w:t xml:space="preserve">pendientes</w:t>
@@ -17572,7 +18472,23 @@
         <w:t xml:space="preserve"> </w:t>
       </w:r>
       <w:r>
-        <w:t xml:space="preserve">del plan a estado</w:t>
+        <w:rPr>
+          <w:b/>
+          <w:bCs/>
+        </w:rPr>
+        <w:t xml:space="preserve">y</w:t>
+      </w:r>
+      <w:r>
+        <w:t xml:space="preserve"> </w:t>
+      </w:r>
+      <w:r>
+        <w:rPr>
+          <w:rStyle w:val="VerbatimChar"/>
+        </w:rPr>
+        <w:t xml:space="preserve">vencidos</w:t>
+      </w:r>
+      <w:r>
+        <w:t xml:space="preserve">) a estado</w:t>
       </w:r>
       <w:r>
         <w:t xml:space="preserve"> </w:t>
@@ -17605,7 +18521,32 @@
         <w:t xml:space="preserve"> </w:t>
       </w:r>
       <w:r>
-        <w:t xml:space="preserve">las Alertas vigentes del viaje.</w:t>
+        <w:t xml:space="preserve">las Alertas vigentes del viaje,</w:t>
+      </w:r>
+      <w:r>
+        <w:t xml:space="preserve"> </w:t>
+      </w:r>
+      <w:r>
+        <w:rPr>
+          <w:b/>
+          <w:bCs/>
+        </w:rPr>
+        <w:t xml:space="preserve">marcándolas como cerradas por la cancelación</w:t>
+      </w:r>
+      <w:r>
+        <w:t xml:space="preserve"> </w:t>
+      </w:r>
+      <w:r>
+        <w:t xml:space="preserve">(</w:t>
+      </w:r>
+      <w:r>
+        <w:rPr>
+          <w:rStyle w:val="VerbatimChar"/>
+        </w:rPr>
+        <w:t xml:space="preserve">cerrada_por_cancelacion</w:t>
+      </w:r>
+      <w:r>
+        <w:t xml:space="preserve">).</w:t>
       </w:r>
     </w:p>
     <w:p>
@@ -17633,7 +18574,64 @@
         <w:t xml:space="preserve"> </w:t>
       </w:r>
       <w:r>
-        <w:t xml:space="preserve">(RN-01 Comisión automática).</w:t>
+        <w:t xml:space="preserve">(RN-01 Comisión automática) —</w:t>
+      </w:r>
+      <w:r>
+        <w:t xml:space="preserve"> </w:t>
+      </w:r>
+      <w:r>
+        <w:rPr>
+          <w:b/>
+          <w:bCs/>
+        </w:rPr>
+        <w:t xml:space="preserve">salvo que el Viaje ya estuviera</w:t>
+      </w:r>
+      <w:r>
+        <w:rPr>
+          <w:b/>
+          <w:bCs/>
+        </w:rPr>
+        <w:t xml:space="preserve"> </w:t>
+      </w:r>
+      <w:r>
+        <w:rPr>
+          <w:rStyle w:val="VerbatimChar"/>
+          <w:b/>
+          <w:bCs/>
+        </w:rPr>
+        <w:t xml:space="preserve">en curso</w:t>
+      </w:r>
+      <w:r>
+        <w:t xml:space="preserve">, donde el servicio ya se prestó y la comisión</w:t>
+      </w:r>
+      <w:r>
+        <w:t xml:space="preserve"> </w:t>
+      </w:r>
+      <w:r>
+        <w:rPr>
+          <w:b/>
+          <w:bCs/>
+        </w:rPr>
+        <w:t xml:space="preserve">se mantiene</w:t>
+      </w:r>
+      <w:r>
+        <w:t xml:space="preserve"> </w:t>
+      </w:r>
+      <w:r>
+        <w:t xml:space="preserve">(ver</w:t>
+      </w:r>
+      <w:r>
+        <w:t xml:space="preserve"> </w:t>
+      </w:r>
+      <w:r>
+        <w:rPr>
+          <w:b/>
+          <w:bCs/>
+        </w:rPr>
+        <w:t xml:space="preserve">A4</w:t>
+      </w:r>
+      <w:r>
+        <w:t xml:space="preserve">).</w:t>
       </w:r>
     </w:p>
     <w:p>
@@ -17773,7 +18771,287 @@
         <w:t xml:space="preserve">finalizado</w:t>
       </w:r>
       <w:r>
-        <w:t xml:space="preserve">, el empleado reactiva el viaje y se reponen sus Pagos/Alertas.</w:t>
+        <w:t xml:space="preserve">, el empleado reactiva el viaje, que</w:t>
+      </w:r>
+      <w:r>
+        <w:t xml:space="preserve"> </w:t>
+      </w:r>
+      <w:r>
+        <w:rPr>
+          <w:b/>
+          <w:bCs/>
+        </w:rPr>
+        <w:t xml:space="preserve">vuelve al estado que tenía justo antes de cancelarse</w:t>
+      </w:r>
+      <w:r>
+        <w:t xml:space="preserve">; sus Pagos vuelven a</w:t>
+      </w:r>
+      <w:r>
+        <w:t xml:space="preserve"> </w:t>
+      </w:r>
+      <w:r>
+        <w:rPr>
+          <w:rStyle w:val="VerbatimChar"/>
+        </w:rPr>
+        <w:t xml:space="preserve">pendiente</w:t>
+      </w:r>
+      <w:r>
+        <w:t xml:space="preserve"> </w:t>
+      </w:r>
+      <w:r>
+        <w:t xml:space="preserve">o</w:t>
+      </w:r>
+      <w:r>
+        <w:t xml:space="preserve"> </w:t>
+      </w:r>
+      <w:r>
+        <w:rPr>
+          <w:rStyle w:val="VerbatimChar"/>
+        </w:rPr>
+        <w:t xml:space="preserve">vencido</w:t>
+      </w:r>
+      <w:r>
+        <w:t xml:space="preserve"> </w:t>
+      </w:r>
+      <w:r>
+        <w:t xml:space="preserve">según su fecha, y se reabren</w:t>
+      </w:r>
+      <w:r>
+        <w:t xml:space="preserve"> </w:t>
+      </w:r>
+      <w:r>
+        <w:rPr>
+          <w:b/>
+          <w:bCs/>
+        </w:rPr>
+        <w:t xml:space="preserve">solo las Alertas que cerró la cancelación</w:t>
+      </w:r>
+      <w:r>
+        <w:t xml:space="preserve"> </w:t>
+      </w:r>
+      <w:r>
+        <w:t xml:space="preserve">(las marcadas en el paso 4); las que ya estaban resueltas por otro motivo (un pago cobrado, un formulario entregado) no vuelven. Si el paso 5 había dejado constancia de que la comisión no se realizaba, esa constancia se anula y la</w:t>
+      </w:r>
+      <w:r>
+        <w:t xml:space="preserve"> </w:t>
+      </w:r>
+      <w:r>
+        <w:rPr>
+          <w:b/>
+          <w:bCs/>
+        </w:rPr>
+        <w:t xml:space="preserve">comisión vuelve a quedar proyectada</w:t>
+      </w:r>
+      <w:r>
+        <w:t xml:space="preserve"> </w:t>
+      </w:r>
+      <w:r>
+        <w:t xml:space="preserve">(RN-01 Comisión automática).</w:t>
+      </w:r>
+    </w:p>
+    <w:p>
+      <w:pPr>
+        <w:pStyle w:val="Compact"/>
+        <w:numPr>
+          <w:ilvl w:val="0"/>
+          <w:numId w:val="1181"/>
+        </w:numPr>
+      </w:pPr>
+      <w:r>
+        <w:rPr>
+          <w:b/>
+          <w:bCs/>
+        </w:rPr>
+        <w:t xml:space="preserve">A4 — Viaje ya iniciado (</w:t>
+      </w:r>
+      <w:r>
+        <w:rPr>
+          <w:rStyle w:val="VerbatimChar"/>
+          <w:b/>
+          <w:bCs/>
+        </w:rPr>
+        <w:t xml:space="preserve">en curso</w:t>
+      </w:r>
+      <w:r>
+        <w:rPr>
+          <w:b/>
+          <w:bCs/>
+        </w:rPr>
+        <w:t xml:space="preserve">):</w:t>
+      </w:r>
+      <w:r>
+        <w:t xml:space="preserve"> </w:t>
+      </w:r>
+      <w:r>
+        <w:t xml:space="preserve">si el Viaje estaba</w:t>
+      </w:r>
+      <w:r>
+        <w:t xml:space="preserve"> </w:t>
+      </w:r>
+      <w:r>
+        <w:rPr>
+          <w:rStyle w:val="VerbatimChar"/>
+          <w:b/>
+          <w:bCs/>
+        </w:rPr>
+        <w:t xml:space="preserve">en curso</w:t>
+      </w:r>
+      <w:r>
+        <w:t xml:space="preserve">, el servicio</w:t>
+      </w:r>
+      <w:r>
+        <w:t xml:space="preserve"> </w:t>
+      </w:r>
+      <w:r>
+        <w:rPr>
+          <w:b/>
+          <w:bCs/>
+        </w:rPr>
+        <w:t xml:space="preserve">ya se prestó</w:t>
+      </w:r>
+      <w:r>
+        <w:t xml:space="preserve"> </w:t>
+      </w:r>
+      <w:r>
+        <w:t xml:space="preserve">(total o parcialmente), así que la cancelación</w:t>
+      </w:r>
+      <w:r>
+        <w:t xml:space="preserve"> </w:t>
+      </w:r>
+      <w:r>
+        <w:rPr>
+          <w:b/>
+          <w:bCs/>
+        </w:rPr>
+        <w:t xml:space="preserve">no toca la economía ya realizada</w:t>
+      </w:r>
+      <w:r>
+        <w:t xml:space="preserve">: la</w:t>
+      </w:r>
+      <w:r>
+        <w:t xml:space="preserve"> </w:t>
+      </w:r>
+      <w:r>
+        <w:rPr>
+          <w:b/>
+          <w:bCs/>
+        </w:rPr>
+        <w:t xml:space="preserve">comisión del vendedor se mantiene</w:t>
+      </w:r>
+      <w:r>
+        <w:t xml:space="preserve"> </w:t>
+      </w:r>
+      <w:r>
+        <w:t xml:space="preserve">(no se revierte, a diferencia del paso 5) y los Pagos ya</w:t>
+      </w:r>
+      <w:r>
+        <w:t xml:space="preserve"> </w:t>
+      </w:r>
+      <w:r>
+        <w:rPr>
+          <w:rStyle w:val="VerbatimChar"/>
+        </w:rPr>
+        <w:t xml:space="preserve">pagados</w:t>
+      </w:r>
+      <w:r>
+        <w:t xml:space="preserve"> </w:t>
+      </w:r>
+      <w:r>
+        <w:t xml:space="preserve">quedan como están. Se anulan igual los Pagos</w:t>
+      </w:r>
+      <w:r>
+        <w:t xml:space="preserve"> </w:t>
+      </w:r>
+      <w:r>
+        <w:rPr>
+          <w:b/>
+          <w:bCs/>
+        </w:rPr>
+        <w:t xml:space="preserve">no cobrados</w:t>
+      </w:r>
+      <w:r>
+        <w:t xml:space="preserve"> </w:t>
+      </w:r>
+      <w:r>
+        <w:t xml:space="preserve">(paso 4), con lo cual</w:t>
+      </w:r>
+      <w:r>
+        <w:t xml:space="preserve"> </w:t>
+      </w:r>
+      <w:r>
+        <w:rPr>
+          <w:rStyle w:val="VerbatimChar"/>
+        </w:rPr>
+        <w:t xml:space="preserve">Σ montos</w:t>
+      </w:r>
+      <w:r>
+        <w:t xml:space="preserve"> </w:t>
+      </w:r>
+      <w:r>
+        <w:t xml:space="preserve">deja de coincidir con el</w:t>
+      </w:r>
+      <w:r>
+        <w:t xml:space="preserve"> </w:t>
+      </w:r>
+      <w:r>
+        <w:rPr>
+          <w:rStyle w:val="VerbatimChar"/>
+        </w:rPr>
+        <w:t xml:space="preserve">precioVenta</w:t>
+      </w:r>
+      <w:r>
+        <w:t xml:space="preserve"> </w:t>
+      </w:r>
+      <w:r>
+        <w:t xml:space="preserve">y pasa a reflejar</w:t>
+      </w:r>
+      <w:r>
+        <w:t xml:space="preserve"> </w:t>
+      </w:r>
+      <w:r>
+        <w:rPr>
+          <w:b/>
+          <w:bCs/>
+        </w:rPr>
+        <w:t xml:space="preserve">lo efectivamente cobrado</w:t>
+      </w:r>
+      <w:r>
+        <w:t xml:space="preserve"> </w:t>
+      </w:r>
+      <w:r>
+        <w:t xml:space="preserve">(CU-11 Definir plan de cuotas A4). Es la</w:t>
+      </w:r>
+      <w:r>
+        <w:t xml:space="preserve"> </w:t>
+      </w:r>
+      <w:r>
+        <w:rPr>
+          <w:b/>
+          <w:bCs/>
+        </w:rPr>
+        <w:t xml:space="preserve">interrupción</w:t>
+      </w:r>
+      <w:r>
+        <w:t xml:space="preserve"> </w:t>
+      </w:r>
+      <w:r>
+        <w:t xml:space="preserve">de un viaje en marcha, no una venta que no ocurrió. El reembolso o la penalidad por la parte no usada siguen</w:t>
+      </w:r>
+      <w:r>
+        <w:t xml:space="preserve"> </w:t>
+      </w:r>
+      <w:r>
+        <w:rPr>
+          <w:b/>
+          <w:bCs/>
+        </w:rPr>
+        <w:t xml:space="preserve">fuera de alcance</w:t>
+      </w:r>
+      <w:r>
+        <w:t xml:space="preserve"> </w:t>
+      </w:r>
+      <w:r>
+        <w:t xml:space="preserve">(A2).</w:t>
       </w:r>
     </w:p>
     <w:bookmarkEnd w:id="327"/>
@@ -17807,7 +19085,31 @@
         <w:t xml:space="preserve">cancelado</w:t>
       </w:r>
       <w:r>
-        <w:t xml:space="preserve">, con sus Pagos pendientes en estado</w:t>
+        <w:t xml:space="preserve">, con sus Pagos no cobrados (</w:t>
+      </w:r>
+      <w:r>
+        <w:rPr>
+          <w:rStyle w:val="VerbatimChar"/>
+        </w:rPr>
+        <w:t xml:space="preserve">pendientes</w:t>
+      </w:r>
+      <w:r>
+        <w:t xml:space="preserve"> </w:t>
+      </w:r>
+      <w:r>
+        <w:t xml:space="preserve">y</w:t>
+      </w:r>
+      <w:r>
+        <w:t xml:space="preserve"> </w:t>
+      </w:r>
+      <w:r>
+        <w:rPr>
+          <w:rStyle w:val="VerbatimChar"/>
+        </w:rPr>
+        <w:t xml:space="preserve">vencidos</w:t>
+      </w:r>
+      <w:r>
+        <w:t xml:space="preserve">) en estado</w:t>
       </w:r>
       <w:r>
         <w:t xml:space="preserve"> </w:t>
@@ -17823,6 +19125,49 @@
       </w:r>
       <w:r>
         <w:t xml:space="preserve">y sus Alertas cerradas, preservando el historial.</w:t>
+      </w:r>
+    </w:p>
+    <w:p>
+      <w:pPr>
+        <w:pStyle w:val="Compact"/>
+        <w:numPr>
+          <w:ilvl w:val="0"/>
+          <w:numId w:val="1182"/>
+        </w:numPr>
+      </w:pPr>
+      <w:r>
+        <w:t xml:space="preserve">Si el Viaje estaba</w:t>
+      </w:r>
+      <w:r>
+        <w:t xml:space="preserve"> </w:t>
+      </w:r>
+      <w:r>
+        <w:rPr>
+          <w:rStyle w:val="VerbatimChar"/>
+        </w:rPr>
+        <w:t xml:space="preserve">en curso</w:t>
+      </w:r>
+      <w:r>
+        <w:t xml:space="preserve"> </w:t>
+      </w:r>
+      <w:r>
+        <w:t xml:space="preserve">al cancelarse,</w:t>
+      </w:r>
+      <w:r>
+        <w:t xml:space="preserve"> </w:t>
+      </w:r>
+      <w:r>
+        <w:rPr>
+          <w:b/>
+          <w:bCs/>
+        </w:rPr>
+        <w:t xml:space="preserve">conserva además la comisión del vendedor</w:t>
+      </w:r>
+      <w:r>
+        <w:t xml:space="preserve"> </w:t>
+      </w:r>
+      <w:r>
+        <w:t xml:space="preserve">y los cobros ya registrados (A4).</w:t>
       </w:r>
     </w:p>
     <w:bookmarkEnd w:id="328"/>
@@ -17844,7 +19189,73 @@
         </w:numPr>
       </w:pPr>
       <w:r>
-        <w:t xml:space="preserve">RN-01 Comisión automática: al cancelar, la comisión proyectada no se realiza.</w:t>
+        <w:t xml:space="preserve">RN-01 Comisión automática: al cancelar, la comisión proyectada no se realiza</w:t>
+      </w:r>
+      <w:r>
+        <w:t xml:space="preserve"> </w:t>
+      </w:r>
+      <w:r>
+        <w:rPr>
+          <w:b/>
+          <w:bCs/>
+        </w:rPr>
+        <w:t xml:space="preserve">si el viaje no había empezado</w:t>
+      </w:r>
+      <w:r>
+        <w:t xml:space="preserve"> </w:t>
+      </w:r>
+      <w:r>
+        <w:t xml:space="preserve">(</w:t>
+      </w:r>
+      <w:r>
+        <w:rPr>
+          <w:rStyle w:val="VerbatimChar"/>
+        </w:rPr>
+        <w:t xml:space="preserve">reservado</w:t>
+      </w:r>
+      <w:r>
+        <w:t xml:space="preserve">,</w:t>
+      </w:r>
+      <w:r>
+        <w:t xml:space="preserve"> </w:t>
+      </w:r>
+      <w:r>
+        <w:rPr>
+          <w:rStyle w:val="VerbatimChar"/>
+        </w:rPr>
+        <w:t xml:space="preserve">vendido</w:t>
+      </w:r>
+      <w:r>
+        <w:t xml:space="preserve"> </w:t>
+      </w:r>
+      <w:r>
+        <w:t xml:space="preserve">o</w:t>
+      </w:r>
+      <w:r>
+        <w:t xml:space="preserve"> </w:t>
+      </w:r>
+      <w:r>
+        <w:rPr>
+          <w:rStyle w:val="VerbatimChar"/>
+        </w:rPr>
+        <w:t xml:space="preserve">confirmado</w:t>
+      </w:r>
+      <w:r>
+        <w:t xml:space="preserve">). Si estaba</w:t>
+      </w:r>
+      <w:r>
+        <w:t xml:space="preserve"> </w:t>
+      </w:r>
+      <w:r>
+        <w:rPr>
+          <w:rStyle w:val="VerbatimChar"/>
+          <w:b/>
+          <w:bCs/>
+        </w:rPr>
+        <w:t xml:space="preserve">en curso</w:t>
+      </w:r>
+      <w:r>
+        <w:t xml:space="preserve">, la comisión se mantiene porque el servicio se prestó (A4). El cálculo de la comisión no cambia; esta regla solo define cuándo se considera realizada.</w:t>
       </w:r>
     </w:p>
     <w:p>
@@ -17919,7 +19330,7 @@
         <w:t xml:space="preserve">manual</w:t>
       </w:r>
       <w:r>
-        <w:t xml:space="preserve">: un recordatorio propio del empleado no derivado de un evento automático (pago, formulario, insistencia o reseña), opcionalmente asociado a un Viaje, Cliente u Oportunidad.</w:t>
+        <w:t xml:space="preserve">: un recordatorio propio del empleado no derivado de un evento automático (como un vencimiento de pago, un formulario del destino o la reseña post-viaje), opcionalmente asociado a un Viaje, Cliente u Oportunidad.</w:t>
       </w:r>
     </w:p>
     <w:bookmarkEnd w:id="332"/>
@@ -18451,7 +19862,7 @@
         </w:numPr>
       </w:pPr>
       <w:r>
-        <w:t xml:space="preserve">El registro se conserva para no romper la trazabilidad de.</w:t>
+        <w:t xml:space="preserve">El registro se conserva para no romper la trazabilidad entre el Hotel, sus Reseñas y los Viajes de origen.</w:t>
       </w:r>
     </w:p>
     <w:bookmarkEnd w:id="346"/>
@@ -18815,7 +20226,23 @@
         </w:numPr>
       </w:pPr>
       <w:r>
-        <w:t xml:space="preserve">El sistema evalúa periódicamente el historial de cada Cliente y detecta a los</w:t>
+        <w:t xml:space="preserve">El sistema evalúa</w:t>
+      </w:r>
+      <w:r>
+        <w:t xml:space="preserve"> </w:t>
+      </w:r>
+      <w:r>
+        <w:rPr>
+          <w:b/>
+          <w:bCs/>
+        </w:rPr>
+        <w:t xml:space="preserve">todos los días, a las 00:00</w:t>
+      </w:r>
+      <w:r>
+        <w:t xml:space="preserve"> </w:t>
+      </w:r>
+      <w:r>
+        <w:t xml:space="preserve">(en el proceso automático diario), el historial de cada Cliente y detecta a los</w:t>
       </w:r>
       <w:r>
         <w:t xml:space="preserve"> </w:t>
@@ -18883,16 +20310,90 @@
         <w:t xml:space="preserve"> </w:t>
       </w:r>
       <w:r>
-        <w:t xml:space="preserve">para el Cliente (o lo lista en un panel de</w:t>
-      </w:r>
-      <w:r>
-        <w:t xml:space="preserve"> </w:t>
-      </w:r>
-      <w:r>
-        <w:t xml:space="preserve">“clientes a recontactar”</w:t>
+        <w:t xml:space="preserve">para el Cliente,</w:t>
+      </w:r>
+      <w:r>
+        <w:t xml:space="preserve"> </w:t>
+      </w:r>
+      <w:r>
+        <w:rPr>
+          <w:b/>
+          <w:bCs/>
+        </w:rPr>
+        <w:t xml:space="preserve">asignada a su responsable</w:t>
+      </w:r>
+      <w:r>
+        <w:t xml:space="preserve"> </w:t>
+      </w:r>
+      <w:r>
+        <w:t xml:space="preserve">(si no tiene un responsable activo, a un</w:t>
+      </w:r>
+      <w:r>
+        <w:t xml:space="preserve"> </w:t>
+      </w:r>
+      <w:r>
+        <w:rPr>
+          <w:rStyle w:val="VerbatimChar"/>
+        </w:rPr>
+        <w:t xml:space="preserve">admin</w:t>
       </w:r>
       <w:r>
         <w:t xml:space="preserve">).</w:t>
+      </w:r>
+      <w:r>
+        <w:t xml:space="preserve"> </w:t>
+      </w:r>
+      <w:r>
+        <w:rPr>
+          <w:b/>
+          <w:bCs/>
+        </w:rPr>
+        <w:t xml:space="preserve">No la duplica:</w:t>
+      </w:r>
+      <w:r>
+        <w:t xml:space="preserve"> </w:t>
+      </w:r>
+      <w:r>
+        <w:t xml:space="preserve">si el Cliente ya tiene una alerta de</w:t>
+      </w:r>
+      <w:r>
+        <w:t xml:space="preserve"> </w:t>
+      </w:r>
+      <w:r>
+        <w:rPr>
+          <w:rStyle w:val="VerbatimChar"/>
+        </w:rPr>
+        <w:t xml:space="preserve">recontacto</w:t>
+      </w:r>
+      <w:r>
+        <w:t xml:space="preserve"> </w:t>
+      </w:r>
+      <w:r>
+        <w:t xml:space="preserve">sin resolver (</w:t>
+      </w:r>
+      <w:r>
+        <w:rPr>
+          <w:rStyle w:val="VerbatimChar"/>
+        </w:rPr>
+        <w:t xml:space="preserve">pendiente</w:t>
+      </w:r>
+      <w:r>
+        <w:t xml:space="preserve"> </w:t>
+      </w:r>
+      <w:r>
+        <w:t xml:space="preserve">o</w:t>
+      </w:r>
+      <w:r>
+        <w:t xml:space="preserve"> </w:t>
+      </w:r>
+      <w:r>
+        <w:rPr>
+          <w:rStyle w:val="VerbatimChar"/>
+        </w:rPr>
+        <w:t xml:space="preserve">vista</w:t>
+      </w:r>
+      <w:r>
+        <w:t xml:space="preserve">, incluidas las pospuestas), no genera otra.</w:t>
       </w:r>
     </w:p>
     <w:p>
@@ -19137,7 +20638,7 @@
           <w:b/>
           <w:bCs/>
         </w:rPr>
-        <w:t xml:space="preserve">Criterio de candidato (agencia, 17/09 — ver Relevamiento — respuestas de la agencia (17-09), bloque 4):</w:t>
+        <w:t xml:space="preserve">Criterio de candidato (definido por la agencia):</w:t>
       </w:r>
       <w:r>
         <w:t xml:space="preserve"> </w:t>
@@ -19859,28 +21360,7 @@
         <w:sz w:val="18"/>
         <w:szCs w:val="18"/>
       </w:rPr>
-      <w:t xml:space="preserve">â€” </w:t>
-    </w:r>
-    <w:r>
-      <w:rPr>
-        <w:color w:val="808080"/>
-        <w:sz w:val="18"/>
-      </w:rPr>
       <w:fldChar w:fldCharType="begin"/>
-    </w:r>
-    <w:r>
-      <w:rPr>
-        <w:color w:val="808080"/>
-        <w:sz w:val="18"/>
-      </w:rPr>
-      <w:instrText xml:space="preserve"> PAGE </w:instrText>
-    </w:r>
-    <w:r>
-      <w:rPr>
-        <w:color w:val="808080"/>
-        <w:sz w:val="18"/>
-      </w:rPr>
-      <w:fldChar w:fldCharType="end"/>
     </w:r>
     <w:r>
       <w:rPr>
@@ -19889,7 +21369,34 @@
         <w:sz w:val="18"/>
         <w:szCs w:val="18"/>
       </w:rPr>
-      <w:t xml:space="preserve"> â€”</w:t>
+      <w:instrText xml:space="preserve"> PAGE </w:instrText>
+    </w:r>
+    <w:r>
+      <w:rPr>
+        <w:rFonts w:ascii="Cambria" w:hAnsi="Cambria"/>
+        <w:color w:val="808080"/>
+        <w:sz w:val="18"/>
+        <w:szCs w:val="18"/>
+      </w:rPr>
+      <w:fldChar w:fldCharType="separate"/>
+    </w:r>
+    <w:r>
+      <w:rPr>
+        <w:rFonts w:ascii="Cambria" w:hAnsi="Cambria"/>
+        <w:color w:val="808080"/>
+        <w:sz w:val="18"/>
+        <w:szCs w:val="18"/>
+      </w:rPr>
+      <w:t>1</w:t>
+    </w:r>
+    <w:r>
+      <w:rPr>
+        <w:rFonts w:ascii="Cambria" w:hAnsi="Cambria"/>
+        <w:color w:val="808080"/>
+        <w:sz w:val="18"/>
+        <w:szCs w:val="18"/>
+      </w:rPr>
+      <w:fldChar w:fldCharType="end"/>
     </w:r>
   </w:p>
 </w:ftr>

</xml_diff>

<commit_message>
CU-14: A5 «Ver próximas» y progreso del día (propuestas de Paloma); RF-154, RF-155 y Alerta.resuelta_en (DEC-0013)
Co-Authored-By: Claude Opus 5.5 <noreply@anthropic.com>
</commit_message>
<xml_diff>
--- a/07-Entregables/Casos de uso/Rumbo — Casos de uso.docx
+++ b/07-Entregables/Casos de uso/Rumbo — Casos de uso.docx
@@ -10756,7 +10756,20 @@
         <w:t xml:space="preserve">fecha</w:t>
       </w:r>
       <w:r>
-        <w:t xml:space="preserve">, filtradas por propietario.</w:t>
+        <w:t xml:space="preserve">, filtradas por propietario. Junto con la lista, muestra el</w:t>
+      </w:r>
+      <w:r>
+        <w:t xml:space="preserve"> </w:t>
+      </w:r>
+      <w:r>
+        <w:rPr>
+          <w:b/>
+          <w:bCs/>
+        </w:rPr>
+        <w:t xml:space="preserve">progreso del día</w:t>
+      </w:r>
+      <w:r>
+        <w:t xml:space="preserve">: cuántas Alertas del propietario se resolvieron hoy sobre el total del día (las resueltas hoy más las vigentes).</w:t>
       </w:r>
     </w:p>
     <w:p>
@@ -10950,6 +10963,70 @@
         <w:t xml:space="preserve">de la Alerta a un día posterior.</w:t>
       </w:r>
     </w:p>
+    <w:p>
+      <w:pPr>
+        <w:pStyle w:val="Compact"/>
+        <w:numPr>
+          <w:ilvl w:val="0"/>
+          <w:numId w:val="1093"/>
+        </w:numPr>
+      </w:pPr>
+      <w:r>
+        <w:rPr>
+          <w:b/>
+          <w:bCs/>
+        </w:rPr>
+        <w:t xml:space="preserve">A5 — Ver próximas:</w:t>
+      </w:r>
+      <w:r>
+        <w:t xml:space="preserve"> </w:t>
+      </w:r>
+      <w:r>
+        <w:t xml:space="preserve">el empleado elige ver las Alertas</w:t>
+      </w:r>
+      <w:r>
+        <w:t xml:space="preserve"> </w:t>
+      </w:r>
+      <w:r>
+        <w:rPr>
+          <w:rStyle w:val="VerbatimChar"/>
+        </w:rPr>
+        <w:t xml:space="preserve">pendientes</w:t>
+      </w:r>
+      <w:r>
+        <w:t xml:space="preserve"> </w:t>
+      </w:r>
+      <w:r>
+        <w:t xml:space="preserve">con</w:t>
+      </w:r>
+      <w:r>
+        <w:t xml:space="preserve"> </w:t>
+      </w:r>
+      <w:r>
+        <w:rPr>
+          <w:rStyle w:val="VerbatimChar"/>
+        </w:rPr>
+        <w:t xml:space="preserve">fecha</w:t>
+      </w:r>
+      <w:r>
+        <w:t xml:space="preserve"> </w:t>
+      </w:r>
+      <w:r>
+        <w:t xml:space="preserve">posterior a hoy, para adelantar trabajo. El sistema las lista ordenadas por</w:t>
+      </w:r>
+      <w:r>
+        <w:t xml:space="preserve"> </w:t>
+      </w:r>
+      <w:r>
+        <w:rPr>
+          <w:rStyle w:val="VerbatimChar"/>
+        </w:rPr>
+        <w:t xml:space="preserve">fecha</w:t>
+      </w:r>
+      <w:r>
+        <w:t xml:space="preserve">, con el mismo filtro por propietario, y el empleado puede atenderlas como en los pasos 3 a 5.</w:t>
+      </w:r>
+    </w:p>
     <w:bookmarkEnd w:id="197"/>
     <w:bookmarkStart w:id="198" w:name="postcondiciones-13"/>
     <w:p>
@@ -10991,6 +11068,33 @@
       </w:r>
       <w:r>
         <w:t xml:space="preserve">; las pospuestas, reagendadas.</w:t>
+      </w:r>
+    </w:p>
+    <w:p>
+      <w:pPr>
+        <w:pStyle w:val="Compact"/>
+        <w:numPr>
+          <w:ilvl w:val="0"/>
+          <w:numId w:val="1094"/>
+        </w:numPr>
+      </w:pPr>
+      <w:r>
+        <w:t xml:space="preserve">El progreso del día se actualiza con cada Alerta resuelta, también cuando se resuelve sola (A2). Las pospuestas (A4) salen del total del día, y marcar una alerta como</w:t>
+      </w:r>
+      <w:r>
+        <w:t xml:space="preserve"> </w:t>
+      </w:r>
+      <w:r>
+        <w:rPr>
+          <w:rStyle w:val="VerbatimChar"/>
+        </w:rPr>
+        <w:t xml:space="preserve">vista</w:t>
+      </w:r>
+      <w:r>
+        <w:t xml:space="preserve"> </w:t>
+      </w:r>
+      <w:r>
+        <w:t xml:space="preserve">no cuenta como avance.</w:t>
       </w:r>
     </w:p>
     <w:bookmarkEnd w:id="198"/>

</xml_diff>

<commit_message>
Sync 30/09: contrato OpenAPI formalizado; el freelance no gestiona hoteles ni reseñas
Los cuatro supuestos del contrato se confirman sin cambios. La exclusión del
freelance en CU-16 y CU-17 queda escrita en los CU, Actores, el diagrama de CU
y una aclaración en DEC-0008. DOCX de Casos de uso y Relevamiento regenerados.

Co-Authored-By: Claude Opus 5.5 <noreply@anthropic.com>
</commit_message>
<xml_diff>
--- a/07-Entregables/Casos de uso/Rumbo — Casos de uso.docx
+++ b/07-Entregables/Casos de uso/Rumbo — Casos de uso.docx
@@ -815,7 +815,7 @@
         <w:t xml:space="preserve"> </w:t>
       </w:r>
       <w:r>
-        <w:t xml:space="preserve">(bloqueo de lectura fuera de sus clientes/operaciones); sí ve el catálogo compartido y sus propias comisiones. Se modela como Usuario con rol</w:t>
+        <w:t xml:space="preserve">(bloqueo de lectura fuera de sus clientes/operaciones); sí ve el catálogo compartido (sin modificarlo: no da de alta ni edita hoteles ni registra reseñas) y sus propias comisiones. Se modela como Usuario con rol</w:t>
       </w:r>
       <w:r>
         <w:t xml:space="preserve"> </w:t>
@@ -11700,7 +11700,19 @@
         <w:pStyle w:val="FirstParagraph"/>
       </w:pPr>
       <w:r>
-        <w:t xml:space="preserve">empleado</w:t>
+        <w:t xml:space="preserve">empleado. No incluye al rol</w:t>
+      </w:r>
+      <w:r>
+        <w:t xml:space="preserve"> </w:t>
+      </w:r>
+      <w:r>
+        <w:rPr>
+          <w:rStyle w:val="VerbatimChar"/>
+        </w:rPr>
+        <w:t xml:space="preserve">freelance</w:t>
+      </w:r>
+      <w:r>
+        <w:t xml:space="preserve">: el vendedor externo consulta el catálogo de hoteles, pero no lo modifica ni registra reseñas.</w:t>
       </w:r>
     </w:p>
     <w:bookmarkEnd w:id="213"/>
@@ -12241,7 +12253,19 @@
         <w:pStyle w:val="FirstParagraph"/>
       </w:pPr>
       <w:r>
-        <w:t xml:space="preserve">empleado</w:t>
+        <w:t xml:space="preserve">empleado. No incluye al rol</w:t>
+      </w:r>
+      <w:r>
+        <w:t xml:space="preserve"> </w:t>
+      </w:r>
+      <w:r>
+        <w:rPr>
+          <w:rStyle w:val="VerbatimChar"/>
+        </w:rPr>
+        <w:t xml:space="preserve">freelance</w:t>
+      </w:r>
+      <w:r>
+        <w:t xml:space="preserve">: el vendedor externo consulta el catálogo de hoteles, pero no lo modifica ni registra reseñas.</w:t>
       </w:r>
     </w:p>
     <w:bookmarkEnd w:id="223"/>

</xml_diff>

<commit_message>
Sync 30/09: el freelance tampoco usa el módulo de redes (CU-19 y CU-20)
Anotado en los CU, Actores, el diagrama de CU y la aclaración de DEC-0008;
DOCX de Casos de uso y Relevamiento regenerados.

Co-Authored-By: Claude Opus 5.5 <noreply@anthropic.com>
</commit_message>
<xml_diff>
--- a/07-Entregables/Casos de uso/Rumbo — Casos de uso.docx
+++ b/07-Entregables/Casos de uso/Rumbo — Casos de uso.docx
@@ -916,7 +916,19 @@
         <w:t xml:space="preserve"> </w:t>
       </w:r>
       <w:r>
-        <w:t xml:space="preserve">(o cubren ellos mismos). En una PyME suele concentrarse en una persona.</w:t>
+        <w:t xml:space="preserve">(o cubren ellos mismos). No se le asigna a un</w:t>
+      </w:r>
+      <w:r>
+        <w:t xml:space="preserve"> </w:t>
+      </w:r>
+      <w:r>
+        <w:rPr>
+          <w:rStyle w:val="VerbatimChar"/>
+        </w:rPr>
+        <w:t xml:space="preserve">freelance</w:t>
+      </w:r>
+      <w:r>
+        <w:t xml:space="preserve">. En una PyME suele concentrarse en una persona.</w:t>
       </w:r>
     </w:p>
     <w:bookmarkEnd w:id="59"/>
@@ -13602,7 +13614,19 @@
         <w:pStyle w:val="FirstParagraph"/>
       </w:pPr>
       <w:r>
-        <w:t xml:space="preserve">empleado</w:t>
+        <w:t xml:space="preserve">empleado con acceso al módulo de redes. No incluye al rol</w:t>
+      </w:r>
+      <w:r>
+        <w:t xml:space="preserve"> </w:t>
+      </w:r>
+      <w:r>
+        <w:rPr>
+          <w:rStyle w:val="VerbatimChar"/>
+        </w:rPr>
+        <w:t xml:space="preserve">freelance</w:t>
+      </w:r>
+      <w:r>
+        <w:t xml:space="preserve">: el vendedor externo no usa el módulo de redes.</w:t>
       </w:r>
     </w:p>
     <w:bookmarkEnd w:id="243"/>
@@ -14249,7 +14273,19 @@
         <w:pStyle w:val="FirstParagraph"/>
       </w:pPr>
       <w:r>
-        <w:t xml:space="preserve">empleado</w:t>
+        <w:t xml:space="preserve">empleado con acceso al módulo de redes. No incluye al rol</w:t>
+      </w:r>
+      <w:r>
+        <w:t xml:space="preserve"> </w:t>
+      </w:r>
+      <w:r>
+        <w:rPr>
+          <w:rStyle w:val="VerbatimChar"/>
+        </w:rPr>
+        <w:t xml:space="preserve">freelance</w:t>
+      </w:r>
+      <w:r>
+        <w:t xml:space="preserve">: el vendedor externo no usa el módulo de redes.</w:t>
       </w:r>
     </w:p>
     <w:bookmarkEnd w:id="253"/>

</xml_diff>

<commit_message>
Entregables: modelo de desarrollo y documento único regenerados con las 59 pantallas
Co-Authored-By: Claude Opus 5.5 <noreply@anthropic.com>
</commit_message>
<xml_diff>
--- a/07-Entregables/Casos de uso/Rumbo — Casos de uso.docx
+++ b/07-Entregables/Casos de uso/Rumbo — Casos de uso.docx
@@ -76,7 +76,7 @@
         </w:p>
       </w:sdtContent>
     </w:sdt>
-    <w:bookmarkStart w:id="50" w:name="introducción"/>
+    <w:bookmarkStart w:id="50" w:name="_introducción"/>
     <w:p>
       <w:pPr>
         <w:pStyle w:val="Heading1"/>
@@ -188,7 +188,7 @@
         <w:t xml:space="preserve">Los casos de uso se agrupan por módulo: Clientes, Oportunidades y cotización, Viajes, Economía y pagos, Alertas, Catálogo de hoteles, Redes, Dashboard, Calendario y Usuarios/Seguridad.</w:t>
       </w:r>
     </w:p>
-    <w:bookmarkStart w:id="49" w:name="convenciones"/>
+    <w:bookmarkStart w:id="49" w:name="_convenciones"/>
     <w:p>
       <w:pPr>
         <w:pStyle w:val="Heading2"/>
@@ -462,7 +462,7 @@
     </w:p>
     <w:bookmarkEnd w:id="49"/>
     <w:bookmarkEnd w:id="50"/>
-    <w:bookmarkStart w:id="54" w:name="diagrama-de-casos-de-uso"/>
+    <w:bookmarkStart w:id="54" w:name="_0e28fd0a4d3ce4f32c8c2c6f51012999e81c079"/>
     <w:p>
       <w:pPr>
         <w:pStyle w:val="Heading1"/>
@@ -527,7 +527,7 @@
       </w:r>
     </w:p>
     <w:bookmarkEnd w:id="54"/>
-    <w:bookmarkStart w:id="61" w:name="actores"/>
+    <w:bookmarkStart w:id="61" w:name="_actores"/>
     <w:p>
       <w:pPr>
         <w:pStyle w:val="Heading1"/>
@@ -544,7 +544,7 @@
         <w:t xml:space="preserve">En una PyME una misma persona puede cubrir varios roles.</w:t>
       </w:r>
     </w:p>
-    <w:bookmarkStart w:id="55" w:name="empleado-asesor-usuario-principal"/>
+    <w:bookmarkStart w:id="55" w:name="_714b8deabe395ced8a6e60fd7261ffdfb2edf05"/>
     <w:p>
       <w:pPr>
         <w:pStyle w:val="Heading2"/>
@@ -622,7 +622,7 @@
       </w:r>
     </w:p>
     <w:bookmarkEnd w:id="55"/>
-    <w:bookmarkStart w:id="56" w:name="administrador-configuración-y-operación"/>
+    <w:bookmarkStart w:id="56" w:name="_35991680d4e6a786826e5436c78c0643863d0f3"/>
     <w:p>
       <w:pPr>
         <w:pStyle w:val="Heading2"/>
@@ -691,7 +691,7 @@
       </w:r>
     </w:p>
     <w:bookmarkEnd w:id="56"/>
-    <w:bookmarkStart w:id="57" w:name="dueñoa-visión-del-negocio"/>
+    <w:bookmarkStart w:id="57" w:name="_ddbf33ac140e93ff06d720c84f0b0107c68180a"/>
     <w:p>
       <w:pPr>
         <w:pStyle w:val="Heading2"/>
@@ -747,7 +747,7 @@
       </w:r>
     </w:p>
     <w:bookmarkEnd w:id="57"/>
-    <w:bookmarkStart w:id="58" w:name="X6c0ef285ed268354d46c074c14239c2805ce85b"/>
+    <w:bookmarkStart w:id="58" w:name="_6c0ef285ed268354d46c074c14239c2805ce85b"/>
     <w:p>
       <w:pPr>
         <w:pStyle w:val="Heading2"/>
@@ -831,7 +831,7 @@
       </w:r>
     </w:p>
     <w:bookmarkEnd w:id="58"/>
-    <w:bookmarkStart w:id="59" w:name="X8f5e30d3a5e8695bc0eada9c82b6705f97940fc"/>
+    <w:bookmarkStart w:id="59" w:name="_8f5e30d3a5e8695bc0eada9c82b6705f97940fc"/>
     <w:p>
       <w:pPr>
         <w:pStyle w:val="Heading2"/>
@@ -932,7 +932,7 @@
       </w:r>
     </w:p>
     <w:bookmarkEnd w:id="59"/>
-    <w:bookmarkStart w:id="60" w:name="pasajero-cliente-actor-externo"/>
+    <w:bookmarkStart w:id="60" w:name="_a550c6261a2d4ef2d9925a03ddec5b0dad31a92"/>
     <w:p>
       <w:pPr>
         <w:pStyle w:val="Heading2"/>
@@ -977,7 +977,7 @@
     </w:p>
     <w:bookmarkEnd w:id="60"/>
     <w:bookmarkEnd w:id="61"/>
-    <w:bookmarkStart w:id="71" w:name="cu-01-de-la-consulta-a-la-venta"/>
+    <w:bookmarkStart w:id="71" w:name="_05e2e2895b68f65d3fbfef502bb6aa663a419b5"/>
     <w:p>
       <w:pPr>
         <w:pStyle w:val="Heading1"/>
@@ -986,7 +986,7 @@
         <w:t xml:space="preserve">CU-01 De la consulta a la venta</w:t>
       </w:r>
     </w:p>
-    <w:bookmarkStart w:id="62" w:name="descripción"/>
+    <w:bookmarkStart w:id="62" w:name="_descripción"/>
     <w:p>
       <w:pPr>
         <w:pStyle w:val="Heading2"/>
@@ -1004,7 +1004,7 @@
       </w:r>
     </w:p>
     <w:bookmarkEnd w:id="62"/>
-    <w:bookmarkStart w:id="63" w:name="actor-principal"/>
+    <w:bookmarkStart w:id="63" w:name="_468685cff39d2ca6117fe9261a8a8a3787325e7"/>
     <w:p>
       <w:pPr>
         <w:pStyle w:val="Heading2"/>
@@ -1055,7 +1055,7 @@
       </w:r>
     </w:p>
     <w:bookmarkEnd w:id="63"/>
-    <w:bookmarkStart w:id="64" w:name="actores-secundarios"/>
+    <w:bookmarkStart w:id="64" w:name="_228b94434b2ab62f7142551317f2632ef70b1d9"/>
     <w:p>
       <w:pPr>
         <w:pStyle w:val="Heading2"/>
@@ -1077,7 +1077,7 @@
       </w:r>
     </w:p>
     <w:bookmarkEnd w:id="64"/>
-    <w:bookmarkStart w:id="65" w:name="precondiciones"/>
+    <w:bookmarkStart w:id="65" w:name="_precondiciones"/>
     <w:p>
       <w:pPr>
         <w:pStyle w:val="Heading2"/>
@@ -1099,7 +1099,7 @@
       </w:r>
     </w:p>
     <w:bookmarkEnd w:id="65"/>
-    <w:bookmarkStart w:id="66" w:name="flujo-principal"/>
+    <w:bookmarkStart w:id="66" w:name="_d35ecbd37d8eccdb5261d6292413d76b9120a0a"/>
     <w:p>
       <w:pPr>
         <w:pStyle w:val="Heading2"/>
@@ -1464,7 +1464,7 @@
       </w:r>
     </w:p>
     <w:bookmarkEnd w:id="66"/>
-    <w:bookmarkStart w:id="67" w:name="flujos-alternativos"/>
+    <w:bookmarkStart w:id="67" w:name="_6e6c713421441a98b72d542dca01c9f99093a39"/>
     <w:p>
       <w:pPr>
         <w:pStyle w:val="Heading2"/>
@@ -1540,7 +1540,7 @@
       </w:r>
     </w:p>
     <w:bookmarkEnd w:id="67"/>
-    <w:bookmarkStart w:id="68" w:name="postcondiciones"/>
+    <w:bookmarkStart w:id="68" w:name="_postcondiciones"/>
     <w:p>
       <w:pPr>
         <w:pStyle w:val="Heading2"/>
@@ -1592,7 +1592,7 @@
       </w:r>
     </w:p>
     <w:bookmarkEnd w:id="68"/>
-    <w:bookmarkStart w:id="69" w:name="reglas-de-negocio-aplicadas"/>
+    <w:bookmarkStart w:id="69" w:name="_acd7c04667154055d6786196e980ff4c12b476c"/>
     <w:p>
       <w:pPr>
         <w:pStyle w:val="Heading2"/>
@@ -1614,7 +1614,7 @@
       </w:r>
     </w:p>
     <w:bookmarkEnd w:id="69"/>
-    <w:bookmarkStart w:id="70" w:name="entidades-del-dominio-involucradas"/>
+    <w:bookmarkStart w:id="70" w:name="_e5650b61a638465dd8c40769a39815ae651aef6"/>
     <w:p>
       <w:pPr>
         <w:pStyle w:val="Heading2"/>
@@ -1637,7 +1637,7 @@
     </w:p>
     <w:bookmarkEnd w:id="70"/>
     <w:bookmarkEnd w:id="71"/>
-    <w:bookmarkStart w:id="81" w:name="cu-02-registrar-cliente"/>
+    <w:bookmarkStart w:id="81" w:name="_5e3ee6c4930a4313d19192bf674701508fcfad4"/>
     <w:p>
       <w:pPr>
         <w:pStyle w:val="Heading1"/>
@@ -1646,7 +1646,7 @@
         <w:t xml:space="preserve">CU-02 Registrar cliente</w:t>
       </w:r>
     </w:p>
-    <w:bookmarkStart w:id="72" w:name="descripción-1"/>
+    <w:bookmarkStart w:id="72" w:name="_11f75c24c22294e6abf69902dabd7bc96c01495"/>
     <w:p>
       <w:pPr>
         <w:pStyle w:val="Heading2"/>
@@ -1677,7 +1677,7 @@
       </w:r>
     </w:p>
     <w:bookmarkEnd w:id="72"/>
-    <w:bookmarkStart w:id="73" w:name="actor-principal-1"/>
+    <w:bookmarkStart w:id="73" w:name="_13fa58cfc70d21d8268a31c55b15133e450c92e"/>
     <w:p>
       <w:pPr>
         <w:pStyle w:val="Heading2"/>
@@ -1695,7 +1695,7 @@
       </w:r>
     </w:p>
     <w:bookmarkEnd w:id="73"/>
-    <w:bookmarkStart w:id="74" w:name="actores-secundarios-1"/>
+    <w:bookmarkStart w:id="74" w:name="_25158fa8bf486c50bee72ec23a39600ea3bfa3b"/>
     <w:p>
       <w:pPr>
         <w:pStyle w:val="Heading2"/>
@@ -1717,7 +1717,7 @@
       </w:r>
     </w:p>
     <w:bookmarkEnd w:id="74"/>
-    <w:bookmarkStart w:id="75" w:name="precondiciones-1"/>
+    <w:bookmarkStart w:id="75" w:name="_fd75a3a1a26c435339477a5e4db1a0f181dc13c"/>
     <w:p>
       <w:pPr>
         <w:pStyle w:val="Heading2"/>
@@ -1739,7 +1739,7 @@
       </w:r>
     </w:p>
     <w:bookmarkEnd w:id="75"/>
-    <w:bookmarkStart w:id="76" w:name="flujo-principal-1"/>
+    <w:bookmarkStart w:id="76" w:name="_51f32711f972b0b7da1ea3b91832eb5ae1a0d66"/>
     <w:p>
       <w:pPr>
         <w:pStyle w:val="Heading2"/>
@@ -1940,7 +1940,7 @@
       </w:r>
     </w:p>
     <w:bookmarkEnd w:id="76"/>
-    <w:bookmarkStart w:id="77" w:name="flujos-alternativos-1"/>
+    <w:bookmarkStart w:id="77" w:name="_f921525ec1da542165c6126e6fa478bcbc39ccf"/>
     <w:p>
       <w:pPr>
         <w:pStyle w:val="Heading2"/>
@@ -2047,7 +2047,7 @@
       </w:r>
     </w:p>
     <w:bookmarkEnd w:id="77"/>
-    <w:bookmarkStart w:id="78" w:name="postcondiciones-1"/>
+    <w:bookmarkStart w:id="78" w:name="_f6cb296c86eb5e1e90ba737470fd50e59749ebc"/>
     <w:p>
       <w:pPr>
         <w:pStyle w:val="Heading2"/>
@@ -2191,7 +2191,7 @@
       </w:r>
     </w:p>
     <w:bookmarkEnd w:id="78"/>
-    <w:bookmarkStart w:id="79" w:name="reglas-de-negocio-aplicadas-1"/>
+    <w:bookmarkStart w:id="79" w:name="_ab16d8b358547b4dd9058534df49fa533b5d049"/>
     <w:p>
       <w:pPr>
         <w:pStyle w:val="Heading2"/>
@@ -2225,7 +2225,7 @@
       </w:r>
     </w:p>
     <w:bookmarkEnd w:id="79"/>
-    <w:bookmarkStart w:id="80" w:name="entidades-del-dominio-involucradas-1"/>
+    <w:bookmarkStart w:id="80" w:name="_25dd548548681cc6ad8cf891c037e9ec34bb065"/>
     <w:p>
       <w:pPr>
         <w:pStyle w:val="Heading2"/>
@@ -2248,7 +2248,7 @@
     </w:p>
     <w:bookmarkEnd w:id="80"/>
     <w:bookmarkEnd w:id="81"/>
-    <w:bookmarkStart w:id="91" w:name="cu-03-gestionar-ficha-del-cliente"/>
+    <w:bookmarkStart w:id="91" w:name="_a4724f6a4b11baf5002ce6b44777bf3a93e81af"/>
     <w:p>
       <w:pPr>
         <w:pStyle w:val="Heading1"/>
@@ -2257,7 +2257,7 @@
         <w:t xml:space="preserve">CU-03 Gestionar ficha del cliente</w:t>
       </w:r>
     </w:p>
-    <w:bookmarkStart w:id="82" w:name="descripción-2"/>
+    <w:bookmarkStart w:id="82" w:name="_754f166cb37bd95a59df1f19a8f7c7b15a0db52"/>
     <w:p>
       <w:pPr>
         <w:pStyle w:val="Heading2"/>
@@ -2291,7 +2291,7 @@
       </w:r>
     </w:p>
     <w:bookmarkEnd w:id="82"/>
-    <w:bookmarkStart w:id="83" w:name="actor-principal-2"/>
+    <w:bookmarkStart w:id="83" w:name="_b45b0e9ef4bd7a9c8f383ba68dfa27196a72fb1"/>
     <w:p>
       <w:pPr>
         <w:pStyle w:val="Heading2"/>
@@ -2309,7 +2309,7 @@
       </w:r>
     </w:p>
     <w:bookmarkEnd w:id="83"/>
-    <w:bookmarkStart w:id="84" w:name="actores-secundarios-2"/>
+    <w:bookmarkStart w:id="84" w:name="_312546c547da5ef03cd88242045e1298dae34f0"/>
     <w:p>
       <w:pPr>
         <w:pStyle w:val="Heading2"/>
@@ -2331,7 +2331,7 @@
       </w:r>
     </w:p>
     <w:bookmarkEnd w:id="84"/>
-    <w:bookmarkStart w:id="85" w:name="precondiciones-2"/>
+    <w:bookmarkStart w:id="85" w:name="_ece99e0f03de36129d804d8841b8a487717ca3f"/>
     <w:p>
       <w:pPr>
         <w:pStyle w:val="Heading2"/>
@@ -2365,7 +2365,7 @@
       </w:r>
     </w:p>
     <w:bookmarkEnd w:id="85"/>
-    <w:bookmarkStart w:id="86" w:name="flujo-principal-2"/>
+    <w:bookmarkStart w:id="86" w:name="_22d4acdc7616c25fdd8b32e7b7ce8d2b74add0e"/>
     <w:p>
       <w:pPr>
         <w:pStyle w:val="Heading2"/>
@@ -2567,7 +2567,7 @@
       </w:r>
     </w:p>
     <w:bookmarkEnd w:id="86"/>
-    <w:bookmarkStart w:id="87" w:name="flujos-alternativos-2"/>
+    <w:bookmarkStart w:id="87" w:name="_37557dacfba68b34f017a83df84999fa4cad4e1"/>
     <w:p>
       <w:pPr>
         <w:pStyle w:val="Heading2"/>
@@ -2643,7 +2643,7 @@
       </w:r>
     </w:p>
     <w:bookmarkEnd w:id="87"/>
-    <w:bookmarkStart w:id="88" w:name="postcondiciones-2"/>
+    <w:bookmarkStart w:id="88" w:name="_35559c5fc5d1e22d50db5bb791a2ec56a4e09dc"/>
     <w:p>
       <w:pPr>
         <w:pStyle w:val="Heading2"/>
@@ -2677,7 +2677,7 @@
       </w:r>
     </w:p>
     <w:bookmarkEnd w:id="88"/>
-    <w:bookmarkStart w:id="89" w:name="reglas-de-negocio-aplicadas-2"/>
+    <w:bookmarkStart w:id="89" w:name="_a5658992e02a95e95b42dbd64c4c1eda6f52be9"/>
     <w:p>
       <w:pPr>
         <w:pStyle w:val="Heading2"/>
@@ -2723,7 +2723,7 @@
       </w:r>
     </w:p>
     <w:bookmarkEnd w:id="89"/>
-    <w:bookmarkStart w:id="90" w:name="entidades-del-dominio-involucradas-2"/>
+    <w:bookmarkStart w:id="90" w:name="_66bb9b721a38362e745ee22f506ed7910c6f67a"/>
     <w:p>
       <w:pPr>
         <w:pStyle w:val="Heading2"/>
@@ -2746,7 +2746,7 @@
     </w:p>
     <w:bookmarkEnd w:id="90"/>
     <w:bookmarkEnd w:id="91"/>
-    <w:bookmarkStart w:id="101" w:name="cu-04-registrar-consulta"/>
+    <w:bookmarkStart w:id="101" w:name="_c0a9681b8130a4c41e2a307583200c166a9a331"/>
     <w:p>
       <w:pPr>
         <w:pStyle w:val="Heading1"/>
@@ -2755,7 +2755,7 @@
         <w:t xml:space="preserve">CU-04 Registrar consulta</w:t>
       </w:r>
     </w:p>
-    <w:bookmarkStart w:id="92" w:name="descripción-3"/>
+    <w:bookmarkStart w:id="92" w:name="_a09adb012b2b9fb351845a12a38225f17f505d7"/>
     <w:p>
       <w:pPr>
         <w:pStyle w:val="Heading2"/>
@@ -2773,7 +2773,7 @@
       </w:r>
     </w:p>
     <w:bookmarkEnd w:id="92"/>
-    <w:bookmarkStart w:id="93" w:name="actor-principal-3"/>
+    <w:bookmarkStart w:id="93" w:name="_41750dbbfabb0297e8b75ea8c2f6898ad189c10"/>
     <w:p>
       <w:pPr>
         <w:pStyle w:val="Heading2"/>
@@ -2791,7 +2791,7 @@
       </w:r>
     </w:p>
     <w:bookmarkEnd w:id="93"/>
-    <w:bookmarkStart w:id="94" w:name="actores-secundarios-3"/>
+    <w:bookmarkStart w:id="94" w:name="_12d6805758238974f88e0b8e86446f4a96695ab"/>
     <w:p>
       <w:pPr>
         <w:pStyle w:val="Heading2"/>
@@ -2813,7 +2813,7 @@
       </w:r>
     </w:p>
     <w:bookmarkEnd w:id="94"/>
-    <w:bookmarkStart w:id="95" w:name="precondiciones-3"/>
+    <w:bookmarkStart w:id="95" w:name="_0a1de8afd097543428a99db9b20267f74bb3955"/>
     <w:p>
       <w:pPr>
         <w:pStyle w:val="Heading2"/>
@@ -2847,7 +2847,7 @@
       </w:r>
     </w:p>
     <w:bookmarkEnd w:id="95"/>
-    <w:bookmarkStart w:id="96" w:name="flujo-principal-3"/>
+    <w:bookmarkStart w:id="96" w:name="_f68060827827a233488cb2d4ea287c3de93ceba"/>
     <w:p>
       <w:pPr>
         <w:pStyle w:val="Heading2"/>
@@ -3038,7 +3038,7 @@
       </w:r>
     </w:p>
     <w:bookmarkEnd w:id="96"/>
-    <w:bookmarkStart w:id="97" w:name="flujos-alternativos-3"/>
+    <w:bookmarkStart w:id="97" w:name="_a1bfd37e8f01a808658bd38ae0b30a122faaa53"/>
     <w:p>
       <w:pPr>
         <w:pStyle w:val="Heading2"/>
@@ -3191,7 +3191,7 @@
       </w:r>
     </w:p>
     <w:bookmarkEnd w:id="97"/>
-    <w:bookmarkStart w:id="98" w:name="postcondiciones-3"/>
+    <w:bookmarkStart w:id="98" w:name="_40195a2906f9c608187ea93daeef936cd4553c1"/>
     <w:p>
       <w:pPr>
         <w:pStyle w:val="Heading2"/>
@@ -3317,7 +3317,7 @@
       </w:r>
     </w:p>
     <w:bookmarkEnd w:id="98"/>
-    <w:bookmarkStart w:id="99" w:name="reglas-de-negocio-aplicadas-3"/>
+    <w:bookmarkStart w:id="99" w:name="_6ea0960b4677555641e09a5bd25d2b3a86b39c8"/>
     <w:p>
       <w:pPr>
         <w:pStyle w:val="Heading2"/>
@@ -3339,7 +3339,7 @@
       </w:r>
     </w:p>
     <w:bookmarkEnd w:id="99"/>
-    <w:bookmarkStart w:id="100" w:name="entidades-del-dominio-involucradas-3"/>
+    <w:bookmarkStart w:id="100" w:name="_df38222f90e1268cab2dc952cd33fdbfc269d9b"/>
     <w:p>
       <w:pPr>
         <w:pStyle w:val="Heading2"/>
@@ -3362,7 +3362,7 @@
     </w:p>
     <w:bookmarkEnd w:id="100"/>
     <w:bookmarkEnd w:id="101"/>
-    <w:bookmarkStart w:id="111" w:name="cu-05-seguir-oportunidad"/>
+    <w:bookmarkStart w:id="111" w:name="_2661a4419e886e64b677b58fbadf6651e177087"/>
     <w:p>
       <w:pPr>
         <w:pStyle w:val="Heading1"/>
@@ -3371,7 +3371,7 @@
         <w:t xml:space="preserve">CU-05 Seguir oportunidad</w:t>
       </w:r>
     </w:p>
-    <w:bookmarkStart w:id="102" w:name="descripción-4"/>
+    <w:bookmarkStart w:id="102" w:name="_30ae283446c7320273ace3602b2ca2c6d7f060f"/>
     <w:p>
       <w:pPr>
         <w:pStyle w:val="Heading2"/>
@@ -3421,7 +3421,7 @@
       </w:r>
     </w:p>
     <w:bookmarkEnd w:id="102"/>
-    <w:bookmarkStart w:id="103" w:name="actor-principal-4"/>
+    <w:bookmarkStart w:id="103" w:name="_593d02616d7f14b04fe25f14d5b5a9fa3f27b1f"/>
     <w:p>
       <w:pPr>
         <w:pStyle w:val="Heading2"/>
@@ -3454,7 +3454,7 @@
       </w:r>
     </w:p>
     <w:bookmarkEnd w:id="103"/>
-    <w:bookmarkStart w:id="104" w:name="actores-secundarios-4"/>
+    <w:bookmarkStart w:id="104" w:name="_4e402ed1835b4ca47737e94131678e901a1011c"/>
     <w:p>
       <w:pPr>
         <w:pStyle w:val="Heading2"/>
@@ -3476,7 +3476,7 @@
       </w:r>
     </w:p>
     <w:bookmarkEnd w:id="104"/>
-    <w:bookmarkStart w:id="105" w:name="precondiciones-4"/>
+    <w:bookmarkStart w:id="105" w:name="_2a0306f36db270c24df1f5350bc76e95178d039"/>
     <w:p>
       <w:pPr>
         <w:pStyle w:val="Heading2"/>
@@ -3552,7 +3552,7 @@
       </w:r>
     </w:p>
     <w:bookmarkEnd w:id="105"/>
-    <w:bookmarkStart w:id="106" w:name="flujo-principal-4"/>
+    <w:bookmarkStart w:id="106" w:name="_ec491eeb8b969c5a2b3e4d25c0944ce5b3729c7"/>
     <w:p>
       <w:pPr>
         <w:pStyle w:val="Heading2"/>
@@ -3819,7 +3819,7 @@
       </w:r>
     </w:p>
     <w:bookmarkEnd w:id="106"/>
-    <w:bookmarkStart w:id="107" w:name="flujos-alternativos-4"/>
+    <w:bookmarkStart w:id="107" w:name="_91f0955e5ee5ac7dd529d4c8849b1a15669e86b"/>
     <w:p>
       <w:pPr>
         <w:pStyle w:val="Heading2"/>
@@ -3990,7 +3990,7 @@
       </w:r>
     </w:p>
     <w:bookmarkEnd w:id="107"/>
-    <w:bookmarkStart w:id="108" w:name="postcondiciones-4"/>
+    <w:bookmarkStart w:id="108" w:name="_595c45a27432a941047410532915ea7c09bf1c6"/>
     <w:p>
       <w:pPr>
         <w:pStyle w:val="Heading2"/>
@@ -4048,7 +4048,7 @@
       </w:r>
     </w:p>
     <w:bookmarkEnd w:id="108"/>
-    <w:bookmarkStart w:id="109" w:name="reglas-de-negocio-aplicadas-4"/>
+    <w:bookmarkStart w:id="109" w:name="_ee5b430a4adbd55c077c1a61f38aaf17a680a99"/>
     <w:p>
       <w:pPr>
         <w:pStyle w:val="Heading2"/>
@@ -4133,7 +4133,7 @@
       </w:r>
     </w:p>
     <w:bookmarkEnd w:id="109"/>
-    <w:bookmarkStart w:id="110" w:name="entidades-del-dominio-involucradas-4"/>
+    <w:bookmarkStart w:id="110" w:name="_eab1c4d606c4bdcd1295f4a856a7c8e2d8f0166"/>
     <w:p>
       <w:pPr>
         <w:pStyle w:val="Heading2"/>
@@ -4156,7 +4156,7 @@
     </w:p>
     <w:bookmarkEnd w:id="110"/>
     <w:bookmarkEnd w:id="111"/>
-    <w:bookmarkStart w:id="121" w:name="cu-06-emitir-cotización"/>
+    <w:bookmarkStart w:id="121" w:name="_f846b894ab1530b2f1a6a337ddba1e92fc0719e"/>
     <w:p>
       <w:pPr>
         <w:pStyle w:val="Heading1"/>
@@ -4165,7 +4165,7 @@
         <w:t xml:space="preserve">CU-06 Emitir cotización</w:t>
       </w:r>
     </w:p>
-    <w:bookmarkStart w:id="112" w:name="descripción-5"/>
+    <w:bookmarkStart w:id="112" w:name="_10dc8fe1f348eac9669ae3c785d773d2fcc2954"/>
     <w:p>
       <w:pPr>
         <w:pStyle w:val="Heading2"/>
@@ -4212,7 +4212,7 @@
       </w:r>
     </w:p>
     <w:bookmarkEnd w:id="112"/>
-    <w:bookmarkStart w:id="113" w:name="actor-principal-5"/>
+    <w:bookmarkStart w:id="113" w:name="_a656b0a260bbb1d664f922b3d9ae23e6fc6cb8f"/>
     <w:p>
       <w:pPr>
         <w:pStyle w:val="Heading2"/>
@@ -4230,7 +4230,7 @@
       </w:r>
     </w:p>
     <w:bookmarkEnd w:id="113"/>
-    <w:bookmarkStart w:id="114" w:name="actores-secundarios-5"/>
+    <w:bookmarkStart w:id="114" w:name="_31e0cd65fa8741a1e06d13e5b30869272e956aa"/>
     <w:p>
       <w:pPr>
         <w:pStyle w:val="Heading2"/>
@@ -4252,7 +4252,7 @@
       </w:r>
     </w:p>
     <w:bookmarkEnd w:id="114"/>
-    <w:bookmarkStart w:id="115" w:name="precondiciones-5"/>
+    <w:bookmarkStart w:id="115" w:name="_20ebfb532f49466b614aee6d8e2c107dc9ad2da"/>
     <w:p>
       <w:pPr>
         <w:pStyle w:val="Heading2"/>
@@ -4286,7 +4286,7 @@
       </w:r>
     </w:p>
     <w:bookmarkEnd w:id="115"/>
-    <w:bookmarkStart w:id="116" w:name="flujo-principal-5"/>
+    <w:bookmarkStart w:id="116" w:name="_f56041d44d989a617f0381b5c459153f91a78f0"/>
     <w:p>
       <w:pPr>
         <w:pStyle w:val="Heading2"/>
@@ -4575,7 +4575,7 @@
       </w:r>
     </w:p>
     <w:bookmarkEnd w:id="116"/>
-    <w:bookmarkStart w:id="117" w:name="flujos-alternativos-5"/>
+    <w:bookmarkStart w:id="117" w:name="_f3307dd15b3bbc3c1e3856c248be4714d231a60"/>
     <w:p>
       <w:pPr>
         <w:pStyle w:val="Heading2"/>
@@ -4883,7 +4883,7 @@
       </w:r>
     </w:p>
     <w:bookmarkEnd w:id="117"/>
-    <w:bookmarkStart w:id="118" w:name="postcondiciones-5"/>
+    <w:bookmarkStart w:id="118" w:name="_18922126579fd92345f088fc42004a408575ed0"/>
     <w:p>
       <w:pPr>
         <w:pStyle w:val="Heading2"/>
@@ -4905,7 +4905,7 @@
       </w:r>
     </w:p>
     <w:bookmarkEnd w:id="118"/>
-    <w:bookmarkStart w:id="119" w:name="reglas-de-negocio-aplicadas-5"/>
+    <w:bookmarkStart w:id="119" w:name="_0010f21ca59c95e898fbd053c0414f33848070d"/>
     <w:p>
       <w:pPr>
         <w:pStyle w:val="Heading2"/>
@@ -4984,7 +4984,7 @@
       </w:r>
     </w:p>
     <w:bookmarkEnd w:id="119"/>
-    <w:bookmarkStart w:id="120" w:name="entidades-del-dominio-involucradas-5"/>
+    <w:bookmarkStart w:id="120" w:name="_b5186136f1c803bc4a55b799ffc8537144ed47c"/>
     <w:p>
       <w:pPr>
         <w:pStyle w:val="Heading2"/>
@@ -5007,7 +5007,7 @@
     </w:p>
     <w:bookmarkEnd w:id="120"/>
     <w:bookmarkEnd w:id="121"/>
-    <w:bookmarkStart w:id="131" w:name="cu-07-confirmar-reserva"/>
+    <w:bookmarkStart w:id="131" w:name="_cafb1546c01a8f7eb60cbefaed7bb0640ea60ab"/>
     <w:p>
       <w:pPr>
         <w:pStyle w:val="Heading1"/>
@@ -5016,7 +5016,7 @@
         <w:t xml:space="preserve">CU-07 Confirmar reserva</w:t>
       </w:r>
     </w:p>
-    <w:bookmarkStart w:id="122" w:name="descripción-6"/>
+    <w:bookmarkStart w:id="122" w:name="_e536aea01158c8c720dd8ebd7dad1e17834f68e"/>
     <w:p>
       <w:pPr>
         <w:pStyle w:val="Heading2"/>
@@ -5122,7 +5122,7 @@
       </w:r>
     </w:p>
     <w:bookmarkEnd w:id="122"/>
-    <w:bookmarkStart w:id="123" w:name="actor-principal-6"/>
+    <w:bookmarkStart w:id="123" w:name="_208b4fe5ccab9a8fa162645bf2f7f934be3faed"/>
     <w:p>
       <w:pPr>
         <w:pStyle w:val="Heading2"/>
@@ -5140,7 +5140,7 @@
       </w:r>
     </w:p>
     <w:bookmarkEnd w:id="123"/>
-    <w:bookmarkStart w:id="124" w:name="actores-secundarios-6"/>
+    <w:bookmarkStart w:id="124" w:name="_be3ff2511b098336eaab8bc39187895e968d240"/>
     <w:p>
       <w:pPr>
         <w:pStyle w:val="Heading2"/>
@@ -5162,7 +5162,7 @@
       </w:r>
     </w:p>
     <w:bookmarkEnd w:id="124"/>
-    <w:bookmarkStart w:id="125" w:name="precondiciones-6"/>
+    <w:bookmarkStart w:id="125" w:name="_093fefbc641afd5d8586ee762c464ed56db4f69"/>
     <w:p>
       <w:pPr>
         <w:pStyle w:val="Heading2"/>
@@ -5226,7 +5226,7 @@
       </w:r>
     </w:p>
     <w:bookmarkEnd w:id="125"/>
-    <w:bookmarkStart w:id="126" w:name="flujo-principal-6"/>
+    <w:bookmarkStart w:id="126" w:name="_86aee4e1a2a1348002414e54812812eea25a19c"/>
     <w:p>
       <w:pPr>
         <w:pStyle w:val="Heading2"/>
@@ -5568,7 +5568,7 @@
       </w:r>
     </w:p>
     <w:bookmarkEnd w:id="126"/>
-    <w:bookmarkStart w:id="127" w:name="flujos-alternativos-6"/>
+    <w:bookmarkStart w:id="127" w:name="_3b9bf82f1c7dbeb2869ebc5f629c11933877365"/>
     <w:p>
       <w:pPr>
         <w:pStyle w:val="Heading2"/>
@@ -5659,7 +5659,7 @@
       </w:r>
     </w:p>
     <w:bookmarkEnd w:id="127"/>
-    <w:bookmarkStart w:id="128" w:name="postcondiciones-6"/>
+    <w:bookmarkStart w:id="128" w:name="_33c87a53604370b18a327f941a64d6247c41a36"/>
     <w:p>
       <w:pPr>
         <w:pStyle w:val="Heading2"/>
@@ -5754,7 +5754,7 @@
       </w:r>
     </w:p>
     <w:bookmarkEnd w:id="128"/>
-    <w:bookmarkStart w:id="129" w:name="reglas-de-negocio-aplicadas-6"/>
+    <w:bookmarkStart w:id="129" w:name="_5ecb430ab107352f81bfd673b9df424f1e2f214"/>
     <w:p>
       <w:pPr>
         <w:pStyle w:val="Heading2"/>
@@ -5819,7 +5819,7 @@
       </w:r>
     </w:p>
     <w:bookmarkEnd w:id="129"/>
-    <w:bookmarkStart w:id="130" w:name="entidades-del-dominio-involucradas-6"/>
+    <w:bookmarkStart w:id="130" w:name="_ac25aebaf46bb0e65aaa6d754a1be7a6e01a1f1"/>
     <w:p>
       <w:pPr>
         <w:pStyle w:val="Heading2"/>
@@ -5842,7 +5842,7 @@
     </w:p>
     <w:bookmarkEnd w:id="130"/>
     <w:bookmarkEnd w:id="131"/>
-    <w:bookmarkStart w:id="141" w:name="cu-08-gestionar-estado-del-viaje"/>
+    <w:bookmarkStart w:id="141" w:name="_02cdcdb2116a5f8d58bbe863441bb01782ff65c"/>
     <w:p>
       <w:pPr>
         <w:pStyle w:val="Heading1"/>
@@ -5851,7 +5851,7 @@
         <w:t xml:space="preserve">CU-08 Gestionar estado del viaje</w:t>
       </w:r>
     </w:p>
-    <w:bookmarkStart w:id="132" w:name="descripción-7"/>
+    <w:bookmarkStart w:id="132" w:name="_180be74e5ebd1ad15ca9cc5edd424b57268d4bb"/>
     <w:p>
       <w:pPr>
         <w:pStyle w:val="Heading2"/>
@@ -5894,7 +5894,7 @@
       </w:r>
     </w:p>
     <w:bookmarkEnd w:id="132"/>
-    <w:bookmarkStart w:id="133" w:name="actor-principal-7"/>
+    <w:bookmarkStart w:id="133" w:name="_10853f31452e410a59ff074ae409c5d95fed2b4"/>
     <w:p>
       <w:pPr>
         <w:pStyle w:val="Heading2"/>
@@ -5927,7 +5927,7 @@
       </w:r>
     </w:p>
     <w:bookmarkEnd w:id="133"/>
-    <w:bookmarkStart w:id="134" w:name="actores-secundarios-7"/>
+    <w:bookmarkStart w:id="134" w:name="_9be7d2dcf6037001d112945d5a4cde7fc01ea38"/>
     <w:p>
       <w:pPr>
         <w:pStyle w:val="Heading2"/>
@@ -5937,7 +5937,7 @@
       </w:r>
     </w:p>
     <w:bookmarkEnd w:id="134"/>
-    <w:bookmarkStart w:id="135" w:name="precondiciones-7"/>
+    <w:bookmarkStart w:id="135" w:name="_40504f51f6af8c458325ff1be96e3615c6f2389"/>
     <w:p>
       <w:pPr>
         <w:pStyle w:val="Heading2"/>
@@ -5971,7 +5971,7 @@
       </w:r>
     </w:p>
     <w:bookmarkEnd w:id="135"/>
-    <w:bookmarkStart w:id="136" w:name="flujo-principal-7"/>
+    <w:bookmarkStart w:id="136" w:name="_667aeeeec803260770a1fddee6d85d2f3098503"/>
     <w:p>
       <w:pPr>
         <w:pStyle w:val="Heading2"/>
@@ -6275,7 +6275,7 @@
       </w:r>
     </w:p>
     <w:bookmarkEnd w:id="136"/>
-    <w:bookmarkStart w:id="137" w:name="flujos-alternativos-7"/>
+    <w:bookmarkStart w:id="137" w:name="_016c4670332c5fee6c2f4cf1ca379a7bda0717c"/>
     <w:p>
       <w:pPr>
         <w:pStyle w:val="Heading2"/>
@@ -6480,7 +6480,7 @@
       </w:r>
     </w:p>
     <w:bookmarkEnd w:id="137"/>
-    <w:bookmarkStart w:id="138" w:name="postcondiciones-7"/>
+    <w:bookmarkStart w:id="138" w:name="_f2c6e663179843f59860986642d16d3d733ed85"/>
     <w:p>
       <w:pPr>
         <w:pStyle w:val="Heading2"/>
@@ -6502,7 +6502,7 @@
       </w:r>
     </w:p>
     <w:bookmarkEnd w:id="138"/>
-    <w:bookmarkStart w:id="139" w:name="reglas-de-negocio-aplicadas-7"/>
+    <w:bookmarkStart w:id="139" w:name="_0e949d9bf1b7a75b7e7867ea497b1d8902919b0"/>
     <w:p>
       <w:pPr>
         <w:pStyle w:val="Heading2"/>
@@ -6658,7 +6658,7 @@
       </w:r>
     </w:p>
     <w:bookmarkEnd w:id="139"/>
-    <w:bookmarkStart w:id="140" w:name="entidades-del-dominio-involucradas-7"/>
+    <w:bookmarkStart w:id="140" w:name="_37e274dbd24cf5f0146e005066d7c2082a53a3a"/>
     <w:p>
       <w:pPr>
         <w:pStyle w:val="Heading2"/>
@@ -6681,7 +6681,7 @@
     </w:p>
     <w:bookmarkEnd w:id="140"/>
     <w:bookmarkEnd w:id="141"/>
-    <w:bookmarkStart w:id="151" w:name="cu-09-armar-itinerario-de-hoteles"/>
+    <w:bookmarkStart w:id="151" w:name="_bc59274a0c76728cd21372a0316c6ff14a9a6b6"/>
     <w:p>
       <w:pPr>
         <w:pStyle w:val="Heading1"/>
@@ -6690,7 +6690,7 @@
         <w:t xml:space="preserve">CU-09 Armar itinerario de hoteles</w:t>
       </w:r>
     </w:p>
-    <w:bookmarkStart w:id="142" w:name="descripción-8"/>
+    <w:bookmarkStart w:id="142" w:name="_8fadba2b7301108dd2d6bd68dd049b8b559ab15"/>
     <w:p>
       <w:pPr>
         <w:pStyle w:val="Heading2"/>
@@ -6724,7 +6724,7 @@
       </w:r>
     </w:p>
     <w:bookmarkEnd w:id="142"/>
-    <w:bookmarkStart w:id="143" w:name="actor-principal-8"/>
+    <w:bookmarkStart w:id="143" w:name="_8c55db69971ecd395f3fb54162f81f3cb26adf7"/>
     <w:p>
       <w:pPr>
         <w:pStyle w:val="Heading2"/>
@@ -6742,7 +6742,7 @@
       </w:r>
     </w:p>
     <w:bookmarkEnd w:id="143"/>
-    <w:bookmarkStart w:id="144" w:name="actores-secundarios-8"/>
+    <w:bookmarkStart w:id="144" w:name="_0401512daf8a15f09b419f5f3a5cfde647c9ea1"/>
     <w:p>
       <w:pPr>
         <w:pStyle w:val="Heading2"/>
@@ -6752,7 +6752,7 @@
       </w:r>
     </w:p>
     <w:bookmarkEnd w:id="144"/>
-    <w:bookmarkStart w:id="145" w:name="precondiciones-8"/>
+    <w:bookmarkStart w:id="145" w:name="_71f54b31b2be12dec66a302a0dc3bcb2955e5b7"/>
     <w:p>
       <w:pPr>
         <w:pStyle w:val="Heading2"/>
@@ -6786,7 +6786,7 @@
       </w:r>
     </w:p>
     <w:bookmarkEnd w:id="145"/>
-    <w:bookmarkStart w:id="146" w:name="flujo-principal-8"/>
+    <w:bookmarkStart w:id="146" w:name="_6eb1769fe5ed27e12470ac7b6df2052c90011c8"/>
     <w:p>
       <w:pPr>
         <w:pStyle w:val="Heading2"/>
@@ -6973,7 +6973,7 @@
       </w:r>
     </w:p>
     <w:bookmarkEnd w:id="146"/>
-    <w:bookmarkStart w:id="147" w:name="flujos-alternativos-8"/>
+    <w:bookmarkStart w:id="147" w:name="_460b81b27ba02ad4a2b6016424c354bbfaca83c"/>
     <w:p>
       <w:pPr>
         <w:pStyle w:val="Heading2"/>
@@ -7187,7 +7187,7 @@
       </w:r>
     </w:p>
     <w:bookmarkEnd w:id="147"/>
-    <w:bookmarkStart w:id="148" w:name="postcondiciones-8"/>
+    <w:bookmarkStart w:id="148" w:name="_25d874de7c14dbb758929b58a196bc2f2225ad3"/>
     <w:p>
       <w:pPr>
         <w:pStyle w:val="Heading2"/>
@@ -7209,7 +7209,7 @@
       </w:r>
     </w:p>
     <w:bookmarkEnd w:id="148"/>
-    <w:bookmarkStart w:id="149" w:name="reglas-de-negocio-aplicadas-8"/>
+    <w:bookmarkStart w:id="149" w:name="_8d8c5e4b048c198f21ac7a2aab5c02b4cf026fb"/>
     <w:p>
       <w:pPr>
         <w:pStyle w:val="Heading2"/>
@@ -7402,7 +7402,7 @@
       </w:r>
     </w:p>
     <w:bookmarkEnd w:id="149"/>
-    <w:bookmarkStart w:id="150" w:name="entidades-del-dominio-involucradas-8"/>
+    <w:bookmarkStart w:id="150" w:name="_bd33f75177d1c517a5a1b323ad416b8becfb7c0"/>
     <w:p>
       <w:pPr>
         <w:pStyle w:val="Heading2"/>
@@ -7437,7 +7437,7 @@
     </w:p>
     <w:bookmarkEnd w:id="150"/>
     <w:bookmarkEnd w:id="151"/>
-    <w:bookmarkStart w:id="161" w:name="cu-10-registrar-economía-del-viaje"/>
+    <w:bookmarkStart w:id="161" w:name="_31e50c310e3d1391b8f83f8aa472fba46308a39"/>
     <w:p>
       <w:pPr>
         <w:pStyle w:val="Heading1"/>
@@ -7446,7 +7446,7 @@
         <w:t xml:space="preserve">CU-10 Registrar economía del viaje</w:t>
       </w:r>
     </w:p>
-    <w:bookmarkStart w:id="152" w:name="descripción-9"/>
+    <w:bookmarkStart w:id="152" w:name="_45ba84089a2189e49731d95e3441e1dc0d91540"/>
     <w:p>
       <w:pPr>
         <w:pStyle w:val="Heading2"/>
@@ -7518,7 +7518,7 @@
       </w:r>
     </w:p>
     <w:bookmarkEnd w:id="152"/>
-    <w:bookmarkStart w:id="153" w:name="actor-principal-9"/>
+    <w:bookmarkStart w:id="153" w:name="_67463de5399a05d52139bfdc88fde96770acff1"/>
     <w:p>
       <w:pPr>
         <w:pStyle w:val="Heading2"/>
@@ -7536,7 +7536,7 @@
       </w:r>
     </w:p>
     <w:bookmarkEnd w:id="153"/>
-    <w:bookmarkStart w:id="154" w:name="actores-secundarios-9"/>
+    <w:bookmarkStart w:id="154" w:name="_2a68552745066c9fed90fc6c9628bc6a7e60470"/>
     <w:p>
       <w:pPr>
         <w:pStyle w:val="Heading2"/>
@@ -7558,7 +7558,7 @@
       </w:r>
     </w:p>
     <w:bookmarkEnd w:id="154"/>
-    <w:bookmarkStart w:id="155" w:name="precondiciones-9"/>
+    <w:bookmarkStart w:id="155" w:name="_2e294829c65de519f729625d488c0f96ef36a92"/>
     <w:p>
       <w:pPr>
         <w:pStyle w:val="Heading2"/>
@@ -7622,7 +7622,7 @@
       </w:r>
     </w:p>
     <w:bookmarkEnd w:id="155"/>
-    <w:bookmarkStart w:id="156" w:name="flujo-principal-9"/>
+    <w:bookmarkStart w:id="156" w:name="_a0e63916090109ad0369f5900c93a3701f519c7"/>
     <w:p>
       <w:pPr>
         <w:pStyle w:val="Heading2"/>
@@ -7867,7 +7867,7 @@
       </w:r>
     </w:p>
     <w:bookmarkEnd w:id="156"/>
-    <w:bookmarkStart w:id="157" w:name="flujos-alternativos-9"/>
+    <w:bookmarkStart w:id="157" w:name="_6a5c606f59e46a8fd0b487a9c126799341f953f"/>
     <w:p>
       <w:pPr>
         <w:pStyle w:val="Heading2"/>
@@ -8097,7 +8097,7 @@
       </w:r>
     </w:p>
     <w:bookmarkEnd w:id="157"/>
-    <w:bookmarkStart w:id="158" w:name="postcondiciones-9"/>
+    <w:bookmarkStart w:id="158" w:name="_9f6eb1b2576d786b4aae5bd328b0013d41b145b"/>
     <w:p>
       <w:pPr>
         <w:pStyle w:val="Heading2"/>
@@ -8227,7 +8227,7 @@
       </w:r>
     </w:p>
     <w:bookmarkEnd w:id="158"/>
-    <w:bookmarkStart w:id="159" w:name="reglas-de-negocio-aplicadas-9"/>
+    <w:bookmarkStart w:id="159" w:name="_db9450f8d3007a7eb5d4d5c367bba1ab45675be"/>
     <w:p>
       <w:pPr>
         <w:pStyle w:val="Heading2"/>
@@ -8249,7 +8249,7 @@
       </w:r>
     </w:p>
     <w:bookmarkEnd w:id="159"/>
-    <w:bookmarkStart w:id="160" w:name="entidades-del-dominio-involucradas-9"/>
+    <w:bookmarkStart w:id="160" w:name="_08510357e13044d0b6fcb573f9ef2ded98f375a"/>
     <w:p>
       <w:pPr>
         <w:pStyle w:val="Heading2"/>
@@ -8272,7 +8272,7 @@
     </w:p>
     <w:bookmarkEnd w:id="160"/>
     <w:bookmarkEnd w:id="161"/>
-    <w:bookmarkStart w:id="171" w:name="cu-11-definir-plan-de-cuotas"/>
+    <w:bookmarkStart w:id="171" w:name="_9fc36f2edbb342598a3b46302434346d812c096"/>
     <w:p>
       <w:pPr>
         <w:pStyle w:val="Heading1"/>
@@ -8281,7 +8281,7 @@
         <w:t xml:space="preserve">CU-11 Definir plan de cuotas</w:t>
       </w:r>
     </w:p>
-    <w:bookmarkStart w:id="162" w:name="descripción-10"/>
+    <w:bookmarkStart w:id="162" w:name="_d2392ba15e6d8530edfd602a73e970bcb8855df"/>
     <w:p>
       <w:pPr>
         <w:pStyle w:val="Heading2"/>
@@ -8299,7 +8299,7 @@
       </w:r>
     </w:p>
     <w:bookmarkEnd w:id="162"/>
-    <w:bookmarkStart w:id="163" w:name="actor-principal-10"/>
+    <w:bookmarkStart w:id="163" w:name="_72b33bee9888f2ef423c355f2d0400fab833b20"/>
     <w:p>
       <w:pPr>
         <w:pStyle w:val="Heading2"/>
@@ -8317,7 +8317,7 @@
       </w:r>
     </w:p>
     <w:bookmarkEnd w:id="163"/>
-    <w:bookmarkStart w:id="164" w:name="actores-secundarios-10"/>
+    <w:bookmarkStart w:id="164" w:name="_9864e036dd0f22d9f2625a28fd44a3099041f78"/>
     <w:p>
       <w:pPr>
         <w:pStyle w:val="Heading2"/>
@@ -8339,7 +8339,7 @@
       </w:r>
     </w:p>
     <w:bookmarkEnd w:id="164"/>
-    <w:bookmarkStart w:id="165" w:name="precondiciones-10"/>
+    <w:bookmarkStart w:id="165" w:name="_f62d18a073dffeda4ac981ee1d345cdfe6e1122"/>
     <w:p>
       <w:pPr>
         <w:pStyle w:val="Heading2"/>
@@ -8373,7 +8373,7 @@
       </w:r>
     </w:p>
     <w:bookmarkEnd w:id="165"/>
-    <w:bookmarkStart w:id="166" w:name="flujo-principal-10"/>
+    <w:bookmarkStart w:id="166" w:name="_f1ed915b0b033ec5e2fc4f26b90c692becf80cd"/>
     <w:p>
       <w:pPr>
         <w:pStyle w:val="Heading2"/>
@@ -8619,7 +8619,7 @@
       </w:r>
     </w:p>
     <w:bookmarkEnd w:id="166"/>
-    <w:bookmarkStart w:id="167" w:name="flujos-alternativos-10"/>
+    <w:bookmarkStart w:id="167" w:name="_cdb423890cdd558b94221b2fce46784beba8d95"/>
     <w:p>
       <w:pPr>
         <w:pStyle w:val="Heading2"/>
@@ -9022,7 +9022,7 @@
       </w:r>
     </w:p>
     <w:bookmarkEnd w:id="167"/>
-    <w:bookmarkStart w:id="168" w:name="postcondiciones-10"/>
+    <w:bookmarkStart w:id="168" w:name="_470e91eef74b4ef144eb4e3fbe12a6c1232e808"/>
     <w:p>
       <w:pPr>
         <w:pStyle w:val="Heading2"/>
@@ -9044,7 +9044,7 @@
       </w:r>
     </w:p>
     <w:bookmarkEnd w:id="168"/>
-    <w:bookmarkStart w:id="169" w:name="reglas-de-negocio-aplicadas-10"/>
+    <w:bookmarkStart w:id="169" w:name="_0391ee754512520247df3a1fa6d99f2858fa706"/>
     <w:p>
       <w:pPr>
         <w:pStyle w:val="Heading2"/>
@@ -9174,7 +9174,7 @@
       </w:r>
     </w:p>
     <w:bookmarkEnd w:id="169"/>
-    <w:bookmarkStart w:id="170" w:name="entidades-del-dominio-involucradas-10"/>
+    <w:bookmarkStart w:id="170" w:name="_a4dc5934367daaf68fece1d7e2b90ce197f2551"/>
     <w:p>
       <w:pPr>
         <w:pStyle w:val="Heading2"/>
@@ -9197,7 +9197,7 @@
     </w:p>
     <w:bookmarkEnd w:id="170"/>
     <w:bookmarkEnd w:id="171"/>
-    <w:bookmarkStart w:id="181" w:name="cu-12-registrar-cobro-de-un-pago"/>
+    <w:bookmarkStart w:id="181" w:name="_4f0257a6d51c553fbc1fadd6d2b2b3818850d9f"/>
     <w:p>
       <w:pPr>
         <w:pStyle w:val="Heading1"/>
@@ -9206,7 +9206,7 @@
         <w:t xml:space="preserve">CU-12 Registrar cobro de un pago</w:t>
       </w:r>
     </w:p>
-    <w:bookmarkStart w:id="172" w:name="descripción-11"/>
+    <w:bookmarkStart w:id="172" w:name="_4fa12c971fe393d93fb6090d9c2732ed6c88455"/>
     <w:p>
       <w:pPr>
         <w:pStyle w:val="Heading2"/>
@@ -9240,7 +9240,7 @@
       </w:r>
     </w:p>
     <w:bookmarkEnd w:id="172"/>
-    <w:bookmarkStart w:id="173" w:name="actor-principal-11"/>
+    <w:bookmarkStart w:id="173" w:name="_405371449db4566ec6935dcba12ae671362d807"/>
     <w:p>
       <w:pPr>
         <w:pStyle w:val="Heading2"/>
@@ -9258,7 +9258,7 @@
       </w:r>
     </w:p>
     <w:bookmarkEnd w:id="173"/>
-    <w:bookmarkStart w:id="174" w:name="actores-secundarios-11"/>
+    <w:bookmarkStart w:id="174" w:name="_b98c31b5fb5bfcd4f4d0bacad77604332eccd08"/>
     <w:p>
       <w:pPr>
         <w:pStyle w:val="Heading2"/>
@@ -9268,7 +9268,7 @@
       </w:r>
     </w:p>
     <w:bookmarkEnd w:id="174"/>
-    <w:bookmarkStart w:id="175" w:name="precondiciones-11"/>
+    <w:bookmarkStart w:id="175" w:name="_8602c01fc4539ca9ac4e22a84e1c3f72ac3c201"/>
     <w:p>
       <w:pPr>
         <w:pStyle w:val="Heading2"/>
@@ -9320,7 +9320,7 @@
       </w:r>
     </w:p>
     <w:bookmarkEnd w:id="175"/>
-    <w:bookmarkStart w:id="176" w:name="flujo-principal-11"/>
+    <w:bookmarkStart w:id="176" w:name="_b1dd2b6a5b3afd6f622818421c5115365937964"/>
     <w:p>
       <w:pPr>
         <w:pStyle w:val="Heading2"/>
@@ -9589,7 +9589,7 @@
       </w:r>
     </w:p>
     <w:bookmarkEnd w:id="176"/>
-    <w:bookmarkStart w:id="177" w:name="flujos-alternativos-11"/>
+    <w:bookmarkStart w:id="177" w:name="_f6ba925520183a60d0e334e73304283f422beff"/>
     <w:p>
       <w:pPr>
         <w:pStyle w:val="Heading2"/>
@@ -9942,7 +9942,7 @@
       </w:r>
     </w:p>
     <w:bookmarkEnd w:id="177"/>
-    <w:bookmarkStart w:id="178" w:name="postcondiciones-11"/>
+    <w:bookmarkStart w:id="178" w:name="_8e3846e5a047330431ebb601eba21071110f86b"/>
     <w:p>
       <w:pPr>
         <w:pStyle w:val="Heading2"/>
@@ -9976,7 +9976,7 @@
       </w:r>
     </w:p>
     <w:bookmarkEnd w:id="178"/>
-    <w:bookmarkStart w:id="179" w:name="reglas-de-negocio-aplicadas-11"/>
+    <w:bookmarkStart w:id="179" w:name="_b3b55a660fd13b2f4fc7df6c5ad66b0ebe2c00c"/>
     <w:p>
       <w:pPr>
         <w:pStyle w:val="Heading2"/>
@@ -10194,7 +10194,7 @@
       </w:r>
     </w:p>
     <w:bookmarkEnd w:id="179"/>
-    <w:bookmarkStart w:id="180" w:name="entidades-del-dominio-involucradas-11"/>
+    <w:bookmarkStart w:id="180" w:name="_996680007d20151aaf6b367be4373c2d160213b"/>
     <w:p>
       <w:pPr>
         <w:pStyle w:val="Heading2"/>
@@ -10217,7 +10217,7 @@
     </w:p>
     <w:bookmarkEnd w:id="180"/>
     <w:bookmarkEnd w:id="181"/>
-    <w:bookmarkStart w:id="191" w:name="cu-13-configurar-porcentaje-de-comisión"/>
+    <w:bookmarkStart w:id="191" w:name="_8d2baf2ba3bd3897cb78f634cd2f68b2267d56d"/>
     <w:p>
       <w:pPr>
         <w:pStyle w:val="Heading1"/>
@@ -10226,7 +10226,7 @@
         <w:t xml:space="preserve">CU-13 Configurar porcentaje de comisión</w:t>
       </w:r>
     </w:p>
-    <w:bookmarkStart w:id="182" w:name="descripción-12"/>
+    <w:bookmarkStart w:id="182" w:name="_c5aeafe79cfccf0f2aea6d84c08c04b6b2710ee"/>
     <w:p>
       <w:pPr>
         <w:pStyle w:val="Heading2"/>
@@ -10298,7 +10298,7 @@
       </w:r>
     </w:p>
     <w:bookmarkEnd w:id="182"/>
-    <w:bookmarkStart w:id="183" w:name="actor-principal-12"/>
+    <w:bookmarkStart w:id="183" w:name="_84897d2eb704e7f90cd186c78d641f263ca8523"/>
     <w:p>
       <w:pPr>
         <w:pStyle w:val="Heading2"/>
@@ -10316,7 +10316,7 @@
       </w:r>
     </w:p>
     <w:bookmarkEnd w:id="183"/>
-    <w:bookmarkStart w:id="184" w:name="actores-secundarios-12"/>
+    <w:bookmarkStart w:id="184" w:name="_804b569122940d0b4a6357511f5a2f83d84d92f"/>
     <w:p>
       <w:pPr>
         <w:pStyle w:val="Heading2"/>
@@ -10326,7 +10326,7 @@
       </w:r>
     </w:p>
     <w:bookmarkEnd w:id="184"/>
-    <w:bookmarkStart w:id="185" w:name="precondiciones-12"/>
+    <w:bookmarkStart w:id="185" w:name="_61fa906b6daa0e4b1b892085bc38b8e35b67dc4"/>
     <w:p>
       <w:pPr>
         <w:pStyle w:val="Heading2"/>
@@ -10360,7 +10360,7 @@
       </w:r>
     </w:p>
     <w:bookmarkEnd w:id="185"/>
-    <w:bookmarkStart w:id="186" w:name="flujo-principal-12"/>
+    <w:bookmarkStart w:id="186" w:name="_a969e6169720f3839d22de85baa4a794de254b2"/>
     <w:p>
       <w:pPr>
         <w:pStyle w:val="Heading2"/>
@@ -10461,7 +10461,7 @@
       </w:r>
     </w:p>
     <w:bookmarkEnd w:id="186"/>
-    <w:bookmarkStart w:id="187" w:name="flujos-alternativos-12"/>
+    <w:bookmarkStart w:id="187" w:name="_a73131a043f9da898e0bdd116751a28f1f50471"/>
     <w:p>
       <w:pPr>
         <w:pStyle w:val="Heading2"/>
@@ -10530,7 +10530,7 @@
       </w:r>
     </w:p>
     <w:bookmarkEnd w:id="187"/>
-    <w:bookmarkStart w:id="188" w:name="postcondiciones-12"/>
+    <w:bookmarkStart w:id="188" w:name="_aa4815479141f2c93b72a71f284179faa6fc6b9"/>
     <w:p>
       <w:pPr>
         <w:pStyle w:val="Heading2"/>
@@ -10552,7 +10552,7 @@
       </w:r>
     </w:p>
     <w:bookmarkEnd w:id="188"/>
-    <w:bookmarkStart w:id="189" w:name="reglas-de-negocio-aplicadas-12"/>
+    <w:bookmarkStart w:id="189" w:name="_676a3d314793378b1e3c5514b846904535d65a0"/>
     <w:p>
       <w:pPr>
         <w:pStyle w:val="Heading2"/>
@@ -10574,7 +10574,7 @@
       </w:r>
     </w:p>
     <w:bookmarkEnd w:id="189"/>
-    <w:bookmarkStart w:id="190" w:name="entidades-del-dominio-involucradas-12"/>
+    <w:bookmarkStart w:id="190" w:name="_d6f3834ec32d00d9ebe42becb54464e57032113"/>
     <w:p>
       <w:pPr>
         <w:pStyle w:val="Heading2"/>
@@ -10597,7 +10597,7 @@
     </w:p>
     <w:bookmarkEnd w:id="190"/>
     <w:bookmarkEnd w:id="191"/>
-    <w:bookmarkStart w:id="201" w:name="cu-14-ver-y-atender-alertas-del-día"/>
+    <w:bookmarkStart w:id="201" w:name="_78b99cf82bfe36446af5da62ae8d6d3bde230b4"/>
     <w:p>
       <w:pPr>
         <w:pStyle w:val="Heading1"/>
@@ -10606,7 +10606,7 @@
         <w:t xml:space="preserve">CU-14 Ver y atender alertas del día</w:t>
       </w:r>
     </w:p>
-    <w:bookmarkStart w:id="192" w:name="descripción-13"/>
+    <w:bookmarkStart w:id="192" w:name="_c03050c6ab34870f9690a30b8901af24752ef18"/>
     <w:p>
       <w:pPr>
         <w:pStyle w:val="Heading2"/>
@@ -10624,7 +10624,7 @@
       </w:r>
     </w:p>
     <w:bookmarkEnd w:id="192"/>
-    <w:bookmarkStart w:id="193" w:name="actor-principal-13"/>
+    <w:bookmarkStart w:id="193" w:name="_12cf5b35914cb8cc68ff0f254d1d81225b1a336"/>
     <w:p>
       <w:pPr>
         <w:pStyle w:val="Heading2"/>
@@ -10642,7 +10642,7 @@
       </w:r>
     </w:p>
     <w:bookmarkEnd w:id="193"/>
-    <w:bookmarkStart w:id="194" w:name="actores-secundarios-13"/>
+    <w:bookmarkStart w:id="194" w:name="_6bc1ee231bea157416742a4ae6bec9c68150f00"/>
     <w:p>
       <w:pPr>
         <w:pStyle w:val="Heading2"/>
@@ -10664,7 +10664,7 @@
       </w:r>
     </w:p>
     <w:bookmarkEnd w:id="194"/>
-    <w:bookmarkStart w:id="195" w:name="precondiciones-13"/>
+    <w:bookmarkStart w:id="195" w:name="_3c2f32d200d58ec24dcd2f60bd9ba9afff940e3"/>
     <w:p>
       <w:pPr>
         <w:pStyle w:val="Heading2"/>
@@ -10686,7 +10686,7 @@
       </w:r>
     </w:p>
     <w:bookmarkEnd w:id="195"/>
-    <w:bookmarkStart w:id="196" w:name="flujo-principal-13"/>
+    <w:bookmarkStart w:id="196" w:name="_b35ce4c5a8a91a431d5b0a764d6d01c4ef680a5"/>
     <w:p>
       <w:pPr>
         <w:pStyle w:val="Heading2"/>
@@ -10863,7 +10863,7 @@
       </w:r>
     </w:p>
     <w:bookmarkEnd w:id="196"/>
-    <w:bookmarkStart w:id="197" w:name="flujos-alternativos-13"/>
+    <w:bookmarkStart w:id="197" w:name="_3a8c6626e52029c5054792b594169531d56628f"/>
     <w:p>
       <w:pPr>
         <w:pStyle w:val="Heading2"/>
@@ -11040,7 +11040,7 @@
       </w:r>
     </w:p>
     <w:bookmarkEnd w:id="197"/>
-    <w:bookmarkStart w:id="198" w:name="postcondiciones-13"/>
+    <w:bookmarkStart w:id="198" w:name="_5a1f8427cb08027d9a5ee50e0bcc130069deee6"/>
     <w:p>
       <w:pPr>
         <w:pStyle w:val="Heading2"/>
@@ -11110,7 +11110,7 @@
       </w:r>
     </w:p>
     <w:bookmarkEnd w:id="198"/>
-    <w:bookmarkStart w:id="199" w:name="reglas-de-negocio-aplicadas-13"/>
+    <w:bookmarkStart w:id="199" w:name="_4c545ebcbf7b31438e6e80c3883d38d3e8849cc"/>
     <w:p>
       <w:pPr>
         <w:pStyle w:val="Heading2"/>
@@ -11132,7 +11132,7 @@
       </w:r>
     </w:p>
     <w:bookmarkEnd w:id="199"/>
-    <w:bookmarkStart w:id="200" w:name="entidades-del-dominio-involucradas-13"/>
+    <w:bookmarkStart w:id="200" w:name="_62557076579f916d49caa7233a37b5587b24562"/>
     <w:p>
       <w:pPr>
         <w:pStyle w:val="Heading2"/>
@@ -11155,7 +11155,7 @@
     </w:p>
     <w:bookmarkEnd w:id="200"/>
     <w:bookmarkEnd w:id="201"/>
-    <w:bookmarkStart w:id="211" w:name="Xa9ff277d96249c13dec4ca3173263328b585074"/>
+    <w:bookmarkStart w:id="211" w:name="_a9ff277d96249c13dec4ca3173263328b585074"/>
     <w:p>
       <w:pPr>
         <w:pStyle w:val="Heading1"/>
@@ -11164,7 +11164,7 @@
         <w:t xml:space="preserve">CU-15 Configurar recordatorios por destino</w:t>
       </w:r>
     </w:p>
-    <w:bookmarkStart w:id="202" w:name="descripción-14"/>
+    <w:bookmarkStart w:id="202" w:name="_aad8934945f163de4ca49d7848e44a4be580bd4"/>
     <w:p>
       <w:pPr>
         <w:pStyle w:val="Heading2"/>
@@ -11197,7 +11197,7 @@
       </w:r>
     </w:p>
     <w:bookmarkEnd w:id="202"/>
-    <w:bookmarkStart w:id="203" w:name="actor-principal-14"/>
+    <w:bookmarkStart w:id="203" w:name="_f82cee1b7ec3ecae0c8e7afec475e065fd8ee13"/>
     <w:p>
       <w:pPr>
         <w:pStyle w:val="Heading2"/>
@@ -11227,7 +11227,7 @@
       </w:r>
     </w:p>
     <w:bookmarkEnd w:id="203"/>
-    <w:bookmarkStart w:id="204" w:name="actores-secundarios-14"/>
+    <w:bookmarkStart w:id="204" w:name="_578e78a6d23baf5952523fea4672db2a000b325"/>
     <w:p>
       <w:pPr>
         <w:pStyle w:val="Heading2"/>
@@ -11237,7 +11237,7 @@
       </w:r>
     </w:p>
     <w:bookmarkEnd w:id="204"/>
-    <w:bookmarkStart w:id="205" w:name="precondiciones-14"/>
+    <w:bookmarkStart w:id="205" w:name="_0f3e67275d9ec0d787e7905934f81cdbc1a0162"/>
     <w:p>
       <w:pPr>
         <w:pStyle w:val="Heading2"/>
@@ -11289,7 +11289,7 @@
       </w:r>
     </w:p>
     <w:bookmarkEnd w:id="205"/>
-    <w:bookmarkStart w:id="206" w:name="flujo-principal-14"/>
+    <w:bookmarkStart w:id="206" w:name="_40b5efbfdb6619ab1b5d0c98e9ed0ee48af2194"/>
     <w:p>
       <w:pPr>
         <w:pStyle w:val="Heading2"/>
@@ -11476,7 +11476,7 @@
       </w:r>
     </w:p>
     <w:bookmarkEnd w:id="206"/>
-    <w:bookmarkStart w:id="207" w:name="flujos-alternativos-14"/>
+    <w:bookmarkStart w:id="207" w:name="_ba5411b3bf18b5049764d7212ae2390db5b1d9c"/>
     <w:p>
       <w:pPr>
         <w:pStyle w:val="Heading2"/>
@@ -11561,7 +11561,7 @@
       </w:r>
     </w:p>
     <w:bookmarkEnd w:id="207"/>
-    <w:bookmarkStart w:id="208" w:name="postcondiciones-14"/>
+    <w:bookmarkStart w:id="208" w:name="_15ca9bdec8a10dff8fa14fbe431d004c0534442"/>
     <w:p>
       <w:pPr>
         <w:pStyle w:val="Heading2"/>
@@ -11595,7 +11595,7 @@
       </w:r>
     </w:p>
     <w:bookmarkEnd w:id="208"/>
-    <w:bookmarkStart w:id="209" w:name="reglas-de-negocio-aplicadas-14"/>
+    <w:bookmarkStart w:id="209" w:name="_d3d9606af570fd0ab012c92d6fe476074464c64"/>
     <w:p>
       <w:pPr>
         <w:pStyle w:val="Heading2"/>
@@ -11632,7 +11632,7 @@
       </w:r>
     </w:p>
     <w:bookmarkEnd w:id="209"/>
-    <w:bookmarkStart w:id="210" w:name="entidades-del-dominio-involucradas-14"/>
+    <w:bookmarkStart w:id="210" w:name="_8aa8c5f85927141c38c01f2fedfa6cc82e22abe"/>
     <w:p>
       <w:pPr>
         <w:pStyle w:val="Heading2"/>
@@ -11655,7 +11655,7 @@
     </w:p>
     <w:bookmarkEnd w:id="210"/>
     <w:bookmarkEnd w:id="211"/>
-    <w:bookmarkStart w:id="221" w:name="cu-16-gestionar-hotel-en-catálogo"/>
+    <w:bookmarkStart w:id="221" w:name="_25b2457c031afd7d5bf6f1bd3d9f1adac5290de"/>
     <w:p>
       <w:pPr>
         <w:pStyle w:val="Heading1"/>
@@ -11664,7 +11664,7 @@
         <w:t xml:space="preserve">CU-16 Gestionar hotel en catálogo</w:t>
       </w:r>
     </w:p>
-    <w:bookmarkStart w:id="212" w:name="descripción-15"/>
+    <w:bookmarkStart w:id="212" w:name="_d7bdb5d408c60d04fbfb7497c88ce706b898910"/>
     <w:p>
       <w:pPr>
         <w:pStyle w:val="Heading2"/>
@@ -11698,7 +11698,7 @@
       </w:r>
     </w:p>
     <w:bookmarkEnd w:id="212"/>
-    <w:bookmarkStart w:id="213" w:name="actor-principal-15"/>
+    <w:bookmarkStart w:id="213" w:name="_6f341e0a2831776b565ec23adac6c8c6e106a84"/>
     <w:p>
       <w:pPr>
         <w:pStyle w:val="Heading2"/>
@@ -11728,7 +11728,7 @@
       </w:r>
     </w:p>
     <w:bookmarkEnd w:id="213"/>
-    <w:bookmarkStart w:id="214" w:name="actores-secundarios-15"/>
+    <w:bookmarkStart w:id="214" w:name="_02991ecdc1705840afc48769315b1fd793cd5e2"/>
     <w:p>
       <w:pPr>
         <w:pStyle w:val="Heading2"/>
@@ -11738,7 +11738,7 @@
       </w:r>
     </w:p>
     <w:bookmarkEnd w:id="214"/>
-    <w:bookmarkStart w:id="215" w:name="precondiciones-15"/>
+    <w:bookmarkStart w:id="215" w:name="_e6c13f18a3f3dc5bee3829a7ad0a1ea188792db"/>
     <w:p>
       <w:pPr>
         <w:pStyle w:val="Heading2"/>
@@ -11760,7 +11760,7 @@
       </w:r>
     </w:p>
     <w:bookmarkEnd w:id="215"/>
-    <w:bookmarkStart w:id="216" w:name="flujo-principal-15"/>
+    <w:bookmarkStart w:id="216" w:name="_acaff5ff997c4f6bd0643ed89b355399e5deebc"/>
     <w:p>
       <w:pPr>
         <w:pStyle w:val="Heading2"/>
@@ -11948,7 +11948,7 @@
       </w:r>
     </w:p>
     <w:bookmarkEnd w:id="216"/>
-    <w:bookmarkStart w:id="217" w:name="flujos-alternativos-15"/>
+    <w:bookmarkStart w:id="217" w:name="_04c30c446aabbb4bb611d03c86f3314a46f5702"/>
     <w:p>
       <w:pPr>
         <w:pStyle w:val="Heading2"/>
@@ -12132,7 +12132,7 @@
       </w:r>
     </w:p>
     <w:bookmarkEnd w:id="217"/>
-    <w:bookmarkStart w:id="218" w:name="postcondiciones-15"/>
+    <w:bookmarkStart w:id="218" w:name="_addcc349ec03979ba987fc9a9529c7276190c03"/>
     <w:p>
       <w:pPr>
         <w:pStyle w:val="Heading2"/>
@@ -12167,7 +12167,7 @@
       </w:r>
     </w:p>
     <w:bookmarkEnd w:id="218"/>
-    <w:bookmarkStart w:id="219" w:name="reglas-de-negocio-aplicadas-15"/>
+    <w:bookmarkStart w:id="219" w:name="_9bfb7f687c0064501de501e55bab8372c184222"/>
     <w:p>
       <w:pPr>
         <w:pStyle w:val="Heading2"/>
@@ -12189,7 +12189,7 @@
       </w:r>
     </w:p>
     <w:bookmarkEnd w:id="219"/>
-    <w:bookmarkStart w:id="220" w:name="entidades-del-dominio-involucradas-15"/>
+    <w:bookmarkStart w:id="220" w:name="_92cdc5884dc496126a00255c5ed9d0e1ccea392"/>
     <w:p>
       <w:pPr>
         <w:pStyle w:val="Heading2"/>
@@ -12224,7 +12224,7 @@
     </w:p>
     <w:bookmarkEnd w:id="220"/>
     <w:bookmarkEnd w:id="221"/>
-    <w:bookmarkStart w:id="231" w:name="cu-17-registrar-reseña-de-hotel"/>
+    <w:bookmarkStart w:id="231" w:name="_c8d9a5fbeae64007f66435cadc64627614bebf6"/>
     <w:p>
       <w:pPr>
         <w:pStyle w:val="Heading1"/>
@@ -12233,7 +12233,7 @@
         <w:t xml:space="preserve">CU-17 Registrar reseña de hotel</w:t>
       </w:r>
     </w:p>
-    <w:bookmarkStart w:id="222" w:name="descripción-16"/>
+    <w:bookmarkStart w:id="222" w:name="_c58481de430381c02194c14f011e2de1de07909"/>
     <w:p>
       <w:pPr>
         <w:pStyle w:val="Heading2"/>
@@ -12251,7 +12251,7 @@
       </w:r>
     </w:p>
     <w:bookmarkEnd w:id="222"/>
-    <w:bookmarkStart w:id="223" w:name="actor-principal-16"/>
+    <w:bookmarkStart w:id="223" w:name="_7aeb51422f79e5fa8f4ae94902f59048ce4f2a9"/>
     <w:p>
       <w:pPr>
         <w:pStyle w:val="Heading2"/>
@@ -12281,7 +12281,7 @@
       </w:r>
     </w:p>
     <w:bookmarkEnd w:id="223"/>
-    <w:bookmarkStart w:id="224" w:name="actores-secundarios-16"/>
+    <w:bookmarkStart w:id="224" w:name="_c9cd3610e8159b90ac949a11d5a3fe8085fc0c4"/>
     <w:p>
       <w:pPr>
         <w:pStyle w:val="Heading2"/>
@@ -12303,7 +12303,7 @@
       </w:r>
     </w:p>
     <w:bookmarkEnd w:id="224"/>
-    <w:bookmarkStart w:id="225" w:name="precondiciones-16"/>
+    <w:bookmarkStart w:id="225" w:name="_64fe6b5343e070567cf252d6d51ef49169e5acd"/>
     <w:p>
       <w:pPr>
         <w:pStyle w:val="Heading2"/>
@@ -12337,7 +12337,7 @@
       </w:r>
     </w:p>
     <w:bookmarkEnd w:id="225"/>
-    <w:bookmarkStart w:id="226" w:name="flujo-principal-16"/>
+    <w:bookmarkStart w:id="226" w:name="_f88452d91ba3f71f83a8068870369290f111eee"/>
     <w:p>
       <w:pPr>
         <w:pStyle w:val="Heading2"/>
@@ -12561,7 +12561,7 @@
       </w:r>
     </w:p>
     <w:bookmarkEnd w:id="226"/>
-    <w:bookmarkStart w:id="227" w:name="flujos-alternativos-16"/>
+    <w:bookmarkStart w:id="227" w:name="_852c81e0f0863bede148d36390099447fa480a7"/>
     <w:p>
       <w:pPr>
         <w:pStyle w:val="Heading2"/>
@@ -12697,7 +12697,7 @@
       </w:r>
     </w:p>
     <w:bookmarkEnd w:id="227"/>
-    <w:bookmarkStart w:id="228" w:name="postcondiciones-16"/>
+    <w:bookmarkStart w:id="228" w:name="_2fb0e7d22071600fef049ca4b9159bae65f516a"/>
     <w:p>
       <w:pPr>
         <w:pStyle w:val="Heading2"/>
@@ -12773,7 +12773,7 @@
       </w:r>
     </w:p>
     <w:bookmarkEnd w:id="228"/>
-    <w:bookmarkStart w:id="229" w:name="reglas-de-negocio-aplicadas-16"/>
+    <w:bookmarkStart w:id="229" w:name="_c1e6211edff09e2e18e75db2adaebb4c17c6c75"/>
     <w:p>
       <w:pPr>
         <w:pStyle w:val="Heading2"/>
@@ -12994,7 +12994,7 @@
       </w:r>
     </w:p>
     <w:bookmarkEnd w:id="229"/>
-    <w:bookmarkStart w:id="230" w:name="entidades-del-dominio-involucradas-16"/>
+    <w:bookmarkStart w:id="230" w:name="_7bee8bd41e1ad4f4429f83f150a0661399674f6"/>
     <w:p>
       <w:pPr>
         <w:pStyle w:val="Heading2"/>
@@ -13017,7 +13017,7 @@
     </w:p>
     <w:bookmarkEnd w:id="230"/>
     <w:bookmarkEnd w:id="231"/>
-    <w:bookmarkStart w:id="241" w:name="cu-18-buscar-y-recomendar-hoteles"/>
+    <w:bookmarkStart w:id="241" w:name="_8d3d677a86d099505ac9522d821d46705733ff3"/>
     <w:p>
       <w:pPr>
         <w:pStyle w:val="Heading1"/>
@@ -13026,7 +13026,7 @@
         <w:t xml:space="preserve">CU-18 Buscar y recomendar hoteles</w:t>
       </w:r>
     </w:p>
-    <w:bookmarkStart w:id="232" w:name="descripción-17"/>
+    <w:bookmarkStart w:id="232" w:name="_80c7e1f3ab2b5d90432e7970649d96e78fa553e"/>
     <w:p>
       <w:pPr>
         <w:pStyle w:val="Heading2"/>
@@ -13060,7 +13060,7 @@
       </w:r>
     </w:p>
     <w:bookmarkEnd w:id="232"/>
-    <w:bookmarkStart w:id="233" w:name="actor-principal-17"/>
+    <w:bookmarkStart w:id="233" w:name="_be07049f125955584efb49153e8be62ecebd58f"/>
     <w:p>
       <w:pPr>
         <w:pStyle w:val="Heading2"/>
@@ -13078,7 +13078,7 @@
       </w:r>
     </w:p>
     <w:bookmarkEnd w:id="233"/>
-    <w:bookmarkStart w:id="234" w:name="actores-secundarios-17"/>
+    <w:bookmarkStart w:id="234" w:name="_186970bb2baaacea4f5f15dae90b98ff9375159"/>
     <w:p>
       <w:pPr>
         <w:pStyle w:val="Heading2"/>
@@ -13100,7 +13100,7 @@
       </w:r>
     </w:p>
     <w:bookmarkEnd w:id="234"/>
-    <w:bookmarkStart w:id="235" w:name="precondiciones-17"/>
+    <w:bookmarkStart w:id="235" w:name="_99801f15a2f46fc07674930f1b76170f4131eee"/>
     <w:p>
       <w:pPr>
         <w:pStyle w:val="Heading2"/>
@@ -13134,7 +13134,7 @@
       </w:r>
     </w:p>
     <w:bookmarkEnd w:id="235"/>
-    <w:bookmarkStart w:id="236" w:name="flujo-principal-17"/>
+    <w:bookmarkStart w:id="236" w:name="_18c04663e95280d33581b18579d67b2034c0f26"/>
     <w:p>
       <w:pPr>
         <w:pStyle w:val="Heading2"/>
@@ -13318,7 +13318,7 @@
       </w:r>
     </w:p>
     <w:bookmarkEnd w:id="236"/>
-    <w:bookmarkStart w:id="237" w:name="flujos-alternativos-17"/>
+    <w:bookmarkStart w:id="237" w:name="_5b268437a63c0dbfc48eb76add60dbaf167dad5"/>
     <w:p>
       <w:pPr>
         <w:pStyle w:val="Heading2"/>
@@ -13403,7 +13403,7 @@
       </w:r>
     </w:p>
     <w:bookmarkEnd w:id="237"/>
-    <w:bookmarkStart w:id="238" w:name="postcondiciones-17"/>
+    <w:bookmarkStart w:id="238" w:name="_05fe039b31bc3eb3a23c7c3d62e493fc97794be"/>
     <w:p>
       <w:pPr>
         <w:pStyle w:val="Heading2"/>
@@ -13456,7 +13456,7 @@
       </w:r>
     </w:p>
     <w:bookmarkEnd w:id="238"/>
-    <w:bookmarkStart w:id="239" w:name="reglas-de-negocio-aplicadas-17"/>
+    <w:bookmarkStart w:id="239" w:name="_abbc29a94a96c36a30afe290548ce5945ecc086"/>
     <w:p>
       <w:pPr>
         <w:pStyle w:val="Heading2"/>
@@ -13518,7 +13518,7 @@
       </w:r>
     </w:p>
     <w:bookmarkEnd w:id="239"/>
-    <w:bookmarkStart w:id="240" w:name="entidades-del-dominio-involucradas-17"/>
+    <w:bookmarkStart w:id="240" w:name="_39cd928ef249e2722a225508ead1992d0c77e18"/>
     <w:p>
       <w:pPr>
         <w:pStyle w:val="Heading2"/>
@@ -13541,7 +13541,7 @@
     </w:p>
     <w:bookmarkEnd w:id="240"/>
     <w:bookmarkEnd w:id="241"/>
-    <w:bookmarkStart w:id="251" w:name="cu-19-planificar-contenido-en-redes"/>
+    <w:bookmarkStart w:id="251" w:name="_1c9c53f69c7e3da40e28ffadb75fc0b3a627631"/>
     <w:p>
       <w:pPr>
         <w:pStyle w:val="Heading1"/>
@@ -13550,7 +13550,7 @@
         <w:t xml:space="preserve">CU-19 Planificar contenido en redes</w:t>
       </w:r>
     </w:p>
-    <w:bookmarkStart w:id="242" w:name="descripción-18"/>
+    <w:bookmarkStart w:id="242" w:name="_f416371f76dbda7f720dbc376dd90c2da84a5a8"/>
     <w:p>
       <w:pPr>
         <w:pStyle w:val="Heading2"/>
@@ -13600,7 +13600,7 @@
       </w:r>
     </w:p>
     <w:bookmarkEnd w:id="242"/>
-    <w:bookmarkStart w:id="243" w:name="actor-principal-18"/>
+    <w:bookmarkStart w:id="243" w:name="_ea53889bd89ea22be10df761165350f73a63a72"/>
     <w:p>
       <w:pPr>
         <w:pStyle w:val="Heading2"/>
@@ -13630,7 +13630,7 @@
       </w:r>
     </w:p>
     <w:bookmarkEnd w:id="243"/>
-    <w:bookmarkStart w:id="244" w:name="actores-secundarios-18"/>
+    <w:bookmarkStart w:id="244" w:name="_46b70cba757dc89376a5a717d454d490efd2592"/>
     <w:p>
       <w:pPr>
         <w:pStyle w:val="Heading2"/>
@@ -13640,7 +13640,7 @@
       </w:r>
     </w:p>
     <w:bookmarkEnd w:id="244"/>
-    <w:bookmarkStart w:id="245" w:name="precondiciones-18"/>
+    <w:bookmarkStart w:id="245" w:name="_1e15605e5082f6ec1cabc7a9b70116e2557f4a9"/>
     <w:p>
       <w:pPr>
         <w:pStyle w:val="Heading2"/>
@@ -13662,7 +13662,7 @@
       </w:r>
     </w:p>
     <w:bookmarkEnd w:id="245"/>
-    <w:bookmarkStart w:id="246" w:name="flujo-principal-18"/>
+    <w:bookmarkStart w:id="246" w:name="_f737eb284e1b6cac8f9f180ebd63f930fba116b"/>
     <w:p>
       <w:pPr>
         <w:pStyle w:val="Heading2"/>
@@ -13835,7 +13835,7 @@
       </w:r>
     </w:p>
     <w:bookmarkEnd w:id="246"/>
-    <w:bookmarkStart w:id="247" w:name="flujos-alternativos-18"/>
+    <w:bookmarkStart w:id="247" w:name="_3d0b026ab814060a93599974208cc39b3e792eb"/>
     <w:p>
       <w:pPr>
         <w:pStyle w:val="Heading2"/>
@@ -14082,7 +14082,7 @@
       </w:r>
     </w:p>
     <w:bookmarkEnd w:id="247"/>
-    <w:bookmarkStart w:id="248" w:name="postcondiciones-18"/>
+    <w:bookmarkStart w:id="248" w:name="_092836d4df180b1fff7eea308da7305524738ed"/>
     <w:p>
       <w:pPr>
         <w:pStyle w:val="Heading2"/>
@@ -14133,7 +14133,7 @@
       </w:r>
     </w:p>
     <w:bookmarkEnd w:id="248"/>
-    <w:bookmarkStart w:id="249" w:name="reglas-de-negocio-aplicadas-18"/>
+    <w:bookmarkStart w:id="249" w:name="_fa78696463c8a854f51a61de29e97cf7d565f14"/>
     <w:p>
       <w:pPr>
         <w:pStyle w:val="Heading2"/>
@@ -14177,7 +14177,7 @@
       </w:r>
     </w:p>
     <w:bookmarkEnd w:id="249"/>
-    <w:bookmarkStart w:id="250" w:name="entidades-del-dominio-involucradas-18"/>
+    <w:bookmarkStart w:id="250" w:name="_12e1f9ed1256ae15c5839bf0f1044a540e5bd36"/>
     <w:p>
       <w:pPr>
         <w:pStyle w:val="Heading2"/>
@@ -14200,7 +14200,7 @@
     </w:p>
     <w:bookmarkEnd w:id="250"/>
     <w:bookmarkEnd w:id="251"/>
-    <w:bookmarkStart w:id="261" w:name="X561e72de4c4b02f961f30d1e3b23e3ff6008f7f"/>
+    <w:bookmarkStart w:id="261" w:name="_561e72de4c4b02f961f30d1e3b23e3ff6008f7f"/>
     <w:p>
       <w:pPr>
         <w:pStyle w:val="Heading1"/>
@@ -14209,7 +14209,7 @@
         <w:t xml:space="preserve">CU-20 Generar propuesta de contenido con IA</w:t>
       </w:r>
     </w:p>
-    <w:bookmarkStart w:id="252" w:name="descripción-19"/>
+    <w:bookmarkStart w:id="252" w:name="_822218f9ffd637a5524c6bdb8ce0847eb8e91c8"/>
     <w:p>
       <w:pPr>
         <w:pStyle w:val="Heading2"/>
@@ -14259,7 +14259,7 @@
       </w:r>
     </w:p>
     <w:bookmarkEnd w:id="252"/>
-    <w:bookmarkStart w:id="253" w:name="actor-principal-19"/>
+    <w:bookmarkStart w:id="253" w:name="_c463bb1d841e1dc2ae0d3876bcbc246bd74de63"/>
     <w:p>
       <w:pPr>
         <w:pStyle w:val="Heading2"/>
@@ -14289,7 +14289,7 @@
       </w:r>
     </w:p>
     <w:bookmarkEnd w:id="253"/>
-    <w:bookmarkStart w:id="254" w:name="actores-secundarios-19"/>
+    <w:bookmarkStart w:id="254" w:name="_e4db607ae99161af9a0ddef5863270b71c1fc65"/>
     <w:p>
       <w:pPr>
         <w:pStyle w:val="Heading2"/>
@@ -14311,7 +14311,7 @@
       </w:r>
     </w:p>
     <w:bookmarkEnd w:id="254"/>
-    <w:bookmarkStart w:id="255" w:name="precondiciones-19"/>
+    <w:bookmarkStart w:id="255" w:name="_6dd5d5d4eb3a9f6f0d2b6c106808e3b47fe3a26"/>
     <w:p>
       <w:pPr>
         <w:pStyle w:val="Heading2"/>
@@ -14333,7 +14333,7 @@
       </w:r>
     </w:p>
     <w:bookmarkEnd w:id="255"/>
-    <w:bookmarkStart w:id="256" w:name="flujo-principal-19"/>
+    <w:bookmarkStart w:id="256" w:name="_28f4a3f571d14817f6c2af4c8dab43628589463"/>
     <w:p>
       <w:pPr>
         <w:pStyle w:val="Heading2"/>
@@ -14576,7 +14576,7 @@
       </w:r>
     </w:p>
     <w:bookmarkEnd w:id="256"/>
-    <w:bookmarkStart w:id="257" w:name="flujos-alternativos-19"/>
+    <w:bookmarkStart w:id="257" w:name="_5c01c997fd2a86fdbae14bd2520e8a792f26af8"/>
     <w:p>
       <w:pPr>
         <w:pStyle w:val="Heading2"/>
@@ -14652,7 +14652,7 @@
       </w:r>
     </w:p>
     <w:bookmarkEnd w:id="257"/>
-    <w:bookmarkStart w:id="258" w:name="postcondiciones-19"/>
+    <w:bookmarkStart w:id="258" w:name="_f26815141bf56a8d073da77678065c251eee125"/>
     <w:p>
       <w:pPr>
         <w:pStyle w:val="Heading2"/>
@@ -14715,7 +14715,7 @@
       </w:r>
     </w:p>
     <w:bookmarkEnd w:id="258"/>
-    <w:bookmarkStart w:id="259" w:name="reglas-de-negocio-aplicadas-19"/>
+    <w:bookmarkStart w:id="259" w:name="_7450ef7ce74188bb23dd06dfb83897ee96b4be2"/>
     <w:p>
       <w:pPr>
         <w:pStyle w:val="Heading2"/>
@@ -14759,7 +14759,7 @@
       </w:r>
     </w:p>
     <w:bookmarkEnd w:id="259"/>
-    <w:bookmarkStart w:id="260" w:name="entidades-del-dominio-involucradas-19"/>
+    <w:bookmarkStart w:id="260" w:name="_f3cf3545bd07ea30a025f57eb38a8b588a856dd"/>
     <w:p>
       <w:pPr>
         <w:pStyle w:val="Heading2"/>
@@ -14782,7 +14782,7 @@
     </w:p>
     <w:bookmarkEnd w:id="260"/>
     <w:bookmarkEnd w:id="261"/>
-    <w:bookmarkStart w:id="271" w:name="cu-21-ver-dashboard-y-embudo"/>
+    <w:bookmarkStart w:id="271" w:name="_15fb729b199d1ea74107844bf8fe2a0932e172c"/>
     <w:p>
       <w:pPr>
         <w:pStyle w:val="Heading1"/>
@@ -14791,7 +14791,7 @@
         <w:t xml:space="preserve">CU-21 Ver dashboard y embudo</w:t>
       </w:r>
     </w:p>
-    <w:bookmarkStart w:id="262" w:name="descripción-20"/>
+    <w:bookmarkStart w:id="262" w:name="_9fc1a36fb6b5c04a36c81e3b55dd9a39f6b70c6"/>
     <w:p>
       <w:pPr>
         <w:pStyle w:val="Heading2"/>
@@ -14838,7 +14838,7 @@
       </w:r>
     </w:p>
     <w:bookmarkEnd w:id="262"/>
-    <w:bookmarkStart w:id="263" w:name="actor-principal-20"/>
+    <w:bookmarkStart w:id="263" w:name="_d6727570e965b788ab216cbf8637267b492e28a"/>
     <w:p>
       <w:pPr>
         <w:pStyle w:val="Heading2"/>
@@ -14868,7 +14868,7 @@
       </w:r>
     </w:p>
     <w:bookmarkEnd w:id="263"/>
-    <w:bookmarkStart w:id="264" w:name="actores-secundarios-20"/>
+    <w:bookmarkStart w:id="264" w:name="_5a753738446ca02f94cdd8810b9b072b6f96fde"/>
     <w:p>
       <w:pPr>
         <w:pStyle w:val="Heading2"/>
@@ -14878,7 +14878,7 @@
       </w:r>
     </w:p>
     <w:bookmarkEnd w:id="264"/>
-    <w:bookmarkStart w:id="265" w:name="precondiciones-20"/>
+    <w:bookmarkStart w:id="265" w:name="_33d3c900873b34d841038cea1ba86c718ae47e3"/>
     <w:p>
       <w:pPr>
         <w:pStyle w:val="Heading2"/>
@@ -14930,7 +14930,7 @@
       </w:r>
     </w:p>
     <w:bookmarkEnd w:id="265"/>
-    <w:bookmarkStart w:id="266" w:name="flujo-principal-20"/>
+    <w:bookmarkStart w:id="266" w:name="_5c5e0fc4eef2223b584287f6b00b58266340873"/>
     <w:p>
       <w:pPr>
         <w:pStyle w:val="Heading2"/>
@@ -15346,7 +15346,7 @@
       </w:r>
     </w:p>
     <w:bookmarkEnd w:id="266"/>
-    <w:bookmarkStart w:id="267" w:name="flujos-alternativos-20"/>
+    <w:bookmarkStart w:id="267" w:name="_528def61223bfdfc49c299180ec643f278e63dd"/>
     <w:p>
       <w:pPr>
         <w:pStyle w:val="Heading2"/>
@@ -15469,7 +15469,7 @@
       </w:r>
     </w:p>
     <w:bookmarkEnd w:id="267"/>
-    <w:bookmarkStart w:id="268" w:name="postcondiciones-20"/>
+    <w:bookmarkStart w:id="268" w:name="_563d1383b596b47fdcb06e82831e4d6bce2b33e"/>
     <w:p>
       <w:pPr>
         <w:pStyle w:val="Heading2"/>
@@ -15507,7 +15507,7 @@
       </w:r>
     </w:p>
     <w:bookmarkEnd w:id="268"/>
-    <w:bookmarkStart w:id="269" w:name="reglas-de-negocio-aplicadas-20"/>
+    <w:bookmarkStart w:id="269" w:name="_435c632885dfce37421fada4ff2ff95f60dbb7d"/>
     <w:p>
       <w:pPr>
         <w:pStyle w:val="Heading2"/>
@@ -15577,7 +15577,7 @@
       </w:r>
     </w:p>
     <w:bookmarkEnd w:id="269"/>
-    <w:bookmarkStart w:id="270" w:name="entidades-del-dominio-involucradas-20"/>
+    <w:bookmarkStart w:id="270" w:name="_a87757a464f3063db953ce5fab06f0600063319"/>
     <w:p>
       <w:pPr>
         <w:pStyle w:val="Heading2"/>
@@ -15600,7 +15600,7 @@
     </w:p>
     <w:bookmarkEnd w:id="270"/>
     <w:bookmarkEnd w:id="271"/>
-    <w:bookmarkStart w:id="281" w:name="cu-22-generar-reportes-y-estadísticas"/>
+    <w:bookmarkStart w:id="281" w:name="_12d6f975404ed47e2bbb25b4a645dbbb8b2aff1"/>
     <w:p>
       <w:pPr>
         <w:pStyle w:val="Heading1"/>
@@ -15609,7 +15609,7 @@
         <w:t xml:space="preserve">CU-22 Generar reportes y estadísticas</w:t>
       </w:r>
     </w:p>
-    <w:bookmarkStart w:id="272" w:name="descripción-21"/>
+    <w:bookmarkStart w:id="272" w:name="_831a09cab52402216c31d51a5e881682b69314a"/>
     <w:p>
       <w:pPr>
         <w:pStyle w:val="Heading2"/>
@@ -15656,7 +15656,7 @@
       </w:r>
     </w:p>
     <w:bookmarkEnd w:id="272"/>
-    <w:bookmarkStart w:id="273" w:name="actor-principal-21"/>
+    <w:bookmarkStart w:id="273" w:name="_a5bb74903ac413884d644d555d52627620d31c9"/>
     <w:p>
       <w:pPr>
         <w:pStyle w:val="Heading2"/>
@@ -15686,7 +15686,7 @@
       </w:r>
     </w:p>
     <w:bookmarkEnd w:id="273"/>
-    <w:bookmarkStart w:id="274" w:name="actores-secundarios-21"/>
+    <w:bookmarkStart w:id="274" w:name="_15dbf43f90cb9e83857e050b499511884c11842"/>
     <w:p>
       <w:pPr>
         <w:pStyle w:val="Heading2"/>
@@ -15696,7 +15696,7 @@
       </w:r>
     </w:p>
     <w:bookmarkEnd w:id="274"/>
-    <w:bookmarkStart w:id="275" w:name="precondiciones-21"/>
+    <w:bookmarkStart w:id="275" w:name="_9583686c47543990faa2d5142d2719e76622777"/>
     <w:p>
       <w:pPr>
         <w:pStyle w:val="Heading2"/>
@@ -15748,7 +15748,7 @@
       </w:r>
     </w:p>
     <w:bookmarkEnd w:id="275"/>
-    <w:bookmarkStart w:id="276" w:name="flujo-principal-21"/>
+    <w:bookmarkStart w:id="276" w:name="_7d32e0eea3f5471f01d0043da5a7c58854088b4"/>
     <w:p>
       <w:pPr>
         <w:pStyle w:val="Heading2"/>
@@ -16080,7 +16080,7 @@
       </w:r>
     </w:p>
     <w:bookmarkEnd w:id="276"/>
-    <w:bookmarkStart w:id="277" w:name="flujos-alternativos-21"/>
+    <w:bookmarkStart w:id="277" w:name="_9999b270073778806e1a3614c113712af7a429f"/>
     <w:p>
       <w:pPr>
         <w:pStyle w:val="Heading2"/>
@@ -16181,7 +16181,7 @@
       </w:r>
     </w:p>
     <w:bookmarkEnd w:id="277"/>
-    <w:bookmarkStart w:id="278" w:name="postcondiciones-21"/>
+    <w:bookmarkStart w:id="278" w:name="_d9f5c448b876fa4d43a7f63f05f327b6a8dfc6b"/>
     <w:p>
       <w:pPr>
         <w:pStyle w:val="Heading2"/>
@@ -16219,7 +16219,7 @@
       </w:r>
     </w:p>
     <w:bookmarkEnd w:id="278"/>
-    <w:bookmarkStart w:id="279" w:name="reglas-de-negocio-aplicadas-21"/>
+    <w:bookmarkStart w:id="279" w:name="_12183e802ee20ba771df77fe51561a89c772082"/>
     <w:p>
       <w:pPr>
         <w:pStyle w:val="Heading2"/>
@@ -16253,7 +16253,7 @@
       </w:r>
     </w:p>
     <w:bookmarkEnd w:id="279"/>
-    <w:bookmarkStart w:id="280" w:name="entidades-del-dominio-involucradas-21"/>
+    <w:bookmarkStart w:id="280" w:name="_423317a58ae3ee3b214f52859bc25c0fc83b1a6"/>
     <w:p>
       <w:pPr>
         <w:pStyle w:val="Heading2"/>
@@ -16276,7 +16276,7 @@
     </w:p>
     <w:bookmarkEnd w:id="280"/>
     <w:bookmarkEnd w:id="281"/>
-    <w:bookmarkStart w:id="291" w:name="X4938012db43a7f89a7848cae0bc7084b7a3c073"/>
+    <w:bookmarkStart w:id="291" w:name="_4938012db43a7f89a7848cae0bc7084b7a3c073"/>
     <w:p>
       <w:pPr>
         <w:pStyle w:val="Heading1"/>
@@ -16285,7 +16285,7 @@
         <w:t xml:space="preserve">CU-23 Ver calendario de viajes y vencimientos</w:t>
       </w:r>
     </w:p>
-    <w:bookmarkStart w:id="282" w:name="descripción-22"/>
+    <w:bookmarkStart w:id="282" w:name="_af3f18f4ecd5abd03bc427eb81ab63e3f735594"/>
     <w:p>
       <w:pPr>
         <w:pStyle w:val="Heading2"/>
@@ -16335,7 +16335,7 @@
       </w:r>
     </w:p>
     <w:bookmarkEnd w:id="282"/>
-    <w:bookmarkStart w:id="283" w:name="actor-principal-22"/>
+    <w:bookmarkStart w:id="283" w:name="_133e6b1e9df283d7a31b3f0c576134bd48aaa26"/>
     <w:p>
       <w:pPr>
         <w:pStyle w:val="Heading2"/>
@@ -16353,7 +16353,7 @@
       </w:r>
     </w:p>
     <w:bookmarkEnd w:id="283"/>
-    <w:bookmarkStart w:id="284" w:name="actores-secundarios-22"/>
+    <w:bookmarkStart w:id="284" w:name="_a295b4d448f8c2a5cd94e17eca596a1d3fa9b13"/>
     <w:p>
       <w:pPr>
         <w:pStyle w:val="Heading2"/>
@@ -16363,7 +16363,7 @@
       </w:r>
     </w:p>
     <w:bookmarkEnd w:id="284"/>
-    <w:bookmarkStart w:id="285" w:name="precondiciones-22"/>
+    <w:bookmarkStart w:id="285" w:name="_c0f35afb961e9c6565bf7af734d247db91826f3"/>
     <w:p>
       <w:pPr>
         <w:pStyle w:val="Heading2"/>
@@ -16385,7 +16385,7 @@
       </w:r>
     </w:p>
     <w:bookmarkEnd w:id="285"/>
-    <w:bookmarkStart w:id="286" w:name="flujo-principal-22"/>
+    <w:bookmarkStart w:id="286" w:name="_46d373d2eb0c478a6bd179c58f9afe1a5616e6e"/>
     <w:p>
       <w:pPr>
         <w:pStyle w:val="Heading2"/>
@@ -16485,7 +16485,7 @@
       </w:r>
     </w:p>
     <w:bookmarkEnd w:id="286"/>
-    <w:bookmarkStart w:id="287" w:name="flujos-alternativos-22"/>
+    <w:bookmarkStart w:id="287" w:name="_dcb9d8b90b2ad6fc9aaddede9c2c2d768b5fbe5"/>
     <w:p>
       <w:pPr>
         <w:pStyle w:val="Heading2"/>
@@ -16635,7 +16635,7 @@
       </w:r>
     </w:p>
     <w:bookmarkEnd w:id="287"/>
-    <w:bookmarkStart w:id="288" w:name="postcondiciones-22"/>
+    <w:bookmarkStart w:id="288" w:name="_dc8e13165bbcfdc6bfe10c72a1b15f702d60639"/>
     <w:p>
       <w:pPr>
         <w:pStyle w:val="Heading2"/>
@@ -16686,7 +16686,7 @@
       </w:r>
     </w:p>
     <w:bookmarkEnd w:id="288"/>
-    <w:bookmarkStart w:id="289" w:name="reglas-de-negocio-aplicadas-22"/>
+    <w:bookmarkStart w:id="289" w:name="_4f21f4dee65eeb2a7b5b5cd4c3c2e3e409bb780"/>
     <w:p>
       <w:pPr>
         <w:pStyle w:val="Heading2"/>
@@ -16733,7 +16733,7 @@
       </w:r>
     </w:p>
     <w:bookmarkEnd w:id="289"/>
-    <w:bookmarkStart w:id="290" w:name="entidades-del-dominio-involucradas-22"/>
+    <w:bookmarkStart w:id="290" w:name="_9aa0c42aeebc01cfa410d019a8ffcf7ed8d8f3f"/>
     <w:p>
       <w:pPr>
         <w:pStyle w:val="Heading2"/>
@@ -16756,7 +16756,7 @@
     </w:p>
     <w:bookmarkEnd w:id="290"/>
     <w:bookmarkEnd w:id="291"/>
-    <w:bookmarkStart w:id="301" w:name="cu-24-iniciar-sesión"/>
+    <w:bookmarkStart w:id="301" w:name="_668114fffb77d7c54baf25a426ebf9ce95b98d1"/>
     <w:p>
       <w:pPr>
         <w:pStyle w:val="Heading1"/>
@@ -16765,7 +16765,7 @@
         <w:t xml:space="preserve">CU-24 Iniciar sesión</w:t>
       </w:r>
     </w:p>
-    <w:bookmarkStart w:id="292" w:name="descripción-23"/>
+    <w:bookmarkStart w:id="292" w:name="_1382725f9d39d04e6a0c83f31adf86f3fb261dd"/>
     <w:p>
       <w:pPr>
         <w:pStyle w:val="Heading2"/>
@@ -16783,7 +16783,7 @@
       </w:r>
     </w:p>
     <w:bookmarkEnd w:id="292"/>
-    <w:bookmarkStart w:id="293" w:name="actor-principal-23"/>
+    <w:bookmarkStart w:id="293" w:name="_f9738eb99785caec89a4dae1a8835c897bbc3d5"/>
     <w:p>
       <w:pPr>
         <w:pStyle w:val="Heading2"/>
@@ -16852,7 +16852,7 @@
       </w:r>
     </w:p>
     <w:bookmarkEnd w:id="293"/>
-    <w:bookmarkStart w:id="294" w:name="actores-secundarios-23"/>
+    <w:bookmarkStart w:id="294" w:name="_d80fff99f85fc8fea4fa92d1ed262c45b182dfc"/>
     <w:p>
       <w:pPr>
         <w:pStyle w:val="Heading2"/>
@@ -16862,7 +16862,7 @@
       </w:r>
     </w:p>
     <w:bookmarkEnd w:id="294"/>
-    <w:bookmarkStart w:id="295" w:name="precondiciones-23"/>
+    <w:bookmarkStart w:id="295" w:name="_49b87f13b4c668e138489d316a3730911922182"/>
     <w:p>
       <w:pPr>
         <w:pStyle w:val="Heading2"/>
@@ -16884,7 +16884,7 @@
       </w:r>
     </w:p>
     <w:bookmarkEnd w:id="295"/>
-    <w:bookmarkStart w:id="296" w:name="flujo-principal-23"/>
+    <w:bookmarkStart w:id="296" w:name="_b5f2a86bb95ba287161eecf2608bd1565ab1852"/>
     <w:p>
       <w:pPr>
         <w:pStyle w:val="Heading2"/>
@@ -17134,7 +17134,7 @@
       </w:r>
     </w:p>
     <w:bookmarkEnd w:id="296"/>
-    <w:bookmarkStart w:id="297" w:name="flujos-alternativos-23"/>
+    <w:bookmarkStart w:id="297" w:name="_53f1c83c5dc720d75aac389599960c24f90aff6"/>
     <w:p>
       <w:pPr>
         <w:pStyle w:val="Heading2"/>
@@ -17210,7 +17210,7 @@
       </w:r>
     </w:p>
     <w:bookmarkEnd w:id="297"/>
-    <w:bookmarkStart w:id="298" w:name="postcondiciones-23"/>
+    <w:bookmarkStart w:id="298" w:name="_652529248bad3b42a225f8c2b2f6a0ffeca8a9f"/>
     <w:p>
       <w:pPr>
         <w:pStyle w:val="Heading2"/>
@@ -17247,7 +17247,7 @@
       </w:r>
     </w:p>
     <w:bookmarkEnd w:id="298"/>
-    <w:bookmarkStart w:id="299" w:name="reglas-de-negocio-aplicadas-23"/>
+    <w:bookmarkStart w:id="299" w:name="_a4a0be169dafb530ac6a66c8d50dda0c3f61d2d"/>
     <w:p>
       <w:pPr>
         <w:pStyle w:val="Heading2"/>
@@ -17269,7 +17269,7 @@
       </w:r>
     </w:p>
     <w:bookmarkEnd w:id="299"/>
-    <w:bookmarkStart w:id="300" w:name="entidades-del-dominio-involucradas-23"/>
+    <w:bookmarkStart w:id="300" w:name="_300801eb6cc76008d591e3010b652da9bbf8360"/>
     <w:p>
       <w:pPr>
         <w:pStyle w:val="Heading2"/>
@@ -17292,7 +17292,7 @@
     </w:p>
     <w:bookmarkEnd w:id="300"/>
     <w:bookmarkEnd w:id="301"/>
-    <w:bookmarkStart w:id="311" w:name="cu-25-gestionar-usuarios-y-roles"/>
+    <w:bookmarkStart w:id="311" w:name="_b6957e084ff1df7cee8dc2b8a49ecca5580b239"/>
     <w:p>
       <w:pPr>
         <w:pStyle w:val="Heading1"/>
@@ -17301,7 +17301,7 @@
         <w:t xml:space="preserve">CU-25 Gestionar usuarios y roles</w:t>
       </w:r>
     </w:p>
-    <w:bookmarkStart w:id="302" w:name="descripción-24"/>
+    <w:bookmarkStart w:id="302" w:name="_fa8e8980642c3248db4fcf5d9902b2c5d6b9734"/>
     <w:p>
       <w:pPr>
         <w:pStyle w:val="Heading2"/>
@@ -17334,7 +17334,7 @@
       </w:r>
     </w:p>
     <w:bookmarkEnd w:id="302"/>
-    <w:bookmarkStart w:id="303" w:name="actor-principal-24"/>
+    <w:bookmarkStart w:id="303" w:name="_3dde9172aa93be165bbf9ca8778a568778c34d1"/>
     <w:p>
       <w:pPr>
         <w:pStyle w:val="Heading2"/>
@@ -17352,7 +17352,7 @@
       </w:r>
     </w:p>
     <w:bookmarkEnd w:id="303"/>
-    <w:bookmarkStart w:id="304" w:name="actores-secundarios-24"/>
+    <w:bookmarkStart w:id="304" w:name="_d572730545d90e55005f72a899f3f55620a18b9"/>
     <w:p>
       <w:pPr>
         <w:pStyle w:val="Heading2"/>
@@ -17362,7 +17362,7 @@
       </w:r>
     </w:p>
     <w:bookmarkEnd w:id="304"/>
-    <w:bookmarkStart w:id="305" w:name="precondiciones-24"/>
+    <w:bookmarkStart w:id="305" w:name="_15e8c903a1917cd1a8158924dea1ca247045e8e"/>
     <w:p>
       <w:pPr>
         <w:pStyle w:val="Heading2"/>
@@ -17396,7 +17396,7 @@
       </w:r>
     </w:p>
     <w:bookmarkEnd w:id="305"/>
-    <w:bookmarkStart w:id="306" w:name="flujo-principal-24"/>
+    <w:bookmarkStart w:id="306" w:name="_e2336d44b3e40e7309718569f7309cdd1565a9a"/>
     <w:p>
       <w:pPr>
         <w:pStyle w:val="Heading2"/>
@@ -17646,7 +17646,7 @@
       </w:r>
     </w:p>
     <w:bookmarkEnd w:id="306"/>
-    <w:bookmarkStart w:id="307" w:name="flujos-alternativos-24"/>
+    <w:bookmarkStart w:id="307" w:name="_11fc4d5b46cf14712eefc54bc2c37e3e76d45b6"/>
     <w:p>
       <w:pPr>
         <w:pStyle w:val="Heading2"/>
@@ -17820,7 +17820,7 @@
       </w:r>
     </w:p>
     <w:bookmarkEnd w:id="307"/>
-    <w:bookmarkStart w:id="308" w:name="postcondiciones-24"/>
+    <w:bookmarkStart w:id="308" w:name="_fefa97cba9b0100fda9160eaa05c400311c4a93"/>
     <w:p>
       <w:pPr>
         <w:pStyle w:val="Heading2"/>
@@ -17842,7 +17842,7 @@
       </w:r>
     </w:p>
     <w:bookmarkEnd w:id="308"/>
-    <w:bookmarkStart w:id="309" w:name="reglas-de-negocio-aplicadas-24"/>
+    <w:bookmarkStart w:id="309" w:name="_6cd853df7a9fd54139f27e8a6bbba3fb8c3b272"/>
     <w:p>
       <w:pPr>
         <w:pStyle w:val="Heading2"/>
@@ -17864,7 +17864,7 @@
       </w:r>
     </w:p>
     <w:bookmarkEnd w:id="309"/>
-    <w:bookmarkStart w:id="310" w:name="entidades-del-dominio-involucradas-24"/>
+    <w:bookmarkStart w:id="310" w:name="_fee4ab9678b6a2efb803034e6c57d7f9d493b6c"/>
     <w:p>
       <w:pPr>
         <w:pStyle w:val="Heading2"/>
@@ -17887,7 +17887,7 @@
     </w:p>
     <w:bookmarkEnd w:id="310"/>
     <w:bookmarkEnd w:id="311"/>
-    <w:bookmarkStart w:id="321" w:name="cu-26-gestionar-destinos"/>
+    <w:bookmarkStart w:id="321" w:name="_1c69ee2e45862fba314dc410f73de44a4980f40"/>
     <w:p>
       <w:pPr>
         <w:pStyle w:val="Heading1"/>
@@ -17896,7 +17896,7 @@
         <w:t xml:space="preserve">CU-26 Gestionar destinos</w:t>
       </w:r>
     </w:p>
-    <w:bookmarkStart w:id="312" w:name="descripción-25"/>
+    <w:bookmarkStart w:id="312" w:name="_564a35f8a97c036854af6e33392dc9a0a406ba9"/>
     <w:p>
       <w:pPr>
         <w:pStyle w:val="Heading2"/>
@@ -17945,7 +17945,7 @@
       </w:r>
     </w:p>
     <w:bookmarkEnd w:id="312"/>
-    <w:bookmarkStart w:id="313" w:name="actor-principal-25"/>
+    <w:bookmarkStart w:id="313" w:name="_c07a6520470fd345de42a997b5da7e3676ef7aa"/>
     <w:p>
       <w:pPr>
         <w:pStyle w:val="Heading2"/>
@@ -17963,7 +17963,7 @@
       </w:r>
     </w:p>
     <w:bookmarkEnd w:id="313"/>
-    <w:bookmarkStart w:id="314" w:name="actores-secundarios-25"/>
+    <w:bookmarkStart w:id="314" w:name="_357ec0fb6dbf6a5be704ae0772722675a225703"/>
     <w:p>
       <w:pPr>
         <w:pStyle w:val="Heading2"/>
@@ -17985,7 +17985,7 @@
       </w:r>
     </w:p>
     <w:bookmarkEnd w:id="314"/>
-    <w:bookmarkStart w:id="315" w:name="precondiciones-25"/>
+    <w:bookmarkStart w:id="315" w:name="_5a8e3c651c19ed409346c14403aae9b94def46e"/>
     <w:p>
       <w:pPr>
         <w:pStyle w:val="Heading2"/>
@@ -18037,7 +18037,7 @@
       </w:r>
     </w:p>
     <w:bookmarkEnd w:id="315"/>
-    <w:bookmarkStart w:id="316" w:name="flujo-principal-25"/>
+    <w:bookmarkStart w:id="316" w:name="_aa7b501639603ccb733545f0d97ad4825667fa2"/>
     <w:p>
       <w:pPr>
         <w:pStyle w:val="Heading2"/>
@@ -18149,7 +18149,7 @@
       </w:r>
     </w:p>
     <w:bookmarkEnd w:id="316"/>
-    <w:bookmarkStart w:id="317" w:name="flujos-alternativos-25"/>
+    <w:bookmarkStart w:id="317" w:name="_5a49d6d56dc98d120d1b9570c15c59af4ffc4c8"/>
     <w:p>
       <w:pPr>
         <w:pStyle w:val="Heading2"/>
@@ -18250,7 +18250,7 @@
       </w:r>
     </w:p>
     <w:bookmarkEnd w:id="317"/>
-    <w:bookmarkStart w:id="318" w:name="postcondiciones-25"/>
+    <w:bookmarkStart w:id="318" w:name="_86d33074fcab2284e5f1d0ae0df68acd5bf3a0b"/>
     <w:p>
       <w:pPr>
         <w:pStyle w:val="Heading2"/>
@@ -18272,7 +18272,7 @@
       </w:r>
     </w:p>
     <w:bookmarkEnd w:id="318"/>
-    <w:bookmarkStart w:id="319" w:name="reglas-de-negocio-aplicadas-25"/>
+    <w:bookmarkStart w:id="319" w:name="_13dc62756eba673c4411f0886491ae17ba539be"/>
     <w:p>
       <w:pPr>
         <w:pStyle w:val="Heading2"/>
@@ -18294,7 +18294,7 @@
       </w:r>
     </w:p>
     <w:bookmarkEnd w:id="319"/>
-    <w:bookmarkStart w:id="320" w:name="entidades-del-dominio-involucradas-25"/>
+    <w:bookmarkStart w:id="320" w:name="_6cfece2da799543735eecf2dd50e8d447648f04"/>
     <w:p>
       <w:pPr>
         <w:pStyle w:val="Heading2"/>
@@ -18317,7 +18317,7 @@
     </w:p>
     <w:bookmarkEnd w:id="320"/>
     <w:bookmarkEnd w:id="321"/>
-    <w:bookmarkStart w:id="331" w:name="cu-27-cancelar-viaje"/>
+    <w:bookmarkStart w:id="331" w:name="_ba138727bccbd1490ee268ef9a8a5623fbffd0e"/>
     <w:p>
       <w:pPr>
         <w:pStyle w:val="Heading1"/>
@@ -18326,7 +18326,7 @@
         <w:t xml:space="preserve">CU-27 Cancelar viaje</w:t>
       </w:r>
     </w:p>
-    <w:bookmarkStart w:id="322" w:name="descripción-26"/>
+    <w:bookmarkStart w:id="322" w:name="_6261a060896a120482456de8485990e03ed4bea"/>
     <w:p>
       <w:pPr>
         <w:pStyle w:val="Heading2"/>
@@ -18344,7 +18344,7 @@
       </w:r>
     </w:p>
     <w:bookmarkEnd w:id="322"/>
-    <w:bookmarkStart w:id="323" w:name="actor-principal-26"/>
+    <w:bookmarkStart w:id="323" w:name="_dfb0038ad9a6664f324bf3e967881a409f5fef7"/>
     <w:p>
       <w:pPr>
         <w:pStyle w:val="Heading2"/>
@@ -18362,7 +18362,7 @@
       </w:r>
     </w:p>
     <w:bookmarkEnd w:id="323"/>
-    <w:bookmarkStart w:id="324" w:name="actores-secundarios-26"/>
+    <w:bookmarkStart w:id="324" w:name="_871c247beaf0b0f295cb705b0b55197133dc406"/>
     <w:p>
       <w:pPr>
         <w:pStyle w:val="Heading2"/>
@@ -18384,7 +18384,7 @@
       </w:r>
     </w:p>
     <w:bookmarkEnd w:id="324"/>
-    <w:bookmarkStart w:id="325" w:name="precondiciones-26"/>
+    <w:bookmarkStart w:id="325" w:name="_cab293cd734a826ac997a12ed13321a06d505ba"/>
     <w:p>
       <w:pPr>
         <w:pStyle w:val="Heading2"/>
@@ -18487,7 +18487,7 @@
       </w:r>
     </w:p>
     <w:bookmarkEnd w:id="325"/>
-    <w:bookmarkStart w:id="326" w:name="flujo-principal-26"/>
+    <w:bookmarkStart w:id="326" w:name="_c031c4ebacf595d11152f8a2f44d2331269a875"/>
     <w:p>
       <w:pPr>
         <w:pStyle w:val="Heading2"/>
@@ -18811,7 +18811,7 @@
       </w:r>
     </w:p>
     <w:bookmarkEnd w:id="326"/>
-    <w:bookmarkStart w:id="327" w:name="flujos-alternativos-26"/>
+    <w:bookmarkStart w:id="327" w:name="_aa3ea86ae22680c20f841d445e09cb3dbc8eea9"/>
     <w:p>
       <w:pPr>
         <w:pStyle w:val="Heading2"/>
@@ -19219,7 +19219,7 @@
       </w:r>
     </w:p>
     <w:bookmarkEnd w:id="327"/>
-    <w:bookmarkStart w:id="328" w:name="postcondiciones-26"/>
+    <w:bookmarkStart w:id="328" w:name="_f24a4c2cb18dcb697aa97bcecffeb360ae1c3c5"/>
     <w:p>
       <w:pPr>
         <w:pStyle w:val="Heading2"/>
@@ -19335,7 +19335,7 @@
       </w:r>
     </w:p>
     <w:bookmarkEnd w:id="328"/>
-    <w:bookmarkStart w:id="329" w:name="reglas-de-negocio-aplicadas-26"/>
+    <w:bookmarkStart w:id="329" w:name="_db28aa7e0b8dd2f67d9bb1cf210ca450a166e1f"/>
     <w:p>
       <w:pPr>
         <w:pStyle w:val="Heading2"/>
@@ -19435,7 +19435,7 @@
       </w:r>
     </w:p>
     <w:bookmarkEnd w:id="329"/>
-    <w:bookmarkStart w:id="330" w:name="entidades-del-dominio-involucradas-26"/>
+    <w:bookmarkStart w:id="330" w:name="_8eb5c16cc88033599503b183c6312ede087e7e0"/>
     <w:p>
       <w:pPr>
         <w:pStyle w:val="Heading2"/>
@@ -19458,7 +19458,7 @@
     </w:p>
     <w:bookmarkEnd w:id="330"/>
     <w:bookmarkEnd w:id="331"/>
-    <w:bookmarkStart w:id="341" w:name="cu-28-crear-recordatorio-manual"/>
+    <w:bookmarkStart w:id="341" w:name="_1df9e19e70bac570f31900878fb2cb75eceff41"/>
     <w:p>
       <w:pPr>
         <w:pStyle w:val="Heading1"/>
@@ -19467,7 +19467,7 @@
         <w:t xml:space="preserve">CU-28 Crear recordatorio manual</w:t>
       </w:r>
     </w:p>
-    <w:bookmarkStart w:id="332" w:name="descripción-27"/>
+    <w:bookmarkStart w:id="332" w:name="_e7b0e4b6672c722b0edad67492a41cc4b35e9b8"/>
     <w:p>
       <w:pPr>
         <w:pStyle w:val="Heading2"/>
@@ -19498,7 +19498,7 @@
       </w:r>
     </w:p>
     <w:bookmarkEnd w:id="332"/>
-    <w:bookmarkStart w:id="333" w:name="actor-principal-27"/>
+    <w:bookmarkStart w:id="333" w:name="_de6c9c173ba4b35f503cfc1e2b50e89be0e246a"/>
     <w:p>
       <w:pPr>
         <w:pStyle w:val="Heading2"/>
@@ -19516,7 +19516,7 @@
       </w:r>
     </w:p>
     <w:bookmarkEnd w:id="333"/>
-    <w:bookmarkStart w:id="334" w:name="actores-secundarios-27"/>
+    <w:bookmarkStart w:id="334" w:name="_561ed60f0fb0b1ce16c401fa8784e9bd313d574"/>
     <w:p>
       <w:pPr>
         <w:pStyle w:val="Heading2"/>
@@ -19526,7 +19526,7 @@
       </w:r>
     </w:p>
     <w:bookmarkEnd w:id="334"/>
-    <w:bookmarkStart w:id="335" w:name="precondiciones-27"/>
+    <w:bookmarkStart w:id="335" w:name="_32eda6a4d6ed7d958bc7716aca34d700e87dacd"/>
     <w:p>
       <w:pPr>
         <w:pStyle w:val="Heading2"/>
@@ -19548,7 +19548,7 @@
       </w:r>
     </w:p>
     <w:bookmarkEnd w:id="335"/>
-    <w:bookmarkStart w:id="336" w:name="flujo-principal-27"/>
+    <w:bookmarkStart w:id="336" w:name="_8eac7d9b7ce146b3e2f1b79fcc5abd83d1894d4"/>
     <w:p>
       <w:pPr>
         <w:pStyle w:val="Heading2"/>
@@ -19682,7 +19682,7 @@
       </w:r>
     </w:p>
     <w:bookmarkEnd w:id="336"/>
-    <w:bookmarkStart w:id="337" w:name="flujos-alternativos-27"/>
+    <w:bookmarkStart w:id="337" w:name="_0cc68856cd404131b87b6b067cd44ef0ce6a7c0"/>
     <w:p>
       <w:pPr>
         <w:pStyle w:val="Heading2"/>
@@ -19748,7 +19748,7 @@
       </w:r>
     </w:p>
     <w:bookmarkEnd w:id="337"/>
-    <w:bookmarkStart w:id="338" w:name="postcondiciones-27"/>
+    <w:bookmarkStart w:id="338" w:name="_f0427dd2939ca29aabe85d4c1d5ff43b0f0e5e8"/>
     <w:p>
       <w:pPr>
         <w:pStyle w:val="Heading2"/>
@@ -19782,7 +19782,7 @@
       </w:r>
     </w:p>
     <w:bookmarkEnd w:id="338"/>
-    <w:bookmarkStart w:id="339" w:name="reglas-de-negocio-aplicadas-27"/>
+    <w:bookmarkStart w:id="339" w:name="_1a60456cd85373398c6819ba3fae401f8fa05d5"/>
     <w:p>
       <w:pPr>
         <w:pStyle w:val="Heading2"/>
@@ -19804,7 +19804,7 @@
       </w:r>
     </w:p>
     <w:bookmarkEnd w:id="339"/>
-    <w:bookmarkStart w:id="340" w:name="entidades-del-dominio-involucradas-27"/>
+    <w:bookmarkStart w:id="340" w:name="_ac8dec96c805c797511f8118e38b5589cdf0f78"/>
     <w:p>
       <w:pPr>
         <w:pStyle w:val="Heading2"/>
@@ -19827,7 +19827,7 @@
     </w:p>
     <w:bookmarkEnd w:id="340"/>
     <w:bookmarkEnd w:id="341"/>
-    <w:bookmarkStart w:id="351" w:name="cu-29-eliminar-reseña"/>
+    <w:bookmarkStart w:id="351" w:name="_5e8d46a74a332724e5b333e337ecfe9173fec96"/>
     <w:p>
       <w:pPr>
         <w:pStyle w:val="Heading1"/>
@@ -19836,7 +19836,7 @@
         <w:t xml:space="preserve">CU-29 Eliminar reseña</w:t>
       </w:r>
     </w:p>
-    <w:bookmarkStart w:id="342" w:name="descripción-28"/>
+    <w:bookmarkStart w:id="342" w:name="_0a8477f3c535464dd9c9ec3bb177f6b64f74982"/>
     <w:p>
       <w:pPr>
         <w:pStyle w:val="Heading2"/>
@@ -19854,7 +19854,7 @@
       </w:r>
     </w:p>
     <w:bookmarkEnd w:id="342"/>
-    <w:bookmarkStart w:id="343" w:name="actor-principal-28"/>
+    <w:bookmarkStart w:id="343" w:name="_f591350afbce6078c6037ac68d1231719cf4501"/>
     <w:p>
       <w:pPr>
         <w:pStyle w:val="Heading2"/>
@@ -19872,7 +19872,7 @@
       </w:r>
     </w:p>
     <w:bookmarkEnd w:id="343"/>
-    <w:bookmarkStart w:id="344" w:name="actores-secundarios-28"/>
+    <w:bookmarkStart w:id="344" w:name="_7ff74fa37bfaba24b435176d0adf432105a3932"/>
     <w:p>
       <w:pPr>
         <w:pStyle w:val="Heading2"/>
@@ -19894,7 +19894,7 @@
       </w:r>
     </w:p>
     <w:bookmarkEnd w:id="344"/>
-    <w:bookmarkStart w:id="345" w:name="precondiciones-28"/>
+    <w:bookmarkStart w:id="345" w:name="_43bd33bb7bc10454c3dc104250be371fea23832"/>
     <w:p>
       <w:pPr>
         <w:pStyle w:val="Heading2"/>
@@ -19931,7 +19931,7 @@
       </w:r>
     </w:p>
     <w:bookmarkEnd w:id="345"/>
-    <w:bookmarkStart w:id="346" w:name="flujo-principal-28"/>
+    <w:bookmarkStart w:id="346" w:name="_9a7bf251875c01bea21bc769db83d7fbf2c4c56"/>
     <w:p>
       <w:pPr>
         <w:pStyle w:val="Heading2"/>
@@ -20030,7 +20030,7 @@
       </w:r>
     </w:p>
     <w:bookmarkEnd w:id="346"/>
-    <w:bookmarkStart w:id="347" w:name="flujos-alternativos-28"/>
+    <w:bookmarkStart w:id="347" w:name="_dfdf38459755eb260a6134b1d7962d67cb25e8a"/>
     <w:p>
       <w:pPr>
         <w:pStyle w:val="Heading2"/>
@@ -20109,7 +20109,7 @@
       </w:r>
     </w:p>
     <w:bookmarkEnd w:id="347"/>
-    <w:bookmarkStart w:id="348" w:name="postcondiciones-28"/>
+    <w:bookmarkStart w:id="348" w:name="_a2738e6ecba37fe04fac685e50164886d12bba7"/>
     <w:p>
       <w:pPr>
         <w:pStyle w:val="Heading2"/>
@@ -20143,7 +20143,7 @@
       </w:r>
     </w:p>
     <w:bookmarkEnd w:id="348"/>
-    <w:bookmarkStart w:id="349" w:name="reglas-de-negocio-aplicadas-28"/>
+    <w:bookmarkStart w:id="349" w:name="_6a7c6361e274736d79afaff292767cd622110fc"/>
     <w:p>
       <w:pPr>
         <w:pStyle w:val="Heading2"/>
@@ -20165,7 +20165,7 @@
       </w:r>
     </w:p>
     <w:bookmarkEnd w:id="349"/>
-    <w:bookmarkStart w:id="350" w:name="entidades-del-dominio-involucradas-28"/>
+    <w:bookmarkStart w:id="350" w:name="_7aebcb80111c4336c0ae0e18b430dbcc660534a"/>
     <w:p>
       <w:pPr>
         <w:pStyle w:val="Heading2"/>
@@ -20188,7 +20188,7 @@
     </w:p>
     <w:bookmarkEnd w:id="350"/>
     <w:bookmarkEnd w:id="351"/>
-    <w:bookmarkStart w:id="361" w:name="cu-30-sugerir-recontacto-de-clientes"/>
+    <w:bookmarkStart w:id="361" w:name="_95786ba0043a13045668ac3dcc16ccc6979f956"/>
     <w:p>
       <w:pPr>
         <w:pStyle w:val="Heading1"/>
@@ -20197,7 +20197,7 @@
         <w:t xml:space="preserve">CU-30 Sugerir recontacto de clientes</w:t>
       </w:r>
     </w:p>
-    <w:bookmarkStart w:id="352" w:name="descripción-29"/>
+    <w:bookmarkStart w:id="352" w:name="_5f6a9766df3b0af85d60f6d3fa0623354975fda"/>
     <w:p>
       <w:pPr>
         <w:pStyle w:val="Heading2"/>
@@ -20298,7 +20298,7 @@
       </w:r>
     </w:p>
     <w:bookmarkEnd w:id="352"/>
-    <w:bookmarkStart w:id="353" w:name="actor-principal-29"/>
+    <w:bookmarkStart w:id="353" w:name="_2706ad3540bd8e426a2b44bb3aed2690b5ff590"/>
     <w:p>
       <w:pPr>
         <w:pStyle w:val="Heading2"/>
@@ -20316,7 +20316,7 @@
       </w:r>
     </w:p>
     <w:bookmarkEnd w:id="353"/>
-    <w:bookmarkStart w:id="354" w:name="actores-secundarios-29"/>
+    <w:bookmarkStart w:id="354" w:name="_65de70a46121026fd3bb1f6503b19325a854c95"/>
     <w:p>
       <w:pPr>
         <w:pStyle w:val="Heading2"/>
@@ -20338,7 +20338,7 @@
       </w:r>
     </w:p>
     <w:bookmarkEnd w:id="354"/>
-    <w:bookmarkStart w:id="355" w:name="precondiciones-29"/>
+    <w:bookmarkStart w:id="355" w:name="_54a34f387f6a4838d79ead24eb220f124d6b581"/>
     <w:p>
       <w:pPr>
         <w:pStyle w:val="Heading2"/>
@@ -20372,7 +20372,7 @@
       </w:r>
     </w:p>
     <w:bookmarkEnd w:id="355"/>
-    <w:bookmarkStart w:id="356" w:name="flujo-principal-29"/>
+    <w:bookmarkStart w:id="356" w:name="_3bdd1cc588f61731607b75646752a6d6912d503"/>
     <w:p>
       <w:pPr>
         <w:pStyle w:val="Heading2"/>
@@ -20645,7 +20645,7 @@
       </w:r>
     </w:p>
     <w:bookmarkEnd w:id="356"/>
-    <w:bookmarkStart w:id="357" w:name="flujos-alternativos-29"/>
+    <w:bookmarkStart w:id="357" w:name="_797c807289ace58b08cac4ad12f23d1487f8c84"/>
     <w:p>
       <w:pPr>
         <w:pStyle w:val="Heading2"/>
@@ -20758,7 +20758,7 @@
       </w:r>
     </w:p>
     <w:bookmarkEnd w:id="357"/>
-    <w:bookmarkStart w:id="358" w:name="postcondiciones-29"/>
+    <w:bookmarkStart w:id="358" w:name="_aaa0740ef9c83d7748878735f05b890d274a214"/>
     <w:p>
       <w:pPr>
         <w:pStyle w:val="Heading2"/>
@@ -20780,7 +20780,7 @@
       </w:r>
     </w:p>
     <w:bookmarkEnd w:id="358"/>
-    <w:bookmarkStart w:id="359" w:name="reglas-de-negocio-aplicadas-29"/>
+    <w:bookmarkStart w:id="359" w:name="_9ef21fd5bf22f906c82236c64923dfdbfcdd2f1"/>
     <w:p>
       <w:pPr>
         <w:pStyle w:val="Heading2"/>
@@ -20976,7 +20976,7 @@
       </w:r>
     </w:p>
     <w:bookmarkEnd w:id="359"/>
-    <w:bookmarkStart w:id="360" w:name="entidades-del-dominio-involucradas-29"/>
+    <w:bookmarkStart w:id="360" w:name="_f11715574b6e5ab29a3adac60c4eca7707d83ee"/>
     <w:p>
       <w:pPr>
         <w:pStyle w:val="Heading2"/>
@@ -21017,7 +21017,7 @@
     </w:p>
     <w:bookmarkEnd w:id="360"/>
     <w:bookmarkEnd w:id="361"/>
-    <w:bookmarkStart w:id="371" w:name="cu-31-gestionar-operadores"/>
+    <w:bookmarkStart w:id="371" w:name="_ebca738abb47356d3189941764247ea09b2d15f"/>
     <w:p>
       <w:pPr>
         <w:pStyle w:val="Heading1"/>
@@ -21026,7 +21026,7 @@
         <w:t xml:space="preserve">CU-31 Gestionar operadores</w:t>
       </w:r>
     </w:p>
-    <w:bookmarkStart w:id="362" w:name="descripción-30"/>
+    <w:bookmarkStart w:id="362" w:name="_0b6534f51e6f422d4afcef905747ea8a8b3a15a"/>
     <w:p>
       <w:pPr>
         <w:pStyle w:val="Heading2"/>
@@ -21123,7 +21123,7 @@
       </w:r>
     </w:p>
     <w:bookmarkEnd w:id="362"/>
-    <w:bookmarkStart w:id="363" w:name="actor-principal-30"/>
+    <w:bookmarkStart w:id="363" w:name="_f456b7060bfba1f576f93a0f117d30be0f06c70"/>
     <w:p>
       <w:pPr>
         <w:pStyle w:val="Heading2"/>
@@ -21141,7 +21141,7 @@
       </w:r>
     </w:p>
     <w:bookmarkEnd w:id="363"/>
-    <w:bookmarkStart w:id="364" w:name="actores-secundarios-30"/>
+    <w:bookmarkStart w:id="364" w:name="_2f44941a3e3ad677ba928d3e64b0035057d1368"/>
     <w:p>
       <w:pPr>
         <w:pStyle w:val="Heading2"/>
@@ -21163,7 +21163,7 @@
       </w:r>
     </w:p>
     <w:bookmarkEnd w:id="364"/>
-    <w:bookmarkStart w:id="365" w:name="precondiciones-30"/>
+    <w:bookmarkStart w:id="365" w:name="_c2be656467801e83563dcb86ac0e4b8037839f7"/>
     <w:p>
       <w:pPr>
         <w:pStyle w:val="Heading2"/>
@@ -21215,7 +21215,7 @@
       </w:r>
     </w:p>
     <w:bookmarkEnd w:id="365"/>
-    <w:bookmarkStart w:id="366" w:name="flujo-principal-30"/>
+    <w:bookmarkStart w:id="366" w:name="_661370032fe9b374f3a0896601945e4e39d91b2"/>
     <w:p>
       <w:pPr>
         <w:pStyle w:val="Heading2"/>
@@ -21327,7 +21327,7 @@
       </w:r>
     </w:p>
     <w:bookmarkEnd w:id="366"/>
-    <w:bookmarkStart w:id="367" w:name="flujos-alternativos-30"/>
+    <w:bookmarkStart w:id="367" w:name="_2de352c00487c75ea3253898d622f21a7f860df"/>
     <w:p>
       <w:pPr>
         <w:pStyle w:val="Heading2"/>
@@ -21428,7 +21428,7 @@
       </w:r>
     </w:p>
     <w:bookmarkEnd w:id="367"/>
-    <w:bookmarkStart w:id="368" w:name="postcondiciones-30"/>
+    <w:bookmarkStart w:id="368" w:name="_f925b26a13044017604087f8e6134c843bd2d04"/>
     <w:p>
       <w:pPr>
         <w:pStyle w:val="Heading2"/>
@@ -21450,7 +21450,7 @@
       </w:r>
     </w:p>
     <w:bookmarkEnd w:id="368"/>
-    <w:bookmarkStart w:id="369" w:name="reglas-de-negocio-aplicadas-30"/>
+    <w:bookmarkStart w:id="369" w:name="_6170a57c7b655032a903092171714f7c29b0542"/>
     <w:p>
       <w:pPr>
         <w:pStyle w:val="Heading2"/>
@@ -21472,7 +21472,7 @@
       </w:r>
     </w:p>
     <w:bookmarkEnd w:id="369"/>
-    <w:bookmarkStart w:id="370" w:name="entidades-del-dominio-involucradas-30"/>
+    <w:bookmarkStart w:id="370" w:name="_4b714a57dcee5f2e55fe3eab9d28642d5f86611"/>
     <w:p>
       <w:pPr>
         <w:pStyle w:val="Heading2"/>

</xml_diff>

<commit_message>
Documento principal del PC1 con el contenido del «Documento con el MVC» y carpeta de entrega
- build-pc1.sh rehecho: problema, alcance y límites (tabla de CU), modelo
  conceptual, flujo UML y C4, datos SQL, comunicación V–C (OpenAPI), IA con
  sus prompts y Mermaid.js; 57 páginas en lugar de 237.
- Nueva nota IA — Prompt de CU-20 (propuesta, en revisión).
- armar-entrega.sh arma la carpeta para el Drive (fuera de Git).

Co-Authored-By: Claude Opus 5.5 <noreply@anthropic.com>
</commit_message>
<xml_diff>
--- a/07-Entregables/Casos de uso/Rumbo — Casos de uso.docx
+++ b/07-Entregables/Casos de uso/Rumbo — Casos de uso.docx
@@ -76,7 +76,7 @@
         </w:p>
       </w:sdtContent>
     </w:sdt>
-    <w:bookmarkStart w:id="50" w:name="_introducción"/>
+    <w:bookmarkStart w:id="50" w:name="introducción"/>
     <w:p>
       <w:pPr>
         <w:pStyle w:val="Heading1"/>
@@ -188,7 +188,7 @@
         <w:t xml:space="preserve">Los casos de uso se agrupan por módulo: Clientes, Oportunidades y cotización, Viajes, Economía y pagos, Alertas, Catálogo de hoteles, Redes, Dashboard, Calendario y Usuarios/Seguridad.</w:t>
       </w:r>
     </w:p>
-    <w:bookmarkStart w:id="49" w:name="_convenciones"/>
+    <w:bookmarkStart w:id="49" w:name="convenciones"/>
     <w:p>
       <w:pPr>
         <w:pStyle w:val="Heading2"/>
@@ -462,7 +462,7 @@
     </w:p>
     <w:bookmarkEnd w:id="49"/>
     <w:bookmarkEnd w:id="50"/>
-    <w:bookmarkStart w:id="54" w:name="_0e28fd0a4d3ce4f32c8c2c6f51012999e81c079"/>
+    <w:bookmarkStart w:id="54" w:name="diagrama-de-casos-de-uso"/>
     <w:p>
       <w:pPr>
         <w:pStyle w:val="Heading1"/>
@@ -527,7 +527,7 @@
       </w:r>
     </w:p>
     <w:bookmarkEnd w:id="54"/>
-    <w:bookmarkStart w:id="61" w:name="_actores"/>
+    <w:bookmarkStart w:id="61" w:name="actores"/>
     <w:p>
       <w:pPr>
         <w:pStyle w:val="Heading1"/>
@@ -544,7 +544,7 @@
         <w:t xml:space="preserve">En una PyME una misma persona puede cubrir varios roles.</w:t>
       </w:r>
     </w:p>
-    <w:bookmarkStart w:id="55" w:name="_714b8deabe395ced8a6e60fd7261ffdfb2edf05"/>
+    <w:bookmarkStart w:id="55" w:name="empleado-asesor-usuario-principal"/>
     <w:p>
       <w:pPr>
         <w:pStyle w:val="Heading2"/>
@@ -622,7 +622,7 @@
       </w:r>
     </w:p>
     <w:bookmarkEnd w:id="55"/>
-    <w:bookmarkStart w:id="56" w:name="_35991680d4e6a786826e5436c78c0643863d0f3"/>
+    <w:bookmarkStart w:id="56" w:name="administrador-configuración-y-operación"/>
     <w:p>
       <w:pPr>
         <w:pStyle w:val="Heading2"/>
@@ -691,7 +691,7 @@
       </w:r>
     </w:p>
     <w:bookmarkEnd w:id="56"/>
-    <w:bookmarkStart w:id="57" w:name="_ddbf33ac140e93ff06d720c84f0b0107c68180a"/>
+    <w:bookmarkStart w:id="57" w:name="dueñoa-visión-del-negocio"/>
     <w:p>
       <w:pPr>
         <w:pStyle w:val="Heading2"/>
@@ -747,7 +747,7 @@
       </w:r>
     </w:p>
     <w:bookmarkEnd w:id="57"/>
-    <w:bookmarkStart w:id="58" w:name="_6c0ef285ed268354d46c074c14239c2805ce85b"/>
+    <w:bookmarkStart w:id="58" w:name="X6c0ef285ed268354d46c074c14239c2805ce85b"/>
     <w:p>
       <w:pPr>
         <w:pStyle w:val="Heading2"/>
@@ -831,7 +831,7 @@
       </w:r>
     </w:p>
     <w:bookmarkEnd w:id="58"/>
-    <w:bookmarkStart w:id="59" w:name="_8f5e30d3a5e8695bc0eada9c82b6705f97940fc"/>
+    <w:bookmarkStart w:id="59" w:name="X8f5e30d3a5e8695bc0eada9c82b6705f97940fc"/>
     <w:p>
       <w:pPr>
         <w:pStyle w:val="Heading2"/>
@@ -932,7 +932,7 @@
       </w:r>
     </w:p>
     <w:bookmarkEnd w:id="59"/>
-    <w:bookmarkStart w:id="60" w:name="_a550c6261a2d4ef2d9925a03ddec5b0dad31a92"/>
+    <w:bookmarkStart w:id="60" w:name="pasajero-cliente-actor-externo"/>
     <w:p>
       <w:pPr>
         <w:pStyle w:val="Heading2"/>
@@ -977,7 +977,7 @@
     </w:p>
     <w:bookmarkEnd w:id="60"/>
     <w:bookmarkEnd w:id="61"/>
-    <w:bookmarkStart w:id="71" w:name="_05e2e2895b68f65d3fbfef502bb6aa663a419b5"/>
+    <w:bookmarkStart w:id="71" w:name="cu-01-de-la-consulta-a-la-venta"/>
     <w:p>
       <w:pPr>
         <w:pStyle w:val="Heading1"/>
@@ -986,7 +986,7 @@
         <w:t xml:space="preserve">CU-01 De la consulta a la venta</w:t>
       </w:r>
     </w:p>
-    <w:bookmarkStart w:id="62" w:name="_descripción"/>
+    <w:bookmarkStart w:id="62" w:name="descripción"/>
     <w:p>
       <w:pPr>
         <w:pStyle w:val="Heading2"/>
@@ -1004,7 +1004,7 @@
       </w:r>
     </w:p>
     <w:bookmarkEnd w:id="62"/>
-    <w:bookmarkStart w:id="63" w:name="_468685cff39d2ca6117fe9261a8a8a3787325e7"/>
+    <w:bookmarkStart w:id="63" w:name="actor-principal"/>
     <w:p>
       <w:pPr>
         <w:pStyle w:val="Heading2"/>
@@ -1055,7 +1055,7 @@
       </w:r>
     </w:p>
     <w:bookmarkEnd w:id="63"/>
-    <w:bookmarkStart w:id="64" w:name="_228b94434b2ab62f7142551317f2632ef70b1d9"/>
+    <w:bookmarkStart w:id="64" w:name="actores-secundarios"/>
     <w:p>
       <w:pPr>
         <w:pStyle w:val="Heading2"/>
@@ -1077,7 +1077,7 @@
       </w:r>
     </w:p>
     <w:bookmarkEnd w:id="64"/>
-    <w:bookmarkStart w:id="65" w:name="_precondiciones"/>
+    <w:bookmarkStart w:id="65" w:name="precondiciones"/>
     <w:p>
       <w:pPr>
         <w:pStyle w:val="Heading2"/>
@@ -1099,7 +1099,7 @@
       </w:r>
     </w:p>
     <w:bookmarkEnd w:id="65"/>
-    <w:bookmarkStart w:id="66" w:name="_d35ecbd37d8eccdb5261d6292413d76b9120a0a"/>
+    <w:bookmarkStart w:id="66" w:name="flujo-principal"/>
     <w:p>
       <w:pPr>
         <w:pStyle w:val="Heading2"/>
@@ -1464,7 +1464,7 @@
       </w:r>
     </w:p>
     <w:bookmarkEnd w:id="66"/>
-    <w:bookmarkStart w:id="67" w:name="_6e6c713421441a98b72d542dca01c9f99093a39"/>
+    <w:bookmarkStart w:id="67" w:name="flujos-alternativos"/>
     <w:p>
       <w:pPr>
         <w:pStyle w:val="Heading2"/>
@@ -1540,7 +1540,7 @@
       </w:r>
     </w:p>
     <w:bookmarkEnd w:id="67"/>
-    <w:bookmarkStart w:id="68" w:name="_postcondiciones"/>
+    <w:bookmarkStart w:id="68" w:name="postcondiciones"/>
     <w:p>
       <w:pPr>
         <w:pStyle w:val="Heading2"/>
@@ -1592,7 +1592,7 @@
       </w:r>
     </w:p>
     <w:bookmarkEnd w:id="68"/>
-    <w:bookmarkStart w:id="69" w:name="_acd7c04667154055d6786196e980ff4c12b476c"/>
+    <w:bookmarkStart w:id="69" w:name="reglas-de-negocio-aplicadas"/>
     <w:p>
       <w:pPr>
         <w:pStyle w:val="Heading2"/>
@@ -1614,7 +1614,7 @@
       </w:r>
     </w:p>
     <w:bookmarkEnd w:id="69"/>
-    <w:bookmarkStart w:id="70" w:name="_e5650b61a638465dd8c40769a39815ae651aef6"/>
+    <w:bookmarkStart w:id="70" w:name="entidades-del-dominio-involucradas"/>
     <w:p>
       <w:pPr>
         <w:pStyle w:val="Heading2"/>
@@ -1637,7 +1637,7 @@
     </w:p>
     <w:bookmarkEnd w:id="70"/>
     <w:bookmarkEnd w:id="71"/>
-    <w:bookmarkStart w:id="81" w:name="_5e3ee6c4930a4313d19192bf674701508fcfad4"/>
+    <w:bookmarkStart w:id="81" w:name="cu-02-registrar-cliente"/>
     <w:p>
       <w:pPr>
         <w:pStyle w:val="Heading1"/>
@@ -1646,7 +1646,7 @@
         <w:t xml:space="preserve">CU-02 Registrar cliente</w:t>
       </w:r>
     </w:p>
-    <w:bookmarkStart w:id="72" w:name="_11f75c24c22294e6abf69902dabd7bc96c01495"/>
+    <w:bookmarkStart w:id="72" w:name="descripción-1"/>
     <w:p>
       <w:pPr>
         <w:pStyle w:val="Heading2"/>
@@ -1677,7 +1677,7 @@
       </w:r>
     </w:p>
     <w:bookmarkEnd w:id="72"/>
-    <w:bookmarkStart w:id="73" w:name="_13fa58cfc70d21d8268a31c55b15133e450c92e"/>
+    <w:bookmarkStart w:id="73" w:name="actor-principal-1"/>
     <w:p>
       <w:pPr>
         <w:pStyle w:val="Heading2"/>
@@ -1695,7 +1695,7 @@
       </w:r>
     </w:p>
     <w:bookmarkEnd w:id="73"/>
-    <w:bookmarkStart w:id="74" w:name="_25158fa8bf486c50bee72ec23a39600ea3bfa3b"/>
+    <w:bookmarkStart w:id="74" w:name="actores-secundarios-1"/>
     <w:p>
       <w:pPr>
         <w:pStyle w:val="Heading2"/>
@@ -1717,7 +1717,7 @@
       </w:r>
     </w:p>
     <w:bookmarkEnd w:id="74"/>
-    <w:bookmarkStart w:id="75" w:name="_fd75a3a1a26c435339477a5e4db1a0f181dc13c"/>
+    <w:bookmarkStart w:id="75" w:name="precondiciones-1"/>
     <w:p>
       <w:pPr>
         <w:pStyle w:val="Heading2"/>
@@ -1739,7 +1739,7 @@
       </w:r>
     </w:p>
     <w:bookmarkEnd w:id="75"/>
-    <w:bookmarkStart w:id="76" w:name="_51f32711f972b0b7da1ea3b91832eb5ae1a0d66"/>
+    <w:bookmarkStart w:id="76" w:name="flujo-principal-1"/>
     <w:p>
       <w:pPr>
         <w:pStyle w:val="Heading2"/>
@@ -1940,7 +1940,7 @@
       </w:r>
     </w:p>
     <w:bookmarkEnd w:id="76"/>
-    <w:bookmarkStart w:id="77" w:name="_f921525ec1da542165c6126e6fa478bcbc39ccf"/>
+    <w:bookmarkStart w:id="77" w:name="flujos-alternativos-1"/>
     <w:p>
       <w:pPr>
         <w:pStyle w:val="Heading2"/>
@@ -2047,7 +2047,7 @@
       </w:r>
     </w:p>
     <w:bookmarkEnd w:id="77"/>
-    <w:bookmarkStart w:id="78" w:name="_f6cb296c86eb5e1e90ba737470fd50e59749ebc"/>
+    <w:bookmarkStart w:id="78" w:name="postcondiciones-1"/>
     <w:p>
       <w:pPr>
         <w:pStyle w:val="Heading2"/>
@@ -2191,7 +2191,7 @@
       </w:r>
     </w:p>
     <w:bookmarkEnd w:id="78"/>
-    <w:bookmarkStart w:id="79" w:name="_ab16d8b358547b4dd9058534df49fa533b5d049"/>
+    <w:bookmarkStart w:id="79" w:name="reglas-de-negocio-aplicadas-1"/>
     <w:p>
       <w:pPr>
         <w:pStyle w:val="Heading2"/>
@@ -2225,7 +2225,7 @@
       </w:r>
     </w:p>
     <w:bookmarkEnd w:id="79"/>
-    <w:bookmarkStart w:id="80" w:name="_25dd548548681cc6ad8cf891c037e9ec34bb065"/>
+    <w:bookmarkStart w:id="80" w:name="entidades-del-dominio-involucradas-1"/>
     <w:p>
       <w:pPr>
         <w:pStyle w:val="Heading2"/>
@@ -2248,7 +2248,7 @@
     </w:p>
     <w:bookmarkEnd w:id="80"/>
     <w:bookmarkEnd w:id="81"/>
-    <w:bookmarkStart w:id="91" w:name="_a4724f6a4b11baf5002ce6b44777bf3a93e81af"/>
+    <w:bookmarkStart w:id="91" w:name="cu-03-gestionar-ficha-del-cliente"/>
     <w:p>
       <w:pPr>
         <w:pStyle w:val="Heading1"/>
@@ -2257,7 +2257,7 @@
         <w:t xml:space="preserve">CU-03 Gestionar ficha del cliente</w:t>
       </w:r>
     </w:p>
-    <w:bookmarkStart w:id="82" w:name="_754f166cb37bd95a59df1f19a8f7c7b15a0db52"/>
+    <w:bookmarkStart w:id="82" w:name="descripción-2"/>
     <w:p>
       <w:pPr>
         <w:pStyle w:val="Heading2"/>
@@ -2291,7 +2291,7 @@
       </w:r>
     </w:p>
     <w:bookmarkEnd w:id="82"/>
-    <w:bookmarkStart w:id="83" w:name="_b45b0e9ef4bd7a9c8f383ba68dfa27196a72fb1"/>
+    <w:bookmarkStart w:id="83" w:name="actor-principal-2"/>
     <w:p>
       <w:pPr>
         <w:pStyle w:val="Heading2"/>
@@ -2309,7 +2309,7 @@
       </w:r>
     </w:p>
     <w:bookmarkEnd w:id="83"/>
-    <w:bookmarkStart w:id="84" w:name="_312546c547da5ef03cd88242045e1298dae34f0"/>
+    <w:bookmarkStart w:id="84" w:name="actores-secundarios-2"/>
     <w:p>
       <w:pPr>
         <w:pStyle w:val="Heading2"/>
@@ -2331,7 +2331,7 @@
       </w:r>
     </w:p>
     <w:bookmarkEnd w:id="84"/>
-    <w:bookmarkStart w:id="85" w:name="_ece99e0f03de36129d804d8841b8a487717ca3f"/>
+    <w:bookmarkStart w:id="85" w:name="precondiciones-2"/>
     <w:p>
       <w:pPr>
         <w:pStyle w:val="Heading2"/>
@@ -2365,7 +2365,7 @@
       </w:r>
     </w:p>
     <w:bookmarkEnd w:id="85"/>
-    <w:bookmarkStart w:id="86" w:name="_22d4acdc7616c25fdd8b32e7b7ce8d2b74add0e"/>
+    <w:bookmarkStart w:id="86" w:name="flujo-principal-2"/>
     <w:p>
       <w:pPr>
         <w:pStyle w:val="Heading2"/>
@@ -2567,7 +2567,7 @@
       </w:r>
     </w:p>
     <w:bookmarkEnd w:id="86"/>
-    <w:bookmarkStart w:id="87" w:name="_37557dacfba68b34f017a83df84999fa4cad4e1"/>
+    <w:bookmarkStart w:id="87" w:name="flujos-alternativos-2"/>
     <w:p>
       <w:pPr>
         <w:pStyle w:val="Heading2"/>
@@ -2643,7 +2643,7 @@
       </w:r>
     </w:p>
     <w:bookmarkEnd w:id="87"/>
-    <w:bookmarkStart w:id="88" w:name="_35559c5fc5d1e22d50db5bb791a2ec56a4e09dc"/>
+    <w:bookmarkStart w:id="88" w:name="postcondiciones-2"/>
     <w:p>
       <w:pPr>
         <w:pStyle w:val="Heading2"/>
@@ -2677,7 +2677,7 @@
       </w:r>
     </w:p>
     <w:bookmarkEnd w:id="88"/>
-    <w:bookmarkStart w:id="89" w:name="_a5658992e02a95e95b42dbd64c4c1eda6f52be9"/>
+    <w:bookmarkStart w:id="89" w:name="reglas-de-negocio-aplicadas-2"/>
     <w:p>
       <w:pPr>
         <w:pStyle w:val="Heading2"/>
@@ -2723,7 +2723,7 @@
       </w:r>
     </w:p>
     <w:bookmarkEnd w:id="89"/>
-    <w:bookmarkStart w:id="90" w:name="_66bb9b721a38362e745ee22f506ed7910c6f67a"/>
+    <w:bookmarkStart w:id="90" w:name="entidades-del-dominio-involucradas-2"/>
     <w:p>
       <w:pPr>
         <w:pStyle w:val="Heading2"/>
@@ -2746,7 +2746,7 @@
     </w:p>
     <w:bookmarkEnd w:id="90"/>
     <w:bookmarkEnd w:id="91"/>
-    <w:bookmarkStart w:id="101" w:name="_c0a9681b8130a4c41e2a307583200c166a9a331"/>
+    <w:bookmarkStart w:id="101" w:name="cu-04-registrar-consulta"/>
     <w:p>
       <w:pPr>
         <w:pStyle w:val="Heading1"/>
@@ -2755,7 +2755,7 @@
         <w:t xml:space="preserve">CU-04 Registrar consulta</w:t>
       </w:r>
     </w:p>
-    <w:bookmarkStart w:id="92" w:name="_a09adb012b2b9fb351845a12a38225f17f505d7"/>
+    <w:bookmarkStart w:id="92" w:name="descripción-3"/>
     <w:p>
       <w:pPr>
         <w:pStyle w:val="Heading2"/>
@@ -2773,7 +2773,7 @@
       </w:r>
     </w:p>
     <w:bookmarkEnd w:id="92"/>
-    <w:bookmarkStart w:id="93" w:name="_41750dbbfabb0297e8b75ea8c2f6898ad189c10"/>
+    <w:bookmarkStart w:id="93" w:name="actor-principal-3"/>
     <w:p>
       <w:pPr>
         <w:pStyle w:val="Heading2"/>
@@ -2791,7 +2791,7 @@
       </w:r>
     </w:p>
     <w:bookmarkEnd w:id="93"/>
-    <w:bookmarkStart w:id="94" w:name="_12d6805758238974f88e0b8e86446f4a96695ab"/>
+    <w:bookmarkStart w:id="94" w:name="actores-secundarios-3"/>
     <w:p>
       <w:pPr>
         <w:pStyle w:val="Heading2"/>
@@ -2813,7 +2813,7 @@
       </w:r>
     </w:p>
     <w:bookmarkEnd w:id="94"/>
-    <w:bookmarkStart w:id="95" w:name="_0a1de8afd097543428a99db9b20267f74bb3955"/>
+    <w:bookmarkStart w:id="95" w:name="precondiciones-3"/>
     <w:p>
       <w:pPr>
         <w:pStyle w:val="Heading2"/>
@@ -2847,7 +2847,7 @@
       </w:r>
     </w:p>
     <w:bookmarkEnd w:id="95"/>
-    <w:bookmarkStart w:id="96" w:name="_f68060827827a233488cb2d4ea287c3de93ceba"/>
+    <w:bookmarkStart w:id="96" w:name="flujo-principal-3"/>
     <w:p>
       <w:pPr>
         <w:pStyle w:val="Heading2"/>
@@ -3038,7 +3038,7 @@
       </w:r>
     </w:p>
     <w:bookmarkEnd w:id="96"/>
-    <w:bookmarkStart w:id="97" w:name="_a1bfd37e8f01a808658bd38ae0b30a122faaa53"/>
+    <w:bookmarkStart w:id="97" w:name="flujos-alternativos-3"/>
     <w:p>
       <w:pPr>
         <w:pStyle w:val="Heading2"/>
@@ -3191,7 +3191,7 @@
       </w:r>
     </w:p>
     <w:bookmarkEnd w:id="97"/>
-    <w:bookmarkStart w:id="98" w:name="_40195a2906f9c608187ea93daeef936cd4553c1"/>
+    <w:bookmarkStart w:id="98" w:name="postcondiciones-3"/>
     <w:p>
       <w:pPr>
         <w:pStyle w:val="Heading2"/>
@@ -3317,7 +3317,7 @@
       </w:r>
     </w:p>
     <w:bookmarkEnd w:id="98"/>
-    <w:bookmarkStart w:id="99" w:name="_6ea0960b4677555641e09a5bd25d2b3a86b39c8"/>
+    <w:bookmarkStart w:id="99" w:name="reglas-de-negocio-aplicadas-3"/>
     <w:p>
       <w:pPr>
         <w:pStyle w:val="Heading2"/>
@@ -3339,7 +3339,7 @@
       </w:r>
     </w:p>
     <w:bookmarkEnd w:id="99"/>
-    <w:bookmarkStart w:id="100" w:name="_df38222f90e1268cab2dc952cd33fdbfc269d9b"/>
+    <w:bookmarkStart w:id="100" w:name="entidades-del-dominio-involucradas-3"/>
     <w:p>
       <w:pPr>
         <w:pStyle w:val="Heading2"/>
@@ -3362,7 +3362,7 @@
     </w:p>
     <w:bookmarkEnd w:id="100"/>
     <w:bookmarkEnd w:id="101"/>
-    <w:bookmarkStart w:id="111" w:name="_2661a4419e886e64b677b58fbadf6651e177087"/>
+    <w:bookmarkStart w:id="111" w:name="cu-05-seguir-oportunidad"/>
     <w:p>
       <w:pPr>
         <w:pStyle w:val="Heading1"/>
@@ -3371,7 +3371,7 @@
         <w:t xml:space="preserve">CU-05 Seguir oportunidad</w:t>
       </w:r>
     </w:p>
-    <w:bookmarkStart w:id="102" w:name="_30ae283446c7320273ace3602b2ca2c6d7f060f"/>
+    <w:bookmarkStart w:id="102" w:name="descripción-4"/>
     <w:p>
       <w:pPr>
         <w:pStyle w:val="Heading2"/>
@@ -3421,7 +3421,7 @@
       </w:r>
     </w:p>
     <w:bookmarkEnd w:id="102"/>
-    <w:bookmarkStart w:id="103" w:name="_593d02616d7f14b04fe25f14d5b5a9fa3f27b1f"/>
+    <w:bookmarkStart w:id="103" w:name="actor-principal-4"/>
     <w:p>
       <w:pPr>
         <w:pStyle w:val="Heading2"/>
@@ -3454,7 +3454,7 @@
       </w:r>
     </w:p>
     <w:bookmarkEnd w:id="103"/>
-    <w:bookmarkStart w:id="104" w:name="_4e402ed1835b4ca47737e94131678e901a1011c"/>
+    <w:bookmarkStart w:id="104" w:name="actores-secundarios-4"/>
     <w:p>
       <w:pPr>
         <w:pStyle w:val="Heading2"/>
@@ -3476,7 +3476,7 @@
       </w:r>
     </w:p>
     <w:bookmarkEnd w:id="104"/>
-    <w:bookmarkStart w:id="105" w:name="_2a0306f36db270c24df1f5350bc76e95178d039"/>
+    <w:bookmarkStart w:id="105" w:name="precondiciones-4"/>
     <w:p>
       <w:pPr>
         <w:pStyle w:val="Heading2"/>
@@ -3552,7 +3552,7 @@
       </w:r>
     </w:p>
     <w:bookmarkEnd w:id="105"/>
-    <w:bookmarkStart w:id="106" w:name="_ec491eeb8b969c5a2b3e4d25c0944ce5b3729c7"/>
+    <w:bookmarkStart w:id="106" w:name="flujo-principal-4"/>
     <w:p>
       <w:pPr>
         <w:pStyle w:val="Heading2"/>
@@ -3819,7 +3819,7 @@
       </w:r>
     </w:p>
     <w:bookmarkEnd w:id="106"/>
-    <w:bookmarkStart w:id="107" w:name="_91f0955e5ee5ac7dd529d4c8849b1a15669e86b"/>
+    <w:bookmarkStart w:id="107" w:name="flujos-alternativos-4"/>
     <w:p>
       <w:pPr>
         <w:pStyle w:val="Heading2"/>
@@ -3990,7 +3990,7 @@
       </w:r>
     </w:p>
     <w:bookmarkEnd w:id="107"/>
-    <w:bookmarkStart w:id="108" w:name="_595c45a27432a941047410532915ea7c09bf1c6"/>
+    <w:bookmarkStart w:id="108" w:name="postcondiciones-4"/>
     <w:p>
       <w:pPr>
         <w:pStyle w:val="Heading2"/>
@@ -4048,7 +4048,7 @@
       </w:r>
     </w:p>
     <w:bookmarkEnd w:id="108"/>
-    <w:bookmarkStart w:id="109" w:name="_ee5b430a4adbd55c077c1a61f38aaf17a680a99"/>
+    <w:bookmarkStart w:id="109" w:name="reglas-de-negocio-aplicadas-4"/>
     <w:p>
       <w:pPr>
         <w:pStyle w:val="Heading2"/>
@@ -4133,7 +4133,7 @@
       </w:r>
     </w:p>
     <w:bookmarkEnd w:id="109"/>
-    <w:bookmarkStart w:id="110" w:name="_eab1c4d606c4bdcd1295f4a856a7c8e2d8f0166"/>
+    <w:bookmarkStart w:id="110" w:name="entidades-del-dominio-involucradas-4"/>
     <w:p>
       <w:pPr>
         <w:pStyle w:val="Heading2"/>
@@ -4156,7 +4156,7 @@
     </w:p>
     <w:bookmarkEnd w:id="110"/>
     <w:bookmarkEnd w:id="111"/>
-    <w:bookmarkStart w:id="121" w:name="_f846b894ab1530b2f1a6a337ddba1e92fc0719e"/>
+    <w:bookmarkStart w:id="121" w:name="cu-06-emitir-cotización"/>
     <w:p>
       <w:pPr>
         <w:pStyle w:val="Heading1"/>
@@ -4165,7 +4165,7 @@
         <w:t xml:space="preserve">CU-06 Emitir cotización</w:t>
       </w:r>
     </w:p>
-    <w:bookmarkStart w:id="112" w:name="_10dc8fe1f348eac9669ae3c785d773d2fcc2954"/>
+    <w:bookmarkStart w:id="112" w:name="descripción-5"/>
     <w:p>
       <w:pPr>
         <w:pStyle w:val="Heading2"/>
@@ -4212,7 +4212,7 @@
       </w:r>
     </w:p>
     <w:bookmarkEnd w:id="112"/>
-    <w:bookmarkStart w:id="113" w:name="_a656b0a260bbb1d664f922b3d9ae23e6fc6cb8f"/>
+    <w:bookmarkStart w:id="113" w:name="actor-principal-5"/>
     <w:p>
       <w:pPr>
         <w:pStyle w:val="Heading2"/>
@@ -4230,7 +4230,7 @@
       </w:r>
     </w:p>
     <w:bookmarkEnd w:id="113"/>
-    <w:bookmarkStart w:id="114" w:name="_31e0cd65fa8741a1e06d13e5b30869272e956aa"/>
+    <w:bookmarkStart w:id="114" w:name="actores-secundarios-5"/>
     <w:p>
       <w:pPr>
         <w:pStyle w:val="Heading2"/>
@@ -4252,7 +4252,7 @@
       </w:r>
     </w:p>
     <w:bookmarkEnd w:id="114"/>
-    <w:bookmarkStart w:id="115" w:name="_20ebfb532f49466b614aee6d8e2c107dc9ad2da"/>
+    <w:bookmarkStart w:id="115" w:name="precondiciones-5"/>
     <w:p>
       <w:pPr>
         <w:pStyle w:val="Heading2"/>
@@ -4286,7 +4286,7 @@
       </w:r>
     </w:p>
     <w:bookmarkEnd w:id="115"/>
-    <w:bookmarkStart w:id="116" w:name="_f56041d44d989a617f0381b5c459153f91a78f0"/>
+    <w:bookmarkStart w:id="116" w:name="flujo-principal-5"/>
     <w:p>
       <w:pPr>
         <w:pStyle w:val="Heading2"/>
@@ -4575,7 +4575,7 @@
       </w:r>
     </w:p>
     <w:bookmarkEnd w:id="116"/>
-    <w:bookmarkStart w:id="117" w:name="_f3307dd15b3bbc3c1e3856c248be4714d231a60"/>
+    <w:bookmarkStart w:id="117" w:name="flujos-alternativos-5"/>
     <w:p>
       <w:pPr>
         <w:pStyle w:val="Heading2"/>
@@ -4883,7 +4883,7 @@
       </w:r>
     </w:p>
     <w:bookmarkEnd w:id="117"/>
-    <w:bookmarkStart w:id="118" w:name="_18922126579fd92345f088fc42004a408575ed0"/>
+    <w:bookmarkStart w:id="118" w:name="postcondiciones-5"/>
     <w:p>
       <w:pPr>
         <w:pStyle w:val="Heading2"/>
@@ -4905,7 +4905,7 @@
       </w:r>
     </w:p>
     <w:bookmarkEnd w:id="118"/>
-    <w:bookmarkStart w:id="119" w:name="_0010f21ca59c95e898fbd053c0414f33848070d"/>
+    <w:bookmarkStart w:id="119" w:name="reglas-de-negocio-aplicadas-5"/>
     <w:p>
       <w:pPr>
         <w:pStyle w:val="Heading2"/>
@@ -4984,7 +4984,7 @@
       </w:r>
     </w:p>
     <w:bookmarkEnd w:id="119"/>
-    <w:bookmarkStart w:id="120" w:name="_b5186136f1c803bc4a55b799ffc8537144ed47c"/>
+    <w:bookmarkStart w:id="120" w:name="entidades-del-dominio-involucradas-5"/>
     <w:p>
       <w:pPr>
         <w:pStyle w:val="Heading2"/>
@@ -5007,7 +5007,7 @@
     </w:p>
     <w:bookmarkEnd w:id="120"/>
     <w:bookmarkEnd w:id="121"/>
-    <w:bookmarkStart w:id="131" w:name="_cafb1546c01a8f7eb60cbefaed7bb0640ea60ab"/>
+    <w:bookmarkStart w:id="131" w:name="cu-07-confirmar-reserva"/>
     <w:p>
       <w:pPr>
         <w:pStyle w:val="Heading1"/>
@@ -5016,7 +5016,7 @@
         <w:t xml:space="preserve">CU-07 Confirmar reserva</w:t>
       </w:r>
     </w:p>
-    <w:bookmarkStart w:id="122" w:name="_e536aea01158c8c720dd8ebd7dad1e17834f68e"/>
+    <w:bookmarkStart w:id="122" w:name="descripción-6"/>
     <w:p>
       <w:pPr>
         <w:pStyle w:val="Heading2"/>
@@ -5122,7 +5122,7 @@
       </w:r>
     </w:p>
     <w:bookmarkEnd w:id="122"/>
-    <w:bookmarkStart w:id="123" w:name="_208b4fe5ccab9a8fa162645bf2f7f934be3faed"/>
+    <w:bookmarkStart w:id="123" w:name="actor-principal-6"/>
     <w:p>
       <w:pPr>
         <w:pStyle w:val="Heading2"/>
@@ -5140,7 +5140,7 @@
       </w:r>
     </w:p>
     <w:bookmarkEnd w:id="123"/>
-    <w:bookmarkStart w:id="124" w:name="_be3ff2511b098336eaab8bc39187895e968d240"/>
+    <w:bookmarkStart w:id="124" w:name="actores-secundarios-6"/>
     <w:p>
       <w:pPr>
         <w:pStyle w:val="Heading2"/>
@@ -5162,7 +5162,7 @@
       </w:r>
     </w:p>
     <w:bookmarkEnd w:id="124"/>
-    <w:bookmarkStart w:id="125" w:name="_093fefbc641afd5d8586ee762c464ed56db4f69"/>
+    <w:bookmarkStart w:id="125" w:name="precondiciones-6"/>
     <w:p>
       <w:pPr>
         <w:pStyle w:val="Heading2"/>
@@ -5226,7 +5226,7 @@
       </w:r>
     </w:p>
     <w:bookmarkEnd w:id="125"/>
-    <w:bookmarkStart w:id="126" w:name="_86aee4e1a2a1348002414e54812812eea25a19c"/>
+    <w:bookmarkStart w:id="126" w:name="flujo-principal-6"/>
     <w:p>
       <w:pPr>
         <w:pStyle w:val="Heading2"/>
@@ -5568,7 +5568,7 @@
       </w:r>
     </w:p>
     <w:bookmarkEnd w:id="126"/>
-    <w:bookmarkStart w:id="127" w:name="_3b9bf82f1c7dbeb2869ebc5f629c11933877365"/>
+    <w:bookmarkStart w:id="127" w:name="flujos-alternativos-6"/>
     <w:p>
       <w:pPr>
         <w:pStyle w:val="Heading2"/>
@@ -5659,7 +5659,7 @@
       </w:r>
     </w:p>
     <w:bookmarkEnd w:id="127"/>
-    <w:bookmarkStart w:id="128" w:name="_33c87a53604370b18a327f941a64d6247c41a36"/>
+    <w:bookmarkStart w:id="128" w:name="postcondiciones-6"/>
     <w:p>
       <w:pPr>
         <w:pStyle w:val="Heading2"/>
@@ -5754,7 +5754,7 @@
       </w:r>
     </w:p>
     <w:bookmarkEnd w:id="128"/>
-    <w:bookmarkStart w:id="129" w:name="_5ecb430ab107352f81bfd673b9df424f1e2f214"/>
+    <w:bookmarkStart w:id="129" w:name="reglas-de-negocio-aplicadas-6"/>
     <w:p>
       <w:pPr>
         <w:pStyle w:val="Heading2"/>
@@ -5819,7 +5819,7 @@
       </w:r>
     </w:p>
     <w:bookmarkEnd w:id="129"/>
-    <w:bookmarkStart w:id="130" w:name="_ac25aebaf46bb0e65aaa6d754a1be7a6e01a1f1"/>
+    <w:bookmarkStart w:id="130" w:name="entidades-del-dominio-involucradas-6"/>
     <w:p>
       <w:pPr>
         <w:pStyle w:val="Heading2"/>
@@ -5842,7 +5842,7 @@
     </w:p>
     <w:bookmarkEnd w:id="130"/>
     <w:bookmarkEnd w:id="131"/>
-    <w:bookmarkStart w:id="141" w:name="_02cdcdb2116a5f8d58bbe863441bb01782ff65c"/>
+    <w:bookmarkStart w:id="141" w:name="cu-08-gestionar-estado-del-viaje"/>
     <w:p>
       <w:pPr>
         <w:pStyle w:val="Heading1"/>
@@ -5851,7 +5851,7 @@
         <w:t xml:space="preserve">CU-08 Gestionar estado del viaje</w:t>
       </w:r>
     </w:p>
-    <w:bookmarkStart w:id="132" w:name="_180be74e5ebd1ad15ca9cc5edd424b57268d4bb"/>
+    <w:bookmarkStart w:id="132" w:name="descripción-7"/>
     <w:p>
       <w:pPr>
         <w:pStyle w:val="Heading2"/>
@@ -5894,7 +5894,7 @@
       </w:r>
     </w:p>
     <w:bookmarkEnd w:id="132"/>
-    <w:bookmarkStart w:id="133" w:name="_10853f31452e410a59ff074ae409c5d95fed2b4"/>
+    <w:bookmarkStart w:id="133" w:name="actor-principal-7"/>
     <w:p>
       <w:pPr>
         <w:pStyle w:val="Heading2"/>
@@ -5927,7 +5927,7 @@
       </w:r>
     </w:p>
     <w:bookmarkEnd w:id="133"/>
-    <w:bookmarkStart w:id="134" w:name="_9be7d2dcf6037001d112945d5a4cde7fc01ea38"/>
+    <w:bookmarkStart w:id="134" w:name="actores-secundarios-7"/>
     <w:p>
       <w:pPr>
         <w:pStyle w:val="Heading2"/>
@@ -5937,7 +5937,7 @@
       </w:r>
     </w:p>
     <w:bookmarkEnd w:id="134"/>
-    <w:bookmarkStart w:id="135" w:name="_40504f51f6af8c458325ff1be96e3615c6f2389"/>
+    <w:bookmarkStart w:id="135" w:name="precondiciones-7"/>
     <w:p>
       <w:pPr>
         <w:pStyle w:val="Heading2"/>
@@ -5971,7 +5971,7 @@
       </w:r>
     </w:p>
     <w:bookmarkEnd w:id="135"/>
-    <w:bookmarkStart w:id="136" w:name="_667aeeeec803260770a1fddee6d85d2f3098503"/>
+    <w:bookmarkStart w:id="136" w:name="flujo-principal-7"/>
     <w:p>
       <w:pPr>
         <w:pStyle w:val="Heading2"/>
@@ -6275,7 +6275,7 @@
       </w:r>
     </w:p>
     <w:bookmarkEnd w:id="136"/>
-    <w:bookmarkStart w:id="137" w:name="_016c4670332c5fee6c2f4cf1ca379a7bda0717c"/>
+    <w:bookmarkStart w:id="137" w:name="flujos-alternativos-7"/>
     <w:p>
       <w:pPr>
         <w:pStyle w:val="Heading2"/>
@@ -6480,7 +6480,7 @@
       </w:r>
     </w:p>
     <w:bookmarkEnd w:id="137"/>
-    <w:bookmarkStart w:id="138" w:name="_f2c6e663179843f59860986642d16d3d733ed85"/>
+    <w:bookmarkStart w:id="138" w:name="postcondiciones-7"/>
     <w:p>
       <w:pPr>
         <w:pStyle w:val="Heading2"/>
@@ -6502,7 +6502,7 @@
       </w:r>
     </w:p>
     <w:bookmarkEnd w:id="138"/>
-    <w:bookmarkStart w:id="139" w:name="_0e949d9bf1b7a75b7e7867ea497b1d8902919b0"/>
+    <w:bookmarkStart w:id="139" w:name="reglas-de-negocio-aplicadas-7"/>
     <w:p>
       <w:pPr>
         <w:pStyle w:val="Heading2"/>
@@ -6658,7 +6658,7 @@
       </w:r>
     </w:p>
     <w:bookmarkEnd w:id="139"/>
-    <w:bookmarkStart w:id="140" w:name="_37e274dbd24cf5f0146e005066d7c2082a53a3a"/>
+    <w:bookmarkStart w:id="140" w:name="entidades-del-dominio-involucradas-7"/>
     <w:p>
       <w:pPr>
         <w:pStyle w:val="Heading2"/>
@@ -6681,7 +6681,7 @@
     </w:p>
     <w:bookmarkEnd w:id="140"/>
     <w:bookmarkEnd w:id="141"/>
-    <w:bookmarkStart w:id="151" w:name="_bc59274a0c76728cd21372a0316c6ff14a9a6b6"/>
+    <w:bookmarkStart w:id="151" w:name="cu-09-armar-itinerario-de-hoteles"/>
     <w:p>
       <w:pPr>
         <w:pStyle w:val="Heading1"/>
@@ -6690,7 +6690,7 @@
         <w:t xml:space="preserve">CU-09 Armar itinerario de hoteles</w:t>
       </w:r>
     </w:p>
-    <w:bookmarkStart w:id="142" w:name="_8fadba2b7301108dd2d6bd68dd049b8b559ab15"/>
+    <w:bookmarkStart w:id="142" w:name="descripción-8"/>
     <w:p>
       <w:pPr>
         <w:pStyle w:val="Heading2"/>
@@ -6724,7 +6724,7 @@
       </w:r>
     </w:p>
     <w:bookmarkEnd w:id="142"/>
-    <w:bookmarkStart w:id="143" w:name="_8c55db69971ecd395f3fb54162f81f3cb26adf7"/>
+    <w:bookmarkStart w:id="143" w:name="actor-principal-8"/>
     <w:p>
       <w:pPr>
         <w:pStyle w:val="Heading2"/>
@@ -6742,7 +6742,7 @@
       </w:r>
     </w:p>
     <w:bookmarkEnd w:id="143"/>
-    <w:bookmarkStart w:id="144" w:name="_0401512daf8a15f09b419f5f3a5cfde647c9ea1"/>
+    <w:bookmarkStart w:id="144" w:name="actores-secundarios-8"/>
     <w:p>
       <w:pPr>
         <w:pStyle w:val="Heading2"/>
@@ -6752,7 +6752,7 @@
       </w:r>
     </w:p>
     <w:bookmarkEnd w:id="144"/>
-    <w:bookmarkStart w:id="145" w:name="_71f54b31b2be12dec66a302a0dc3bcb2955e5b7"/>
+    <w:bookmarkStart w:id="145" w:name="precondiciones-8"/>
     <w:p>
       <w:pPr>
         <w:pStyle w:val="Heading2"/>
@@ -6786,7 +6786,7 @@
       </w:r>
     </w:p>
     <w:bookmarkEnd w:id="145"/>
-    <w:bookmarkStart w:id="146" w:name="_6eb1769fe5ed27e12470ac7b6df2052c90011c8"/>
+    <w:bookmarkStart w:id="146" w:name="flujo-principal-8"/>
     <w:p>
       <w:pPr>
         <w:pStyle w:val="Heading2"/>
@@ -6973,7 +6973,7 @@
       </w:r>
     </w:p>
     <w:bookmarkEnd w:id="146"/>
-    <w:bookmarkStart w:id="147" w:name="_460b81b27ba02ad4a2b6016424c354bbfaca83c"/>
+    <w:bookmarkStart w:id="147" w:name="flujos-alternativos-8"/>
     <w:p>
       <w:pPr>
         <w:pStyle w:val="Heading2"/>
@@ -7187,7 +7187,7 @@
       </w:r>
     </w:p>
     <w:bookmarkEnd w:id="147"/>
-    <w:bookmarkStart w:id="148" w:name="_25d874de7c14dbb758929b58a196bc2f2225ad3"/>
+    <w:bookmarkStart w:id="148" w:name="postcondiciones-8"/>
     <w:p>
       <w:pPr>
         <w:pStyle w:val="Heading2"/>
@@ -7209,7 +7209,7 @@
       </w:r>
     </w:p>
     <w:bookmarkEnd w:id="148"/>
-    <w:bookmarkStart w:id="149" w:name="_8d8c5e4b048c198f21ac7a2aab5c02b4cf026fb"/>
+    <w:bookmarkStart w:id="149" w:name="reglas-de-negocio-aplicadas-8"/>
     <w:p>
       <w:pPr>
         <w:pStyle w:val="Heading2"/>
@@ -7402,7 +7402,7 @@
       </w:r>
     </w:p>
     <w:bookmarkEnd w:id="149"/>
-    <w:bookmarkStart w:id="150" w:name="_bd33f75177d1c517a5a1b323ad416b8becfb7c0"/>
+    <w:bookmarkStart w:id="150" w:name="entidades-del-dominio-involucradas-8"/>
     <w:p>
       <w:pPr>
         <w:pStyle w:val="Heading2"/>
@@ -7437,7 +7437,7 @@
     </w:p>
     <w:bookmarkEnd w:id="150"/>
     <w:bookmarkEnd w:id="151"/>
-    <w:bookmarkStart w:id="161" w:name="_31e50c310e3d1391b8f83f8aa472fba46308a39"/>
+    <w:bookmarkStart w:id="161" w:name="cu-10-registrar-economía-del-viaje"/>
     <w:p>
       <w:pPr>
         <w:pStyle w:val="Heading1"/>
@@ -7446,7 +7446,7 @@
         <w:t xml:space="preserve">CU-10 Registrar economía del viaje</w:t>
       </w:r>
     </w:p>
-    <w:bookmarkStart w:id="152" w:name="_45ba84089a2189e49731d95e3441e1dc0d91540"/>
+    <w:bookmarkStart w:id="152" w:name="descripción-9"/>
     <w:p>
       <w:pPr>
         <w:pStyle w:val="Heading2"/>
@@ -7518,7 +7518,7 @@
       </w:r>
     </w:p>
     <w:bookmarkEnd w:id="152"/>
-    <w:bookmarkStart w:id="153" w:name="_67463de5399a05d52139bfdc88fde96770acff1"/>
+    <w:bookmarkStart w:id="153" w:name="actor-principal-9"/>
     <w:p>
       <w:pPr>
         <w:pStyle w:val="Heading2"/>
@@ -7536,7 +7536,7 @@
       </w:r>
     </w:p>
     <w:bookmarkEnd w:id="153"/>
-    <w:bookmarkStart w:id="154" w:name="_2a68552745066c9fed90fc6c9628bc6a7e60470"/>
+    <w:bookmarkStart w:id="154" w:name="actores-secundarios-9"/>
     <w:p>
       <w:pPr>
         <w:pStyle w:val="Heading2"/>
@@ -7558,7 +7558,7 @@
       </w:r>
     </w:p>
     <w:bookmarkEnd w:id="154"/>
-    <w:bookmarkStart w:id="155" w:name="_2e294829c65de519f729625d488c0f96ef36a92"/>
+    <w:bookmarkStart w:id="155" w:name="precondiciones-9"/>
     <w:p>
       <w:pPr>
         <w:pStyle w:val="Heading2"/>
@@ -7622,7 +7622,7 @@
       </w:r>
     </w:p>
     <w:bookmarkEnd w:id="155"/>
-    <w:bookmarkStart w:id="156" w:name="_a0e63916090109ad0369f5900c93a3701f519c7"/>
+    <w:bookmarkStart w:id="156" w:name="flujo-principal-9"/>
     <w:p>
       <w:pPr>
         <w:pStyle w:val="Heading2"/>
@@ -7867,7 +7867,7 @@
       </w:r>
     </w:p>
     <w:bookmarkEnd w:id="156"/>
-    <w:bookmarkStart w:id="157" w:name="_6a5c606f59e46a8fd0b487a9c126799341f953f"/>
+    <w:bookmarkStart w:id="157" w:name="flujos-alternativos-9"/>
     <w:p>
       <w:pPr>
         <w:pStyle w:val="Heading2"/>
@@ -8097,7 +8097,7 @@
       </w:r>
     </w:p>
     <w:bookmarkEnd w:id="157"/>
-    <w:bookmarkStart w:id="158" w:name="_9f6eb1b2576d786b4aae5bd328b0013d41b145b"/>
+    <w:bookmarkStart w:id="158" w:name="postcondiciones-9"/>
     <w:p>
       <w:pPr>
         <w:pStyle w:val="Heading2"/>
@@ -8227,7 +8227,7 @@
       </w:r>
     </w:p>
     <w:bookmarkEnd w:id="158"/>
-    <w:bookmarkStart w:id="159" w:name="_db9450f8d3007a7eb5d4d5c367bba1ab45675be"/>
+    <w:bookmarkStart w:id="159" w:name="reglas-de-negocio-aplicadas-9"/>
     <w:p>
       <w:pPr>
         <w:pStyle w:val="Heading2"/>
@@ -8249,7 +8249,7 @@
       </w:r>
     </w:p>
     <w:bookmarkEnd w:id="159"/>
-    <w:bookmarkStart w:id="160" w:name="_08510357e13044d0b6fcb573f9ef2ded98f375a"/>
+    <w:bookmarkStart w:id="160" w:name="entidades-del-dominio-involucradas-9"/>
     <w:p>
       <w:pPr>
         <w:pStyle w:val="Heading2"/>
@@ -8272,7 +8272,7 @@
     </w:p>
     <w:bookmarkEnd w:id="160"/>
     <w:bookmarkEnd w:id="161"/>
-    <w:bookmarkStart w:id="171" w:name="_9fc36f2edbb342598a3b46302434346d812c096"/>
+    <w:bookmarkStart w:id="171" w:name="cu-11-definir-plan-de-cuotas"/>
     <w:p>
       <w:pPr>
         <w:pStyle w:val="Heading1"/>
@@ -8281,7 +8281,7 @@
         <w:t xml:space="preserve">CU-11 Definir plan de cuotas</w:t>
       </w:r>
     </w:p>
-    <w:bookmarkStart w:id="162" w:name="_d2392ba15e6d8530edfd602a73e970bcb8855df"/>
+    <w:bookmarkStart w:id="162" w:name="descripción-10"/>
     <w:p>
       <w:pPr>
         <w:pStyle w:val="Heading2"/>
@@ -8299,7 +8299,7 @@
       </w:r>
     </w:p>
     <w:bookmarkEnd w:id="162"/>
-    <w:bookmarkStart w:id="163" w:name="_72b33bee9888f2ef423c355f2d0400fab833b20"/>
+    <w:bookmarkStart w:id="163" w:name="actor-principal-10"/>
     <w:p>
       <w:pPr>
         <w:pStyle w:val="Heading2"/>
@@ -8317,7 +8317,7 @@
       </w:r>
     </w:p>
     <w:bookmarkEnd w:id="163"/>
-    <w:bookmarkStart w:id="164" w:name="_9864e036dd0f22d9f2625a28fd44a3099041f78"/>
+    <w:bookmarkStart w:id="164" w:name="actores-secundarios-10"/>
     <w:p>
       <w:pPr>
         <w:pStyle w:val="Heading2"/>
@@ -8339,7 +8339,7 @@
       </w:r>
     </w:p>
     <w:bookmarkEnd w:id="164"/>
-    <w:bookmarkStart w:id="165" w:name="_f62d18a073dffeda4ac981ee1d345cdfe6e1122"/>
+    <w:bookmarkStart w:id="165" w:name="precondiciones-10"/>
     <w:p>
       <w:pPr>
         <w:pStyle w:val="Heading2"/>
@@ -8373,7 +8373,7 @@
       </w:r>
     </w:p>
     <w:bookmarkEnd w:id="165"/>
-    <w:bookmarkStart w:id="166" w:name="_f1ed915b0b033ec5e2fc4f26b90c692becf80cd"/>
+    <w:bookmarkStart w:id="166" w:name="flujo-principal-10"/>
     <w:p>
       <w:pPr>
         <w:pStyle w:val="Heading2"/>
@@ -8619,7 +8619,7 @@
       </w:r>
     </w:p>
     <w:bookmarkEnd w:id="166"/>
-    <w:bookmarkStart w:id="167" w:name="_cdb423890cdd558b94221b2fce46784beba8d95"/>
+    <w:bookmarkStart w:id="167" w:name="flujos-alternativos-10"/>
     <w:p>
       <w:pPr>
         <w:pStyle w:val="Heading2"/>
@@ -9022,7 +9022,7 @@
       </w:r>
     </w:p>
     <w:bookmarkEnd w:id="167"/>
-    <w:bookmarkStart w:id="168" w:name="_470e91eef74b4ef144eb4e3fbe12a6c1232e808"/>
+    <w:bookmarkStart w:id="168" w:name="postcondiciones-10"/>
     <w:p>
       <w:pPr>
         <w:pStyle w:val="Heading2"/>
@@ -9044,7 +9044,7 @@
       </w:r>
     </w:p>
     <w:bookmarkEnd w:id="168"/>
-    <w:bookmarkStart w:id="169" w:name="_0391ee754512520247df3a1fa6d99f2858fa706"/>
+    <w:bookmarkStart w:id="169" w:name="reglas-de-negocio-aplicadas-10"/>
     <w:p>
       <w:pPr>
         <w:pStyle w:val="Heading2"/>
@@ -9174,7 +9174,7 @@
       </w:r>
     </w:p>
     <w:bookmarkEnd w:id="169"/>
-    <w:bookmarkStart w:id="170" w:name="_a4dc5934367daaf68fece1d7e2b90ce197f2551"/>
+    <w:bookmarkStart w:id="170" w:name="entidades-del-dominio-involucradas-10"/>
     <w:p>
       <w:pPr>
         <w:pStyle w:val="Heading2"/>
@@ -9197,7 +9197,7 @@
     </w:p>
     <w:bookmarkEnd w:id="170"/>
     <w:bookmarkEnd w:id="171"/>
-    <w:bookmarkStart w:id="181" w:name="_4f0257a6d51c553fbc1fadd6d2b2b3818850d9f"/>
+    <w:bookmarkStart w:id="181" w:name="cu-12-registrar-cobro-de-un-pago"/>
     <w:p>
       <w:pPr>
         <w:pStyle w:val="Heading1"/>
@@ -9206,7 +9206,7 @@
         <w:t xml:space="preserve">CU-12 Registrar cobro de un pago</w:t>
       </w:r>
     </w:p>
-    <w:bookmarkStart w:id="172" w:name="_4fa12c971fe393d93fb6090d9c2732ed6c88455"/>
+    <w:bookmarkStart w:id="172" w:name="descripción-11"/>
     <w:p>
       <w:pPr>
         <w:pStyle w:val="Heading2"/>
@@ -9240,7 +9240,7 @@
       </w:r>
     </w:p>
     <w:bookmarkEnd w:id="172"/>
-    <w:bookmarkStart w:id="173" w:name="_405371449db4566ec6935dcba12ae671362d807"/>
+    <w:bookmarkStart w:id="173" w:name="actor-principal-11"/>
     <w:p>
       <w:pPr>
         <w:pStyle w:val="Heading2"/>
@@ -9258,7 +9258,7 @@
       </w:r>
     </w:p>
     <w:bookmarkEnd w:id="173"/>
-    <w:bookmarkStart w:id="174" w:name="_b98c31b5fb5bfcd4f4d0bacad77604332eccd08"/>
+    <w:bookmarkStart w:id="174" w:name="actores-secundarios-11"/>
     <w:p>
       <w:pPr>
         <w:pStyle w:val="Heading2"/>
@@ -9268,7 +9268,7 @@
       </w:r>
     </w:p>
     <w:bookmarkEnd w:id="174"/>
-    <w:bookmarkStart w:id="175" w:name="_8602c01fc4539ca9ac4e22a84e1c3f72ac3c201"/>
+    <w:bookmarkStart w:id="175" w:name="precondiciones-11"/>
     <w:p>
       <w:pPr>
         <w:pStyle w:val="Heading2"/>
@@ -9320,7 +9320,7 @@
       </w:r>
     </w:p>
     <w:bookmarkEnd w:id="175"/>
-    <w:bookmarkStart w:id="176" w:name="_b1dd2b6a5b3afd6f622818421c5115365937964"/>
+    <w:bookmarkStart w:id="176" w:name="flujo-principal-11"/>
     <w:p>
       <w:pPr>
         <w:pStyle w:val="Heading2"/>
@@ -9589,7 +9589,7 @@
       </w:r>
     </w:p>
     <w:bookmarkEnd w:id="176"/>
-    <w:bookmarkStart w:id="177" w:name="_f6ba925520183a60d0e334e73304283f422beff"/>
+    <w:bookmarkStart w:id="177" w:name="flujos-alternativos-11"/>
     <w:p>
       <w:pPr>
         <w:pStyle w:val="Heading2"/>
@@ -9942,7 +9942,7 @@
       </w:r>
     </w:p>
     <w:bookmarkEnd w:id="177"/>
-    <w:bookmarkStart w:id="178" w:name="_8e3846e5a047330431ebb601eba21071110f86b"/>
+    <w:bookmarkStart w:id="178" w:name="postcondiciones-11"/>
     <w:p>
       <w:pPr>
         <w:pStyle w:val="Heading2"/>
@@ -9976,7 +9976,7 @@
       </w:r>
     </w:p>
     <w:bookmarkEnd w:id="178"/>
-    <w:bookmarkStart w:id="179" w:name="_b3b55a660fd13b2f4fc7df6c5ad66b0ebe2c00c"/>
+    <w:bookmarkStart w:id="179" w:name="reglas-de-negocio-aplicadas-11"/>
     <w:p>
       <w:pPr>
         <w:pStyle w:val="Heading2"/>
@@ -10194,7 +10194,7 @@
       </w:r>
     </w:p>
     <w:bookmarkEnd w:id="179"/>
-    <w:bookmarkStart w:id="180" w:name="_996680007d20151aaf6b367be4373c2d160213b"/>
+    <w:bookmarkStart w:id="180" w:name="entidades-del-dominio-involucradas-11"/>
     <w:p>
       <w:pPr>
         <w:pStyle w:val="Heading2"/>
@@ -10217,7 +10217,7 @@
     </w:p>
     <w:bookmarkEnd w:id="180"/>
     <w:bookmarkEnd w:id="181"/>
-    <w:bookmarkStart w:id="191" w:name="_8d2baf2ba3bd3897cb78f634cd2f68b2267d56d"/>
+    <w:bookmarkStart w:id="191" w:name="cu-13-configurar-porcentaje-de-comisión"/>
     <w:p>
       <w:pPr>
         <w:pStyle w:val="Heading1"/>
@@ -10226,7 +10226,7 @@
         <w:t xml:space="preserve">CU-13 Configurar porcentaje de comisión</w:t>
       </w:r>
     </w:p>
-    <w:bookmarkStart w:id="182" w:name="_c5aeafe79cfccf0f2aea6d84c08c04b6b2710ee"/>
+    <w:bookmarkStart w:id="182" w:name="descripción-12"/>
     <w:p>
       <w:pPr>
         <w:pStyle w:val="Heading2"/>
@@ -10298,7 +10298,7 @@
       </w:r>
     </w:p>
     <w:bookmarkEnd w:id="182"/>
-    <w:bookmarkStart w:id="183" w:name="_84897d2eb704e7f90cd186c78d641f263ca8523"/>
+    <w:bookmarkStart w:id="183" w:name="actor-principal-12"/>
     <w:p>
       <w:pPr>
         <w:pStyle w:val="Heading2"/>
@@ -10316,7 +10316,7 @@
       </w:r>
     </w:p>
     <w:bookmarkEnd w:id="183"/>
-    <w:bookmarkStart w:id="184" w:name="_804b569122940d0b4a6357511f5a2f83d84d92f"/>
+    <w:bookmarkStart w:id="184" w:name="actores-secundarios-12"/>
     <w:p>
       <w:pPr>
         <w:pStyle w:val="Heading2"/>
@@ -10326,7 +10326,7 @@
       </w:r>
     </w:p>
     <w:bookmarkEnd w:id="184"/>
-    <w:bookmarkStart w:id="185" w:name="_61fa906b6daa0e4b1b892085bc38b8e35b67dc4"/>
+    <w:bookmarkStart w:id="185" w:name="precondiciones-12"/>
     <w:p>
       <w:pPr>
         <w:pStyle w:val="Heading2"/>
@@ -10360,7 +10360,7 @@
       </w:r>
     </w:p>
     <w:bookmarkEnd w:id="185"/>
-    <w:bookmarkStart w:id="186" w:name="_a969e6169720f3839d22de85baa4a794de254b2"/>
+    <w:bookmarkStart w:id="186" w:name="flujo-principal-12"/>
     <w:p>
       <w:pPr>
         <w:pStyle w:val="Heading2"/>
@@ -10461,7 +10461,7 @@
       </w:r>
     </w:p>
     <w:bookmarkEnd w:id="186"/>
-    <w:bookmarkStart w:id="187" w:name="_a73131a043f9da898e0bdd116751a28f1f50471"/>
+    <w:bookmarkStart w:id="187" w:name="flujos-alternativos-12"/>
     <w:p>
       <w:pPr>
         <w:pStyle w:val="Heading2"/>
@@ -10530,7 +10530,7 @@
       </w:r>
     </w:p>
     <w:bookmarkEnd w:id="187"/>
-    <w:bookmarkStart w:id="188" w:name="_aa4815479141f2c93b72a71f284179faa6fc6b9"/>
+    <w:bookmarkStart w:id="188" w:name="postcondiciones-12"/>
     <w:p>
       <w:pPr>
         <w:pStyle w:val="Heading2"/>
@@ -10552,7 +10552,7 @@
       </w:r>
     </w:p>
     <w:bookmarkEnd w:id="188"/>
-    <w:bookmarkStart w:id="189" w:name="_676a3d314793378b1e3c5514b846904535d65a0"/>
+    <w:bookmarkStart w:id="189" w:name="reglas-de-negocio-aplicadas-12"/>
     <w:p>
       <w:pPr>
         <w:pStyle w:val="Heading2"/>
@@ -10574,7 +10574,7 @@
       </w:r>
     </w:p>
     <w:bookmarkEnd w:id="189"/>
-    <w:bookmarkStart w:id="190" w:name="_d6f3834ec32d00d9ebe42becb54464e57032113"/>
+    <w:bookmarkStart w:id="190" w:name="entidades-del-dominio-involucradas-12"/>
     <w:p>
       <w:pPr>
         <w:pStyle w:val="Heading2"/>
@@ -10597,7 +10597,7 @@
     </w:p>
     <w:bookmarkEnd w:id="190"/>
     <w:bookmarkEnd w:id="191"/>
-    <w:bookmarkStart w:id="201" w:name="_78b99cf82bfe36446af5da62ae8d6d3bde230b4"/>
+    <w:bookmarkStart w:id="201" w:name="cu-14-ver-y-atender-alertas-del-día"/>
     <w:p>
       <w:pPr>
         <w:pStyle w:val="Heading1"/>
@@ -10606,7 +10606,7 @@
         <w:t xml:space="preserve">CU-14 Ver y atender alertas del día</w:t>
       </w:r>
     </w:p>
-    <w:bookmarkStart w:id="192" w:name="_c03050c6ab34870f9690a30b8901af24752ef18"/>
+    <w:bookmarkStart w:id="192" w:name="descripción-13"/>
     <w:p>
       <w:pPr>
         <w:pStyle w:val="Heading2"/>
@@ -10624,7 +10624,7 @@
       </w:r>
     </w:p>
     <w:bookmarkEnd w:id="192"/>
-    <w:bookmarkStart w:id="193" w:name="_12cf5b35914cb8cc68ff0f254d1d81225b1a336"/>
+    <w:bookmarkStart w:id="193" w:name="actor-principal-13"/>
     <w:p>
       <w:pPr>
         <w:pStyle w:val="Heading2"/>
@@ -10642,7 +10642,7 @@
       </w:r>
     </w:p>
     <w:bookmarkEnd w:id="193"/>
-    <w:bookmarkStart w:id="194" w:name="_6bc1ee231bea157416742a4ae6bec9c68150f00"/>
+    <w:bookmarkStart w:id="194" w:name="actores-secundarios-13"/>
     <w:p>
       <w:pPr>
         <w:pStyle w:val="Heading2"/>
@@ -10664,7 +10664,7 @@
       </w:r>
     </w:p>
     <w:bookmarkEnd w:id="194"/>
-    <w:bookmarkStart w:id="195" w:name="_3c2f32d200d58ec24dcd2f60bd9ba9afff940e3"/>
+    <w:bookmarkStart w:id="195" w:name="precondiciones-13"/>
     <w:p>
       <w:pPr>
         <w:pStyle w:val="Heading2"/>
@@ -10686,7 +10686,7 @@
       </w:r>
     </w:p>
     <w:bookmarkEnd w:id="195"/>
-    <w:bookmarkStart w:id="196" w:name="_b35ce4c5a8a91a431d5b0a764d6d01c4ef680a5"/>
+    <w:bookmarkStart w:id="196" w:name="flujo-principal-13"/>
     <w:p>
       <w:pPr>
         <w:pStyle w:val="Heading2"/>
@@ -10863,7 +10863,7 @@
       </w:r>
     </w:p>
     <w:bookmarkEnd w:id="196"/>
-    <w:bookmarkStart w:id="197" w:name="_3a8c6626e52029c5054792b594169531d56628f"/>
+    <w:bookmarkStart w:id="197" w:name="flujos-alternativos-13"/>
     <w:p>
       <w:pPr>
         <w:pStyle w:val="Heading2"/>
@@ -11040,7 +11040,7 @@
       </w:r>
     </w:p>
     <w:bookmarkEnd w:id="197"/>
-    <w:bookmarkStart w:id="198" w:name="_5a1f8427cb08027d9a5ee50e0bcc130069deee6"/>
+    <w:bookmarkStart w:id="198" w:name="postcondiciones-13"/>
     <w:p>
       <w:pPr>
         <w:pStyle w:val="Heading2"/>
@@ -11110,7 +11110,7 @@
       </w:r>
     </w:p>
     <w:bookmarkEnd w:id="198"/>
-    <w:bookmarkStart w:id="199" w:name="_4c545ebcbf7b31438e6e80c3883d38d3e8849cc"/>
+    <w:bookmarkStart w:id="199" w:name="reglas-de-negocio-aplicadas-13"/>
     <w:p>
       <w:pPr>
         <w:pStyle w:val="Heading2"/>
@@ -11132,7 +11132,7 @@
       </w:r>
     </w:p>
     <w:bookmarkEnd w:id="199"/>
-    <w:bookmarkStart w:id="200" w:name="_62557076579f916d49caa7233a37b5587b24562"/>
+    <w:bookmarkStart w:id="200" w:name="entidades-del-dominio-involucradas-13"/>
     <w:p>
       <w:pPr>
         <w:pStyle w:val="Heading2"/>
@@ -11155,7 +11155,7 @@
     </w:p>
     <w:bookmarkEnd w:id="200"/>
     <w:bookmarkEnd w:id="201"/>
-    <w:bookmarkStart w:id="211" w:name="_a9ff277d96249c13dec4ca3173263328b585074"/>
+    <w:bookmarkStart w:id="211" w:name="Xa9ff277d96249c13dec4ca3173263328b585074"/>
     <w:p>
       <w:pPr>
         <w:pStyle w:val="Heading1"/>
@@ -11164,7 +11164,7 @@
         <w:t xml:space="preserve">CU-15 Configurar recordatorios por destino</w:t>
       </w:r>
     </w:p>
-    <w:bookmarkStart w:id="202" w:name="_aad8934945f163de4ca49d7848e44a4be580bd4"/>
+    <w:bookmarkStart w:id="202" w:name="descripción-14"/>
     <w:p>
       <w:pPr>
         <w:pStyle w:val="Heading2"/>
@@ -11197,7 +11197,7 @@
       </w:r>
     </w:p>
     <w:bookmarkEnd w:id="202"/>
-    <w:bookmarkStart w:id="203" w:name="_f82cee1b7ec3ecae0c8e7afec475e065fd8ee13"/>
+    <w:bookmarkStart w:id="203" w:name="actor-principal-14"/>
     <w:p>
       <w:pPr>
         <w:pStyle w:val="Heading2"/>
@@ -11227,7 +11227,7 @@
       </w:r>
     </w:p>
     <w:bookmarkEnd w:id="203"/>
-    <w:bookmarkStart w:id="204" w:name="_578e78a6d23baf5952523fea4672db2a000b325"/>
+    <w:bookmarkStart w:id="204" w:name="actores-secundarios-14"/>
     <w:p>
       <w:pPr>
         <w:pStyle w:val="Heading2"/>
@@ -11237,7 +11237,7 @@
       </w:r>
     </w:p>
     <w:bookmarkEnd w:id="204"/>
-    <w:bookmarkStart w:id="205" w:name="_0f3e67275d9ec0d787e7905934f81cdbc1a0162"/>
+    <w:bookmarkStart w:id="205" w:name="precondiciones-14"/>
     <w:p>
       <w:pPr>
         <w:pStyle w:val="Heading2"/>
@@ -11289,7 +11289,7 @@
       </w:r>
     </w:p>
     <w:bookmarkEnd w:id="205"/>
-    <w:bookmarkStart w:id="206" w:name="_40b5efbfdb6619ab1b5d0c98e9ed0ee48af2194"/>
+    <w:bookmarkStart w:id="206" w:name="flujo-principal-14"/>
     <w:p>
       <w:pPr>
         <w:pStyle w:val="Heading2"/>
@@ -11476,7 +11476,7 @@
       </w:r>
     </w:p>
     <w:bookmarkEnd w:id="206"/>
-    <w:bookmarkStart w:id="207" w:name="_ba5411b3bf18b5049764d7212ae2390db5b1d9c"/>
+    <w:bookmarkStart w:id="207" w:name="flujos-alternativos-14"/>
     <w:p>
       <w:pPr>
         <w:pStyle w:val="Heading2"/>
@@ -11561,7 +11561,7 @@
       </w:r>
     </w:p>
     <w:bookmarkEnd w:id="207"/>
-    <w:bookmarkStart w:id="208" w:name="_15ca9bdec8a10dff8fa14fbe431d004c0534442"/>
+    <w:bookmarkStart w:id="208" w:name="postcondiciones-14"/>
     <w:p>
       <w:pPr>
         <w:pStyle w:val="Heading2"/>
@@ -11595,7 +11595,7 @@
       </w:r>
     </w:p>
     <w:bookmarkEnd w:id="208"/>
-    <w:bookmarkStart w:id="209" w:name="_d3d9606af570fd0ab012c92d6fe476074464c64"/>
+    <w:bookmarkStart w:id="209" w:name="reglas-de-negocio-aplicadas-14"/>
     <w:p>
       <w:pPr>
         <w:pStyle w:val="Heading2"/>
@@ -11632,7 +11632,7 @@
       </w:r>
     </w:p>
     <w:bookmarkEnd w:id="209"/>
-    <w:bookmarkStart w:id="210" w:name="_8aa8c5f85927141c38c01f2fedfa6cc82e22abe"/>
+    <w:bookmarkStart w:id="210" w:name="entidades-del-dominio-involucradas-14"/>
     <w:p>
       <w:pPr>
         <w:pStyle w:val="Heading2"/>
@@ -11655,7 +11655,7 @@
     </w:p>
     <w:bookmarkEnd w:id="210"/>
     <w:bookmarkEnd w:id="211"/>
-    <w:bookmarkStart w:id="221" w:name="_25b2457c031afd7d5bf6f1bd3d9f1adac5290de"/>
+    <w:bookmarkStart w:id="221" w:name="cu-16-gestionar-hotel-en-catálogo"/>
     <w:p>
       <w:pPr>
         <w:pStyle w:val="Heading1"/>
@@ -11664,7 +11664,7 @@
         <w:t xml:space="preserve">CU-16 Gestionar hotel en catálogo</w:t>
       </w:r>
     </w:p>
-    <w:bookmarkStart w:id="212" w:name="_d7bdb5d408c60d04fbfb7497c88ce706b898910"/>
+    <w:bookmarkStart w:id="212" w:name="descripción-15"/>
     <w:p>
       <w:pPr>
         <w:pStyle w:val="Heading2"/>
@@ -11698,7 +11698,7 @@
       </w:r>
     </w:p>
     <w:bookmarkEnd w:id="212"/>
-    <w:bookmarkStart w:id="213" w:name="_6f341e0a2831776b565ec23adac6c8c6e106a84"/>
+    <w:bookmarkStart w:id="213" w:name="actor-principal-15"/>
     <w:p>
       <w:pPr>
         <w:pStyle w:val="Heading2"/>
@@ -11728,7 +11728,7 @@
       </w:r>
     </w:p>
     <w:bookmarkEnd w:id="213"/>
-    <w:bookmarkStart w:id="214" w:name="_02991ecdc1705840afc48769315b1fd793cd5e2"/>
+    <w:bookmarkStart w:id="214" w:name="actores-secundarios-15"/>
     <w:p>
       <w:pPr>
         <w:pStyle w:val="Heading2"/>
@@ -11738,7 +11738,7 @@
       </w:r>
     </w:p>
     <w:bookmarkEnd w:id="214"/>
-    <w:bookmarkStart w:id="215" w:name="_e6c13f18a3f3dc5bee3829a7ad0a1ea188792db"/>
+    <w:bookmarkStart w:id="215" w:name="precondiciones-15"/>
     <w:p>
       <w:pPr>
         <w:pStyle w:val="Heading2"/>
@@ -11760,7 +11760,7 @@
       </w:r>
     </w:p>
     <w:bookmarkEnd w:id="215"/>
-    <w:bookmarkStart w:id="216" w:name="_acaff5ff997c4f6bd0643ed89b355399e5deebc"/>
+    <w:bookmarkStart w:id="216" w:name="flujo-principal-15"/>
     <w:p>
       <w:pPr>
         <w:pStyle w:val="Heading2"/>
@@ -11948,7 +11948,7 @@
       </w:r>
     </w:p>
     <w:bookmarkEnd w:id="216"/>
-    <w:bookmarkStart w:id="217" w:name="_04c30c446aabbb4bb611d03c86f3314a46f5702"/>
+    <w:bookmarkStart w:id="217" w:name="flujos-alternativos-15"/>
     <w:p>
       <w:pPr>
         <w:pStyle w:val="Heading2"/>
@@ -12132,7 +12132,7 @@
       </w:r>
     </w:p>
     <w:bookmarkEnd w:id="217"/>
-    <w:bookmarkStart w:id="218" w:name="_addcc349ec03979ba987fc9a9529c7276190c03"/>
+    <w:bookmarkStart w:id="218" w:name="postcondiciones-15"/>
     <w:p>
       <w:pPr>
         <w:pStyle w:val="Heading2"/>
@@ -12167,7 +12167,7 @@
       </w:r>
     </w:p>
     <w:bookmarkEnd w:id="218"/>
-    <w:bookmarkStart w:id="219" w:name="_9bfb7f687c0064501de501e55bab8372c184222"/>
+    <w:bookmarkStart w:id="219" w:name="reglas-de-negocio-aplicadas-15"/>
     <w:p>
       <w:pPr>
         <w:pStyle w:val="Heading2"/>
@@ -12189,7 +12189,7 @@
       </w:r>
     </w:p>
     <w:bookmarkEnd w:id="219"/>
-    <w:bookmarkStart w:id="220" w:name="_92cdc5884dc496126a00255c5ed9d0e1ccea392"/>
+    <w:bookmarkStart w:id="220" w:name="entidades-del-dominio-involucradas-15"/>
     <w:p>
       <w:pPr>
         <w:pStyle w:val="Heading2"/>
@@ -12224,7 +12224,7 @@
     </w:p>
     <w:bookmarkEnd w:id="220"/>
     <w:bookmarkEnd w:id="221"/>
-    <w:bookmarkStart w:id="231" w:name="_c8d9a5fbeae64007f66435cadc64627614bebf6"/>
+    <w:bookmarkStart w:id="231" w:name="cu-17-registrar-reseña-de-hotel"/>
     <w:p>
       <w:pPr>
         <w:pStyle w:val="Heading1"/>
@@ -12233,7 +12233,7 @@
         <w:t xml:space="preserve">CU-17 Registrar reseña de hotel</w:t>
       </w:r>
     </w:p>
-    <w:bookmarkStart w:id="222" w:name="_c58481de430381c02194c14f011e2de1de07909"/>
+    <w:bookmarkStart w:id="222" w:name="descripción-16"/>
     <w:p>
       <w:pPr>
         <w:pStyle w:val="Heading2"/>
@@ -12251,7 +12251,7 @@
       </w:r>
     </w:p>
     <w:bookmarkEnd w:id="222"/>
-    <w:bookmarkStart w:id="223" w:name="_7aeb51422f79e5fa8f4ae94902f59048ce4f2a9"/>
+    <w:bookmarkStart w:id="223" w:name="actor-principal-16"/>
     <w:p>
       <w:pPr>
         <w:pStyle w:val="Heading2"/>
@@ -12281,7 +12281,7 @@
       </w:r>
     </w:p>
     <w:bookmarkEnd w:id="223"/>
-    <w:bookmarkStart w:id="224" w:name="_c9cd3610e8159b90ac949a11d5a3fe8085fc0c4"/>
+    <w:bookmarkStart w:id="224" w:name="actores-secundarios-16"/>
     <w:p>
       <w:pPr>
         <w:pStyle w:val="Heading2"/>
@@ -12303,7 +12303,7 @@
       </w:r>
     </w:p>
     <w:bookmarkEnd w:id="224"/>
-    <w:bookmarkStart w:id="225" w:name="_64fe6b5343e070567cf252d6d51ef49169e5acd"/>
+    <w:bookmarkStart w:id="225" w:name="precondiciones-16"/>
     <w:p>
       <w:pPr>
         <w:pStyle w:val="Heading2"/>
@@ -12337,7 +12337,7 @@
       </w:r>
     </w:p>
     <w:bookmarkEnd w:id="225"/>
-    <w:bookmarkStart w:id="226" w:name="_f88452d91ba3f71f83a8068870369290f111eee"/>
+    <w:bookmarkStart w:id="226" w:name="flujo-principal-16"/>
     <w:p>
       <w:pPr>
         <w:pStyle w:val="Heading2"/>
@@ -12561,7 +12561,7 @@
       </w:r>
     </w:p>
     <w:bookmarkEnd w:id="226"/>
-    <w:bookmarkStart w:id="227" w:name="_852c81e0f0863bede148d36390099447fa480a7"/>
+    <w:bookmarkStart w:id="227" w:name="flujos-alternativos-16"/>
     <w:p>
       <w:pPr>
         <w:pStyle w:val="Heading2"/>
@@ -12697,7 +12697,7 @@
       </w:r>
     </w:p>
     <w:bookmarkEnd w:id="227"/>
-    <w:bookmarkStart w:id="228" w:name="_2fb0e7d22071600fef049ca4b9159bae65f516a"/>
+    <w:bookmarkStart w:id="228" w:name="postcondiciones-16"/>
     <w:p>
       <w:pPr>
         <w:pStyle w:val="Heading2"/>
@@ -12773,7 +12773,7 @@
       </w:r>
     </w:p>
     <w:bookmarkEnd w:id="228"/>
-    <w:bookmarkStart w:id="229" w:name="_c1e6211edff09e2e18e75db2adaebb4c17c6c75"/>
+    <w:bookmarkStart w:id="229" w:name="reglas-de-negocio-aplicadas-16"/>
     <w:p>
       <w:pPr>
         <w:pStyle w:val="Heading2"/>
@@ -12994,7 +12994,7 @@
       </w:r>
     </w:p>
     <w:bookmarkEnd w:id="229"/>
-    <w:bookmarkStart w:id="230" w:name="_7bee8bd41e1ad4f4429f83f150a0661399674f6"/>
+    <w:bookmarkStart w:id="230" w:name="entidades-del-dominio-involucradas-16"/>
     <w:p>
       <w:pPr>
         <w:pStyle w:val="Heading2"/>
@@ -13017,7 +13017,7 @@
     </w:p>
     <w:bookmarkEnd w:id="230"/>
     <w:bookmarkEnd w:id="231"/>
-    <w:bookmarkStart w:id="241" w:name="_8d3d677a86d099505ac9522d821d46705733ff3"/>
+    <w:bookmarkStart w:id="241" w:name="cu-18-buscar-y-recomendar-hoteles"/>
     <w:p>
       <w:pPr>
         <w:pStyle w:val="Heading1"/>
@@ -13026,7 +13026,7 @@
         <w:t xml:space="preserve">CU-18 Buscar y recomendar hoteles</w:t>
       </w:r>
     </w:p>
-    <w:bookmarkStart w:id="232" w:name="_80c7e1f3ab2b5d90432e7970649d96e78fa553e"/>
+    <w:bookmarkStart w:id="232" w:name="descripción-17"/>
     <w:p>
       <w:pPr>
         <w:pStyle w:val="Heading2"/>
@@ -13060,7 +13060,7 @@
       </w:r>
     </w:p>
     <w:bookmarkEnd w:id="232"/>
-    <w:bookmarkStart w:id="233" w:name="_be07049f125955584efb49153e8be62ecebd58f"/>
+    <w:bookmarkStart w:id="233" w:name="actor-principal-17"/>
     <w:p>
       <w:pPr>
         <w:pStyle w:val="Heading2"/>
@@ -13078,7 +13078,7 @@
       </w:r>
     </w:p>
     <w:bookmarkEnd w:id="233"/>
-    <w:bookmarkStart w:id="234" w:name="_186970bb2baaacea4f5f15dae90b98ff9375159"/>
+    <w:bookmarkStart w:id="234" w:name="actores-secundarios-17"/>
     <w:p>
       <w:pPr>
         <w:pStyle w:val="Heading2"/>
@@ -13100,7 +13100,7 @@
       </w:r>
     </w:p>
     <w:bookmarkEnd w:id="234"/>
-    <w:bookmarkStart w:id="235" w:name="_99801f15a2f46fc07674930f1b76170f4131eee"/>
+    <w:bookmarkStart w:id="235" w:name="precondiciones-17"/>
     <w:p>
       <w:pPr>
         <w:pStyle w:val="Heading2"/>
@@ -13134,7 +13134,7 @@
       </w:r>
     </w:p>
     <w:bookmarkEnd w:id="235"/>
-    <w:bookmarkStart w:id="236" w:name="_18c04663e95280d33581b18579d67b2034c0f26"/>
+    <w:bookmarkStart w:id="236" w:name="flujo-principal-17"/>
     <w:p>
       <w:pPr>
         <w:pStyle w:val="Heading2"/>
@@ -13318,7 +13318,7 @@
       </w:r>
     </w:p>
     <w:bookmarkEnd w:id="236"/>
-    <w:bookmarkStart w:id="237" w:name="_5b268437a63c0dbfc48eb76add60dbaf167dad5"/>
+    <w:bookmarkStart w:id="237" w:name="flujos-alternativos-17"/>
     <w:p>
       <w:pPr>
         <w:pStyle w:val="Heading2"/>
@@ -13403,7 +13403,7 @@
       </w:r>
     </w:p>
     <w:bookmarkEnd w:id="237"/>
-    <w:bookmarkStart w:id="238" w:name="_05fe039b31bc3eb3a23c7c3d62e493fc97794be"/>
+    <w:bookmarkStart w:id="238" w:name="postcondiciones-17"/>
     <w:p>
       <w:pPr>
         <w:pStyle w:val="Heading2"/>
@@ -13456,7 +13456,7 @@
       </w:r>
     </w:p>
     <w:bookmarkEnd w:id="238"/>
-    <w:bookmarkStart w:id="239" w:name="_abbc29a94a96c36a30afe290548ce5945ecc086"/>
+    <w:bookmarkStart w:id="239" w:name="reglas-de-negocio-aplicadas-17"/>
     <w:p>
       <w:pPr>
         <w:pStyle w:val="Heading2"/>
@@ -13518,7 +13518,7 @@
       </w:r>
     </w:p>
     <w:bookmarkEnd w:id="239"/>
-    <w:bookmarkStart w:id="240" w:name="_39cd928ef249e2722a225508ead1992d0c77e18"/>
+    <w:bookmarkStart w:id="240" w:name="entidades-del-dominio-involucradas-17"/>
     <w:p>
       <w:pPr>
         <w:pStyle w:val="Heading2"/>
@@ -13541,7 +13541,7 @@
     </w:p>
     <w:bookmarkEnd w:id="240"/>
     <w:bookmarkEnd w:id="241"/>
-    <w:bookmarkStart w:id="251" w:name="_1c9c53f69c7e3da40e28ffadb75fc0b3a627631"/>
+    <w:bookmarkStart w:id="251" w:name="cu-19-planificar-contenido-en-redes"/>
     <w:p>
       <w:pPr>
         <w:pStyle w:val="Heading1"/>
@@ -13550,7 +13550,7 @@
         <w:t xml:space="preserve">CU-19 Planificar contenido en redes</w:t>
       </w:r>
     </w:p>
-    <w:bookmarkStart w:id="242" w:name="_f416371f76dbda7f720dbc376dd90c2da84a5a8"/>
+    <w:bookmarkStart w:id="242" w:name="descripción-18"/>
     <w:p>
       <w:pPr>
         <w:pStyle w:val="Heading2"/>
@@ -13600,7 +13600,7 @@
       </w:r>
     </w:p>
     <w:bookmarkEnd w:id="242"/>
-    <w:bookmarkStart w:id="243" w:name="_ea53889bd89ea22be10df761165350f73a63a72"/>
+    <w:bookmarkStart w:id="243" w:name="actor-principal-18"/>
     <w:p>
       <w:pPr>
         <w:pStyle w:val="Heading2"/>
@@ -13630,7 +13630,7 @@
       </w:r>
     </w:p>
     <w:bookmarkEnd w:id="243"/>
-    <w:bookmarkStart w:id="244" w:name="_46b70cba757dc89376a5a717d454d490efd2592"/>
+    <w:bookmarkStart w:id="244" w:name="actores-secundarios-18"/>
     <w:p>
       <w:pPr>
         <w:pStyle w:val="Heading2"/>
@@ -13640,7 +13640,7 @@
       </w:r>
     </w:p>
     <w:bookmarkEnd w:id="244"/>
-    <w:bookmarkStart w:id="245" w:name="_1e15605e5082f6ec1cabc7a9b70116e2557f4a9"/>
+    <w:bookmarkStart w:id="245" w:name="precondiciones-18"/>
     <w:p>
       <w:pPr>
         <w:pStyle w:val="Heading2"/>
@@ -13662,7 +13662,7 @@
       </w:r>
     </w:p>
     <w:bookmarkEnd w:id="245"/>
-    <w:bookmarkStart w:id="246" w:name="_f737eb284e1b6cac8f9f180ebd63f930fba116b"/>
+    <w:bookmarkStart w:id="246" w:name="flujo-principal-18"/>
     <w:p>
       <w:pPr>
         <w:pStyle w:val="Heading2"/>
@@ -13835,7 +13835,7 @@
       </w:r>
     </w:p>
     <w:bookmarkEnd w:id="246"/>
-    <w:bookmarkStart w:id="247" w:name="_3d0b026ab814060a93599974208cc39b3e792eb"/>
+    <w:bookmarkStart w:id="247" w:name="flujos-alternativos-18"/>
     <w:p>
       <w:pPr>
         <w:pStyle w:val="Heading2"/>
@@ -14082,7 +14082,7 @@
       </w:r>
     </w:p>
     <w:bookmarkEnd w:id="247"/>
-    <w:bookmarkStart w:id="248" w:name="_092836d4df180b1fff7eea308da7305524738ed"/>
+    <w:bookmarkStart w:id="248" w:name="postcondiciones-18"/>
     <w:p>
       <w:pPr>
         <w:pStyle w:val="Heading2"/>
@@ -14133,7 +14133,7 @@
       </w:r>
     </w:p>
     <w:bookmarkEnd w:id="248"/>
-    <w:bookmarkStart w:id="249" w:name="_fa78696463c8a854f51a61de29e97cf7d565f14"/>
+    <w:bookmarkStart w:id="249" w:name="reglas-de-negocio-aplicadas-18"/>
     <w:p>
       <w:pPr>
         <w:pStyle w:val="Heading2"/>
@@ -14177,7 +14177,7 @@
       </w:r>
     </w:p>
     <w:bookmarkEnd w:id="249"/>
-    <w:bookmarkStart w:id="250" w:name="_12e1f9ed1256ae15c5839bf0f1044a540e5bd36"/>
+    <w:bookmarkStart w:id="250" w:name="entidades-del-dominio-involucradas-18"/>
     <w:p>
       <w:pPr>
         <w:pStyle w:val="Heading2"/>
@@ -14200,7 +14200,7 @@
     </w:p>
     <w:bookmarkEnd w:id="250"/>
     <w:bookmarkEnd w:id="251"/>
-    <w:bookmarkStart w:id="261" w:name="_561e72de4c4b02f961f30d1e3b23e3ff6008f7f"/>
+    <w:bookmarkStart w:id="261" w:name="X561e72de4c4b02f961f30d1e3b23e3ff6008f7f"/>
     <w:p>
       <w:pPr>
         <w:pStyle w:val="Heading1"/>
@@ -14209,7 +14209,7 @@
         <w:t xml:space="preserve">CU-20 Generar propuesta de contenido con IA</w:t>
       </w:r>
     </w:p>
-    <w:bookmarkStart w:id="252" w:name="_822218f9ffd637a5524c6bdb8ce0847eb8e91c8"/>
+    <w:bookmarkStart w:id="252" w:name="descripción-19"/>
     <w:p>
       <w:pPr>
         <w:pStyle w:val="Heading2"/>
@@ -14259,7 +14259,7 @@
       </w:r>
     </w:p>
     <w:bookmarkEnd w:id="252"/>
-    <w:bookmarkStart w:id="253" w:name="_c463bb1d841e1dc2ae0d3876bcbc246bd74de63"/>
+    <w:bookmarkStart w:id="253" w:name="actor-principal-19"/>
     <w:p>
       <w:pPr>
         <w:pStyle w:val="Heading2"/>
@@ -14289,7 +14289,7 @@
       </w:r>
     </w:p>
     <w:bookmarkEnd w:id="253"/>
-    <w:bookmarkStart w:id="254" w:name="_e4db607ae99161af9a0ddef5863270b71c1fc65"/>
+    <w:bookmarkStart w:id="254" w:name="actores-secundarios-19"/>
     <w:p>
       <w:pPr>
         <w:pStyle w:val="Heading2"/>
@@ -14311,7 +14311,7 @@
       </w:r>
     </w:p>
     <w:bookmarkEnd w:id="254"/>
-    <w:bookmarkStart w:id="255" w:name="_6dd5d5d4eb3a9f6f0d2b6c106808e3b47fe3a26"/>
+    <w:bookmarkStart w:id="255" w:name="precondiciones-19"/>
     <w:p>
       <w:pPr>
         <w:pStyle w:val="Heading2"/>
@@ -14333,7 +14333,7 @@
       </w:r>
     </w:p>
     <w:bookmarkEnd w:id="255"/>
-    <w:bookmarkStart w:id="256" w:name="_28f4a3f571d14817f6c2af4c8dab43628589463"/>
+    <w:bookmarkStart w:id="256" w:name="flujo-principal-19"/>
     <w:p>
       <w:pPr>
         <w:pStyle w:val="Heading2"/>
@@ -14576,7 +14576,7 @@
       </w:r>
     </w:p>
     <w:bookmarkEnd w:id="256"/>
-    <w:bookmarkStart w:id="257" w:name="_5c01c997fd2a86fdbae14bd2520e8a792f26af8"/>
+    <w:bookmarkStart w:id="257" w:name="flujos-alternativos-19"/>
     <w:p>
       <w:pPr>
         <w:pStyle w:val="Heading2"/>
@@ -14652,7 +14652,7 @@
       </w:r>
     </w:p>
     <w:bookmarkEnd w:id="257"/>
-    <w:bookmarkStart w:id="258" w:name="_f26815141bf56a8d073da77678065c251eee125"/>
+    <w:bookmarkStart w:id="258" w:name="postcondiciones-19"/>
     <w:p>
       <w:pPr>
         <w:pStyle w:val="Heading2"/>
@@ -14715,7 +14715,7 @@
       </w:r>
     </w:p>
     <w:bookmarkEnd w:id="258"/>
-    <w:bookmarkStart w:id="259" w:name="_7450ef7ce74188bb23dd06dfb83897ee96b4be2"/>
+    <w:bookmarkStart w:id="259" w:name="reglas-de-negocio-aplicadas-19"/>
     <w:p>
       <w:pPr>
         <w:pStyle w:val="Heading2"/>
@@ -14759,7 +14759,7 @@
       </w:r>
     </w:p>
     <w:bookmarkEnd w:id="259"/>
-    <w:bookmarkStart w:id="260" w:name="_f3cf3545bd07ea30a025f57eb38a8b588a856dd"/>
+    <w:bookmarkStart w:id="260" w:name="entidades-del-dominio-involucradas-19"/>
     <w:p>
       <w:pPr>
         <w:pStyle w:val="Heading2"/>
@@ -14782,7 +14782,7 @@
     </w:p>
     <w:bookmarkEnd w:id="260"/>
     <w:bookmarkEnd w:id="261"/>
-    <w:bookmarkStart w:id="271" w:name="_15fb729b199d1ea74107844bf8fe2a0932e172c"/>
+    <w:bookmarkStart w:id="271" w:name="cu-21-ver-dashboard-y-embudo"/>
     <w:p>
       <w:pPr>
         <w:pStyle w:val="Heading1"/>
@@ -14791,7 +14791,7 @@
         <w:t xml:space="preserve">CU-21 Ver dashboard y embudo</w:t>
       </w:r>
     </w:p>
-    <w:bookmarkStart w:id="262" w:name="_9fc1a36fb6b5c04a36c81e3b55dd9a39f6b70c6"/>
+    <w:bookmarkStart w:id="262" w:name="descripción-20"/>
     <w:p>
       <w:pPr>
         <w:pStyle w:val="Heading2"/>
@@ -14838,7 +14838,7 @@
       </w:r>
     </w:p>
     <w:bookmarkEnd w:id="262"/>
-    <w:bookmarkStart w:id="263" w:name="_d6727570e965b788ab216cbf8637267b492e28a"/>
+    <w:bookmarkStart w:id="263" w:name="actor-principal-20"/>
     <w:p>
       <w:pPr>
         <w:pStyle w:val="Heading2"/>
@@ -14868,7 +14868,7 @@
       </w:r>
     </w:p>
     <w:bookmarkEnd w:id="263"/>
-    <w:bookmarkStart w:id="264" w:name="_5a753738446ca02f94cdd8810b9b072b6f96fde"/>
+    <w:bookmarkStart w:id="264" w:name="actores-secundarios-20"/>
     <w:p>
       <w:pPr>
         <w:pStyle w:val="Heading2"/>
@@ -14878,7 +14878,7 @@
       </w:r>
     </w:p>
     <w:bookmarkEnd w:id="264"/>
-    <w:bookmarkStart w:id="265" w:name="_33d3c900873b34d841038cea1ba86c718ae47e3"/>
+    <w:bookmarkStart w:id="265" w:name="precondiciones-20"/>
     <w:p>
       <w:pPr>
         <w:pStyle w:val="Heading2"/>
@@ -14930,7 +14930,7 @@
       </w:r>
     </w:p>
     <w:bookmarkEnd w:id="265"/>
-    <w:bookmarkStart w:id="266" w:name="_5c5e0fc4eef2223b584287f6b00b58266340873"/>
+    <w:bookmarkStart w:id="266" w:name="flujo-principal-20"/>
     <w:p>
       <w:pPr>
         <w:pStyle w:val="Heading2"/>
@@ -15346,7 +15346,7 @@
       </w:r>
     </w:p>
     <w:bookmarkEnd w:id="266"/>
-    <w:bookmarkStart w:id="267" w:name="_528def61223bfdfc49c299180ec643f278e63dd"/>
+    <w:bookmarkStart w:id="267" w:name="flujos-alternativos-20"/>
     <w:p>
       <w:pPr>
         <w:pStyle w:val="Heading2"/>
@@ -15469,7 +15469,7 @@
       </w:r>
     </w:p>
     <w:bookmarkEnd w:id="267"/>
-    <w:bookmarkStart w:id="268" w:name="_563d1383b596b47fdcb06e82831e4d6bce2b33e"/>
+    <w:bookmarkStart w:id="268" w:name="postcondiciones-20"/>
     <w:p>
       <w:pPr>
         <w:pStyle w:val="Heading2"/>
@@ -15507,7 +15507,7 @@
       </w:r>
     </w:p>
     <w:bookmarkEnd w:id="268"/>
-    <w:bookmarkStart w:id="269" w:name="_435c632885dfce37421fada4ff2ff95f60dbb7d"/>
+    <w:bookmarkStart w:id="269" w:name="reglas-de-negocio-aplicadas-20"/>
     <w:p>
       <w:pPr>
         <w:pStyle w:val="Heading2"/>
@@ -15577,7 +15577,7 @@
       </w:r>
     </w:p>
     <w:bookmarkEnd w:id="269"/>
-    <w:bookmarkStart w:id="270" w:name="_a87757a464f3063db953ce5fab06f0600063319"/>
+    <w:bookmarkStart w:id="270" w:name="entidades-del-dominio-involucradas-20"/>
     <w:p>
       <w:pPr>
         <w:pStyle w:val="Heading2"/>
@@ -15600,7 +15600,7 @@
     </w:p>
     <w:bookmarkEnd w:id="270"/>
     <w:bookmarkEnd w:id="271"/>
-    <w:bookmarkStart w:id="281" w:name="_12d6f975404ed47e2bbb25b4a645dbbb8b2aff1"/>
+    <w:bookmarkStart w:id="281" w:name="cu-22-generar-reportes-y-estadísticas"/>
     <w:p>
       <w:pPr>
         <w:pStyle w:val="Heading1"/>
@@ -15609,7 +15609,7 @@
         <w:t xml:space="preserve">CU-22 Generar reportes y estadísticas</w:t>
       </w:r>
     </w:p>
-    <w:bookmarkStart w:id="272" w:name="_831a09cab52402216c31d51a5e881682b69314a"/>
+    <w:bookmarkStart w:id="272" w:name="descripción-21"/>
     <w:p>
       <w:pPr>
         <w:pStyle w:val="Heading2"/>
@@ -15656,7 +15656,7 @@
       </w:r>
     </w:p>
     <w:bookmarkEnd w:id="272"/>
-    <w:bookmarkStart w:id="273" w:name="_a5bb74903ac413884d644d555d52627620d31c9"/>
+    <w:bookmarkStart w:id="273" w:name="actor-principal-21"/>
     <w:p>
       <w:pPr>
         <w:pStyle w:val="Heading2"/>
@@ -15686,7 +15686,7 @@
       </w:r>
     </w:p>
     <w:bookmarkEnd w:id="273"/>
-    <w:bookmarkStart w:id="274" w:name="_15dbf43f90cb9e83857e050b499511884c11842"/>
+    <w:bookmarkStart w:id="274" w:name="actores-secundarios-21"/>
     <w:p>
       <w:pPr>
         <w:pStyle w:val="Heading2"/>
@@ -15696,7 +15696,7 @@
       </w:r>
     </w:p>
     <w:bookmarkEnd w:id="274"/>
-    <w:bookmarkStart w:id="275" w:name="_9583686c47543990faa2d5142d2719e76622777"/>
+    <w:bookmarkStart w:id="275" w:name="precondiciones-21"/>
     <w:p>
       <w:pPr>
         <w:pStyle w:val="Heading2"/>
@@ -15748,7 +15748,7 @@
       </w:r>
     </w:p>
     <w:bookmarkEnd w:id="275"/>
-    <w:bookmarkStart w:id="276" w:name="_7d32e0eea3f5471f01d0043da5a7c58854088b4"/>
+    <w:bookmarkStart w:id="276" w:name="flujo-principal-21"/>
     <w:p>
       <w:pPr>
         <w:pStyle w:val="Heading2"/>
@@ -16080,7 +16080,7 @@
       </w:r>
     </w:p>
     <w:bookmarkEnd w:id="276"/>
-    <w:bookmarkStart w:id="277" w:name="_9999b270073778806e1a3614c113712af7a429f"/>
+    <w:bookmarkStart w:id="277" w:name="flujos-alternativos-21"/>
     <w:p>
       <w:pPr>
         <w:pStyle w:val="Heading2"/>
@@ -16181,7 +16181,7 @@
       </w:r>
     </w:p>
     <w:bookmarkEnd w:id="277"/>
-    <w:bookmarkStart w:id="278" w:name="_d9f5c448b876fa4d43a7f63f05f327b6a8dfc6b"/>
+    <w:bookmarkStart w:id="278" w:name="postcondiciones-21"/>
     <w:p>
       <w:pPr>
         <w:pStyle w:val="Heading2"/>
@@ -16219,7 +16219,7 @@
       </w:r>
     </w:p>
     <w:bookmarkEnd w:id="278"/>
-    <w:bookmarkStart w:id="279" w:name="_12183e802ee20ba771df77fe51561a89c772082"/>
+    <w:bookmarkStart w:id="279" w:name="reglas-de-negocio-aplicadas-21"/>
     <w:p>
       <w:pPr>
         <w:pStyle w:val="Heading2"/>
@@ -16253,7 +16253,7 @@
       </w:r>
     </w:p>
     <w:bookmarkEnd w:id="279"/>
-    <w:bookmarkStart w:id="280" w:name="_423317a58ae3ee3b214f52859bc25c0fc83b1a6"/>
+    <w:bookmarkStart w:id="280" w:name="entidades-del-dominio-involucradas-21"/>
     <w:p>
       <w:pPr>
         <w:pStyle w:val="Heading2"/>
@@ -16276,7 +16276,7 @@
     </w:p>
     <w:bookmarkEnd w:id="280"/>
     <w:bookmarkEnd w:id="281"/>
-    <w:bookmarkStart w:id="291" w:name="_4938012db43a7f89a7848cae0bc7084b7a3c073"/>
+    <w:bookmarkStart w:id="291" w:name="X4938012db43a7f89a7848cae0bc7084b7a3c073"/>
     <w:p>
       <w:pPr>
         <w:pStyle w:val="Heading1"/>
@@ -16285,7 +16285,7 @@
         <w:t xml:space="preserve">CU-23 Ver calendario de viajes y vencimientos</w:t>
       </w:r>
     </w:p>
-    <w:bookmarkStart w:id="282" w:name="_af3f18f4ecd5abd03bc427eb81ab63e3f735594"/>
+    <w:bookmarkStart w:id="282" w:name="descripción-22"/>
     <w:p>
       <w:pPr>
         <w:pStyle w:val="Heading2"/>
@@ -16335,7 +16335,7 @@
       </w:r>
     </w:p>
     <w:bookmarkEnd w:id="282"/>
-    <w:bookmarkStart w:id="283" w:name="_133e6b1e9df283d7a31b3f0c576134bd48aaa26"/>
+    <w:bookmarkStart w:id="283" w:name="actor-principal-22"/>
     <w:p>
       <w:pPr>
         <w:pStyle w:val="Heading2"/>
@@ -16353,7 +16353,7 @@
       </w:r>
     </w:p>
     <w:bookmarkEnd w:id="283"/>
-    <w:bookmarkStart w:id="284" w:name="_a295b4d448f8c2a5cd94e17eca596a1d3fa9b13"/>
+    <w:bookmarkStart w:id="284" w:name="actores-secundarios-22"/>
     <w:p>
       <w:pPr>
         <w:pStyle w:val="Heading2"/>
@@ -16363,7 +16363,7 @@
       </w:r>
     </w:p>
     <w:bookmarkEnd w:id="284"/>
-    <w:bookmarkStart w:id="285" w:name="_c0f35afb961e9c6565bf7af734d247db91826f3"/>
+    <w:bookmarkStart w:id="285" w:name="precondiciones-22"/>
     <w:p>
       <w:pPr>
         <w:pStyle w:val="Heading2"/>
@@ -16385,7 +16385,7 @@
       </w:r>
     </w:p>
     <w:bookmarkEnd w:id="285"/>
-    <w:bookmarkStart w:id="286" w:name="_46d373d2eb0c478a6bd179c58f9afe1a5616e6e"/>
+    <w:bookmarkStart w:id="286" w:name="flujo-principal-22"/>
     <w:p>
       <w:pPr>
         <w:pStyle w:val="Heading2"/>
@@ -16485,7 +16485,7 @@
       </w:r>
     </w:p>
     <w:bookmarkEnd w:id="286"/>
-    <w:bookmarkStart w:id="287" w:name="_dcb9d8b90b2ad6fc9aaddede9c2c2d768b5fbe5"/>
+    <w:bookmarkStart w:id="287" w:name="flujos-alternativos-22"/>
     <w:p>
       <w:pPr>
         <w:pStyle w:val="Heading2"/>
@@ -16635,7 +16635,7 @@
       </w:r>
     </w:p>
     <w:bookmarkEnd w:id="287"/>
-    <w:bookmarkStart w:id="288" w:name="_dc8e13165bbcfdc6bfe10c72a1b15f702d60639"/>
+    <w:bookmarkStart w:id="288" w:name="postcondiciones-22"/>
     <w:p>
       <w:pPr>
         <w:pStyle w:val="Heading2"/>
@@ -16686,7 +16686,7 @@
       </w:r>
     </w:p>
     <w:bookmarkEnd w:id="288"/>
-    <w:bookmarkStart w:id="289" w:name="_4f21f4dee65eeb2a7b5b5cd4c3c2e3e409bb780"/>
+    <w:bookmarkStart w:id="289" w:name="reglas-de-negocio-aplicadas-22"/>
     <w:p>
       <w:pPr>
         <w:pStyle w:val="Heading2"/>
@@ -16733,7 +16733,7 @@
       </w:r>
     </w:p>
     <w:bookmarkEnd w:id="289"/>
-    <w:bookmarkStart w:id="290" w:name="_9aa0c42aeebc01cfa410d019a8ffcf7ed8d8f3f"/>
+    <w:bookmarkStart w:id="290" w:name="entidades-del-dominio-involucradas-22"/>
     <w:p>
       <w:pPr>
         <w:pStyle w:val="Heading2"/>
@@ -16756,7 +16756,7 @@
     </w:p>
     <w:bookmarkEnd w:id="290"/>
     <w:bookmarkEnd w:id="291"/>
-    <w:bookmarkStart w:id="301" w:name="_668114fffb77d7c54baf25a426ebf9ce95b98d1"/>
+    <w:bookmarkStart w:id="301" w:name="cu-24-iniciar-sesión"/>
     <w:p>
       <w:pPr>
         <w:pStyle w:val="Heading1"/>
@@ -16765,7 +16765,7 @@
         <w:t xml:space="preserve">CU-24 Iniciar sesión</w:t>
       </w:r>
     </w:p>
-    <w:bookmarkStart w:id="292" w:name="_1382725f9d39d04e6a0c83f31adf86f3fb261dd"/>
+    <w:bookmarkStart w:id="292" w:name="descripción-23"/>
     <w:p>
       <w:pPr>
         <w:pStyle w:val="Heading2"/>
@@ -16783,7 +16783,7 @@
       </w:r>
     </w:p>
     <w:bookmarkEnd w:id="292"/>
-    <w:bookmarkStart w:id="293" w:name="_f9738eb99785caec89a4dae1a8835c897bbc3d5"/>
+    <w:bookmarkStart w:id="293" w:name="actor-principal-23"/>
     <w:p>
       <w:pPr>
         <w:pStyle w:val="Heading2"/>
@@ -16852,7 +16852,7 @@
       </w:r>
     </w:p>
     <w:bookmarkEnd w:id="293"/>
-    <w:bookmarkStart w:id="294" w:name="_d80fff99f85fc8fea4fa92d1ed262c45b182dfc"/>
+    <w:bookmarkStart w:id="294" w:name="actores-secundarios-23"/>
     <w:p>
       <w:pPr>
         <w:pStyle w:val="Heading2"/>
@@ -16862,7 +16862,7 @@
       </w:r>
     </w:p>
     <w:bookmarkEnd w:id="294"/>
-    <w:bookmarkStart w:id="295" w:name="_49b87f13b4c668e138489d316a3730911922182"/>
+    <w:bookmarkStart w:id="295" w:name="precondiciones-23"/>
     <w:p>
       <w:pPr>
         <w:pStyle w:val="Heading2"/>
@@ -16884,7 +16884,7 @@
       </w:r>
     </w:p>
     <w:bookmarkEnd w:id="295"/>
-    <w:bookmarkStart w:id="296" w:name="_b5f2a86bb95ba287161eecf2608bd1565ab1852"/>
+    <w:bookmarkStart w:id="296" w:name="flujo-principal-23"/>
     <w:p>
       <w:pPr>
         <w:pStyle w:val="Heading2"/>
@@ -17134,7 +17134,7 @@
       </w:r>
     </w:p>
     <w:bookmarkEnd w:id="296"/>
-    <w:bookmarkStart w:id="297" w:name="_53f1c83c5dc720d75aac389599960c24f90aff6"/>
+    <w:bookmarkStart w:id="297" w:name="flujos-alternativos-23"/>
     <w:p>
       <w:pPr>
         <w:pStyle w:val="Heading2"/>
@@ -17210,7 +17210,7 @@
       </w:r>
     </w:p>
     <w:bookmarkEnd w:id="297"/>
-    <w:bookmarkStart w:id="298" w:name="_652529248bad3b42a225f8c2b2f6a0ffeca8a9f"/>
+    <w:bookmarkStart w:id="298" w:name="postcondiciones-23"/>
     <w:p>
       <w:pPr>
         <w:pStyle w:val="Heading2"/>
@@ -17247,7 +17247,7 @@
       </w:r>
     </w:p>
     <w:bookmarkEnd w:id="298"/>
-    <w:bookmarkStart w:id="299" w:name="_a4a0be169dafb530ac6a66c8d50dda0c3f61d2d"/>
+    <w:bookmarkStart w:id="299" w:name="reglas-de-negocio-aplicadas-23"/>
     <w:p>
       <w:pPr>
         <w:pStyle w:val="Heading2"/>
@@ -17269,7 +17269,7 @@
       </w:r>
     </w:p>
     <w:bookmarkEnd w:id="299"/>
-    <w:bookmarkStart w:id="300" w:name="_300801eb6cc76008d591e3010b652da9bbf8360"/>
+    <w:bookmarkStart w:id="300" w:name="entidades-del-dominio-involucradas-23"/>
     <w:p>
       <w:pPr>
         <w:pStyle w:val="Heading2"/>
@@ -17292,7 +17292,7 @@
     </w:p>
     <w:bookmarkEnd w:id="300"/>
     <w:bookmarkEnd w:id="301"/>
-    <w:bookmarkStart w:id="311" w:name="_b6957e084ff1df7cee8dc2b8a49ecca5580b239"/>
+    <w:bookmarkStart w:id="311" w:name="cu-25-gestionar-usuarios-y-roles"/>
     <w:p>
       <w:pPr>
         <w:pStyle w:val="Heading1"/>
@@ -17301,7 +17301,7 @@
         <w:t xml:space="preserve">CU-25 Gestionar usuarios y roles</w:t>
       </w:r>
     </w:p>
-    <w:bookmarkStart w:id="302" w:name="_fa8e8980642c3248db4fcf5d9902b2c5d6b9734"/>
+    <w:bookmarkStart w:id="302" w:name="descripción-24"/>
     <w:p>
       <w:pPr>
         <w:pStyle w:val="Heading2"/>
@@ -17334,7 +17334,7 @@
       </w:r>
     </w:p>
     <w:bookmarkEnd w:id="302"/>
-    <w:bookmarkStart w:id="303" w:name="_3dde9172aa93be165bbf9ca8778a568778c34d1"/>
+    <w:bookmarkStart w:id="303" w:name="actor-principal-24"/>
     <w:p>
       <w:pPr>
         <w:pStyle w:val="Heading2"/>
@@ -17352,7 +17352,7 @@
       </w:r>
     </w:p>
     <w:bookmarkEnd w:id="303"/>
-    <w:bookmarkStart w:id="304" w:name="_d572730545d90e55005f72a899f3f55620a18b9"/>
+    <w:bookmarkStart w:id="304" w:name="actores-secundarios-24"/>
     <w:p>
       <w:pPr>
         <w:pStyle w:val="Heading2"/>
@@ -17362,7 +17362,7 @@
       </w:r>
     </w:p>
     <w:bookmarkEnd w:id="304"/>
-    <w:bookmarkStart w:id="305" w:name="_15e8c903a1917cd1a8158924dea1ca247045e8e"/>
+    <w:bookmarkStart w:id="305" w:name="precondiciones-24"/>
     <w:p>
       <w:pPr>
         <w:pStyle w:val="Heading2"/>
@@ -17396,7 +17396,7 @@
       </w:r>
     </w:p>
     <w:bookmarkEnd w:id="305"/>
-    <w:bookmarkStart w:id="306" w:name="_e2336d44b3e40e7309718569f7309cdd1565a9a"/>
+    <w:bookmarkStart w:id="306" w:name="flujo-principal-24"/>
     <w:p>
       <w:pPr>
         <w:pStyle w:val="Heading2"/>
@@ -17646,7 +17646,7 @@
       </w:r>
     </w:p>
     <w:bookmarkEnd w:id="306"/>
-    <w:bookmarkStart w:id="307" w:name="_11fc4d5b46cf14712eefc54bc2c37e3e76d45b6"/>
+    <w:bookmarkStart w:id="307" w:name="flujos-alternativos-24"/>
     <w:p>
       <w:pPr>
         <w:pStyle w:val="Heading2"/>
@@ -17820,7 +17820,7 @@
       </w:r>
     </w:p>
     <w:bookmarkEnd w:id="307"/>
-    <w:bookmarkStart w:id="308" w:name="_fefa97cba9b0100fda9160eaa05c400311c4a93"/>
+    <w:bookmarkStart w:id="308" w:name="postcondiciones-24"/>
     <w:p>
       <w:pPr>
         <w:pStyle w:val="Heading2"/>
@@ -17842,7 +17842,7 @@
       </w:r>
     </w:p>
     <w:bookmarkEnd w:id="308"/>
-    <w:bookmarkStart w:id="309" w:name="_6cd853df7a9fd54139f27e8a6bbba3fb8c3b272"/>
+    <w:bookmarkStart w:id="309" w:name="reglas-de-negocio-aplicadas-24"/>
     <w:p>
       <w:pPr>
         <w:pStyle w:val="Heading2"/>
@@ -17864,7 +17864,7 @@
       </w:r>
     </w:p>
     <w:bookmarkEnd w:id="309"/>
-    <w:bookmarkStart w:id="310" w:name="_fee4ab9678b6a2efb803034e6c57d7f9d493b6c"/>
+    <w:bookmarkStart w:id="310" w:name="entidades-del-dominio-involucradas-24"/>
     <w:p>
       <w:pPr>
         <w:pStyle w:val="Heading2"/>
@@ -17887,7 +17887,7 @@
     </w:p>
     <w:bookmarkEnd w:id="310"/>
     <w:bookmarkEnd w:id="311"/>
-    <w:bookmarkStart w:id="321" w:name="_1c69ee2e45862fba314dc410f73de44a4980f40"/>
+    <w:bookmarkStart w:id="321" w:name="cu-26-gestionar-destinos"/>
     <w:p>
       <w:pPr>
         <w:pStyle w:val="Heading1"/>
@@ -17896,7 +17896,7 @@
         <w:t xml:space="preserve">CU-26 Gestionar destinos</w:t>
       </w:r>
     </w:p>
-    <w:bookmarkStart w:id="312" w:name="_564a35f8a97c036854af6e33392dc9a0a406ba9"/>
+    <w:bookmarkStart w:id="312" w:name="descripción-25"/>
     <w:p>
       <w:pPr>
         <w:pStyle w:val="Heading2"/>
@@ -17945,7 +17945,7 @@
       </w:r>
     </w:p>
     <w:bookmarkEnd w:id="312"/>
-    <w:bookmarkStart w:id="313" w:name="_c07a6520470fd345de42a997b5da7e3676ef7aa"/>
+    <w:bookmarkStart w:id="313" w:name="actor-principal-25"/>
     <w:p>
       <w:pPr>
         <w:pStyle w:val="Heading2"/>
@@ -17963,7 +17963,7 @@
       </w:r>
     </w:p>
     <w:bookmarkEnd w:id="313"/>
-    <w:bookmarkStart w:id="314" w:name="_357ec0fb6dbf6a5be704ae0772722675a225703"/>
+    <w:bookmarkStart w:id="314" w:name="actores-secundarios-25"/>
     <w:p>
       <w:pPr>
         <w:pStyle w:val="Heading2"/>
@@ -17985,7 +17985,7 @@
       </w:r>
     </w:p>
     <w:bookmarkEnd w:id="314"/>
-    <w:bookmarkStart w:id="315" w:name="_5a8e3c651c19ed409346c14403aae9b94def46e"/>
+    <w:bookmarkStart w:id="315" w:name="precondiciones-25"/>
     <w:p>
       <w:pPr>
         <w:pStyle w:val="Heading2"/>
@@ -18037,7 +18037,7 @@
       </w:r>
     </w:p>
     <w:bookmarkEnd w:id="315"/>
-    <w:bookmarkStart w:id="316" w:name="_aa7b501639603ccb733545f0d97ad4825667fa2"/>
+    <w:bookmarkStart w:id="316" w:name="flujo-principal-25"/>
     <w:p>
       <w:pPr>
         <w:pStyle w:val="Heading2"/>
@@ -18149,7 +18149,7 @@
       </w:r>
     </w:p>
     <w:bookmarkEnd w:id="316"/>
-    <w:bookmarkStart w:id="317" w:name="_5a49d6d56dc98d120d1b9570c15c59af4ffc4c8"/>
+    <w:bookmarkStart w:id="317" w:name="flujos-alternativos-25"/>
     <w:p>
       <w:pPr>
         <w:pStyle w:val="Heading2"/>
@@ -18250,7 +18250,7 @@
       </w:r>
     </w:p>
     <w:bookmarkEnd w:id="317"/>
-    <w:bookmarkStart w:id="318" w:name="_86d33074fcab2284e5f1d0ae0df68acd5bf3a0b"/>
+    <w:bookmarkStart w:id="318" w:name="postcondiciones-25"/>
     <w:p>
       <w:pPr>
         <w:pStyle w:val="Heading2"/>
@@ -18272,7 +18272,7 @@
       </w:r>
     </w:p>
     <w:bookmarkEnd w:id="318"/>
-    <w:bookmarkStart w:id="319" w:name="_13dc62756eba673c4411f0886491ae17ba539be"/>
+    <w:bookmarkStart w:id="319" w:name="reglas-de-negocio-aplicadas-25"/>
     <w:p>
       <w:pPr>
         <w:pStyle w:val="Heading2"/>
@@ -18294,7 +18294,7 @@
       </w:r>
     </w:p>
     <w:bookmarkEnd w:id="319"/>
-    <w:bookmarkStart w:id="320" w:name="_6cfece2da799543735eecf2dd50e8d447648f04"/>
+    <w:bookmarkStart w:id="320" w:name="entidades-del-dominio-involucradas-25"/>
     <w:p>
       <w:pPr>
         <w:pStyle w:val="Heading2"/>
@@ -18317,7 +18317,7 @@
     </w:p>
     <w:bookmarkEnd w:id="320"/>
     <w:bookmarkEnd w:id="321"/>
-    <w:bookmarkStart w:id="331" w:name="_ba138727bccbd1490ee268ef9a8a5623fbffd0e"/>
+    <w:bookmarkStart w:id="331" w:name="cu-27-cancelar-viaje"/>
     <w:p>
       <w:pPr>
         <w:pStyle w:val="Heading1"/>
@@ -18326,7 +18326,7 @@
         <w:t xml:space="preserve">CU-27 Cancelar viaje</w:t>
       </w:r>
     </w:p>
-    <w:bookmarkStart w:id="322" w:name="_6261a060896a120482456de8485990e03ed4bea"/>
+    <w:bookmarkStart w:id="322" w:name="descripción-26"/>
     <w:p>
       <w:pPr>
         <w:pStyle w:val="Heading2"/>
@@ -18344,7 +18344,7 @@
       </w:r>
     </w:p>
     <w:bookmarkEnd w:id="322"/>
-    <w:bookmarkStart w:id="323" w:name="_dfb0038ad9a6664f324bf3e967881a409f5fef7"/>
+    <w:bookmarkStart w:id="323" w:name="actor-principal-26"/>
     <w:p>
       <w:pPr>
         <w:pStyle w:val="Heading2"/>
@@ -18362,7 +18362,7 @@
       </w:r>
     </w:p>
     <w:bookmarkEnd w:id="323"/>
-    <w:bookmarkStart w:id="324" w:name="_871c247beaf0b0f295cb705b0b55197133dc406"/>
+    <w:bookmarkStart w:id="324" w:name="actores-secundarios-26"/>
     <w:p>
       <w:pPr>
         <w:pStyle w:val="Heading2"/>
@@ -18384,7 +18384,7 @@
       </w:r>
     </w:p>
     <w:bookmarkEnd w:id="324"/>
-    <w:bookmarkStart w:id="325" w:name="_cab293cd734a826ac997a12ed13321a06d505ba"/>
+    <w:bookmarkStart w:id="325" w:name="precondiciones-26"/>
     <w:p>
       <w:pPr>
         <w:pStyle w:val="Heading2"/>
@@ -18487,7 +18487,7 @@
       </w:r>
     </w:p>
     <w:bookmarkEnd w:id="325"/>
-    <w:bookmarkStart w:id="326" w:name="_c031c4ebacf595d11152f8a2f44d2331269a875"/>
+    <w:bookmarkStart w:id="326" w:name="flujo-principal-26"/>
     <w:p>
       <w:pPr>
         <w:pStyle w:val="Heading2"/>
@@ -18811,7 +18811,7 @@
       </w:r>
     </w:p>
     <w:bookmarkEnd w:id="326"/>
-    <w:bookmarkStart w:id="327" w:name="_aa3ea86ae22680c20f841d445e09cb3dbc8eea9"/>
+    <w:bookmarkStart w:id="327" w:name="flujos-alternativos-26"/>
     <w:p>
       <w:pPr>
         <w:pStyle w:val="Heading2"/>
@@ -19219,7 +19219,7 @@
       </w:r>
     </w:p>
     <w:bookmarkEnd w:id="327"/>
-    <w:bookmarkStart w:id="328" w:name="_f24a4c2cb18dcb697aa97bcecffeb360ae1c3c5"/>
+    <w:bookmarkStart w:id="328" w:name="postcondiciones-26"/>
     <w:p>
       <w:pPr>
         <w:pStyle w:val="Heading2"/>
@@ -19335,7 +19335,7 @@
       </w:r>
     </w:p>
     <w:bookmarkEnd w:id="328"/>
-    <w:bookmarkStart w:id="329" w:name="_db28aa7e0b8dd2f67d9bb1cf210ca450a166e1f"/>
+    <w:bookmarkStart w:id="329" w:name="reglas-de-negocio-aplicadas-26"/>
     <w:p>
       <w:pPr>
         <w:pStyle w:val="Heading2"/>
@@ -19435,7 +19435,7 @@
       </w:r>
     </w:p>
     <w:bookmarkEnd w:id="329"/>
-    <w:bookmarkStart w:id="330" w:name="_8eb5c16cc88033599503b183c6312ede087e7e0"/>
+    <w:bookmarkStart w:id="330" w:name="entidades-del-dominio-involucradas-26"/>
     <w:p>
       <w:pPr>
         <w:pStyle w:val="Heading2"/>
@@ -19458,7 +19458,7 @@
     </w:p>
     <w:bookmarkEnd w:id="330"/>
     <w:bookmarkEnd w:id="331"/>
-    <w:bookmarkStart w:id="341" w:name="_1df9e19e70bac570f31900878fb2cb75eceff41"/>
+    <w:bookmarkStart w:id="341" w:name="cu-28-crear-recordatorio-manual"/>
     <w:p>
       <w:pPr>
         <w:pStyle w:val="Heading1"/>
@@ -19467,7 +19467,7 @@
         <w:t xml:space="preserve">CU-28 Crear recordatorio manual</w:t>
       </w:r>
     </w:p>
-    <w:bookmarkStart w:id="332" w:name="_e7b0e4b6672c722b0edad67492a41cc4b35e9b8"/>
+    <w:bookmarkStart w:id="332" w:name="descripción-27"/>
     <w:p>
       <w:pPr>
         <w:pStyle w:val="Heading2"/>
@@ -19498,7 +19498,7 @@
       </w:r>
     </w:p>
     <w:bookmarkEnd w:id="332"/>
-    <w:bookmarkStart w:id="333" w:name="_de6c9c173ba4b35f503cfc1e2b50e89be0e246a"/>
+    <w:bookmarkStart w:id="333" w:name="actor-principal-27"/>
     <w:p>
       <w:pPr>
         <w:pStyle w:val="Heading2"/>
@@ -19516,7 +19516,7 @@
       </w:r>
     </w:p>
     <w:bookmarkEnd w:id="333"/>
-    <w:bookmarkStart w:id="334" w:name="_561ed60f0fb0b1ce16c401fa8784e9bd313d574"/>
+    <w:bookmarkStart w:id="334" w:name="actores-secundarios-27"/>
     <w:p>
       <w:pPr>
         <w:pStyle w:val="Heading2"/>
@@ -19526,7 +19526,7 @@
       </w:r>
     </w:p>
     <w:bookmarkEnd w:id="334"/>
-    <w:bookmarkStart w:id="335" w:name="_32eda6a4d6ed7d958bc7716aca34d700e87dacd"/>
+    <w:bookmarkStart w:id="335" w:name="precondiciones-27"/>
     <w:p>
       <w:pPr>
         <w:pStyle w:val="Heading2"/>
@@ -19548,7 +19548,7 @@
       </w:r>
     </w:p>
     <w:bookmarkEnd w:id="335"/>
-    <w:bookmarkStart w:id="336" w:name="_8eac7d9b7ce146b3e2f1b79fcc5abd83d1894d4"/>
+    <w:bookmarkStart w:id="336" w:name="flujo-principal-27"/>
     <w:p>
       <w:pPr>
         <w:pStyle w:val="Heading2"/>
@@ -19682,7 +19682,7 @@
       </w:r>
     </w:p>
     <w:bookmarkEnd w:id="336"/>
-    <w:bookmarkStart w:id="337" w:name="_0cc68856cd404131b87b6b067cd44ef0ce6a7c0"/>
+    <w:bookmarkStart w:id="337" w:name="flujos-alternativos-27"/>
     <w:p>
       <w:pPr>
         <w:pStyle w:val="Heading2"/>
@@ -19748,7 +19748,7 @@
       </w:r>
     </w:p>
     <w:bookmarkEnd w:id="337"/>
-    <w:bookmarkStart w:id="338" w:name="_f0427dd2939ca29aabe85d4c1d5ff43b0f0e5e8"/>
+    <w:bookmarkStart w:id="338" w:name="postcondiciones-27"/>
     <w:p>
       <w:pPr>
         <w:pStyle w:val="Heading2"/>
@@ -19782,7 +19782,7 @@
       </w:r>
     </w:p>
     <w:bookmarkEnd w:id="338"/>
-    <w:bookmarkStart w:id="339" w:name="_1a60456cd85373398c6819ba3fae401f8fa05d5"/>
+    <w:bookmarkStart w:id="339" w:name="reglas-de-negocio-aplicadas-27"/>
     <w:p>
       <w:pPr>
         <w:pStyle w:val="Heading2"/>
@@ -19804,7 +19804,7 @@
       </w:r>
     </w:p>
     <w:bookmarkEnd w:id="339"/>
-    <w:bookmarkStart w:id="340" w:name="_ac8dec96c805c797511f8118e38b5589cdf0f78"/>
+    <w:bookmarkStart w:id="340" w:name="entidades-del-dominio-involucradas-27"/>
     <w:p>
       <w:pPr>
         <w:pStyle w:val="Heading2"/>
@@ -19827,7 +19827,7 @@
     </w:p>
     <w:bookmarkEnd w:id="340"/>
     <w:bookmarkEnd w:id="341"/>
-    <w:bookmarkStart w:id="351" w:name="_5e8d46a74a332724e5b333e337ecfe9173fec96"/>
+    <w:bookmarkStart w:id="351" w:name="cu-29-eliminar-reseña"/>
     <w:p>
       <w:pPr>
         <w:pStyle w:val="Heading1"/>
@@ -19836,7 +19836,7 @@
         <w:t xml:space="preserve">CU-29 Eliminar reseña</w:t>
       </w:r>
     </w:p>
-    <w:bookmarkStart w:id="342" w:name="_0a8477f3c535464dd9c9ec3bb177f6b64f74982"/>
+    <w:bookmarkStart w:id="342" w:name="descripción-28"/>
     <w:p>
       <w:pPr>
         <w:pStyle w:val="Heading2"/>
@@ -19854,7 +19854,7 @@
       </w:r>
     </w:p>
     <w:bookmarkEnd w:id="342"/>
-    <w:bookmarkStart w:id="343" w:name="_f591350afbce6078c6037ac68d1231719cf4501"/>
+    <w:bookmarkStart w:id="343" w:name="actor-principal-28"/>
     <w:p>
       <w:pPr>
         <w:pStyle w:val="Heading2"/>
@@ -19872,7 +19872,7 @@
       </w:r>
     </w:p>
     <w:bookmarkEnd w:id="343"/>
-    <w:bookmarkStart w:id="344" w:name="_7ff74fa37bfaba24b435176d0adf432105a3932"/>
+    <w:bookmarkStart w:id="344" w:name="actores-secundarios-28"/>
     <w:p>
       <w:pPr>
         <w:pStyle w:val="Heading2"/>
@@ -19894,7 +19894,7 @@
       </w:r>
     </w:p>
     <w:bookmarkEnd w:id="344"/>
-    <w:bookmarkStart w:id="345" w:name="_43bd33bb7bc10454c3dc104250be371fea23832"/>
+    <w:bookmarkStart w:id="345" w:name="precondiciones-28"/>
     <w:p>
       <w:pPr>
         <w:pStyle w:val="Heading2"/>
@@ -19931,7 +19931,7 @@
       </w:r>
     </w:p>
     <w:bookmarkEnd w:id="345"/>
-    <w:bookmarkStart w:id="346" w:name="_9a7bf251875c01bea21bc769db83d7fbf2c4c56"/>
+    <w:bookmarkStart w:id="346" w:name="flujo-principal-28"/>
     <w:p>
       <w:pPr>
         <w:pStyle w:val="Heading2"/>
@@ -20030,7 +20030,7 @@
       </w:r>
     </w:p>
     <w:bookmarkEnd w:id="346"/>
-    <w:bookmarkStart w:id="347" w:name="_dfdf38459755eb260a6134b1d7962d67cb25e8a"/>
+    <w:bookmarkStart w:id="347" w:name="flujos-alternativos-28"/>
     <w:p>
       <w:pPr>
         <w:pStyle w:val="Heading2"/>
@@ -20109,7 +20109,7 @@
       </w:r>
     </w:p>
     <w:bookmarkEnd w:id="347"/>
-    <w:bookmarkStart w:id="348" w:name="_a2738e6ecba37fe04fac685e50164886d12bba7"/>
+    <w:bookmarkStart w:id="348" w:name="postcondiciones-28"/>
     <w:p>
       <w:pPr>
         <w:pStyle w:val="Heading2"/>
@@ -20143,7 +20143,7 @@
       </w:r>
     </w:p>
     <w:bookmarkEnd w:id="348"/>
-    <w:bookmarkStart w:id="349" w:name="_6a7c6361e274736d79afaff292767cd622110fc"/>
+    <w:bookmarkStart w:id="349" w:name="reglas-de-negocio-aplicadas-28"/>
     <w:p>
       <w:pPr>
         <w:pStyle w:val="Heading2"/>
@@ -20165,7 +20165,7 @@
       </w:r>
     </w:p>
     <w:bookmarkEnd w:id="349"/>
-    <w:bookmarkStart w:id="350" w:name="_7aebcb80111c4336c0ae0e18b430dbcc660534a"/>
+    <w:bookmarkStart w:id="350" w:name="entidades-del-dominio-involucradas-28"/>
     <w:p>
       <w:pPr>
         <w:pStyle w:val="Heading2"/>
@@ -20188,7 +20188,7 @@
     </w:p>
     <w:bookmarkEnd w:id="350"/>
     <w:bookmarkEnd w:id="351"/>
-    <w:bookmarkStart w:id="361" w:name="_95786ba0043a13045668ac3dcc16ccc6979f956"/>
+    <w:bookmarkStart w:id="361" w:name="cu-30-sugerir-recontacto-de-clientes"/>
     <w:p>
       <w:pPr>
         <w:pStyle w:val="Heading1"/>
@@ -20197,7 +20197,7 @@
         <w:t xml:space="preserve">CU-30 Sugerir recontacto de clientes</w:t>
       </w:r>
     </w:p>
-    <w:bookmarkStart w:id="352" w:name="_5f6a9766df3b0af85d60f6d3fa0623354975fda"/>
+    <w:bookmarkStart w:id="352" w:name="descripción-29"/>
     <w:p>
       <w:pPr>
         <w:pStyle w:val="Heading2"/>
@@ -20298,7 +20298,7 @@
       </w:r>
     </w:p>
     <w:bookmarkEnd w:id="352"/>
-    <w:bookmarkStart w:id="353" w:name="_2706ad3540bd8e426a2b44bb3aed2690b5ff590"/>
+    <w:bookmarkStart w:id="353" w:name="actor-principal-29"/>
     <w:p>
       <w:pPr>
         <w:pStyle w:val="Heading2"/>
@@ -20316,7 +20316,7 @@
       </w:r>
     </w:p>
     <w:bookmarkEnd w:id="353"/>
-    <w:bookmarkStart w:id="354" w:name="_65de70a46121026fd3bb1f6503b19325a854c95"/>
+    <w:bookmarkStart w:id="354" w:name="actores-secundarios-29"/>
     <w:p>
       <w:pPr>
         <w:pStyle w:val="Heading2"/>
@@ -20338,7 +20338,7 @@
       </w:r>
     </w:p>
     <w:bookmarkEnd w:id="354"/>
-    <w:bookmarkStart w:id="355" w:name="_54a34f387f6a4838d79ead24eb220f124d6b581"/>
+    <w:bookmarkStart w:id="355" w:name="precondiciones-29"/>
     <w:p>
       <w:pPr>
         <w:pStyle w:val="Heading2"/>
@@ -20372,7 +20372,7 @@
       </w:r>
     </w:p>
     <w:bookmarkEnd w:id="355"/>
-    <w:bookmarkStart w:id="356" w:name="_3bdd1cc588f61731607b75646752a6d6912d503"/>
+    <w:bookmarkStart w:id="356" w:name="flujo-principal-29"/>
     <w:p>
       <w:pPr>
         <w:pStyle w:val="Heading2"/>
@@ -20645,7 +20645,7 @@
       </w:r>
     </w:p>
     <w:bookmarkEnd w:id="356"/>
-    <w:bookmarkStart w:id="357" w:name="_797c807289ace58b08cac4ad12f23d1487f8c84"/>
+    <w:bookmarkStart w:id="357" w:name="flujos-alternativos-29"/>
     <w:p>
       <w:pPr>
         <w:pStyle w:val="Heading2"/>
@@ -20758,7 +20758,7 @@
       </w:r>
     </w:p>
     <w:bookmarkEnd w:id="357"/>
-    <w:bookmarkStart w:id="358" w:name="_aaa0740ef9c83d7748878735f05b890d274a214"/>
+    <w:bookmarkStart w:id="358" w:name="postcondiciones-29"/>
     <w:p>
       <w:pPr>
         <w:pStyle w:val="Heading2"/>
@@ -20780,7 +20780,7 @@
       </w:r>
     </w:p>
     <w:bookmarkEnd w:id="358"/>
-    <w:bookmarkStart w:id="359" w:name="_9ef21fd5bf22f906c82236c64923dfdbfcdd2f1"/>
+    <w:bookmarkStart w:id="359" w:name="reglas-de-negocio-aplicadas-29"/>
     <w:p>
       <w:pPr>
         <w:pStyle w:val="Heading2"/>
@@ -20976,7 +20976,7 @@
       </w:r>
     </w:p>
     <w:bookmarkEnd w:id="359"/>
-    <w:bookmarkStart w:id="360" w:name="_f11715574b6e5ab29a3adac60c4eca7707d83ee"/>
+    <w:bookmarkStart w:id="360" w:name="entidades-del-dominio-involucradas-29"/>
     <w:p>
       <w:pPr>
         <w:pStyle w:val="Heading2"/>
@@ -21017,7 +21017,7 @@
     </w:p>
     <w:bookmarkEnd w:id="360"/>
     <w:bookmarkEnd w:id="361"/>
-    <w:bookmarkStart w:id="371" w:name="_ebca738abb47356d3189941764247ea09b2d15f"/>
+    <w:bookmarkStart w:id="371" w:name="cu-31-gestionar-operadores"/>
     <w:p>
       <w:pPr>
         <w:pStyle w:val="Heading1"/>
@@ -21026,7 +21026,7 @@
         <w:t xml:space="preserve">CU-31 Gestionar operadores</w:t>
       </w:r>
     </w:p>
-    <w:bookmarkStart w:id="362" w:name="_0b6534f51e6f422d4afcef905747ea8a8b3a15a"/>
+    <w:bookmarkStart w:id="362" w:name="descripción-30"/>
     <w:p>
       <w:pPr>
         <w:pStyle w:val="Heading2"/>
@@ -21123,7 +21123,7 @@
       </w:r>
     </w:p>
     <w:bookmarkEnd w:id="362"/>
-    <w:bookmarkStart w:id="363" w:name="_f456b7060bfba1f576f93a0f117d30be0f06c70"/>
+    <w:bookmarkStart w:id="363" w:name="actor-principal-30"/>
     <w:p>
       <w:pPr>
         <w:pStyle w:val="Heading2"/>
@@ -21141,7 +21141,7 @@
       </w:r>
     </w:p>
     <w:bookmarkEnd w:id="363"/>
-    <w:bookmarkStart w:id="364" w:name="_2f44941a3e3ad677ba928d3e64b0035057d1368"/>
+    <w:bookmarkStart w:id="364" w:name="actores-secundarios-30"/>
     <w:p>
       <w:pPr>
         <w:pStyle w:val="Heading2"/>
@@ -21163,7 +21163,7 @@
       </w:r>
     </w:p>
     <w:bookmarkEnd w:id="364"/>
-    <w:bookmarkStart w:id="365" w:name="_c2be656467801e83563dcb86ac0e4b8037839f7"/>
+    <w:bookmarkStart w:id="365" w:name="precondiciones-30"/>
     <w:p>
       <w:pPr>
         <w:pStyle w:val="Heading2"/>
@@ -21215,7 +21215,7 @@
       </w:r>
     </w:p>
     <w:bookmarkEnd w:id="365"/>
-    <w:bookmarkStart w:id="366" w:name="_661370032fe9b374f3a0896601945e4e39d91b2"/>
+    <w:bookmarkStart w:id="366" w:name="flujo-principal-30"/>
     <w:p>
       <w:pPr>
         <w:pStyle w:val="Heading2"/>
@@ -21327,7 +21327,7 @@
       </w:r>
     </w:p>
     <w:bookmarkEnd w:id="366"/>
-    <w:bookmarkStart w:id="367" w:name="_2de352c00487c75ea3253898d622f21a7f860df"/>
+    <w:bookmarkStart w:id="367" w:name="flujos-alternativos-30"/>
     <w:p>
       <w:pPr>
         <w:pStyle w:val="Heading2"/>
@@ -21428,7 +21428,7 @@
       </w:r>
     </w:p>
     <w:bookmarkEnd w:id="367"/>
-    <w:bookmarkStart w:id="368" w:name="_f925b26a13044017604087f8e6134c843bd2d04"/>
+    <w:bookmarkStart w:id="368" w:name="postcondiciones-30"/>
     <w:p>
       <w:pPr>
         <w:pStyle w:val="Heading2"/>
@@ -21450,7 +21450,7 @@
       </w:r>
     </w:p>
     <w:bookmarkEnd w:id="368"/>
-    <w:bookmarkStart w:id="369" w:name="_6170a57c7b655032a903092171714f7c29b0542"/>
+    <w:bookmarkStart w:id="369" w:name="reglas-de-negocio-aplicadas-30"/>
     <w:p>
       <w:pPr>
         <w:pStyle w:val="Heading2"/>
@@ -21472,7 +21472,7 @@
       </w:r>
     </w:p>
     <w:bookmarkEnd w:id="369"/>
-    <w:bookmarkStart w:id="370" w:name="_4b714a57dcee5f2e55fe3eab9d28642d5f86611"/>
+    <w:bookmarkStart w:id="370" w:name="entidades-del-dominio-involucradas-30"/>
     <w:p>
       <w:pPr>
         <w:pStyle w:val="Heading2"/>

</xml_diff>

<commit_message>
La dueña también gestiona usuarios, comisiones y reseñas (CU-13, CU-25 y CU-29)
Alinea los CU con DEC-0005, el relevamiento y el contrato OpenAPI. El diagrama
de casos de uso conecta a la dueña con los casos de gestión y al admin con el
dashboard y los reportes; PNG y entregables regenerados. DEC-0005 ya no marca
la infraestructura como pendiente. Queda la pantalla de Paloma.

Co-Authored-By: Claude Opus 5.5 <noreply@anthropic.com>
</commit_message>
<xml_diff>
--- a/07-Entregables/Casos de uso/Rumbo — Casos de uso.docx
+++ b/07-Entregables/Casos de uso/Rumbo — Casos de uso.docx
@@ -478,7 +478,7 @@
       <w:r>
         <w:drawing>
           <wp:inline>
-            <wp:extent cx="2876550" cy="6285114"/>
+            <wp:extent cx="2876550" cy="9326773"/>
             <wp:effectExtent b="0" l="0" r="0" t="0"/>
             <wp:docPr descr="Diagrama general de casos de uso de Rumbo." title="" id="52" name="Picture"/>
             <a:graphic>
@@ -499,7 +499,7 @@
                   <pic:spPr bwMode="auto">
                     <a:xfrm>
                       <a:off x="0" y="0"/>
-                      <a:ext cx="2876550" cy="6285114"/>
+                      <a:ext cx="2876550" cy="9326773"/>
                     </a:xfrm>
                     <a:prstGeom prst="rect">
                       <a:avLst/>
@@ -731,7 +731,7 @@
         <w:t xml:space="preserve"> </w:t>
       </w:r>
       <w:r>
-        <w:t xml:space="preserve">Usuario con rol</w:t>
+        <w:t xml:space="preserve">Además puede hacer todo lo del administrador: configuración, usuarios, comisiones y moderación de reseñas. Usuario con rol</w:t>
       </w:r>
       <w:r>
         <w:t xml:space="preserve"> </w:t>
@@ -10312,7 +10312,19 @@
         <w:pStyle w:val="FirstParagraph"/>
       </w:pPr>
       <w:r>
-        <w:t xml:space="preserve">admin</w:t>
+        <w:t xml:space="preserve">admin (también</w:t>
+      </w:r>
+      <w:r>
+        <w:t xml:space="preserve"> </w:t>
+      </w:r>
+      <w:r>
+        <w:rPr>
+          <w:rStyle w:val="VerbatimChar"/>
+        </w:rPr>
+        <w:t xml:space="preserve">dueño</w:t>
+      </w:r>
+      <w:r>
+        <w:t xml:space="preserve">)</w:t>
       </w:r>
     </w:p>
     <w:bookmarkEnd w:id="183"/>
@@ -10344,7 +10356,7 @@
         </w:numPr>
       </w:pPr>
       <w:r>
-        <w:t xml:space="preserve">El Usuario tiene rol</w:t>
+        <w:t xml:space="preserve">El Usuario inició sesión con rol</w:t>
       </w:r>
       <w:r>
         <w:t xml:space="preserve"> </w:t>
@@ -10356,7 +10368,25 @@
         <w:t xml:space="preserve">admin</w:t>
       </w:r>
       <w:r>
-        <w:t xml:space="preserve">.</w:t>
+        <w:t xml:space="preserve"> </w:t>
+      </w:r>
+      <w:r>
+        <w:t xml:space="preserve">o</w:t>
+      </w:r>
+      <w:r>
+        <w:t xml:space="preserve"> </w:t>
+      </w:r>
+      <w:r>
+        <w:rPr>
+          <w:rStyle w:val="VerbatimChar"/>
+        </w:rPr>
+        <w:t xml:space="preserve">dueño</w:t>
+      </w:r>
+      <w:r>
+        <w:t xml:space="preserve"> </w:t>
+      </w:r>
+      <w:r>
+        <w:t xml:space="preserve">(CU-24 Iniciar sesión).</w:t>
       </w:r>
     </w:p>
     <w:bookmarkEnd w:id="185"/>
@@ -17348,7 +17378,19 @@
         <w:pStyle w:val="FirstParagraph"/>
       </w:pPr>
       <w:r>
-        <w:t xml:space="preserve">admin</w:t>
+        <w:t xml:space="preserve">admin (también</w:t>
+      </w:r>
+      <w:r>
+        <w:t xml:space="preserve"> </w:t>
+      </w:r>
+      <w:r>
+        <w:rPr>
+          <w:rStyle w:val="VerbatimChar"/>
+        </w:rPr>
+        <w:t xml:space="preserve">dueño</w:t>
+      </w:r>
+      <w:r>
+        <w:t xml:space="preserve">)</w:t>
       </w:r>
     </w:p>
     <w:bookmarkEnd w:id="303"/>
@@ -17380,7 +17422,7 @@
         </w:numPr>
       </w:pPr>
       <w:r>
-        <w:t xml:space="preserve">El Usuario tiene rol</w:t>
+        <w:t xml:space="preserve">El Usuario inició sesión con rol</w:t>
       </w:r>
       <w:r>
         <w:t xml:space="preserve"> </w:t>
@@ -17392,7 +17434,25 @@
         <w:t xml:space="preserve">admin</w:t>
       </w:r>
       <w:r>
-        <w:t xml:space="preserve">.</w:t>
+        <w:t xml:space="preserve"> </w:t>
+      </w:r>
+      <w:r>
+        <w:t xml:space="preserve">o</w:t>
+      </w:r>
+      <w:r>
+        <w:t xml:space="preserve"> </w:t>
+      </w:r>
+      <w:r>
+        <w:rPr>
+          <w:rStyle w:val="VerbatimChar"/>
+        </w:rPr>
+        <w:t xml:space="preserve">dueño</w:t>
+      </w:r>
+      <w:r>
+        <w:t xml:space="preserve"> </w:t>
+      </w:r>
+      <w:r>
+        <w:t xml:space="preserve">(CU-24 Iniciar sesión).</w:t>
       </w:r>
     </w:p>
     <w:bookmarkEnd w:id="305"/>
@@ -19868,7 +19928,19 @@
         <w:pStyle w:val="FirstParagraph"/>
       </w:pPr>
       <w:r>
-        <w:t xml:space="preserve">admin</w:t>
+        <w:t xml:space="preserve">admin (también</w:t>
+      </w:r>
+      <w:r>
+        <w:t xml:space="preserve"> </w:t>
+      </w:r>
+      <w:r>
+        <w:rPr>
+          <w:rStyle w:val="VerbatimChar"/>
+        </w:rPr>
+        <w:t xml:space="preserve">dueño</w:t>
+      </w:r>
+      <w:r>
+        <w:t xml:space="preserve">)</w:t>
       </w:r>
     </w:p>
     <w:bookmarkEnd w:id="343"/>
@@ -19901,6 +19973,48 @@
       </w:pPr>
       <w:r>
         <w:t xml:space="preserve">Precondiciones</w:t>
+      </w:r>
+    </w:p>
+    <w:p>
+      <w:pPr>
+        <w:pStyle w:val="Compact"/>
+        <w:numPr>
+          <w:ilvl w:val="0"/>
+          <w:numId w:val="1192"/>
+        </w:numPr>
+      </w:pPr>
+      <w:r>
+        <w:t xml:space="preserve">El Usuario inició sesión con rol</w:t>
+      </w:r>
+      <w:r>
+        <w:t xml:space="preserve"> </w:t>
+      </w:r>
+      <w:r>
+        <w:rPr>
+          <w:rStyle w:val="VerbatimChar"/>
+        </w:rPr>
+        <w:t xml:space="preserve">admin</w:t>
+      </w:r>
+      <w:r>
+        <w:t xml:space="preserve"> </w:t>
+      </w:r>
+      <w:r>
+        <w:t xml:space="preserve">o</w:t>
+      </w:r>
+      <w:r>
+        <w:t xml:space="preserve"> </w:t>
+      </w:r>
+      <w:r>
+        <w:rPr>
+          <w:rStyle w:val="VerbatimChar"/>
+        </w:rPr>
+        <w:t xml:space="preserve">dueño</w:t>
+      </w:r>
+      <w:r>
+        <w:t xml:space="preserve"> </w:t>
+      </w:r>
+      <w:r>
+        <w:t xml:space="preserve">(CU-24 Iniciar sesión).</w:t>
       </w:r>
     </w:p>
     <w:p>

</xml_diff>